<commit_message>
Hourly snapshot: 14:25 26/02/24
</commit_message>
<xml_diff>
--- a/mitterpach_bp_en.docx
+++ b/mitterpach_bp_en.docx
@@ -594,7 +594,7 @@
             </w:rPr>
             <w:fldChar w:fldCharType="separate"/>
           </w:r>
-          <w:hyperlink w:anchor="_Toc222407414" w:history="1">
+          <w:hyperlink w:anchor="_Toc222407992" w:history="1">
             <w:r>
               <w:rPr>
                 <w:rStyle w:val="Hypertextovodkaz"/>
@@ -621,7 +621,7 @@
                 <w:noProof/>
                 <w:webHidden/>
               </w:rPr>
-              <w:instrText xml:space="preserve"> PAGEREF _Toc222407414 \h </w:instrText>
+              <w:instrText xml:space="preserve"> PAGEREF _Toc222407992 \h </w:instrText>
             </w:r>
             <w:r>
               <w:rPr>
@@ -641,7 +641,7 @@
                 <w:noProof/>
                 <w:webHidden/>
               </w:rPr>
-              <w:t>8</w:t>
+              <w:t>7</w:t>
             </w:r>
             <w:r>
               <w:rPr>
@@ -669,7 +669,7 @@
               <w14:numForm w14:val="default"/>
             </w:rPr>
           </w:pPr>
-          <w:hyperlink w:anchor="_Toc222407415" w:history="1">
+          <w:hyperlink w:anchor="_Toc222407993" w:history="1">
             <w:r>
               <w:rPr>
                 <w:rStyle w:val="Hypertextovodkaz"/>
@@ -696,7 +696,7 @@
                 <w:noProof/>
                 <w:webHidden/>
               </w:rPr>
-              <w:instrText xml:space="preserve"> PAGEREF _Toc222407415 \h </w:instrText>
+              <w:instrText xml:space="preserve"> PAGEREF _Toc222407993 \h </w:instrText>
             </w:r>
             <w:r>
               <w:rPr>
@@ -716,7 +716,7 @@
                 <w:noProof/>
                 <w:webHidden/>
               </w:rPr>
-              <w:t>9</w:t>
+              <w:t>8</w:t>
             </w:r>
             <w:r>
               <w:rPr>
@@ -744,7 +744,7 @@
               <w14:numForm w14:val="default"/>
             </w:rPr>
           </w:pPr>
-          <w:hyperlink w:anchor="_Toc222407416" w:history="1">
+          <w:hyperlink w:anchor="_Toc222407994" w:history="1">
             <w:r>
               <w:rPr>
                 <w:rStyle w:val="Hypertextovodkaz"/>
@@ -771,7 +771,7 @@
                 <w:noProof/>
                 <w:webHidden/>
               </w:rPr>
-              <w:instrText xml:space="preserve"> PAGEREF _Toc222407416 \h </w:instrText>
+              <w:instrText xml:space="preserve"> PAGEREF _Toc222407994 \h </w:instrText>
             </w:r>
             <w:r>
               <w:rPr>
@@ -791,7 +791,7 @@
                 <w:noProof/>
                 <w:webHidden/>
               </w:rPr>
-              <w:t>9</w:t>
+              <w:t>8</w:t>
             </w:r>
             <w:r>
               <w:rPr>
@@ -819,7 +819,7 @@
               <w14:numForm w14:val="default"/>
             </w:rPr>
           </w:pPr>
-          <w:hyperlink w:anchor="_Toc222407417" w:history="1">
+          <w:hyperlink w:anchor="_Toc222407995" w:history="1">
             <w:r>
               <w:rPr>
                 <w:rStyle w:val="Hypertextovodkaz"/>
@@ -846,7 +846,7 @@
                 <w:noProof/>
                 <w:webHidden/>
               </w:rPr>
-              <w:instrText xml:space="preserve"> PAGEREF _Toc222407417 \h </w:instrText>
+              <w:instrText xml:space="preserve"> PAGEREF _Toc222407995 \h </w:instrText>
             </w:r>
             <w:r>
               <w:rPr>
@@ -866,7 +866,7 @@
                 <w:noProof/>
                 <w:webHidden/>
               </w:rPr>
-              <w:t>9</w:t>
+              <w:t>8</w:t>
             </w:r>
             <w:r>
               <w:rPr>
@@ -894,7 +894,7 @@
               <w14:numForm w14:val="default"/>
             </w:rPr>
           </w:pPr>
-          <w:hyperlink w:anchor="_Toc222407418" w:history="1">
+          <w:hyperlink w:anchor="_Toc222407996" w:history="1">
             <w:r>
               <w:rPr>
                 <w:rStyle w:val="Hypertextovodkaz"/>
@@ -921,7 +921,7 @@
                 <w:noProof/>
                 <w:webHidden/>
               </w:rPr>
-              <w:instrText xml:space="preserve"> PAGEREF _Toc222407418 \h </w:instrText>
+              <w:instrText xml:space="preserve"> PAGEREF _Toc222407996 \h </w:instrText>
             </w:r>
             <w:r>
               <w:rPr>
@@ -941,7 +941,7 @@
                 <w:noProof/>
                 <w:webHidden/>
               </w:rPr>
-              <w:t>10</w:t>
+              <w:t>9</w:t>
             </w:r>
             <w:r>
               <w:rPr>
@@ -969,7 +969,7 @@
               <w14:numForm w14:val="default"/>
             </w:rPr>
           </w:pPr>
-          <w:hyperlink w:anchor="_Toc222407419" w:history="1">
+          <w:hyperlink w:anchor="_Toc222407997" w:history="1">
             <w:r>
               <w:rPr>
                 <w:rStyle w:val="Hypertextovodkaz"/>
@@ -996,7 +996,7 @@
                 <w:noProof/>
                 <w:webHidden/>
               </w:rPr>
-              <w:instrText xml:space="preserve"> PAGEREF _Toc222407419 \h </w:instrText>
+              <w:instrText xml:space="preserve"> PAGEREF _Toc222407997 \h </w:instrText>
             </w:r>
             <w:r>
               <w:rPr>
@@ -1016,7 +1016,7 @@
                 <w:noProof/>
                 <w:webHidden/>
               </w:rPr>
-              <w:t>10</w:t>
+              <w:t>9</w:t>
             </w:r>
             <w:r>
               <w:rPr>
@@ -1044,7 +1044,7 @@
               <w14:numForm w14:val="default"/>
             </w:rPr>
           </w:pPr>
-          <w:hyperlink w:anchor="_Toc222407420" w:history="1">
+          <w:hyperlink w:anchor="_Toc222407998" w:history="1">
             <w:r>
               <w:rPr>
                 <w:rStyle w:val="Hypertextovodkaz"/>
@@ -1071,7 +1071,7 @@
                 <w:noProof/>
                 <w:webHidden/>
               </w:rPr>
-              <w:instrText xml:space="preserve"> PAGEREF _Toc222407420 \h </w:instrText>
+              <w:instrText xml:space="preserve"> PAGEREF _Toc222407998 \h </w:instrText>
             </w:r>
             <w:r>
               <w:rPr>
@@ -1091,7 +1091,7 @@
                 <w:noProof/>
                 <w:webHidden/>
               </w:rPr>
-              <w:t>11</w:t>
+              <w:t>10</w:t>
             </w:r>
             <w:r>
               <w:rPr>
@@ -1119,7 +1119,7 @@
               <w14:numForm w14:val="default"/>
             </w:rPr>
           </w:pPr>
-          <w:hyperlink w:anchor="_Toc222407421" w:history="1">
+          <w:hyperlink w:anchor="_Toc222407999" w:history="1">
             <w:r>
               <w:rPr>
                 <w:rStyle w:val="Hypertextovodkaz"/>
@@ -1146,7 +1146,7 @@
                 <w:noProof/>
                 <w:webHidden/>
               </w:rPr>
-              <w:instrText xml:space="preserve"> PAGEREF _Toc222407421 \h </w:instrText>
+              <w:instrText xml:space="preserve"> PAGEREF _Toc222407999 \h </w:instrText>
             </w:r>
             <w:r>
               <w:rPr>
@@ -1166,7 +1166,7 @@
                 <w:noProof/>
                 <w:webHidden/>
               </w:rPr>
-              <w:t>11</w:t>
+              <w:t>10</w:t>
             </w:r>
             <w:r>
               <w:rPr>
@@ -1194,7 +1194,7 @@
               <w14:numForm w14:val="default"/>
             </w:rPr>
           </w:pPr>
-          <w:hyperlink w:anchor="_Toc222407422" w:history="1">
+          <w:hyperlink w:anchor="_Toc222408000" w:history="1">
             <w:r>
               <w:rPr>
                 <w:rStyle w:val="Hypertextovodkaz"/>
@@ -1221,7 +1221,7 @@
                 <w:noProof/>
                 <w:webHidden/>
               </w:rPr>
-              <w:instrText xml:space="preserve"> PAGEREF _Toc222407422 \h </w:instrText>
+              <w:instrText xml:space="preserve"> PAGEREF _Toc222408000 \h </w:instrText>
             </w:r>
             <w:r>
               <w:rPr>
@@ -1241,7 +1241,7 @@
                 <w:noProof/>
                 <w:webHidden/>
               </w:rPr>
-              <w:t>12</w:t>
+              <w:t>11</w:t>
             </w:r>
             <w:r>
               <w:rPr>
@@ -1269,7 +1269,7 @@
               <w14:numForm w14:val="default"/>
             </w:rPr>
           </w:pPr>
-          <w:hyperlink w:anchor="_Toc222407423" w:history="1">
+          <w:hyperlink w:anchor="_Toc222408001" w:history="1">
             <w:r>
               <w:rPr>
                 <w:rStyle w:val="Hypertextovodkaz"/>
@@ -1296,7 +1296,7 @@
                 <w:noProof/>
                 <w:webHidden/>
               </w:rPr>
-              <w:instrText xml:space="preserve"> PAGEREF _Toc222407423 \h </w:instrText>
+              <w:instrText xml:space="preserve"> PAGEREF _Toc222408001 \h </w:instrText>
             </w:r>
             <w:r>
               <w:rPr>
@@ -1316,7 +1316,7 @@
                 <w:noProof/>
                 <w:webHidden/>
               </w:rPr>
-              <w:t>12</w:t>
+              <w:t>11</w:t>
             </w:r>
             <w:r>
               <w:rPr>
@@ -1344,7 +1344,7 @@
               <w14:numForm w14:val="default"/>
             </w:rPr>
           </w:pPr>
-          <w:hyperlink w:anchor="_Toc222407424" w:history="1">
+          <w:hyperlink w:anchor="_Toc222408002" w:history="1">
             <w:r>
               <w:rPr>
                 <w:rStyle w:val="Hypertextovodkaz"/>
@@ -1371,7 +1371,7 @@
                 <w:noProof/>
                 <w:webHidden/>
               </w:rPr>
-              <w:instrText xml:space="preserve"> PAGEREF _Toc222407424 \h </w:instrText>
+              <w:instrText xml:space="preserve"> PAGEREF _Toc222408002 \h </w:instrText>
             </w:r>
             <w:r>
               <w:rPr>
@@ -1391,7 +1391,7 @@
                 <w:noProof/>
                 <w:webHidden/>
               </w:rPr>
-              <w:t>12</w:t>
+              <w:t>11</w:t>
             </w:r>
             <w:r>
               <w:rPr>
@@ -1419,7 +1419,7 @@
               <w14:numForm w14:val="default"/>
             </w:rPr>
           </w:pPr>
-          <w:hyperlink w:anchor="_Toc222407425" w:history="1">
+          <w:hyperlink w:anchor="_Toc222408003" w:history="1">
             <w:r>
               <w:rPr>
                 <w:rStyle w:val="Hypertextovodkaz"/>
@@ -1446,7 +1446,7 @@
                 <w:noProof/>
                 <w:webHidden/>
               </w:rPr>
-              <w:instrText xml:space="preserve"> PAGEREF _Toc222407425 \h </w:instrText>
+              <w:instrText xml:space="preserve"> PAGEREF _Toc222408003 \h </w:instrText>
             </w:r>
             <w:r>
               <w:rPr>
@@ -1466,7 +1466,7 @@
                 <w:noProof/>
                 <w:webHidden/>
               </w:rPr>
-              <w:t>12</w:t>
+              <w:t>11</w:t>
             </w:r>
             <w:r>
               <w:rPr>
@@ -1494,13 +1494,13 @@
               <w14:numForm w14:val="default"/>
             </w:rPr>
           </w:pPr>
-          <w:hyperlink w:anchor="_Toc222407426" w:history="1">
+          <w:hyperlink w:anchor="_Toc222408004" w:history="1">
             <w:r>
               <w:rPr>
                 <w:rStyle w:val="Hypertextovodkaz"/>
                 <w:noProof/>
               </w:rPr>
-              <w:t>2.1.3 rsyslog and related formats</w:t>
+              <w:t>2.1.3 rsyslog</w:t>
             </w:r>
             <w:r>
               <w:rPr>
@@ -1521,7 +1521,7 @@
                 <w:noProof/>
                 <w:webHidden/>
               </w:rPr>
-              <w:instrText xml:space="preserve"> PAGEREF _Toc222407426 \h </w:instrText>
+              <w:instrText xml:space="preserve"> PAGEREF _Toc222408004 \h </w:instrText>
             </w:r>
             <w:r>
               <w:rPr>
@@ -1541,7 +1541,82 @@
                 <w:noProof/>
                 <w:webHidden/>
               </w:rPr>
-              <w:t>12</w:t>
+              <w:t>11</w:t>
+            </w:r>
+            <w:r>
+              <w:rPr>
+                <w:noProof/>
+                <w:webHidden/>
+              </w:rPr>
+              <w:fldChar w:fldCharType="end"/>
+            </w:r>
+          </w:hyperlink>
+        </w:p>
+        <w:p>
+          <w:pPr>
+            <w:pStyle w:val="Obsah3"/>
+            <w:tabs>
+              <w:tab w:val="right" w:leader="dot" w:pos="8776"/>
+            </w:tabs>
+            <w:rPr>
+              <w:rFonts w:eastAsiaTheme="minorEastAsia"/>
+              <w:noProof/>
+              <w:kern w:val="2"/>
+              <w:sz w:val="24"/>
+              <w:szCs w:val="24"/>
+              <w:lang w:val="cs-CZ" w:eastAsia="cs-CZ"/>
+              <w14:ligatures w14:val="standardContextual"/>
+              <w14:numForm w14:val="default"/>
+            </w:rPr>
+          </w:pPr>
+          <w:hyperlink w:anchor="_Toc222408005" w:history="1">
+            <w:r>
+              <w:rPr>
+                <w:rStyle w:val="Hypertextovodkaz"/>
+                <w:noProof/>
+              </w:rPr>
+              <w:t>2.1.4 DMACT</w:t>
+            </w:r>
+            <w:r>
+              <w:rPr>
+                <w:noProof/>
+                <w:webHidden/>
+              </w:rPr>
+              <w:tab/>
+            </w:r>
+            <w:r>
+              <w:rPr>
+                <w:noProof/>
+                <w:webHidden/>
+              </w:rPr>
+              <w:fldChar w:fldCharType="begin"/>
+            </w:r>
+            <w:r>
+              <w:rPr>
+                <w:noProof/>
+                <w:webHidden/>
+              </w:rPr>
+              <w:instrText xml:space="preserve"> PAGEREF _Toc222408005 \h </w:instrText>
+            </w:r>
+            <w:r>
+              <w:rPr>
+                <w:noProof/>
+                <w:webHidden/>
+              </w:rPr>
+            </w:r>
+            <w:r>
+              <w:rPr>
+                <w:noProof/>
+                <w:webHidden/>
+              </w:rPr>
+              <w:fldChar w:fldCharType="separate"/>
+            </w:r>
+            <w:r>
+              <w:rPr>
+                <w:noProof/>
+                <w:webHidden/>
+              </w:rPr>
+              <w:t>11</w:t>
             </w:r>
             <w:r>
               <w:rPr>
@@ -1569,7 +1644,7 @@
               <w14:numForm w14:val="default"/>
             </w:rPr>
           </w:pPr>
-          <w:hyperlink w:anchor="_Toc222407427" w:history="1">
+          <w:hyperlink w:anchor="_Toc222408006" w:history="1">
             <w:r>
               <w:rPr>
                 <w:rStyle w:val="Hypertextovodkaz"/>
@@ -1596,7 +1671,7 @@
                 <w:noProof/>
                 <w:webHidden/>
               </w:rPr>
-              <w:instrText xml:space="preserve"> PAGEREF _Toc222407427 \h </w:instrText>
+              <w:instrText xml:space="preserve"> PAGEREF _Toc222408006 \h </w:instrText>
             </w:r>
             <w:r>
               <w:rPr>
@@ -1616,7 +1691,7 @@
                 <w:noProof/>
                 <w:webHidden/>
               </w:rPr>
-              <w:t>12</w:t>
+              <w:t>11</w:t>
             </w:r>
             <w:r>
               <w:rPr>
@@ -1644,7 +1719,7 @@
               <w14:numForm w14:val="default"/>
             </w:rPr>
           </w:pPr>
-          <w:hyperlink w:anchor="_Toc222407428" w:history="1">
+          <w:hyperlink w:anchor="_Toc222408007" w:history="1">
             <w:r>
               <w:rPr>
                 <w:rStyle w:val="Hypertextovodkaz"/>
@@ -1671,7 +1746,7 @@
                 <w:noProof/>
                 <w:webHidden/>
               </w:rPr>
-              <w:instrText xml:space="preserve"> PAGEREF _Toc222407428 \h </w:instrText>
+              <w:instrText xml:space="preserve"> PAGEREF _Toc222408007 \h </w:instrText>
             </w:r>
             <w:r>
               <w:rPr>
@@ -1691,7 +1766,7 @@
                 <w:noProof/>
                 <w:webHidden/>
               </w:rPr>
-              <w:t>12</w:t>
+              <w:t>11</w:t>
             </w:r>
             <w:r>
               <w:rPr>
@@ -1719,7 +1794,7 @@
               <w14:numForm w14:val="default"/>
             </w:rPr>
           </w:pPr>
-          <w:hyperlink w:anchor="_Toc222407429" w:history="1">
+          <w:hyperlink w:anchor="_Toc222408008" w:history="1">
             <w:r>
               <w:rPr>
                 <w:rStyle w:val="Hypertextovodkaz"/>
@@ -1746,7 +1821,7 @@
                 <w:noProof/>
                 <w:webHidden/>
               </w:rPr>
-              <w:instrText xml:space="preserve"> PAGEREF _Toc222407429 \h </w:instrText>
+              <w:instrText xml:space="preserve"> PAGEREF _Toc222408008 \h </w:instrText>
             </w:r>
             <w:r>
               <w:rPr>
@@ -1766,7 +1841,7 @@
                 <w:noProof/>
                 <w:webHidden/>
               </w:rPr>
-              <w:t>12</w:t>
+              <w:t>11</w:t>
             </w:r>
             <w:r>
               <w:rPr>
@@ -1794,7 +1869,7 @@
               <w14:numForm w14:val="default"/>
             </w:rPr>
           </w:pPr>
-          <w:hyperlink w:anchor="_Toc222407430" w:history="1">
+          <w:hyperlink w:anchor="_Toc222408009" w:history="1">
             <w:r>
               <w:rPr>
                 <w:rStyle w:val="Hypertextovodkaz"/>
@@ -1821,7 +1896,7 @@
                 <w:noProof/>
                 <w:webHidden/>
               </w:rPr>
-              <w:instrText xml:space="preserve"> PAGEREF _Toc222407430 \h </w:instrText>
+              <w:instrText xml:space="preserve"> PAGEREF _Toc222408009 \h </w:instrText>
             </w:r>
             <w:r>
               <w:rPr>
@@ -1841,7 +1916,7 @@
                 <w:noProof/>
                 <w:webHidden/>
               </w:rPr>
-              <w:t>12</w:t>
+              <w:t>11</w:t>
             </w:r>
             <w:r>
               <w:rPr>
@@ -1869,7 +1944,7 @@
               <w14:numForm w14:val="default"/>
             </w:rPr>
           </w:pPr>
-          <w:hyperlink w:anchor="_Toc222407431" w:history="1">
+          <w:hyperlink w:anchor="_Toc222408010" w:history="1">
             <w:r>
               <w:rPr>
                 <w:rStyle w:val="Hypertextovodkaz"/>
@@ -1896,7 +1971,7 @@
                 <w:noProof/>
                 <w:webHidden/>
               </w:rPr>
-              <w:instrText xml:space="preserve"> PAGEREF _Toc222407431 \h </w:instrText>
+              <w:instrText xml:space="preserve"> PAGEREF _Toc222408010 \h </w:instrText>
             </w:r>
             <w:r>
               <w:rPr>
@@ -1916,7 +1991,7 @@
                 <w:noProof/>
                 <w:webHidden/>
               </w:rPr>
-              <w:t>12</w:t>
+              <w:t>11</w:t>
             </w:r>
             <w:r>
               <w:rPr>
@@ -1944,13 +2019,13 @@
               <w14:numForm w14:val="default"/>
             </w:rPr>
           </w:pPr>
-          <w:hyperlink w:anchor="_Toc222407432" w:history="1">
+          <w:hyperlink w:anchor="_Toc222408011" w:history="1">
             <w:r>
               <w:rPr>
                 <w:rStyle w:val="Hypertextovodkaz"/>
                 <w:noProof/>
               </w:rPr>
-              <w:t>2.3.1 1. Real-time monitoring</w:t>
+              <w:t>2.3.1 Real-time monitoring</w:t>
             </w:r>
             <w:r>
               <w:rPr>
@@ -1971,7 +2046,7 @@
                 <w:noProof/>
                 <w:webHidden/>
               </w:rPr>
-              <w:instrText xml:space="preserve"> PAGEREF _Toc222407432 \h </w:instrText>
+              <w:instrText xml:space="preserve"> PAGEREF _Toc222408011 \h </w:instrText>
             </w:r>
             <w:r>
               <w:rPr>
@@ -1991,7 +2066,7 @@
                 <w:noProof/>
                 <w:webHidden/>
               </w:rPr>
-              <w:t>12</w:t>
+              <w:t>11</w:t>
             </w:r>
             <w:r>
               <w:rPr>
@@ -2019,13 +2094,13 @@
               <w14:numForm w14:val="default"/>
             </w:rPr>
           </w:pPr>
-          <w:hyperlink w:anchor="_Toc222407433" w:history="1">
+          <w:hyperlink w:anchor="_Toc222408012" w:history="1">
             <w:r>
               <w:rPr>
                 <w:rStyle w:val="Hypertextovodkaz"/>
                 <w:noProof/>
               </w:rPr>
-              <w:t>2.3.2 2. Dashboards and Single Pane of Glass</w:t>
+              <w:t>2.3.2 Dashboards and Single Pane of Glass</w:t>
             </w:r>
             <w:r>
               <w:rPr>
@@ -2046,7 +2121,7 @@
                 <w:noProof/>
                 <w:webHidden/>
               </w:rPr>
-              <w:instrText xml:space="preserve"> PAGEREF _Toc222407433 \h </w:instrText>
+              <w:instrText xml:space="preserve"> PAGEREF _Toc222408012 \h </w:instrText>
             </w:r>
             <w:r>
               <w:rPr>
@@ -2066,7 +2141,7 @@
                 <w:noProof/>
                 <w:webHidden/>
               </w:rPr>
-              <w:t>12</w:t>
+              <w:t>11</w:t>
             </w:r>
             <w:r>
               <w:rPr>
@@ -2094,7 +2169,7 @@
               <w14:numForm w14:val="default"/>
             </w:rPr>
           </w:pPr>
-          <w:hyperlink w:anchor="_Toc222407434" w:history="1">
+          <w:hyperlink w:anchor="_Toc222408013" w:history="1">
             <w:r>
               <w:rPr>
                 <w:rStyle w:val="Hypertextovodkaz"/>
@@ -2121,7 +2196,7 @@
                 <w:noProof/>
                 <w:webHidden/>
               </w:rPr>
-              <w:instrText xml:space="preserve"> PAGEREF _Toc222407434 \h </w:instrText>
+              <w:instrText xml:space="preserve"> PAGEREF _Toc222408013 \h </w:instrText>
             </w:r>
             <w:r>
               <w:rPr>
@@ -2141,7 +2216,7 @@
                 <w:noProof/>
                 <w:webHidden/>
               </w:rPr>
-              <w:t>12</w:t>
+              <w:t>11</w:t>
             </w:r>
             <w:r>
               <w:rPr>
@@ -2169,13 +2244,13 @@
               <w14:numForm w14:val="default"/>
             </w:rPr>
           </w:pPr>
-          <w:hyperlink w:anchor="_Toc222407435" w:history="1">
+          <w:hyperlink w:anchor="_Toc222408014" w:history="1">
             <w:r>
               <w:rPr>
                 <w:rStyle w:val="Hypertextovodkaz"/>
                 <w:noProof/>
               </w:rPr>
-              <w:t>2.4.1 1. Methods of Alerting</w:t>
+              <w:t>2.4.1 Methods of Alerting</w:t>
             </w:r>
             <w:r>
               <w:rPr>
@@ -2196,7 +2271,7 @@
                 <w:noProof/>
                 <w:webHidden/>
               </w:rPr>
-              <w:instrText xml:space="preserve"> PAGEREF _Toc222407435 \h </w:instrText>
+              <w:instrText xml:space="preserve"> PAGEREF _Toc222408014 \h </w:instrText>
             </w:r>
             <w:r>
               <w:rPr>
@@ -2216,7 +2291,7 @@
                 <w:noProof/>
                 <w:webHidden/>
               </w:rPr>
-              <w:t>12</w:t>
+              <w:t>11</w:t>
             </w:r>
             <w:r>
               <w:rPr>
@@ -2244,13 +2319,13 @@
               <w14:numForm w14:val="default"/>
             </w:rPr>
           </w:pPr>
-          <w:hyperlink w:anchor="_Toc222407436" w:history="1">
+          <w:hyperlink w:anchor="_Toc222408015" w:history="1">
             <w:r>
               <w:rPr>
                 <w:rStyle w:val="Hypertextovodkaz"/>
                 <w:noProof/>
               </w:rPr>
-              <w:t>2.4.2 2. Alert Fatigue</w:t>
+              <w:t>2.4.2 Alert Fatigue</w:t>
             </w:r>
             <w:r>
               <w:rPr>
@@ -2271,7 +2346,7 @@
                 <w:noProof/>
                 <w:webHidden/>
               </w:rPr>
-              <w:instrText xml:space="preserve"> PAGEREF _Toc222407436 \h </w:instrText>
+              <w:instrText xml:space="preserve"> PAGEREF _Toc222408015 \h </w:instrText>
             </w:r>
             <w:r>
               <w:rPr>
@@ -2319,7 +2394,7 @@
               <w14:numForm w14:val="default"/>
             </w:rPr>
           </w:pPr>
-          <w:hyperlink w:anchor="_Toc222407437" w:history="1">
+          <w:hyperlink w:anchor="_Toc222408016" w:history="1">
             <w:r>
               <w:rPr>
                 <w:rStyle w:val="Hypertextovodkaz"/>
@@ -2346,7 +2421,7 @@
                 <w:noProof/>
                 <w:webHidden/>
               </w:rPr>
-              <w:instrText xml:space="preserve"> PAGEREF _Toc222407437 \h </w:instrText>
+              <w:instrText xml:space="preserve"> PAGEREF _Toc222408016 \h </w:instrText>
             </w:r>
             <w:r>
               <w:rPr>
@@ -2394,13 +2469,13 @@
               <w14:numForm w14:val="default"/>
             </w:rPr>
           </w:pPr>
-          <w:hyperlink w:anchor="_Toc222407438" w:history="1">
+          <w:hyperlink w:anchor="_Toc222408017" w:history="1">
             <w:r>
               <w:rPr>
                 <w:rStyle w:val="Hypertextovodkaz"/>
                 <w:noProof/>
               </w:rPr>
-              <w:t>3.1 1. Requirements</w:t>
+              <w:t>3.1 Requirements</w:t>
             </w:r>
             <w:r>
               <w:rPr>
@@ -2421,7 +2496,7 @@
                 <w:noProof/>
                 <w:webHidden/>
               </w:rPr>
-              <w:instrText xml:space="preserve"> PAGEREF _Toc222407438 \h </w:instrText>
+              <w:instrText xml:space="preserve"> PAGEREF _Toc222408017 \h </w:instrText>
             </w:r>
             <w:r>
               <w:rPr>
@@ -2469,13 +2544,13 @@
               <w14:numForm w14:val="default"/>
             </w:rPr>
           </w:pPr>
-          <w:hyperlink w:anchor="_Toc222407439" w:history="1">
+          <w:hyperlink w:anchor="_Toc222408018" w:history="1">
             <w:r>
               <w:rPr>
                 <w:rStyle w:val="Hypertextovodkaz"/>
                 <w:noProof/>
               </w:rPr>
-              <w:t>3.2 2. Specification</w:t>
+              <w:t>3.2 Specification</w:t>
             </w:r>
             <w:r>
               <w:rPr>
@@ -2496,7 +2571,7 @@
                 <w:noProof/>
                 <w:webHidden/>
               </w:rPr>
-              <w:instrText xml:space="preserve"> PAGEREF _Toc222407439 \h </w:instrText>
+              <w:instrText xml:space="preserve"> PAGEREF _Toc222408018 \h </w:instrText>
             </w:r>
             <w:r>
               <w:rPr>
@@ -2544,13 +2619,13 @@
               <w14:numForm w14:val="default"/>
             </w:rPr>
           </w:pPr>
-          <w:hyperlink w:anchor="_Toc222407440" w:history="1">
+          <w:hyperlink w:anchor="_Toc222408019" w:history="1">
             <w:r>
               <w:rPr>
                 <w:rStyle w:val="Hypertextovodkaz"/>
                 <w:noProof/>
               </w:rPr>
-              <w:t>3.3 3. Implementation</w:t>
+              <w:t>3.3 Implementation</w:t>
             </w:r>
             <w:r>
               <w:rPr>
@@ -2571,7 +2646,7 @@
                 <w:noProof/>
                 <w:webHidden/>
               </w:rPr>
-              <w:instrText xml:space="preserve"> PAGEREF _Toc222407440 \h </w:instrText>
+              <w:instrText xml:space="preserve"> PAGEREF _Toc222408019 \h </w:instrText>
             </w:r>
             <w:r>
               <w:rPr>
@@ -2619,13 +2694,13 @@
               <w14:numForm w14:val="default"/>
             </w:rPr>
           </w:pPr>
-          <w:hyperlink w:anchor="_Toc222407441" w:history="1">
+          <w:hyperlink w:anchor="_Toc222408020" w:history="1">
             <w:r>
               <w:rPr>
                 <w:rStyle w:val="Hypertextovodkaz"/>
                 <w:noProof/>
               </w:rPr>
-              <w:t>3.4 4. Testing and CI/CD</w:t>
+              <w:t>3.4 Testing and CI/CD</w:t>
             </w:r>
             <w:r>
               <w:rPr>
@@ -2646,7 +2721,7 @@
                 <w:noProof/>
                 <w:webHidden/>
               </w:rPr>
-              <w:instrText xml:space="preserve"> PAGEREF _Toc222407441 \h </w:instrText>
+              <w:instrText xml:space="preserve"> PAGEREF _Toc222408020 \h </w:instrText>
             </w:r>
             <w:r>
               <w:rPr>
@@ -2694,7 +2769,7 @@
               <w14:numForm w14:val="default"/>
             </w:rPr>
           </w:pPr>
-          <w:hyperlink w:anchor="_Toc222407442" w:history="1">
+          <w:hyperlink w:anchor="_Toc222408021" w:history="1">
             <w:r>
               <w:rPr>
                 <w:rStyle w:val="Hypertextovodkaz"/>
@@ -2721,7 +2796,7 @@
                 <w:noProof/>
                 <w:webHidden/>
               </w:rPr>
-              <w:instrText xml:space="preserve"> PAGEREF _Toc222407442 \h </w:instrText>
+              <w:instrText xml:space="preserve"> PAGEREF _Toc222408021 \h </w:instrText>
             </w:r>
             <w:r>
               <w:rPr>
@@ -2769,7 +2844,7 @@
               <w14:numForm w14:val="default"/>
             </w:rPr>
           </w:pPr>
-          <w:hyperlink w:anchor="_Toc222407443" w:history="1">
+          <w:hyperlink w:anchor="_Toc222408022" w:history="1">
             <w:r>
               <w:rPr>
                 <w:rStyle w:val="Hypertextovodkaz"/>
@@ -2796,7 +2871,7 @@
                 <w:noProof/>
                 <w:webHidden/>
               </w:rPr>
-              <w:instrText xml:space="preserve"> PAGEREF _Toc222407443 \h </w:instrText>
+              <w:instrText xml:space="preserve"> PAGEREF _Toc222408022 \h </w:instrText>
             </w:r>
             <w:r>
               <w:rPr>
@@ -2844,7 +2919,7 @@
               <w14:numForm w14:val="default"/>
             </w:rPr>
           </w:pPr>
-          <w:hyperlink w:anchor="_Toc222407444" w:history="1">
+          <w:hyperlink w:anchor="_Toc222408023" w:history="1">
             <w:r>
               <w:rPr>
                 <w:rStyle w:val="Hypertextovodkaz"/>
@@ -2871,7 +2946,7 @@
                 <w:noProof/>
                 <w:webHidden/>
               </w:rPr>
-              <w:instrText xml:space="preserve"> PAGEREF _Toc222407444 \h </w:instrText>
+              <w:instrText xml:space="preserve"> PAGEREF _Toc222408023 \h </w:instrText>
             </w:r>
             <w:r>
               <w:rPr>
@@ -2919,7 +2994,7 @@
               <w14:numForm w14:val="default"/>
             </w:rPr>
           </w:pPr>
-          <w:hyperlink w:anchor="_Toc222407445" w:history="1">
+          <w:hyperlink w:anchor="_Toc222408024" w:history="1">
             <w:r>
               <w:rPr>
                 <w:rStyle w:val="Hypertextovodkaz"/>
@@ -2946,7 +3021,7 @@
                 <w:noProof/>
                 <w:webHidden/>
               </w:rPr>
-              <w:instrText xml:space="preserve"> PAGEREF _Toc222407445 \h </w:instrText>
+              <w:instrText xml:space="preserve"> PAGEREF _Toc222408024 \h </w:instrText>
             </w:r>
             <w:r>
               <w:rPr>
@@ -3028,8 +3103,6 @@
       </w:r>
       <w:r>
         <w:tab/>
-      </w:r>
-      <w:r>
         <w:t>Domain-based Message Authentication, Reporting and Conformance</w:t>
       </w:r>
     </w:p>
@@ -3053,7 +3126,7 @@
       <w:pPr>
         <w:pStyle w:val="Nadpis1neslovan"/>
       </w:pPr>
-      <w:bookmarkStart w:id="0" w:name="_Toc222407414"/>
+      <w:bookmarkStart w:id="0" w:name="_Toc222407992"/>
       <w:r>
         <w:lastRenderedPageBreak/>
         <w:t>Introduction</w:t>
@@ -3062,24 +3135,42 @@
     </w:p>
     <w:p>
       <w:r>
-        <w:t>The aim of this work is to describe the business impact of observability within software development and the advantages it can provide to modern software businesses. Even small improvements in monitoring can allow exceedingly high savings with an early detection and mitigation of software problems.</w:t>
+        <w:t xml:space="preserve">The aim of this work is to describe the business impact of observability within software development and the advantages it can provide </w:t>
+      </w:r>
+      <w:r>
+        <w:t>for</w:t>
+      </w:r>
+      <w:r>
+        <w:t xml:space="preserve"> modern software businesses. Even small improvements in monitoring can allow exceedingly high savings with an early detection and mitigation of software problems</w:t>
+      </w:r>
+      <w:r>
+        <w:t>, as well as prevent colossal losses due to outages and data loss</w:t>
+      </w:r>
+      <w:r>
+        <w:t>.</w:t>
       </w:r>
     </w:p>
     <w:p>
       <w:r>
-        <w:t xml:space="preserve">Software engineering has grown immeasurably more complex in the past decade. From expanded legal requirements to the ongoing need to innovate and continuously improve their products, software companies face an increase in the amount as well as complexity of the code that they produce and maintain. However, with every line of code comes the potential for bugs, errors and crashes that threaten the stability of the business. A single line of wrongly written code may take down the company's website, delete the database or expose private customer data to the public. Largest software outages cause financial impacts in </w:t>
+        <w:t>Software engineering has grown immeasurably more complex in the past decade. From expanded legal requirements to the ongoing need to innovate and continuously improve their products, software companies face an increase in the amount</w:t>
+      </w:r>
+      <w:r>
+        <w:t>,</w:t>
+      </w:r>
+      <w:r>
+        <w:t xml:space="preserve"> as well as complexity of the code that they produce and maintain. However, with every line of code comes the potential for bugs, errors and crashes that threaten the stability of the business. A single line of wrongly written code may take down the company's website, delete the database or expose private customer data to the public. Largest software outages cause financial impacts in </w:t>
       </w:r>
       <w:r>
         <w:t>billions</w:t>
       </w:r>
       <w:r>
-        <w:t xml:space="preserve"> of dollars (CrowdSTRIKE) and software errors can ruin a company in under an hour (Knight Capital). For this reason, it is of vital importance that a company invests well in </w:t>
-      </w:r>
-      <w:r>
-        <w:t>its</w:t>
-      </w:r>
-      <w:r>
-        <w:t xml:space="preserve"> deployment processes, as well as monitoring and observability.</w:t>
+        <w:t xml:space="preserve"> of dollars</w:t>
+      </w:r>
+      <w:r>
+        <w:t xml:space="preserve"> </w:t>
+      </w:r>
+      <w:r>
+        <w:t>and software errors can ruin a company in under an hour. For this reason, it is of vital importance that a company invests well in its deployment processes, as well as monitoring and observability.</w:t>
       </w:r>
     </w:p>
     <w:p>
@@ -3090,7 +3181,13 @@
         <w:t>allows</w:t>
       </w:r>
       <w:r>
-        <w:t xml:space="preserve"> multiple applications to output their metrics and logs into one single format, which allows for centralization of the business's observability.</w:t>
+        <w:t xml:space="preserve"> multiple applications to output their metrics and logs into one single format, which </w:t>
+      </w:r>
+      <w:r>
+        <w:t>enables</w:t>
+      </w:r>
+      <w:r>
+        <w:t xml:space="preserve"> centralization of the business's observability.</w:t>
       </w:r>
     </w:p>
     <w:p/>
@@ -3107,7 +3204,7 @@
       <w:pPr>
         <w:pStyle w:val="Nadpis1"/>
       </w:pPr>
-      <w:bookmarkStart w:id="1" w:name="_Toc222407415"/>
+      <w:bookmarkStart w:id="1" w:name="_Toc222407993"/>
       <w:r>
         <w:lastRenderedPageBreak/>
         <w:t>Observability</w:t>
@@ -3118,7 +3215,7 @@
       <w:pPr>
         <w:pStyle w:val="Nadpis2"/>
       </w:pPr>
-      <w:bookmarkStart w:id="2" w:name="_Toc222407416"/>
+      <w:bookmarkStart w:id="2" w:name="_Toc222407994"/>
       <w:r>
         <w:t>Definition</w:t>
       </w:r>
@@ -3193,10 +3290,15 @@
         <w:t>data loss across the network</w:t>
       </w:r>
     </w:p>
-    <w:p/>
     <w:p>
       <w:r>
-        <w:t xml:space="preserve">Combined with effective alerting (further described in chapter TODO), this can lead to early detection of anomalous </w:t>
+        <w:t xml:space="preserve">Combined with effective alerting (further described in chapter </w:t>
+      </w:r>
+      <w:r>
+        <w:t>2.4</w:t>
+      </w:r>
+      <w:r>
+        <w:t xml:space="preserve">), this can lead to early detection of anomalous </w:t>
       </w:r>
       <w:r>
         <w:t>behavior</w:t>
@@ -3214,7 +3316,7 @@
       <w:pPr>
         <w:pStyle w:val="Nadpis2"/>
       </w:pPr>
-      <w:bookmarkStart w:id="3" w:name="_Toc222407417"/>
+      <w:bookmarkStart w:id="3" w:name="_Toc222407995"/>
       <w:r>
         <w:t>DevOps and SRE</w:t>
       </w:r>
@@ -3222,20 +3324,45 @@
     </w:p>
     <w:p>
       <w:r>
-        <w:t xml:space="preserve">Historically, software development used to be split into Development and Operations (shortened to Dev and Ops respectively). While Dev was tasked with creating new features for the software and updating them, the actual deployment to the servers and their ongoing maintenance was left to Ops. This has caused a fracture or outright resentment between the teams, who viewed each other as enemies, rather than colleagues working towards a common goal. </w:t>
+        <w:t xml:space="preserve">Historically, software development used to be split into Development and Operations. While </w:t>
+      </w:r>
+      <w:r>
+        <w:t xml:space="preserve">Development </w:t>
+      </w:r>
+      <w:r>
+        <w:t>was tasked with creating new features for the software and updating them, the actual deployment</w:t>
+      </w:r>
+      <w:r>
+        <w:t xml:space="preserve"> of code</w:t>
+      </w:r>
+      <w:r>
+        <w:t xml:space="preserve"> to the servers and their ongoing maintenance was left to </w:t>
+      </w:r>
+      <w:r>
+        <w:t>Operations</w:t>
+      </w:r>
+      <w:r>
+        <w:t xml:space="preserve">. This has caused a fracture or outright resentment between the teams, who viewed each other as enemies, rather than colleagues working towards a common goal. </w:t>
       </w:r>
     </w:p>
     <w:p>
       <w:r>
-        <w:t xml:space="preserve">To streamline the deployment process and assure stable development, a new culture began to emerge in the late 2010s, called *DevOps*. DevOps attempts to bridge the gap between </w:t>
-      </w:r>
-      <w:r>
-        <w:lastRenderedPageBreak/>
-        <w:t>Development and Operations and connects the two teams together. That way, development teams take part in deployment and operations play an active role in development.</w:t>
+        <w:t xml:space="preserve">To streamline the deployment process and assure stable development, a new culture began to emerge in the late 2010s, called </w:t>
+      </w:r>
+      <w:r>
+        <w:rPr>
+          <w:i/>
+          <w:iCs/>
+        </w:rPr>
+        <w:t>DevOps</w:t>
+      </w:r>
+      <w:r>
+        <w:t>. DevOps attempts to bridge the gap between Development and Operations and connects the two teams together. That way, development teams take part in deployment and operations play an active role in development.</w:t>
       </w:r>
     </w:p>
     <w:p>
       <w:r>
+        <w:lastRenderedPageBreak/>
         <w:t xml:space="preserve">The term would further develop into the 2020s, and as of time of this thesis the term is at a sharp all-time high. </w:t>
       </w:r>
     </w:p>
@@ -3265,7 +3392,7 @@
       <w:pPr>
         <w:pStyle w:val="Nadpis2"/>
       </w:pPr>
-      <w:bookmarkStart w:id="4" w:name="_Toc222407418"/>
+      <w:bookmarkStart w:id="4" w:name="_Toc222407996"/>
       <w:r>
         <w:t>Costs and Benefits</w:t>
       </w:r>
@@ -3275,10 +3402,7 @@
       <w:pPr>
         <w:pStyle w:val="Nadpis3"/>
       </w:pPr>
-      <w:r>
-        <w:t xml:space="preserve"> </w:t>
-      </w:r>
-      <w:bookmarkStart w:id="5" w:name="_Toc222407419"/>
+      <w:bookmarkStart w:id="5" w:name="_Toc222407997"/>
       <w:r>
         <w:t>Problems with auto-scaling systems</w:t>
       </w:r>
@@ -3302,7 +3426,25 @@
         <w:t>allows</w:t>
       </w:r>
       <w:r>
-        <w:t xml:space="preserve"> software to run on virtual machines or containers. This process, combined with cloud hosting, allows for automated scaling of memory / disk-space available to the application based on its current needs. If an application is running out of memory during intensive operations, it is trivial to add more processing cores and RAM. </w:t>
+        <w:t xml:space="preserve"> software to run on virtual machines or containers</w:t>
+      </w:r>
+      <w:r>
+        <w:t>, rather than being tied to specific hardware</w:t>
+      </w:r>
+      <w:r>
+        <w:t xml:space="preserve">. This process, combined with </w:t>
+      </w:r>
+      <w:r>
+        <w:t xml:space="preserve">widely available </w:t>
+      </w:r>
+      <w:r>
+        <w:t>cloud hosting</w:t>
+      </w:r>
+      <w:r>
+        <w:t xml:space="preserve"> services</w:t>
+      </w:r>
+      <w:r>
+        <w:t xml:space="preserve">, allows for automated scaling of memory / disk-space available to the application based on its current needs. If an application is running out of memory during intensive operations, it is trivial to add more processing cores and RAM. </w:t>
       </w:r>
     </w:p>
     <w:p>
@@ -3313,12 +3455,36 @@
         <w:t>increasingly</w:t>
       </w:r>
       <w:r>
-        <w:t xml:space="preserve"> often this scaling is automated and can respond within seconds to increased demand. This is done to make sure the application works correctly even during unusually high traffic, such as during specific holidays or limited sales. </w:t>
+        <w:t xml:space="preserve"> often this scaling is automated and can respond within seconds to increased demand. This is done to make sure the application </w:t>
+      </w:r>
+      <w:r>
+        <w:t xml:space="preserve">runs unimpeded </w:t>
+      </w:r>
+      <w:r>
+        <w:t xml:space="preserve">even during unusually high traffic, such as during specific holidays or </w:t>
+      </w:r>
+      <w:r>
+        <w:t>events</w:t>
+      </w:r>
+      <w:r>
+        <w:t xml:space="preserve">. </w:t>
       </w:r>
     </w:p>
     <w:p>
       <w:r>
-        <w:t>However, these resources come at a cost. A program which incorrectly or inefficiently utilizes space or memory might lead to exorbitant costs to the business. It is very often difficult to catch such inefficiencies, as finding out which process takes too much time or runs inefficiently requires an in-depth understanding of the system.</w:t>
+        <w:t xml:space="preserve">However, these resources come at a cost. A program which incorrectly or inefficiently utilizes space or memory </w:t>
+      </w:r>
+      <w:r>
+        <w:t xml:space="preserve">wastes resources at a large </w:t>
+      </w:r>
+      <w:r>
+        <w:t>cost</w:t>
+      </w:r>
+      <w:r>
+        <w:t xml:space="preserve"> </w:t>
+      </w:r>
+      <w:r>
+        <w:t>to the business. It is very often difficult to catch such inefficiencies, as finding out which process takes too much time or runs inefficiently requires an in-depth understanding of the system.</w:t>
       </w:r>
     </w:p>
     <w:p>
@@ -3335,7 +3501,17 @@
         <w:t>analyzing</w:t>
       </w:r>
       <w:r>
-        <w:t xml:space="preserve"> such system traces for space or time complexity is called *profiling*, and allows the developer to figure out, where the program spends most of </w:t>
+        <w:t xml:space="preserve"> such system traces for space or time complexity is called </w:t>
+      </w:r>
+      <w:r>
+        <w:rPr>
+          <w:i/>
+          <w:iCs/>
+        </w:rPr>
+        <w:t>profiling</w:t>
+      </w:r>
+      <w:r>
+        <w:t xml:space="preserve"> and allows the developer to figure out where the program spends most of </w:t>
       </w:r>
       <w:r>
         <w:t>its</w:t>
@@ -3346,33 +3522,47 @@
     </w:p>
     <w:p>
       <w:r>
-        <w:t xml:space="preserve">Common pitfalls might include inefficient database reads or calculation algorithms. When reading from a database, such as to retrieve a username, it is often inefficient to go element by element. Instead, correct indexing and search algorithms can be used to access the user much faster, which places </w:t>
+        <w:t xml:space="preserve">Common pitfalls might include inefficient database reads or calculation algorithms. When reading from a database, such as to retrieve a username, it is often </w:t>
+      </w:r>
+      <w:r>
+        <w:t xml:space="preserve">for the query to look at all </w:t>
+      </w:r>
+      <w:r>
+        <w:t>element</w:t>
+      </w:r>
+      <w:r>
+        <w:t>s within a database</w:t>
+      </w:r>
+      <w:r>
+        <w:t xml:space="preserve">. Instead, correct indexing and search algorithms can be used to access the user much faster, which places </w:t>
       </w:r>
       <w:r>
         <w:t>less</w:t>
       </w:r>
       <w:r>
         <w:t xml:space="preserve"> pressure on the system itself. </w:t>
-      </w:r>
-    </w:p>
-    <w:p/>
-    <w:p>
-      <w:r>
-        <w:lastRenderedPageBreak/>
-        <w:t xml:space="preserve">The problem with these inefficiencies is that they often only show up at a large scale. Different algorithms can have different properties </w:t>
-      </w:r>
-      <w:r>
-        <w:t>regarding</w:t>
-      </w:r>
-      <w:r>
-        <w:t xml:space="preserve"> the length of runtime based on the number of elements.</w:t>
       </w:r>
     </w:p>
     <w:p>
-      <w:pPr>
-        <w:pStyle w:val="Nadpis3"/>
-      </w:pPr>
-      <w:bookmarkStart w:id="6" w:name="_Toc222407420"/>
+      <w:r>
+        <w:t>T</w:t>
+      </w:r>
+      <w:r>
+        <w:t xml:space="preserve">hese inefficiencies often only show up </w:t>
+      </w:r>
+      <w:r>
+        <w:t xml:space="preserve">when the software is running </w:t>
+      </w:r>
+      <w:r>
+        <w:t>at a large scale</w:t>
+      </w:r>
+      <w:r>
+        <w:t>, and can be thus difficult to catch</w:t>
+      </w:r>
+      <w:r>
+        <w:t xml:space="preserve">. </w:t>
+      </w:r>
+      <w:bookmarkStart w:id="6" w:name="_Toc222407998"/>
       <w:r>
         <w:t>Effects of large outages on business</w:t>
       </w:r>
@@ -3383,6 +3573,7 @@
         <w:pStyle w:val="Nadpis4"/>
       </w:pPr>
       <w:r>
+        <w:lastRenderedPageBreak/>
         <w:t>CrowdStrike Outage</w:t>
       </w:r>
     </w:p>
@@ -3398,7 +3589,7 @@
       <w:pPr>
         <w:pStyle w:val="Nadpis3"/>
       </w:pPr>
-      <w:bookmarkStart w:id="7" w:name="_Toc222407421"/>
+      <w:bookmarkStart w:id="7" w:name="_Toc222407999"/>
       <w:r>
         <w:t>Prevention</w:t>
       </w:r>
@@ -3417,7 +3608,7 @@
       <w:pPr>
         <w:pStyle w:val="Nadpis1"/>
       </w:pPr>
-      <w:bookmarkStart w:id="8" w:name="_Toc222407422"/>
+      <w:bookmarkStart w:id="8" w:name="_Toc222408000"/>
       <w:r>
         <w:lastRenderedPageBreak/>
         <w:t>Monitoring and Logging</w:t>
@@ -3428,7 +3619,7 @@
       <w:pPr>
         <w:pStyle w:val="Nadpis2"/>
       </w:pPr>
-      <w:bookmarkStart w:id="9" w:name="_Toc222407423"/>
+      <w:bookmarkStart w:id="9" w:name="_Toc222408001"/>
       <w:r>
         <w:t>Logging Formats</w:t>
       </w:r>
@@ -3438,13 +3629,7 @@
       <w:pPr>
         <w:pStyle w:val="Nadpis3"/>
       </w:pPr>
-      <w:r>
-        <w:tab/>
-      </w:r>
-      <w:r>
-        <w:tab/>
-      </w:r>
-      <w:bookmarkStart w:id="10" w:name="_Toc222407424"/>
+      <w:bookmarkStart w:id="10" w:name="_Toc222408002"/>
       <w:r>
         <w:t>JSON</w:t>
       </w:r>
@@ -3454,15 +3639,12 @@
       <w:pPr>
         <w:pStyle w:val="Nadpis3"/>
       </w:pPr>
-      <w:r>
-        <w:tab/>
-      </w:r>
-      <w:r>
-        <w:tab/>
-      </w:r>
-      <w:bookmarkStart w:id="11" w:name="_Toc222407425"/>
-      <w:r>
-        <w:t>XML</w:t>
+      <w:bookmarkStart w:id="11" w:name="_Toc222408003"/>
+      <w:r>
+        <w:t>X</w:t>
+      </w:r>
+      <w:r>
+        <w:t>ML</w:t>
       </w:r>
       <w:bookmarkEnd w:id="11"/>
     </w:p>
@@ -3470,44 +3652,32 @@
       <w:pPr>
         <w:pStyle w:val="Nadpis3"/>
       </w:pPr>
-      <w:r>
-        <w:tab/>
-      </w:r>
-      <w:r>
-        <w:tab/>
-      </w:r>
-      <w:bookmarkStart w:id="12" w:name="_Toc222407426"/>
-      <w:r>
-        <w:t>rsyslog and related formats</w:t>
+      <w:bookmarkStart w:id="12" w:name="_Toc222408004"/>
+      <w:r>
+        <w:t>rsyslog</w:t>
       </w:r>
       <w:bookmarkEnd w:id="12"/>
     </w:p>
     <w:p>
       <w:pPr>
-        <w:pStyle w:val="Nadpis2"/>
-      </w:pPr>
-      <w:r>
-        <w:tab/>
-      </w:r>
-      <w:bookmarkStart w:id="13" w:name="_Toc222407427"/>
-      <w:r>
-        <w:t>Storing and analyzing logs</w:t>
+        <w:pStyle w:val="Nadpis3"/>
+      </w:pPr>
+      <w:bookmarkStart w:id="13" w:name="_Toc222408005"/>
+      <w:r>
+        <w:t>DMA</w:t>
       </w:r>
       <w:bookmarkEnd w:id="13"/>
+      <w:r>
+        <w:t>RC</w:t>
+      </w:r>
     </w:p>
     <w:p>
       <w:pPr>
-        <w:pStyle w:val="Nadpis3"/>
-      </w:pPr>
-      <w:r>
-        <w:tab/>
-      </w:r>
-      <w:r>
-        <w:tab/>
-      </w:r>
-      <w:bookmarkStart w:id="14" w:name="_Toc222407428"/>
-      <w:r>
-        <w:t>System Logs</w:t>
+        <w:pStyle w:val="Nadpis2"/>
+      </w:pPr>
+      <w:bookmarkStart w:id="14" w:name="_Toc222408006"/>
+      <w:r>
+        <w:t>Storing and analyzing logs</w:t>
       </w:r>
       <w:bookmarkEnd w:id="14"/>
     </w:p>
@@ -3515,18 +3685,9 @@
       <w:pPr>
         <w:pStyle w:val="Nadpis3"/>
       </w:pPr>
-      <w:r>
-        <w:tab/>
-      </w:r>
-      <w:r>
-        <w:tab/>
-      </w:r>
-      <w:bookmarkStart w:id="15" w:name="_Toc222407429"/>
-      <w:r>
-        <w:t>Aggregate</w:t>
-      </w:r>
-      <w:r>
-        <w:t xml:space="preserve"> Reports</w:t>
+      <w:bookmarkStart w:id="15" w:name="_Toc222408007"/>
+      <w:r>
+        <w:t>System Logs</w:t>
       </w:r>
       <w:bookmarkEnd w:id="15"/>
     </w:p>
@@ -3534,62 +3695,37 @@
       <w:pPr>
         <w:pStyle w:val="Nadpis3"/>
       </w:pPr>
-      <w:r>
-        <w:tab/>
-      </w:r>
-      <w:r>
-        <w:tab/>
-      </w:r>
-      <w:bookmarkStart w:id="16" w:name="_Toc222407430"/>
-      <w:r>
-        <w:t>S</w:t>
-      </w:r>
-      <w:r>
-        <w:t>torage requirements and costs</w:t>
+      <w:bookmarkStart w:id="16" w:name="_Toc222408008"/>
+      <w:r>
+        <w:t>Aggregate Reports</w:t>
       </w:r>
       <w:bookmarkEnd w:id="16"/>
     </w:p>
     <w:p>
       <w:pPr>
-        <w:pStyle w:val="Nadpis4"/>
-      </w:pPr>
-      <w:r>
-        <w:tab/>
-      </w:r>
-      <w:r>
-        <w:tab/>
-      </w:r>
-      <w:r>
-        <w:tab/>
-        <w:t>Reducing storage costs</w:t>
-      </w:r>
-    </w:p>
-    <w:p>
-      <w:pPr>
-        <w:pStyle w:val="Nadpis2"/>
-      </w:pPr>
-      <w:r>
-        <w:tab/>
-      </w:r>
-      <w:bookmarkStart w:id="17" w:name="_Toc222407431"/>
-      <w:r>
-        <w:t>Monitoring</w:t>
+        <w:pStyle w:val="Nadpis3"/>
+      </w:pPr>
+      <w:bookmarkStart w:id="17" w:name="_Toc222408009"/>
+      <w:r>
+        <w:t>Storage requirements and costs</w:t>
       </w:r>
       <w:bookmarkEnd w:id="17"/>
     </w:p>
     <w:p>
       <w:pPr>
-        <w:pStyle w:val="Nadpis3"/>
-      </w:pPr>
-      <w:r>
-        <w:tab/>
-      </w:r>
-      <w:r>
-        <w:tab/>
-      </w:r>
-      <w:bookmarkStart w:id="18" w:name="_Toc222407432"/>
-      <w:r>
-        <w:t>Real-time monitoring</w:t>
+        <w:pStyle w:val="Nadpis4"/>
+      </w:pPr>
+      <w:r>
+        <w:t>Reducing storage costs</w:t>
+      </w:r>
+    </w:p>
+    <w:p>
+      <w:pPr>
+        <w:pStyle w:val="Nadpis2"/>
+      </w:pPr>
+      <w:bookmarkStart w:id="18" w:name="_Toc222408010"/>
+      <w:r>
+        <w:t>Monitoring</w:t>
       </w:r>
       <w:bookmarkEnd w:id="18"/>
     </w:p>
@@ -3597,44 +3733,29 @@
       <w:pPr>
         <w:pStyle w:val="Nadpis3"/>
       </w:pPr>
-      <w:r>
-        <w:tab/>
-      </w:r>
-      <w:r>
-        <w:tab/>
-      </w:r>
-      <w:bookmarkStart w:id="19" w:name="_Toc222407433"/>
-      <w:r>
-        <w:t>Dashboards and Single Pane of Glass</w:t>
+      <w:bookmarkStart w:id="19" w:name="_Toc222408011"/>
+      <w:r>
+        <w:t>Real-time monitoring</w:t>
       </w:r>
       <w:bookmarkEnd w:id="19"/>
     </w:p>
     <w:p>
       <w:pPr>
-        <w:pStyle w:val="Nadpis2"/>
-      </w:pPr>
-      <w:r>
-        <w:tab/>
-      </w:r>
-      <w:bookmarkStart w:id="20" w:name="_Toc222407434"/>
-      <w:r>
-        <w:t>Alerting</w:t>
+        <w:pStyle w:val="Nadpis3"/>
+      </w:pPr>
+      <w:bookmarkStart w:id="20" w:name="_Toc222408012"/>
+      <w:r>
+        <w:t>Dashboards and Single Pane of Glass</w:t>
       </w:r>
       <w:bookmarkEnd w:id="20"/>
     </w:p>
     <w:p>
       <w:pPr>
-        <w:pStyle w:val="Nadpis3"/>
-      </w:pPr>
-      <w:r>
-        <w:tab/>
-      </w:r>
-      <w:r>
-        <w:tab/>
-      </w:r>
-      <w:bookmarkStart w:id="21" w:name="_Toc222407435"/>
-      <w:r>
-        <w:t>Methods of Alerting</w:t>
+        <w:pStyle w:val="Nadpis2"/>
+      </w:pPr>
+      <w:bookmarkStart w:id="21" w:name="_Toc222408013"/>
+      <w:r>
+        <w:t>Alerting</w:t>
       </w:r>
       <w:bookmarkEnd w:id="21"/>
     </w:p>
@@ -3642,45 +3763,37 @@
       <w:pPr>
         <w:pStyle w:val="Nadpis3"/>
       </w:pPr>
-      <w:r>
-        <w:tab/>
-      </w:r>
-      <w:r>
-        <w:tab/>
-      </w:r>
-      <w:bookmarkStart w:id="22" w:name="_Toc222407436"/>
-      <w:r>
-        <w:t xml:space="preserve">Alert </w:t>
-      </w:r>
-      <w:r>
-        <w:t>Fatigue</w:t>
+      <w:bookmarkStart w:id="22" w:name="_Toc222408014"/>
+      <w:r>
+        <w:t>Methods of Alerting</w:t>
       </w:r>
       <w:bookmarkEnd w:id="22"/>
     </w:p>
     <w:p>
       <w:pPr>
-        <w:pStyle w:val="Nadpis1"/>
-      </w:pPr>
-      <w:bookmarkStart w:id="23" w:name="_Toc222407437"/>
+        <w:pStyle w:val="Nadpis3"/>
+      </w:pPr>
       <w:r>
         <w:lastRenderedPageBreak/>
-        <w:t>Application</w:t>
-      </w:r>
-      <w:r>
-        <w:t xml:space="preserve"> Implementation</w:t>
+        <w:tab/>
+      </w:r>
+      <w:bookmarkStart w:id="23" w:name="_Toc222408015"/>
+      <w:r>
+        <w:t>Alert Fatigue</w:t>
       </w:r>
       <w:bookmarkEnd w:id="23"/>
     </w:p>
     <w:p>
       <w:pPr>
-        <w:pStyle w:val="Nadpis2"/>
-      </w:pPr>
-      <w:r>
-        <w:tab/>
-      </w:r>
-      <w:bookmarkStart w:id="24" w:name="_Toc222407438"/>
-      <w:r>
-        <w:t>Requirements</w:t>
+        <w:pStyle w:val="Nadpis1"/>
+      </w:pPr>
+      <w:bookmarkStart w:id="24" w:name="_Toc222408016"/>
+      <w:r>
+        <w:lastRenderedPageBreak/>
+        <w:t>Application</w:t>
+      </w:r>
+      <w:r>
+        <w:t xml:space="preserve"> Implementation</w:t>
       </w:r>
       <w:bookmarkEnd w:id="24"/>
     </w:p>
@@ -3688,12 +3801,9 @@
       <w:pPr>
         <w:pStyle w:val="Nadpis2"/>
       </w:pPr>
-      <w:r>
-        <w:tab/>
-      </w:r>
-      <w:bookmarkStart w:id="25" w:name="_Toc222407439"/>
-      <w:r>
-        <w:t>Specification</w:t>
+      <w:bookmarkStart w:id="25" w:name="_Toc222408017"/>
+      <w:r>
+        <w:t>Requirements</w:t>
       </w:r>
       <w:bookmarkEnd w:id="25"/>
     </w:p>
@@ -3701,12 +3811,9 @@
       <w:pPr>
         <w:pStyle w:val="Nadpis2"/>
       </w:pPr>
-      <w:r>
-        <w:tab/>
-      </w:r>
-      <w:bookmarkStart w:id="26" w:name="_Toc222407440"/>
-      <w:r>
-        <w:t>Implementation</w:t>
+      <w:bookmarkStart w:id="26" w:name="_Toc222408018"/>
+      <w:r>
+        <w:t>Specification</w:t>
       </w:r>
       <w:bookmarkEnd w:id="26"/>
     </w:p>
@@ -3714,23 +3821,19 @@
       <w:pPr>
         <w:pStyle w:val="Nadpis2"/>
       </w:pPr>
-      <w:r>
-        <w:tab/>
-      </w:r>
-      <w:bookmarkStart w:id="27" w:name="_Toc222407441"/>
-      <w:r>
-        <w:t>Testing and CI/CD</w:t>
+      <w:bookmarkStart w:id="27" w:name="_Toc222408019"/>
+      <w:r>
+        <w:t>Implementation</w:t>
       </w:r>
       <w:bookmarkEnd w:id="27"/>
     </w:p>
     <w:p>
       <w:pPr>
-        <w:pStyle w:val="Nadpis1"/>
-      </w:pPr>
-      <w:bookmarkStart w:id="28" w:name="_Toc222407442"/>
-      <w:r>
-        <w:lastRenderedPageBreak/>
-        <w:t>Discussion to implementation</w:t>
+        <w:pStyle w:val="Nadpis2"/>
+      </w:pPr>
+      <w:bookmarkStart w:id="28" w:name="_Toc222408020"/>
+      <w:r>
+        <w:t>Testing and CI/CD</w:t>
       </w:r>
       <w:bookmarkEnd w:id="28"/>
     </w:p>
@@ -3738,10 +3841,10 @@
       <w:pPr>
         <w:pStyle w:val="Nadpis1"/>
       </w:pPr>
-      <w:bookmarkStart w:id="29" w:name="_Toc222407443"/>
+      <w:bookmarkStart w:id="29" w:name="_Toc222408021"/>
       <w:r>
         <w:lastRenderedPageBreak/>
-        <w:t>Conclusions</w:t>
+        <w:t>Discussion to implementation</w:t>
       </w:r>
       <w:bookmarkEnd w:id="29"/>
     </w:p>
@@ -3749,12 +3852,23 @@
       <w:pPr>
         <w:pStyle w:val="Nadpis1"/>
       </w:pPr>
-      <w:bookmarkStart w:id="30" w:name="_Toc222407444"/>
+      <w:bookmarkStart w:id="30" w:name="_Toc222408022"/>
+      <w:r>
+        <w:lastRenderedPageBreak/>
+        <w:t>Conclusions</w:t>
+      </w:r>
+      <w:bookmarkEnd w:id="30"/>
+    </w:p>
+    <w:p>
+      <w:pPr>
+        <w:pStyle w:val="Nadpis1"/>
+      </w:pPr>
+      <w:bookmarkStart w:id="31" w:name="_Toc222408023"/>
       <w:r>
         <w:lastRenderedPageBreak/>
         <w:t>List of references</w:t>
       </w:r>
-      <w:bookmarkEnd w:id="30"/>
+      <w:bookmarkEnd w:id="31"/>
     </w:p>
     <w:p>
       <w:r>
@@ -3864,12 +3978,12 @@
       <w:pPr>
         <w:pStyle w:val="Nadpis1neslovan"/>
       </w:pPr>
-      <w:bookmarkStart w:id="31" w:name="_Toc222407445"/>
+      <w:bookmarkStart w:id="32" w:name="_Toc222408024"/>
       <w:r>
         <w:lastRenderedPageBreak/>
         <w:t>Appendices</w:t>
       </w:r>
-      <w:bookmarkEnd w:id="31"/>
+      <w:bookmarkEnd w:id="32"/>
     </w:p>
     <w:p/>
     <w:sectPr>
@@ -8982,6 +9096,15 @@
 </file>
 
 <file path=customXml/item2.xml><?xml version="1.0" encoding="utf-8"?>
+<?mso-contentType ?>
+<FormTemplates xmlns="http://schemas.microsoft.com/sharepoint/v3/contenttype/forms">
+  <Display>DocumentLibraryForm</Display>
+  <Edit>DocumentLibraryForm</Edit>
+  <New>DocumentLibraryForm</New>
+</FormTemplates>
+</file>
+
+<file path=customXml/item3.xml><?xml version="1.0" encoding="utf-8"?>
 <ct:contentTypeSchema xmlns:ct="http://schemas.microsoft.com/office/2006/metadata/contentType" xmlns:ma="http://schemas.microsoft.com/office/2006/metadata/properties/metaAttributes" ct:_="" ma:_="" ma:contentTypeName="Dokument" ma:contentTypeID="0x010100A5EAD61CDED85140BF5B934B48DD3484" ma:contentTypeVersion="15" ma:contentTypeDescription="Vytvoří nový dokument" ma:contentTypeScope="" ma:versionID="650a80ffac071b00940b99789c030117">
   <xsd:schema xmlns:xsd="http://www.w3.org/2001/XMLSchema" xmlns:xs="http://www.w3.org/2001/XMLSchema" xmlns:p="http://schemas.microsoft.com/office/2006/metadata/properties" xmlns:ns2="7fe71cfb-81ed-4b9d-9a1f-cae1a72b62ba" xmlns:ns3="184be059-f9c1-47a1-baeb-6b78fb5c2cd7" targetNamespace="http://schemas.microsoft.com/office/2006/metadata/properties" ma:root="true" ma:fieldsID="84f9754f55100dee04bb21cdbbf205ea" ns2:_="" ns3:_="">
     <xsd:import namespace="7fe71cfb-81ed-4b9d-9a1f-cae1a72b62ba"/>
@@ -9210,7 +9333,7 @@
 </ct:contentTypeSchema>
 </file>
 
-<file path=customXml/item3.xml><?xml version="1.0" encoding="utf-8"?>
+<file path=customXml/item4.xml><?xml version="1.0" encoding="utf-8"?>
 <b:Sources xmlns:b="http://schemas.openxmlformats.org/officeDocument/2006/bibliography" xmlns="http://schemas.openxmlformats.org/officeDocument/2006/bibliography" SelectedStyle="\HarvardAnglia2008OfficeOnline.xsl" StyleName="Harvard – Anglia" Version="2008">
   <b:Source>
     <b:Tag>JAB18</b:Tag>
@@ -9326,15 +9449,6 @@
 </b:Sources>
 </file>
 
-<file path=customXml/item4.xml><?xml version="1.0" encoding="utf-8"?>
-<?mso-contentType ?>
-<FormTemplates xmlns="http://schemas.microsoft.com/sharepoint/v3/contenttype/forms">
-  <Display>DocumentLibraryForm</Display>
-  <Edit>DocumentLibraryForm</Edit>
-  <New>DocumentLibraryForm</New>
-</FormTemplates>
-</file>
-
 <file path=customXml/itemProps1.xml><?xml version="1.0" encoding="utf-8"?>
 <ds:datastoreItem xmlns:ds="http://schemas.openxmlformats.org/officeDocument/2006/customXml" ds:itemID="{D04EB944-32B9-4763-86CC-835324F34208}">
   <ds:schemaRefs>
@@ -9347,6 +9461,14 @@
 </file>
 
 <file path=customXml/itemProps2.xml><?xml version="1.0" encoding="utf-8"?>
+<ds:datastoreItem xmlns:ds="http://schemas.openxmlformats.org/officeDocument/2006/customXml" ds:itemID="{B20E3A8B-6AD5-4C75-B663-202B302D3610}">
+  <ds:schemaRefs>
+    <ds:schemaRef ds:uri="http://schemas.microsoft.com/sharepoint/v3/contenttype/forms"/>
+  </ds:schemaRefs>
+</ds:datastoreItem>
+</file>
+
+<file path=customXml/itemProps3.xml><?xml version="1.0" encoding="utf-8"?>
 <ds:datastoreItem xmlns:ds="http://schemas.openxmlformats.org/officeDocument/2006/customXml" ds:itemID="{8905DAC8-6CAE-4D14-B6E7-353AD22F862D}">
   <ds:schemaRefs>
     <ds:schemaRef ds:uri="http://schemas.microsoft.com/office/2006/metadata/contentType"/>
@@ -9365,18 +9487,10 @@
 </ds:datastoreItem>
 </file>
 
-<file path=customXml/itemProps3.xml><?xml version="1.0" encoding="utf-8"?>
+<file path=customXml/itemProps4.xml><?xml version="1.0" encoding="utf-8"?>
 <ds:datastoreItem xmlns:ds="http://schemas.openxmlformats.org/officeDocument/2006/customXml" ds:itemID="{F9F098CF-5C9F-4B4F-8EA7-B56220723CAF}">
   <ds:schemaRefs>
     <ds:schemaRef ds:uri="http://schemas.openxmlformats.org/officeDocument/2006/bibliography"/>
   </ds:schemaRefs>
 </ds:datastoreItem>
-</file>
-
-<file path=customXml/itemProps4.xml><?xml version="1.0" encoding="utf-8"?>
-<ds:datastoreItem xmlns:ds="http://schemas.openxmlformats.org/officeDocument/2006/customXml" ds:itemID="{B20E3A8B-6AD5-4C75-B663-202B302D3610}">
-  <ds:schemaRefs>
-    <ds:schemaRef ds:uri="http://schemas.microsoft.com/sharepoint/v3/contenttype/forms"/>
-  </ds:schemaRefs>
-</ds:datastoreItem>
 </file>
</xml_diff>

<commit_message>
Hourly snapshot: 10:59 26/03/05
</commit_message>
<xml_diff>
--- a/mitterpach_bp_en.docx
+++ b/mitterpach_bp_en.docx
@@ -3234,7 +3234,13 @@
         <w:t>behavior</w:t>
       </w:r>
       <w:r>
-        <w:t>, performance and health of the layers within a software ecosystem". This ecosystem can encompass everything from user interfaces to backend services, databases, infrastructures and the networks that connect them. (Kisina et al., 2021)</w:t>
+        <w:t xml:space="preserve">, performance and health of the layers within a software ecosystem". This ecosystem can encompass everything from user interfaces to backend services, databases, </w:t>
+      </w:r>
+      <w:r>
+        <w:t xml:space="preserve">supporting </w:t>
+      </w:r>
+      <w:r>
+        <w:t>infrastructure and the networks that connect them. (Kisina et al., 2021)</w:t>
       </w:r>
     </w:p>
     <w:p>
@@ -3311,6 +3317,16 @@
       <w:r>
         <w:t>The field that has come to be best associated with ensuring observability and monitoring is called Site Reliability Engineering, also known as SRE. The origins of this term can be traced to Google, where the first SRE team was established in 2003. (Treynor, 2014)</w:t>
       </w:r>
+      <w:r>
+        <w:t xml:space="preserve">  </w:t>
+      </w:r>
+      <w:r>
+        <w:br/>
+      </w:r>
+      <w:r>
+        <w:br/>
+        <w:t xml:space="preserve">Site Reliability Engineering is closely related to the term DevOps, which describes the culture that places high importance on observability, tight feedback loops and automation of recurring processes. </w:t>
+      </w:r>
     </w:p>
     <w:p>
       <w:pPr>
@@ -3342,7 +3358,13 @@
         <w:t>Operations</w:t>
       </w:r>
       <w:r>
-        <w:t xml:space="preserve">. This has caused a fracture or outright resentment between the teams, who viewed each other as enemies, rather than colleagues working towards a common goal. </w:t>
+        <w:t xml:space="preserve">. </w:t>
+      </w:r>
+      <w:r>
+        <w:t>(Wiedemann et al., 2023)</w:t>
+      </w:r>
+      <w:r>
+        <w:t xml:space="preserve"> </w:t>
       </w:r>
     </w:p>
     <w:p>
@@ -3357,35 +3379,83 @@
         <w:t>DevOps</w:t>
       </w:r>
       <w:r>
-        <w:t>. DevOps attempts to bridge the gap between Development and Operations and connects the two teams together. That way, development teams take part in deployment and operations play an active role in development.</w:t>
+        <w:t xml:space="preserve">. DevOps attempts to bridge the gap between </w:t>
+      </w:r>
+      <w:r>
+        <w:lastRenderedPageBreak/>
+        <w:t>Development and Operations and connects the two teams together. That way, development teams take part in deployment and operations play an active role in development.</w:t>
       </w:r>
     </w:p>
     <w:p>
-      <w:r>
-        <w:lastRenderedPageBreak/>
-        <w:t xml:space="preserve">The term would further develop into the 2020s, and as of time of this thesis the term is at a sharp all-time high. </w:t>
+      <w:pPr>
+        <w:rPr>
+          <w:highlight w:val="yellow"/>
+        </w:rPr>
+      </w:pPr>
+      <w:r>
+        <w:rPr>
+          <w:highlight w:val="yellow"/>
+        </w:rPr>
+        <w:t xml:space="preserve">The term would further develop into the 2020s, </w:t>
+      </w:r>
+      <w:r>
+        <w:rPr>
+          <w:highlight w:val="yellow"/>
+        </w:rPr>
+        <w:t>however, m</w:t>
+      </w:r>
+      <w:r>
+        <w:rPr>
+          <w:highlight w:val="yellow"/>
+        </w:rPr>
+        <w:t xml:space="preserve">any critics warn that DevOps has steered too far away from </w:t>
+      </w:r>
+      <w:r>
+        <w:rPr>
+          <w:highlight w:val="yellow"/>
+        </w:rPr>
+        <w:t>its</w:t>
+      </w:r>
+      <w:r>
+        <w:rPr>
+          <w:highlight w:val="yellow"/>
+        </w:rPr>
+        <w:t xml:space="preserve"> original purpose, becoming </w:t>
+      </w:r>
+      <w:r>
+        <w:rPr>
+          <w:highlight w:val="yellow"/>
+        </w:rPr>
+        <w:t>its</w:t>
+      </w:r>
+      <w:r>
+        <w:rPr>
+          <w:highlight w:val="yellow"/>
+        </w:rPr>
+        <w:t xml:space="preserve"> own discipline, rather than a culture bridging two cooperating disciplines. </w:t>
       </w:r>
     </w:p>
     <w:p>
       <w:r>
-        <w:t xml:space="preserve">Many critics warn that DevOps has steered too far away from </w:t>
-      </w:r>
-      <w:r>
-        <w:t>its</w:t>
-      </w:r>
-      <w:r>
-        <w:t xml:space="preserve"> original purpose, with DevOps becoming </w:t>
-      </w:r>
-      <w:r>
-        <w:t>its</w:t>
-      </w:r>
-      <w:r>
-        <w:t xml:space="preserve"> own discipline, rather than a culture bridging two cooperating disciplines. </w:t>
-      </w:r>
-    </w:p>
-    <w:p>
-      <w:r>
-        <w:t>Developers who describe themselves as "DevOps" now make up 2.5% of the workforce, according to the latest StackOverflow developer survey. This marks a large increase from the 1.3% reported in 2015.</w:t>
+        <w:rPr>
+          <w:highlight w:val="yellow"/>
+        </w:rPr>
+        <w:t>Developers who describe themselves as "DevOps</w:t>
+      </w:r>
+      <w:r>
+        <w:rPr>
+          <w:highlight w:val="yellow"/>
+        </w:rPr>
+        <w:t xml:space="preserve"> developers</w:t>
+      </w:r>
+      <w:r>
+        <w:rPr>
+          <w:highlight w:val="yellow"/>
+        </w:rPr>
+        <w:t>" now make up 2.5% of the workforce, according to the latest StackOverflow developer survey. This marks a large increase from the 1.3% reported in 2015.</w:t>
+      </w:r>
+      <w:r>
+        <w:t xml:space="preserve"> REWORK, ELABORATE</w:t>
       </w:r>
     </w:p>
     <w:p>
@@ -3399,6 +3469,11 @@
       <w:bookmarkEnd w:id="4"/>
     </w:p>
     <w:p>
+      <w:r>
+        <w:t>ADD INTRO TO COSTS AND BENEFITS</w:t>
+      </w:r>
+    </w:p>
+    <w:p>
       <w:pPr>
         <w:pStyle w:val="Nadpis3"/>
       </w:pPr>
@@ -3407,6 +3482,11 @@
         <w:t>Problems with auto-scaling systems</w:t>
       </w:r>
       <w:bookmarkEnd w:id="5"/>
+    </w:p>
+    <w:p>
+      <w:r>
+        <w:t>GOES TOO FAST INTO VIRTUALIZATION, NEEDS INTRODUCTION</w:t>
+      </w:r>
     </w:p>
     <w:p>
       <w:r>

</xml_diff>

<commit_message>
Hourly snapshot: 11:59 26/03/05
</commit_message>
<xml_diff>
--- a/mitterpach_bp_en.docx
+++ b/mitterpach_bp_en.docx
@@ -495,6 +495,38 @@
       </w:r>
     </w:p>
     <w:p>
+      <w:r>
+        <w:t>This thesis addresses the problems of observability in modern software development and the growing need for open-source adaptability layers between different monitoring applications. Main goal stated for the thesis is the development of a Flask application that translates inputs from multiple reporting formats into one common format, which allows for the centralization of reporting from numerous different parts of the software stack into one common database.</w:t>
+      </w:r>
+    </w:p>
+    <w:p>
+      <w:r>
+        <w:t>The theoretical part of this application aims to explain the requirement for observability from both a technical and a business side, demonstrating the devastating impact that insufficient monitoring can have on a company with specific case studies. Further on, the thesis explains the different file formats commonly used in data manipulation, discusses trade-offs and uses.</w:t>
+      </w:r>
+    </w:p>
+    <w:p>
+      <w:r>
+        <w:t xml:space="preserve">The practical part details the creation of application for the collection of software reports in varying formats, their translation and output in one common language. It contains the requirements for the application, high-level system design, discussion of the implementation and deployment, as well as robust End to </w:t>
+      </w:r>
+      <w:r>
+        <w:t>End</w:t>
+      </w:r>
+      <w:r>
+        <w:t xml:space="preserve"> and unit testing.</w:t>
+      </w:r>
+    </w:p>
+    <w:p>
+      <w:r>
+        <w:t xml:space="preserve">The outcome of this work is a fully functioning and deployed open-source application, thoroughly documented, as well as </w:t>
+      </w:r>
+      <w:r>
+        <w:t>supporting</w:t>
+      </w:r>
+      <w:r>
+        <w:t xml:space="preserve"> infrastructure for automated CI/CD building, testing and deployment.</w:t>
+      </w:r>
+    </w:p>
+    <w:p>
       <w:pPr>
         <w:pStyle w:val="Klovslova"/>
         <w:rPr>
@@ -514,7 +546,17 @@
         <w:t xml:space="preserve"> </w:t>
       </w:r>
     </w:p>
-    <w:p/>
+    <w:p>
+      <w:r>
+        <w:t xml:space="preserve">Observability; </w:t>
+      </w:r>
+      <w:r>
+        <w:t xml:space="preserve">DevOps; </w:t>
+      </w:r>
+      <w:r>
+        <w:t>Monitoring; Logging; Web Application; Open Source; Flask</w:t>
+      </w:r>
+    </w:p>
     <w:sdt>
       <w:sdtPr>
         <w:rPr>
@@ -3121,7 +3163,51 @@
         <w:t>Application Programming Interface</w:t>
       </w:r>
     </w:p>
-    <w:p/>
+    <w:p>
+      <w:r>
+        <w:t>TTL</w:t>
+      </w:r>
+      <w:r>
+        <w:tab/>
+      </w:r>
+      <w:r>
+        <w:tab/>
+      </w:r>
+      <w:r>
+        <w:tab/>
+        <w:t>Time-to-live</w:t>
+      </w:r>
+    </w:p>
+    <w:p>
+      <w:r>
+        <w:t>SRE</w:t>
+      </w:r>
+      <w:r>
+        <w:tab/>
+      </w:r>
+      <w:r>
+        <w:tab/>
+      </w:r>
+      <w:r>
+        <w:tab/>
+        <w:t>Site Reliability Engineering</w:t>
+      </w:r>
+    </w:p>
+    <w:p>
+      <w:r>
+        <w:t>DDoS</w:t>
+      </w:r>
+      <w:r>
+        <w:tab/>
+      </w:r>
+      <w:r>
+        <w:tab/>
+      </w:r>
+      <w:r>
+        <w:tab/>
+        <w:t>Distributed Denial of Service</w:t>
+      </w:r>
+    </w:p>
     <w:p>
       <w:pPr>
         <w:pStyle w:val="Nadpis1neslovan"/>
@@ -3524,7 +3610,13 @@
         <w:t xml:space="preserve"> services</w:t>
       </w:r>
       <w:r>
-        <w:t xml:space="preserve">, allows for automated scaling of memory / disk-space available to the application based on its current needs. If an application is running out of memory during intensive operations, it is trivial to add more processing cores and RAM. </w:t>
+        <w:t xml:space="preserve">, allows for automated scaling of memory / disk-space available to the application based on its current needs. If an application is running out of memory during intensive operations, it is trivial to add more processing cores and </w:t>
+      </w:r>
+      <w:r>
+        <w:t>increase available memory</w:t>
+      </w:r>
+      <w:r>
+        <w:t xml:space="preserve">. </w:t>
       </w:r>
     </w:p>
     <w:p>
@@ -3624,6 +3716,11 @@
       </w:r>
     </w:p>
     <w:p>
+      <w:pPr>
+        <w:tabs>
+          <w:tab w:val="left" w:pos="1276"/>
+        </w:tabs>
+      </w:pPr>
       <w:r>
         <w:t>T</w:t>
       </w:r>
@@ -3696,6 +3793,156 @@
       <w:bookmarkEnd w:id="8"/>
     </w:p>
     <w:p>
+      <w:r>
+        <w:t xml:space="preserve">Monitoring is the process of gathering application front-end or back-end measurement data to diagnose, prevent or recover from application errors. (Tamburri, 2020) During this process, the application itself or programs associated with the application observe, collect and send data that describes how the application is running. </w:t>
+      </w:r>
+    </w:p>
+    <w:p>
+      <w:r>
+        <w:t xml:space="preserve">This monitoring can include everything from logs of unrecoverable catastrophic errors to day-to-day ordinary traces that detail regular code execution. As such, logs are usually assigned severity levels. In the mostly commonly used scheme, the severity </w:t>
+      </w:r>
+    </w:p>
+    <w:p>
+      <w:r>
+        <w:t xml:space="preserve">Traces or logs are pieces of text that detail the current state of the system, such as the current working state of the application - values of variables, thread count and load currently placed upon the application. </w:t>
+      </w:r>
+    </w:p>
+    <w:p>
+      <w:r>
+        <w:t>These traces can often be critical in the diagnostics after a system failure - why did the application crash and under what circumstances</w:t>
+      </w:r>
+      <w:r>
+        <w:t>?</w:t>
+      </w:r>
+      <w:r>
+        <w:t xml:space="preserve"> Such crashes can be catastrophic for business - an e-shop may lose </w:t>
+      </w:r>
+      <w:r>
+        <w:t>hundreds</w:t>
+      </w:r>
+      <w:r>
+        <w:t xml:space="preserve"> of thousands in revenue for every minute it is offline and unavailable to its customers. As such, it is essential to get the business up and running as soon as possible, which requires the developer to figure out what is wrong with the current system and how to fix it. For this diagnostic, logs are irreplaceable and very often offer the first clues for the fix.</w:t>
+      </w:r>
+    </w:p>
+    <w:p>
+      <w:r>
+        <w:t xml:space="preserve">Monitoring also </w:t>
+      </w:r>
+      <w:r>
+        <w:t>allows</w:t>
+      </w:r>
+      <w:r>
+        <w:t xml:space="preserve"> the business to notice anything has gone wrong. As detailed in chapter 1.2.2 Knight Capital, a company can lose half a billion dollars in an hour because of a </w:t>
+      </w:r>
+      <w:r>
+        <w:t xml:space="preserve">rudimentary </w:t>
+      </w:r>
+      <w:r>
+        <w:t xml:space="preserve">bug. To prevent such a catastrophic loss, it is necessary </w:t>
+      </w:r>
+      <w:r>
+        <w:t xml:space="preserve">for companies </w:t>
+      </w:r>
+      <w:r>
+        <w:t xml:space="preserve">to have </w:t>
+      </w:r>
+      <w:r>
+        <w:t>proper alert systems</w:t>
+      </w:r>
+      <w:r>
+        <w:t xml:space="preserve"> in place. </w:t>
+      </w:r>
+    </w:p>
+    <w:p>
+      <w:r>
+        <w:t xml:space="preserve">The developers </w:t>
+      </w:r>
+      <w:r>
+        <w:t xml:space="preserve">responsible for keeping the software up and running </w:t>
+      </w:r>
+      <w:r>
+        <w:t>are automatically paged or sent a message as soon as the system starts reporting anomalous values</w:t>
+      </w:r>
+      <w:r>
+        <w:t>. An example of problems a software application might face when running:</w:t>
+      </w:r>
+    </w:p>
+    <w:p>
+      <w:pPr>
+        <w:pStyle w:val="Odstavecseseznamem"/>
+        <w:numPr>
+          <w:ilvl w:val="0"/>
+          <w:numId w:val="26"/>
+        </w:numPr>
+      </w:pPr>
+      <w:r>
+        <w:t>Critical errors stop code execution</w:t>
+      </w:r>
+    </w:p>
+    <w:p>
+      <w:pPr>
+        <w:pStyle w:val="Odstavecseseznamem"/>
+        <w:numPr>
+          <w:ilvl w:val="0"/>
+          <w:numId w:val="26"/>
+        </w:numPr>
+      </w:pPr>
+      <w:r>
+        <w:t>Output values are not as expected</w:t>
+      </w:r>
+    </w:p>
+    <w:p>
+      <w:pPr>
+        <w:pStyle w:val="Odstavecseseznamem"/>
+        <w:numPr>
+          <w:ilvl w:val="0"/>
+          <w:numId w:val="26"/>
+        </w:numPr>
+      </w:pPr>
+      <w:r>
+        <w:t>L</w:t>
+      </w:r>
+      <w:r>
+        <w:t xml:space="preserve">oad </w:t>
+      </w:r>
+      <w:r>
+        <w:t xml:space="preserve">placed on the infrastructure is </w:t>
+      </w:r>
+      <w:r>
+        <w:t>too high</w:t>
+      </w:r>
+    </w:p>
+    <w:p>
+      <w:pPr>
+        <w:pStyle w:val="Odstavecseseznamem"/>
+        <w:numPr>
+          <w:ilvl w:val="0"/>
+          <w:numId w:val="26"/>
+        </w:numPr>
+      </w:pPr>
+      <w:r>
+        <w:t>S</w:t>
+      </w:r>
+      <w:r>
+        <w:t>ervers stop responding</w:t>
+      </w:r>
+    </w:p>
+    <w:p>
+      <w:pPr>
+        <w:pStyle w:val="Odstavecseseznamem"/>
+        <w:numPr>
+          <w:ilvl w:val="0"/>
+          <w:numId w:val="26"/>
+        </w:numPr>
+      </w:pPr>
+      <w:r>
+        <w:t>W</w:t>
+      </w:r>
+      <w:r>
+        <w:t>ebsite is unreachable</w:t>
+      </w:r>
+    </w:p>
+    <w:p>
       <w:pPr>
         <w:pStyle w:val="Nadpis2"/>
       </w:pPr>
@@ -3705,12 +3952,14 @@
       </w:r>
       <w:bookmarkEnd w:id="9"/>
     </w:p>
+    <w:p/>
     <w:p>
       <w:pPr>
         <w:pStyle w:val="Nadpis3"/>
       </w:pPr>
       <w:bookmarkStart w:id="10" w:name="_Toc222408002"/>
       <w:r>
+        <w:lastRenderedPageBreak/>
         <w:t>JSON</w:t>
       </w:r>
       <w:bookmarkEnd w:id="10"/>
@@ -3854,7 +4103,6 @@
         <w:pStyle w:val="Nadpis3"/>
       </w:pPr>
       <w:r>
-        <w:lastRenderedPageBreak/>
         <w:tab/>
       </w:r>
       <w:bookmarkStart w:id="23" w:name="_Toc222408015"/>
@@ -4949,6 +5197,118 @@
     </w:lvl>
   </w:abstractNum>
   <w:abstractNum w:abstractNumId="6" w15:restartNumberingAfterBreak="0">
+    <w:nsid w:val="25F44B3F"/>
+    <w:multiLevelType w:val="hybridMultilevel"/>
+    <w:tmpl w:val="C44293AC"/>
+    <w:lvl w:ilvl="0" w:tplc="5046E610">
+      <w:numFmt w:val="bullet"/>
+      <w:lvlText w:val="-"/>
+      <w:lvlJc w:val="left"/>
+      <w:pPr>
+        <w:ind w:left="1080" w:hanging="360"/>
+      </w:pPr>
+      <w:rPr>
+        <w:rFonts w:ascii="Georgia" w:eastAsiaTheme="minorHAnsi" w:hAnsi="Georgia" w:cstheme="minorBidi" w:hint="default"/>
+      </w:rPr>
+    </w:lvl>
+    <w:lvl w:ilvl="1" w:tplc="04050003" w:tentative="1">
+      <w:start w:val="1"/>
+      <w:numFmt w:val="bullet"/>
+      <w:lvlText w:val="o"/>
+      <w:lvlJc w:val="left"/>
+      <w:pPr>
+        <w:ind w:left="1800" w:hanging="360"/>
+      </w:pPr>
+      <w:rPr>
+        <w:rFonts w:ascii="Courier New" w:hAnsi="Courier New" w:cs="Courier New" w:hint="default"/>
+      </w:rPr>
+    </w:lvl>
+    <w:lvl w:ilvl="2" w:tplc="04050005" w:tentative="1">
+      <w:start w:val="1"/>
+      <w:numFmt w:val="bullet"/>
+      <w:lvlText w:val=""/>
+      <w:lvlJc w:val="left"/>
+      <w:pPr>
+        <w:ind w:left="2520" w:hanging="360"/>
+      </w:pPr>
+      <w:rPr>
+        <w:rFonts w:ascii="Wingdings" w:hAnsi="Wingdings" w:hint="default"/>
+      </w:rPr>
+    </w:lvl>
+    <w:lvl w:ilvl="3" w:tplc="04050001" w:tentative="1">
+      <w:start w:val="1"/>
+      <w:numFmt w:val="bullet"/>
+      <w:lvlText w:val=""/>
+      <w:lvlJc w:val="left"/>
+      <w:pPr>
+        <w:ind w:left="3240" w:hanging="360"/>
+      </w:pPr>
+      <w:rPr>
+        <w:rFonts w:ascii="Symbol" w:hAnsi="Symbol" w:hint="default"/>
+      </w:rPr>
+    </w:lvl>
+    <w:lvl w:ilvl="4" w:tplc="04050003" w:tentative="1">
+      <w:start w:val="1"/>
+      <w:numFmt w:val="bullet"/>
+      <w:lvlText w:val="o"/>
+      <w:lvlJc w:val="left"/>
+      <w:pPr>
+        <w:ind w:left="3960" w:hanging="360"/>
+      </w:pPr>
+      <w:rPr>
+        <w:rFonts w:ascii="Courier New" w:hAnsi="Courier New" w:cs="Courier New" w:hint="default"/>
+      </w:rPr>
+    </w:lvl>
+    <w:lvl w:ilvl="5" w:tplc="04050005" w:tentative="1">
+      <w:start w:val="1"/>
+      <w:numFmt w:val="bullet"/>
+      <w:lvlText w:val=""/>
+      <w:lvlJc w:val="left"/>
+      <w:pPr>
+        <w:ind w:left="4680" w:hanging="360"/>
+      </w:pPr>
+      <w:rPr>
+        <w:rFonts w:ascii="Wingdings" w:hAnsi="Wingdings" w:hint="default"/>
+      </w:rPr>
+    </w:lvl>
+    <w:lvl w:ilvl="6" w:tplc="04050001" w:tentative="1">
+      <w:start w:val="1"/>
+      <w:numFmt w:val="bullet"/>
+      <w:lvlText w:val=""/>
+      <w:lvlJc w:val="left"/>
+      <w:pPr>
+        <w:ind w:left="5400" w:hanging="360"/>
+      </w:pPr>
+      <w:rPr>
+        <w:rFonts w:ascii="Symbol" w:hAnsi="Symbol" w:hint="default"/>
+      </w:rPr>
+    </w:lvl>
+    <w:lvl w:ilvl="7" w:tplc="04050003" w:tentative="1">
+      <w:start w:val="1"/>
+      <w:numFmt w:val="bullet"/>
+      <w:lvlText w:val="o"/>
+      <w:lvlJc w:val="left"/>
+      <w:pPr>
+        <w:ind w:left="6120" w:hanging="360"/>
+      </w:pPr>
+      <w:rPr>
+        <w:rFonts w:ascii="Courier New" w:hAnsi="Courier New" w:cs="Courier New" w:hint="default"/>
+      </w:rPr>
+    </w:lvl>
+    <w:lvl w:ilvl="8" w:tplc="04050005" w:tentative="1">
+      <w:start w:val="1"/>
+      <w:numFmt w:val="bullet"/>
+      <w:lvlText w:val=""/>
+      <w:lvlJc w:val="left"/>
+      <w:pPr>
+        <w:ind w:left="6840" w:hanging="360"/>
+      </w:pPr>
+      <w:rPr>
+        <w:rFonts w:ascii="Wingdings" w:hAnsi="Wingdings" w:hint="default"/>
+      </w:rPr>
+    </w:lvl>
+  </w:abstractNum>
+  <w:abstractNum w:abstractNumId="7" w15:restartNumberingAfterBreak="0">
     <w:nsid w:val="28AC0914"/>
     <w:multiLevelType w:val="hybridMultilevel"/>
     <w:tmpl w:val="7E66A68C"/>
@@ -5061,7 +5421,7 @@
       </w:rPr>
     </w:lvl>
   </w:abstractNum>
-  <w:abstractNum w:abstractNumId="7" w15:restartNumberingAfterBreak="0">
+  <w:abstractNum w:abstractNumId="8" w15:restartNumberingAfterBreak="0">
     <w:nsid w:val="2A5E20FB"/>
     <w:multiLevelType w:val="hybridMultilevel"/>
     <w:tmpl w:val="4798295C"/>
@@ -5174,7 +5534,7 @@
       </w:rPr>
     </w:lvl>
   </w:abstractNum>
-  <w:abstractNum w:abstractNumId="8" w15:restartNumberingAfterBreak="0">
+  <w:abstractNum w:abstractNumId="9" w15:restartNumberingAfterBreak="0">
     <w:nsid w:val="2E9C55DE"/>
     <w:multiLevelType w:val="hybridMultilevel"/>
     <w:tmpl w:val="D3AE6432"/>
@@ -5286,7 +5646,7 @@
       </w:rPr>
     </w:lvl>
   </w:abstractNum>
-  <w:abstractNum w:abstractNumId="9" w15:restartNumberingAfterBreak="0">
+  <w:abstractNum w:abstractNumId="10" w15:restartNumberingAfterBreak="0">
     <w:nsid w:val="324A72F7"/>
     <w:multiLevelType w:val="hybridMultilevel"/>
     <w:tmpl w:val="819EF9EE"/>
@@ -5399,7 +5759,7 @@
       </w:rPr>
     </w:lvl>
   </w:abstractNum>
-  <w:abstractNum w:abstractNumId="10" w15:restartNumberingAfterBreak="0">
+  <w:abstractNum w:abstractNumId="11" w15:restartNumberingAfterBreak="0">
     <w:nsid w:val="36093E53"/>
     <w:multiLevelType w:val="hybridMultilevel"/>
     <w:tmpl w:val="B0DC7B9C"/>
@@ -5511,7 +5871,7 @@
       </w:rPr>
     </w:lvl>
   </w:abstractNum>
-  <w:abstractNum w:abstractNumId="11" w15:restartNumberingAfterBreak="0">
+  <w:abstractNum w:abstractNumId="12" w15:restartNumberingAfterBreak="0">
     <w:nsid w:val="39953D46"/>
     <w:multiLevelType w:val="hybridMultilevel"/>
     <w:tmpl w:val="DD0CC1C8"/>
@@ -5624,7 +5984,7 @@
       </w:rPr>
     </w:lvl>
   </w:abstractNum>
-  <w:abstractNum w:abstractNumId="12" w15:restartNumberingAfterBreak="0">
+  <w:abstractNum w:abstractNumId="13" w15:restartNumberingAfterBreak="0">
     <w:nsid w:val="3A297E0E"/>
     <w:multiLevelType w:val="hybridMultilevel"/>
     <w:tmpl w:val="6F187ADE"/>
@@ -5737,7 +6097,7 @@
       </w:rPr>
     </w:lvl>
   </w:abstractNum>
-  <w:abstractNum w:abstractNumId="13" w15:restartNumberingAfterBreak="0">
+  <w:abstractNum w:abstractNumId="14" w15:restartNumberingAfterBreak="0">
     <w:nsid w:val="3F1C639D"/>
     <w:multiLevelType w:val="hybridMultilevel"/>
     <w:tmpl w:val="0EB23D7A"/>
@@ -5850,7 +6210,7 @@
       </w:rPr>
     </w:lvl>
   </w:abstractNum>
-  <w:abstractNum w:abstractNumId="14" w15:restartNumberingAfterBreak="0">
+  <w:abstractNum w:abstractNumId="15" w15:restartNumberingAfterBreak="0">
     <w:nsid w:val="3F764A25"/>
     <w:multiLevelType w:val="hybridMultilevel"/>
     <w:tmpl w:val="71E60104"/>
@@ -5962,7 +6322,7 @@
       </w:rPr>
     </w:lvl>
   </w:abstractNum>
-  <w:abstractNum w:abstractNumId="15" w15:restartNumberingAfterBreak="0">
+  <w:abstractNum w:abstractNumId="16" w15:restartNumberingAfterBreak="0">
     <w:nsid w:val="49A61E05"/>
     <w:multiLevelType w:val="multilevel"/>
     <w:tmpl w:val="68C8236A"/>
@@ -6077,7 +6437,7 @@
       </w:rPr>
     </w:lvl>
   </w:abstractNum>
-  <w:abstractNum w:abstractNumId="16" w15:restartNumberingAfterBreak="0">
+  <w:abstractNum w:abstractNumId="17" w15:restartNumberingAfterBreak="0">
     <w:nsid w:val="49E360DC"/>
     <w:multiLevelType w:val="hybridMultilevel"/>
     <w:tmpl w:val="650299C4"/>
@@ -6163,7 +6523,7 @@
       </w:pPr>
     </w:lvl>
   </w:abstractNum>
-  <w:abstractNum w:abstractNumId="17" w15:restartNumberingAfterBreak="0">
+  <w:abstractNum w:abstractNumId="18" w15:restartNumberingAfterBreak="0">
     <w:nsid w:val="5A6B816F"/>
     <w:multiLevelType w:val="hybridMultilevel"/>
     <w:tmpl w:val="8674763E"/>
@@ -6277,7 +6637,7 @@
       </w:rPr>
     </w:lvl>
   </w:abstractNum>
-  <w:abstractNum w:abstractNumId="18" w15:restartNumberingAfterBreak="0">
+  <w:abstractNum w:abstractNumId="19" w15:restartNumberingAfterBreak="0">
     <w:nsid w:val="5DBC5132"/>
     <w:multiLevelType w:val="hybridMultilevel"/>
     <w:tmpl w:val="782EE7CA"/>
@@ -6390,7 +6750,7 @@
       </w:rPr>
     </w:lvl>
   </w:abstractNum>
-  <w:abstractNum w:abstractNumId="19" w15:restartNumberingAfterBreak="0">
+  <w:abstractNum w:abstractNumId="20" w15:restartNumberingAfterBreak="0">
     <w:nsid w:val="631F5680"/>
     <w:multiLevelType w:val="multilevel"/>
     <w:tmpl w:val="F08CAB9E"/>
@@ -6503,7 +6863,7 @@
       </w:rPr>
     </w:lvl>
   </w:abstractNum>
-  <w:abstractNum w:abstractNumId="20" w15:restartNumberingAfterBreak="0">
+  <w:abstractNum w:abstractNumId="21" w15:restartNumberingAfterBreak="0">
     <w:nsid w:val="64560340"/>
     <w:multiLevelType w:val="hybridMultilevel"/>
     <w:tmpl w:val="A224F0FC"/>
@@ -6616,7 +6976,119 @@
       </w:rPr>
     </w:lvl>
   </w:abstractNum>
-  <w:abstractNum w:abstractNumId="21" w15:restartNumberingAfterBreak="0">
+  <w:abstractNum w:abstractNumId="22" w15:restartNumberingAfterBreak="0">
+    <w:nsid w:val="66081024"/>
+    <w:multiLevelType w:val="hybridMultilevel"/>
+    <w:tmpl w:val="A9662508"/>
+    <w:lvl w:ilvl="0" w:tplc="5046E610">
+      <w:numFmt w:val="bullet"/>
+      <w:lvlText w:val="-"/>
+      <w:lvlJc w:val="left"/>
+      <w:pPr>
+        <w:ind w:left="720" w:hanging="360"/>
+      </w:pPr>
+      <w:rPr>
+        <w:rFonts w:ascii="Georgia" w:eastAsiaTheme="minorHAnsi" w:hAnsi="Georgia" w:cstheme="minorBidi" w:hint="default"/>
+      </w:rPr>
+    </w:lvl>
+    <w:lvl w:ilvl="1" w:tplc="04050003" w:tentative="1">
+      <w:start w:val="1"/>
+      <w:numFmt w:val="bullet"/>
+      <w:lvlText w:val="o"/>
+      <w:lvlJc w:val="left"/>
+      <w:pPr>
+        <w:ind w:left="1440" w:hanging="360"/>
+      </w:pPr>
+      <w:rPr>
+        <w:rFonts w:ascii="Courier New" w:hAnsi="Courier New" w:cs="Courier New" w:hint="default"/>
+      </w:rPr>
+    </w:lvl>
+    <w:lvl w:ilvl="2" w:tplc="04050005" w:tentative="1">
+      <w:start w:val="1"/>
+      <w:numFmt w:val="bullet"/>
+      <w:lvlText w:val=""/>
+      <w:lvlJc w:val="left"/>
+      <w:pPr>
+        <w:ind w:left="2160" w:hanging="360"/>
+      </w:pPr>
+      <w:rPr>
+        <w:rFonts w:ascii="Wingdings" w:hAnsi="Wingdings" w:hint="default"/>
+      </w:rPr>
+    </w:lvl>
+    <w:lvl w:ilvl="3" w:tplc="04050001" w:tentative="1">
+      <w:start w:val="1"/>
+      <w:numFmt w:val="bullet"/>
+      <w:lvlText w:val=""/>
+      <w:lvlJc w:val="left"/>
+      <w:pPr>
+        <w:ind w:left="2880" w:hanging="360"/>
+      </w:pPr>
+      <w:rPr>
+        <w:rFonts w:ascii="Symbol" w:hAnsi="Symbol" w:hint="default"/>
+      </w:rPr>
+    </w:lvl>
+    <w:lvl w:ilvl="4" w:tplc="04050003" w:tentative="1">
+      <w:start w:val="1"/>
+      <w:numFmt w:val="bullet"/>
+      <w:lvlText w:val="o"/>
+      <w:lvlJc w:val="left"/>
+      <w:pPr>
+        <w:ind w:left="3600" w:hanging="360"/>
+      </w:pPr>
+      <w:rPr>
+        <w:rFonts w:ascii="Courier New" w:hAnsi="Courier New" w:cs="Courier New" w:hint="default"/>
+      </w:rPr>
+    </w:lvl>
+    <w:lvl w:ilvl="5" w:tplc="04050005" w:tentative="1">
+      <w:start w:val="1"/>
+      <w:numFmt w:val="bullet"/>
+      <w:lvlText w:val=""/>
+      <w:lvlJc w:val="left"/>
+      <w:pPr>
+        <w:ind w:left="4320" w:hanging="360"/>
+      </w:pPr>
+      <w:rPr>
+        <w:rFonts w:ascii="Wingdings" w:hAnsi="Wingdings" w:hint="default"/>
+      </w:rPr>
+    </w:lvl>
+    <w:lvl w:ilvl="6" w:tplc="04050001" w:tentative="1">
+      <w:start w:val="1"/>
+      <w:numFmt w:val="bullet"/>
+      <w:lvlText w:val=""/>
+      <w:lvlJc w:val="left"/>
+      <w:pPr>
+        <w:ind w:left="5040" w:hanging="360"/>
+      </w:pPr>
+      <w:rPr>
+        <w:rFonts w:ascii="Symbol" w:hAnsi="Symbol" w:hint="default"/>
+      </w:rPr>
+    </w:lvl>
+    <w:lvl w:ilvl="7" w:tplc="04050003" w:tentative="1">
+      <w:start w:val="1"/>
+      <w:numFmt w:val="bullet"/>
+      <w:lvlText w:val="o"/>
+      <w:lvlJc w:val="left"/>
+      <w:pPr>
+        <w:ind w:left="5760" w:hanging="360"/>
+      </w:pPr>
+      <w:rPr>
+        <w:rFonts w:ascii="Courier New" w:hAnsi="Courier New" w:cs="Courier New" w:hint="default"/>
+      </w:rPr>
+    </w:lvl>
+    <w:lvl w:ilvl="8" w:tplc="04050005" w:tentative="1">
+      <w:start w:val="1"/>
+      <w:numFmt w:val="bullet"/>
+      <w:lvlText w:val=""/>
+      <w:lvlJc w:val="left"/>
+      <w:pPr>
+        <w:ind w:left="6480" w:hanging="360"/>
+      </w:pPr>
+      <w:rPr>
+        <w:rFonts w:ascii="Wingdings" w:hAnsi="Wingdings" w:hint="default"/>
+      </w:rPr>
+    </w:lvl>
+  </w:abstractNum>
+  <w:abstractNum w:abstractNumId="23" w15:restartNumberingAfterBreak="0">
     <w:nsid w:val="6AA21E91"/>
     <w:multiLevelType w:val="multilevel"/>
     <w:tmpl w:val="FFFA9DB4"/>
@@ -6741,7 +7213,120 @@
       </w:rPr>
     </w:lvl>
   </w:abstractNum>
-  <w:abstractNum w:abstractNumId="22" w15:restartNumberingAfterBreak="0">
+  <w:abstractNum w:abstractNumId="24" w15:restartNumberingAfterBreak="0">
+    <w:nsid w:val="6C4D14B0"/>
+    <w:multiLevelType w:val="hybridMultilevel"/>
+    <w:tmpl w:val="38824C30"/>
+    <w:lvl w:ilvl="0" w:tplc="04050001">
+      <w:start w:val="1"/>
+      <w:numFmt w:val="bullet"/>
+      <w:lvlText w:val=""/>
+      <w:lvlJc w:val="left"/>
+      <w:pPr>
+        <w:ind w:left="1080" w:hanging="360"/>
+      </w:pPr>
+      <w:rPr>
+        <w:rFonts w:ascii="Symbol" w:hAnsi="Symbol" w:hint="default"/>
+      </w:rPr>
+    </w:lvl>
+    <w:lvl w:ilvl="1" w:tplc="FFFFFFFF" w:tentative="1">
+      <w:start w:val="1"/>
+      <w:numFmt w:val="bullet"/>
+      <w:lvlText w:val="o"/>
+      <w:lvlJc w:val="left"/>
+      <w:pPr>
+        <w:ind w:left="1800" w:hanging="360"/>
+      </w:pPr>
+      <w:rPr>
+        <w:rFonts w:ascii="Courier New" w:hAnsi="Courier New" w:cs="Courier New" w:hint="default"/>
+      </w:rPr>
+    </w:lvl>
+    <w:lvl w:ilvl="2" w:tplc="FFFFFFFF" w:tentative="1">
+      <w:start w:val="1"/>
+      <w:numFmt w:val="bullet"/>
+      <w:lvlText w:val=""/>
+      <w:lvlJc w:val="left"/>
+      <w:pPr>
+        <w:ind w:left="2520" w:hanging="360"/>
+      </w:pPr>
+      <w:rPr>
+        <w:rFonts w:ascii="Wingdings" w:hAnsi="Wingdings" w:hint="default"/>
+      </w:rPr>
+    </w:lvl>
+    <w:lvl w:ilvl="3" w:tplc="FFFFFFFF" w:tentative="1">
+      <w:start w:val="1"/>
+      <w:numFmt w:val="bullet"/>
+      <w:lvlText w:val=""/>
+      <w:lvlJc w:val="left"/>
+      <w:pPr>
+        <w:ind w:left="3240" w:hanging="360"/>
+      </w:pPr>
+      <w:rPr>
+        <w:rFonts w:ascii="Symbol" w:hAnsi="Symbol" w:hint="default"/>
+      </w:rPr>
+    </w:lvl>
+    <w:lvl w:ilvl="4" w:tplc="FFFFFFFF" w:tentative="1">
+      <w:start w:val="1"/>
+      <w:numFmt w:val="bullet"/>
+      <w:lvlText w:val="o"/>
+      <w:lvlJc w:val="left"/>
+      <w:pPr>
+        <w:ind w:left="3960" w:hanging="360"/>
+      </w:pPr>
+      <w:rPr>
+        <w:rFonts w:ascii="Courier New" w:hAnsi="Courier New" w:cs="Courier New" w:hint="default"/>
+      </w:rPr>
+    </w:lvl>
+    <w:lvl w:ilvl="5" w:tplc="FFFFFFFF" w:tentative="1">
+      <w:start w:val="1"/>
+      <w:numFmt w:val="bullet"/>
+      <w:lvlText w:val=""/>
+      <w:lvlJc w:val="left"/>
+      <w:pPr>
+        <w:ind w:left="4680" w:hanging="360"/>
+      </w:pPr>
+      <w:rPr>
+        <w:rFonts w:ascii="Wingdings" w:hAnsi="Wingdings" w:hint="default"/>
+      </w:rPr>
+    </w:lvl>
+    <w:lvl w:ilvl="6" w:tplc="FFFFFFFF" w:tentative="1">
+      <w:start w:val="1"/>
+      <w:numFmt w:val="bullet"/>
+      <w:lvlText w:val=""/>
+      <w:lvlJc w:val="left"/>
+      <w:pPr>
+        <w:ind w:left="5400" w:hanging="360"/>
+      </w:pPr>
+      <w:rPr>
+        <w:rFonts w:ascii="Symbol" w:hAnsi="Symbol" w:hint="default"/>
+      </w:rPr>
+    </w:lvl>
+    <w:lvl w:ilvl="7" w:tplc="FFFFFFFF" w:tentative="1">
+      <w:start w:val="1"/>
+      <w:numFmt w:val="bullet"/>
+      <w:lvlText w:val="o"/>
+      <w:lvlJc w:val="left"/>
+      <w:pPr>
+        <w:ind w:left="6120" w:hanging="360"/>
+      </w:pPr>
+      <w:rPr>
+        <w:rFonts w:ascii="Courier New" w:hAnsi="Courier New" w:cs="Courier New" w:hint="default"/>
+      </w:rPr>
+    </w:lvl>
+    <w:lvl w:ilvl="8" w:tplc="FFFFFFFF" w:tentative="1">
+      <w:start w:val="1"/>
+      <w:numFmt w:val="bullet"/>
+      <w:lvlText w:val=""/>
+      <w:lvlJc w:val="left"/>
+      <w:pPr>
+        <w:ind w:left="6840" w:hanging="360"/>
+      </w:pPr>
+      <w:rPr>
+        <w:rFonts w:ascii="Wingdings" w:hAnsi="Wingdings" w:hint="default"/>
+      </w:rPr>
+    </w:lvl>
+  </w:abstractNum>
+  <w:abstractNum w:abstractNumId="25" w15:restartNumberingAfterBreak="0">
     <w:nsid w:val="776F1C4E"/>
     <w:multiLevelType w:val="hybridMultilevel"/>
     <w:tmpl w:val="79BED6E8"/>
@@ -6855,28 +7440,28 @@
     </w:lvl>
   </w:abstractNum>
   <w:num w:numId="1" w16cid:durableId="944732855">
-    <w:abstractNumId w:val="21"/>
+    <w:abstractNumId w:val="23"/>
   </w:num>
   <w:num w:numId="2" w16cid:durableId="136922467">
-    <w:abstractNumId w:val="19"/>
+    <w:abstractNumId w:val="20"/>
   </w:num>
   <w:num w:numId="3" w16cid:durableId="1191992487">
+    <w:abstractNumId w:val="16"/>
+  </w:num>
+  <w:num w:numId="4" w16cid:durableId="1589192832">
     <w:abstractNumId w:val="15"/>
   </w:num>
-  <w:num w:numId="4" w16cid:durableId="1589192832">
+  <w:num w:numId="5" w16cid:durableId="562180158">
     <w:abstractNumId w:val="14"/>
   </w:num>
-  <w:num w:numId="5" w16cid:durableId="562180158">
-    <w:abstractNumId w:val="13"/>
-  </w:num>
   <w:num w:numId="6" w16cid:durableId="1181777835">
-    <w:abstractNumId w:val="16"/>
+    <w:abstractNumId w:val="17"/>
   </w:num>
   <w:num w:numId="7" w16cid:durableId="418911056">
-    <w:abstractNumId w:val="22"/>
+    <w:abstractNumId w:val="25"/>
   </w:num>
   <w:num w:numId="8" w16cid:durableId="1196117197">
-    <w:abstractNumId w:val="8"/>
+    <w:abstractNumId w:val="9"/>
   </w:num>
   <w:num w:numId="9" w16cid:durableId="722606638">
     <w:abstractNumId w:val="5"/>
@@ -6885,31 +7470,31 @@
     <w:abstractNumId w:val="2"/>
   </w:num>
   <w:num w:numId="11" w16cid:durableId="66197232">
-    <w:abstractNumId w:val="12"/>
+    <w:abstractNumId w:val="13"/>
   </w:num>
   <w:num w:numId="12" w16cid:durableId="54087011">
-    <w:abstractNumId w:val="20"/>
+    <w:abstractNumId w:val="21"/>
   </w:num>
   <w:num w:numId="13" w16cid:durableId="1495760012">
     <w:abstractNumId w:val="1"/>
   </w:num>
   <w:num w:numId="14" w16cid:durableId="1716347460">
-    <w:abstractNumId w:val="9"/>
+    <w:abstractNumId w:val="10"/>
   </w:num>
   <w:num w:numId="15" w16cid:durableId="1837114021">
     <w:abstractNumId w:val="3"/>
   </w:num>
   <w:num w:numId="16" w16cid:durableId="1523863412">
-    <w:abstractNumId w:val="11"/>
+    <w:abstractNumId w:val="12"/>
   </w:num>
   <w:num w:numId="17" w16cid:durableId="1214536231">
-    <w:abstractNumId w:val="17"/>
+    <w:abstractNumId w:val="18"/>
   </w:num>
   <w:num w:numId="18" w16cid:durableId="483859003">
-    <w:abstractNumId w:val="18"/>
+    <w:abstractNumId w:val="19"/>
   </w:num>
   <w:num w:numId="19" w16cid:durableId="57439879">
-    <w:abstractNumId w:val="6"/>
+    <w:abstractNumId w:val="7"/>
   </w:num>
   <w:num w:numId="20" w16cid:durableId="1958826030">
     <w:abstractNumId w:val="4"/>
@@ -6918,10 +7503,19 @@
     <w:abstractNumId w:val="0"/>
   </w:num>
   <w:num w:numId="22" w16cid:durableId="637537357">
-    <w:abstractNumId w:val="10"/>
+    <w:abstractNumId w:val="11"/>
   </w:num>
   <w:num w:numId="23" w16cid:durableId="63140882">
-    <w:abstractNumId w:val="7"/>
+    <w:abstractNumId w:val="8"/>
+  </w:num>
+  <w:num w:numId="24" w16cid:durableId="1632202433">
+    <w:abstractNumId w:val="22"/>
+  </w:num>
+  <w:num w:numId="25" w16cid:durableId="584460224">
+    <w:abstractNumId w:val="6"/>
+  </w:num>
+  <w:num w:numId="26" w16cid:durableId="1696954710">
+    <w:abstractNumId w:val="24"/>
   </w:num>
 </w:numbering>
 </file>

</xml_diff>

<commit_message>
Hourly snapshot: 14:12 26/03/11
</commit_message>
<xml_diff>
--- a/mitterpach_bp_en.docx
+++ b/mitterpach_bp_en.docx
@@ -506,24 +506,12 @@
     </w:p>
     <w:p>
       <w:r>
-        <w:t xml:space="preserve">The practical part details the creation of application for the collection of software reports in varying formats, their translation and output in one common language. It contains the requirements for the application, high-level system design, discussion of the implementation and deployment, as well as robust End to </w:t>
-      </w:r>
-      <w:r>
-        <w:t>End</w:t>
-      </w:r>
-      <w:r>
-        <w:t xml:space="preserve"> and unit testing.</w:t>
-      </w:r>
-    </w:p>
-    <w:p>
-      <w:r>
-        <w:t xml:space="preserve">The outcome of this work is a fully functioning and deployed open-source application, thoroughly documented, as well as </w:t>
-      </w:r>
-      <w:r>
-        <w:t>supporting</w:t>
-      </w:r>
-      <w:r>
-        <w:t xml:space="preserve"> infrastructure for automated CI/CD building, testing and deployment.</w:t>
+        <w:t>The practical part details the creation of application for the collection of software reports in varying formats, their translation and output in one common language. It contains the requirements for the application, high-level system design, discussion of the implementation and deployment, as well as robust End to End and unit testing.</w:t>
+      </w:r>
+    </w:p>
+    <w:p>
+      <w:r>
+        <w:t>The outcome of this work is a fully functioning and deployed open-source application, thoroughly documented, as well as supporting infrastructure for automated CI/CD building, testing and deployment.</w:t>
       </w:r>
     </w:p>
     <w:p>
@@ -548,13 +536,7 @@
     </w:p>
     <w:p>
       <w:r>
-        <w:t xml:space="preserve">Observability; </w:t>
-      </w:r>
-      <w:r>
-        <w:t xml:space="preserve">DevOps; </w:t>
-      </w:r>
-      <w:r>
-        <w:t>Monitoring; Logging; Web Application; Open Source; Flask</w:t>
+        <w:t>Observability; DevOps; Monitoring; Logging; Web Application; Open Source; Flask</w:t>
       </w:r>
     </w:p>
     <w:sdt>
@@ -3571,11 +3553,6 @@
     </w:p>
     <w:p>
       <w:r>
-        <w:t>GOES TOO FAST INTO VIRTUALIZATION, NEEDS INTRODUCTION</w:t>
-      </w:r>
-    </w:p>
-    <w:p>
-      <w:r>
         <w:t xml:space="preserve">Many software projects utilize </w:t>
       </w:r>
       <w:r>
@@ -3794,17 +3771,24 @@
     </w:p>
     <w:p>
       <w:r>
-        <w:t xml:space="preserve">Monitoring is the process of gathering application front-end or back-end measurement data to diagnose, prevent or recover from application errors. (Tamburri, 2020) During this process, the application itself or programs associated with the application observe, collect and send data that describes how the application is running. </w:t>
-      </w:r>
-    </w:p>
-    <w:p>
-      <w:r>
-        <w:t xml:space="preserve">This monitoring can include everything from logs of unrecoverable catastrophic errors to day-to-day ordinary traces that detail regular code execution. As such, logs are usually assigned severity levels. In the mostly commonly used scheme, the severity </w:t>
-      </w:r>
-    </w:p>
-    <w:p>
-      <w:r>
-        <w:t xml:space="preserve">Traces or logs are pieces of text that detail the current state of the system, such as the current working state of the application - values of variables, thread count and load currently placed upon the application. </w:t>
+        <w:t>Monitoring is the process of gathering application measurement data to diagnose, prevent or recover from application errors. (Tamburri, 2020) During this process, the application itself or programs associated with the application observe, collect and send data that describe how the application is running</w:t>
+      </w:r>
+      <w:r>
+        <w:t>, this data being called logs</w:t>
+      </w:r>
+      <w:r>
+        <w:t xml:space="preserve">. </w:t>
+      </w:r>
+    </w:p>
+    <w:p>
+      <w:r>
+        <w:t xml:space="preserve">Logs (or traces) </w:t>
+      </w:r>
+      <w:r>
+        <w:t xml:space="preserve">are pieces of text that detail the current state of the system, such as the current working state of the application - values of variables, thread count and load currently placed upon the application. </w:t>
+      </w:r>
+      <w:r>
+        <w:t xml:space="preserve">The specific format of the logs depends on the application itself and can vary greatly based on use and specific concerns of the developers. </w:t>
       </w:r>
     </w:p>
     <w:p>
@@ -3815,53 +3799,17 @@
         <w:t>?</w:t>
       </w:r>
       <w:r>
-        <w:t xml:space="preserve"> Such crashes can be catastrophic for business - an e-shop may lose </w:t>
-      </w:r>
-      <w:r>
-        <w:t>hundreds</w:t>
-      </w:r>
-      <w:r>
-        <w:t xml:space="preserve"> of thousands in revenue for every minute it is offline and unavailable to its customers. As such, it is essential to get the business up and running as soon as possible, which requires the developer to figure out what is wrong with the current system and how to fix it. For this diagnostic, logs are irreplaceable and very often offer the first clues for the fix.</w:t>
-      </w:r>
-    </w:p>
-    <w:p>
-      <w:r>
-        <w:t xml:space="preserve">Monitoring also </w:t>
-      </w:r>
-      <w:r>
-        <w:t>allows</w:t>
-      </w:r>
-      <w:r>
-        <w:t xml:space="preserve"> the business to notice anything has gone wrong. As detailed in chapter 1.2.2 Knight Capital, a company can lose half a billion dollars in an hour because of a </w:t>
-      </w:r>
-      <w:r>
-        <w:t xml:space="preserve">rudimentary </w:t>
-      </w:r>
-      <w:r>
-        <w:t xml:space="preserve">bug. To prevent such a catastrophic loss, it is necessary </w:t>
-      </w:r>
-      <w:r>
-        <w:t xml:space="preserve">for companies </w:t>
-      </w:r>
-      <w:r>
-        <w:t xml:space="preserve">to have </w:t>
-      </w:r>
-      <w:r>
-        <w:t>proper alert systems</w:t>
-      </w:r>
-      <w:r>
-        <w:t xml:space="preserve"> in place. </w:t>
-      </w:r>
-    </w:p>
-    <w:p>
-      <w:r>
-        <w:t xml:space="preserve">The developers </w:t>
-      </w:r>
-      <w:r>
-        <w:t xml:space="preserve">responsible for keeping the software up and running </w:t>
-      </w:r>
-      <w:r>
-        <w:t>are automatically paged or sent a message as soon as the system starts reporting anomalous values</w:t>
+        <w:t xml:space="preserve"> Such crashes can be catastrophic for business - an e-shop may lose hundreds of thousands in revenue for every minute it is offline and unavailable to its customers. As such, it is essential to get the business up and running as soon as possible, which requires the developer to figure out what is wrong with the current system and how to fix it. For this diagnostic, logs are irreplaceable and very often offer the first clues for the fix.</w:t>
+      </w:r>
+    </w:p>
+    <w:p>
+      <w:r>
+        <w:t xml:space="preserve">Monitoring also allows the business to notice anything has gone wrong. As detailed in chapter 1.2.2 Knight Capital, a company can lose half a billion dollars in an hour because of a rudimentary bug. To prevent such a catastrophic loss, it is necessary for companies to have proper alert systems in place. </w:t>
+      </w:r>
+    </w:p>
+    <w:p>
+      <w:r>
+        <w:t>The developers responsible for keeping the software up and running are automatically paged or sent a message as soon as the system starts reporting anomalous values</w:t>
       </w:r>
       <w:r>
         <w:t>. An example of problems a software application might face when running:</w:t>
@@ -3888,7 +3836,7 @@
         </w:numPr>
       </w:pPr>
       <w:r>
-        <w:t>Output values are not as expected</w:t>
+        <w:t>Unexpected output values</w:t>
       </w:r>
     </w:p>
     <w:p>
@@ -3943,6 +3891,11 @@
       </w:r>
     </w:p>
     <w:p>
+      <w:r>
+        <w:t>And many more. To make sure that problems with the application are discovered as soon as possible, teams often utilize testing environments, in which the code is deployed before being given to the customers (so called production environment). To make sure that testing environment has a chance to catch problems that would’ve shown up in production environment otherwise, it is of great importance to make sure that the two are as similar as possible..</w:t>
+      </w:r>
+    </w:p>
+    <w:p>
       <w:pPr>
         <w:spacing w:after="160" w:line="259" w:lineRule="auto"/>
         <w:jc w:val="left"/>
@@ -3964,18 +3917,17 @@
     </w:p>
     <w:p>
       <w:r>
-        <w:t xml:space="preserve">As different development teams have different requirements, so too do their needs for logging differ. Some applications may require a large </w:t>
-      </w:r>
-      <w:r>
-        <w:t>number</w:t>
-      </w:r>
-      <w:r>
-        <w:t xml:space="preserve"> of logs to be processed in a short amount of time, some place large importance on the data integrity and log all actions taken by the software multiple times on multiple different places. Some teams may be locked into working with specific formats based on their software vendors, customers or due to regulations defined by the law.</w:t>
+        <w:t>As different development teams have different requirements, so too do their needs for logging differ. Some applications may require a large number of logs to be processed in a short amount of time, some place large importance on the data integrity and log all actions taken by the software multiple times on multiple different places. Some teams may be locked into working with specific formats based on their software vendors, customers or due to regulations defined by the law.</w:t>
       </w:r>
     </w:p>
     <w:p>
       <w:r>
         <w:t>For the reasons detailed above, several logging formats have emerged from the developer community. The specifics and abilities of each format can differ greatly. The following chapters detail the commonly used formats, as well as the formats for the specific reporting standards that the application developed in the practical part of this thesis standardizes.</w:t>
+      </w:r>
+    </w:p>
+    <w:p>
+      <w:r>
+        <w:t>Note that Syslog and DMARC formats will be discussed at length, as their formats are critical to the practical part of this thesis and should then be looked at in great detail.</w:t>
       </w:r>
     </w:p>
     <w:p>
@@ -4397,35 +4349,34 @@
         <w:rPr>
           <w:lang w:val="en-GB"/>
         </w:rPr>
+        <w:lastRenderedPageBreak/>
         <w:t>}</w:t>
       </w:r>
     </w:p>
     <w:p/>
     <w:p>
       <w:r>
-        <w:lastRenderedPageBreak/>
-        <w:t xml:space="preserve">JSON has </w:t>
-      </w:r>
-      <w:proofErr w:type="gramStart"/>
-      <w:r>
-        <w:t>quickly</w:t>
-      </w:r>
-      <w:proofErr w:type="gramEnd"/>
+        <w:t xml:space="preserve">JSON </w:t>
+      </w:r>
+      <w:r>
+        <w:t>has,</w:t>
+      </w:r>
       <w:r>
         <w:t xml:space="preserve"> since its inception </w:t>
       </w:r>
       <w:r>
-        <w:t xml:space="preserve">in </w:t>
-      </w:r>
-      <w:proofErr w:type="gramStart"/>
-      <w:r>
-        <w:t>1999</w:t>
-      </w:r>
-      <w:proofErr w:type="gramEnd"/>
+        <w:t>in 1999</w:t>
+      </w:r>
+      <w:r>
+        <w:t>,</w:t>
+      </w:r>
       <w:r>
         <w:t xml:space="preserve"> </w:t>
       </w:r>
       <w:r>
+        <w:t xml:space="preserve">quickly </w:t>
+      </w:r>
+      <w:r>
         <w:t xml:space="preserve">become one of the predominant formats for use in exchanging data on the Web. </w:t>
       </w:r>
       <w:r>
@@ -4448,11 +4399,9 @@
       <w:r>
         <w:t xml:space="preserve"> lead it to be unsuitable </w:t>
       </w:r>
-      <w:proofErr w:type="gramStart"/>
-      <w:r>
-        <w:t>to</w:t>
-      </w:r>
-      <w:proofErr w:type="gramEnd"/>
+      <w:r>
+        <w:t>for</w:t>
+      </w:r>
       <w:r>
         <w:t xml:space="preserve"> certain tasks</w:t>
       </w:r>
@@ -4525,7 +4474,13 @@
     </w:p>
     <w:p>
       <w:r>
-        <w:t xml:space="preserve">Despite these issues, JSON remains overall a commonly used and very attractive format for storing and representing data. Additionally, research has shown good compatibility with modern AI systems. </w:t>
+        <w:t>Despite these issues, JSON remains overall a commonly used and very attractive format for storing and representing data. Additionally, research has shown good compatibility with modern AI systems</w:t>
+      </w:r>
+      <w:r>
+        <w:t>, which may lead to even further adoption in the near future</w:t>
+      </w:r>
+      <w:r>
+        <w:t xml:space="preserve">. </w:t>
       </w:r>
       <w:r>
         <w:t>(Wei et al., 2025)</w:t>
@@ -4548,37 +4503,1787 @@
         <w:t xml:space="preserve"> and other markup languages</w:t>
       </w:r>
     </w:p>
+    <w:p>
+      <w:r>
+        <w:rPr>
+          <w:highlight w:val="yellow"/>
+        </w:rPr>
+        <w:t>SOURCES TO ZOTERO LATER</w:t>
+      </w:r>
+      <w:r>
+        <w:t>:</w:t>
+      </w:r>
+    </w:p>
+    <w:p>
+      <w:hyperlink r:id="rId16" w:anchor="v=onepage&amp;q&amp;f=false" w:history="1">
+        <w:r>
+          <w:rPr>
+            <w:rStyle w:val="Hypertextovodkaz"/>
+          </w:rPr>
+          <w:t>https://books.google.cz/books?hl=en&amp;lr=&amp;id=NBwnSfoCStAC&amp;oi=fnd&amp;pg=PR5&amp;dq=xml&amp;ots=StjqUyGVU6&amp;sig=6NDIs1CIPzydgH0ui5LK6-Mi9WA&amp;redir_esc=y#v=onepage&amp;q&amp;f=false</w:t>
+        </w:r>
+      </w:hyperlink>
+    </w:p>
+    <w:p>
+      <w:r>
+        <w:t>https://help.nintex.com/en-US/k2blackpearl/userguide/4.6.10/XML_Data_Types.html</w:t>
+      </w:r>
+    </w:p>
+    <w:p>
+      <w:r>
+        <w:t xml:space="preserve">XML, the Extensible Markup Language, is a World Wide Web Consortium endorsed standard for document markup. It defines a generic syntax used to mark up data with simple, human readable tags. It provides </w:t>
+      </w:r>
+      <w:r>
+        <w:t xml:space="preserve">a standard format for </w:t>
+      </w:r>
+      <w:r>
+        <w:t>computer documents</w:t>
+      </w:r>
+      <w:r>
+        <w:t xml:space="preserve"> that is flexible enough to be used with a variety of different topics, ranging from web sites and vector graphics to genealogy and real estate listings. (</w:t>
+      </w:r>
+      <w:r>
+        <w:t>Harold, 2004)</w:t>
+      </w:r>
+    </w:p>
+    <w:p>
+      <w:r>
+        <w:t>Data is included in XML documents as strings of text, surrounded by a text markup that describes the data. The basic unit of data and mark up is called an element, and XML is rather permissive when it comes to implementing elements – after all, the X in XML stands for extensible. Any developer can create new elements as required – genealogy requires representation of various genomes, chemistry requires elements that describe molecules, atoms, reactions.</w:t>
+      </w:r>
+    </w:p>
+    <w:p>
+      <w:r>
+        <w:lastRenderedPageBreak/>
+        <w:t xml:space="preserve">What is not extensible, however, is the grammar </w:t>
+      </w:r>
+      <w:r>
+        <w:t>ruling</w:t>
+      </w:r>
+      <w:r>
+        <w:t xml:space="preserve"> where tags may be placed, what they must look like, which element names are legal and so forth. This grammar is specific enough to allow the development of XML parsers that can read any document. </w:t>
+      </w:r>
+      <w:r>
+        <w:t xml:space="preserve">Documents which satisfy this grammar are said to be </w:t>
+      </w:r>
+      <w:r>
+        <w:rPr>
+          <w:i/>
+          <w:iCs/>
+        </w:rPr>
+        <w:t>well-formed</w:t>
+      </w:r>
+      <w:r>
+        <w:t xml:space="preserve">, and many modern editors allow for syntax checks and schema validation. </w:t>
+      </w:r>
+    </w:p>
+    <w:p>
+      <w:pPr>
+        <w:rPr>
+          <w:b/>
+          <w:bCs/>
+        </w:rPr>
+      </w:pPr>
+      <w:r>
+        <w:rPr>
+          <w:b/>
+          <w:bCs/>
+          <w:iCs/>
+          <w:lang w:val="en-GB"/>
+        </w:rPr>
+        <w:t xml:space="preserve">Code </w:t>
+      </w:r>
+      <w:r>
+        <w:rPr>
+          <w:iCs/>
+          <w:lang w:val="cs-CZ"/>
+        </w:rPr>
+        <w:fldChar w:fldCharType="begin"/>
+      </w:r>
+      <w:r>
+        <w:rPr>
+          <w:b/>
+          <w:bCs/>
+          <w:iCs/>
+          <w:lang w:val="en-GB"/>
+        </w:rPr>
+        <w:instrText xml:space="preserve"> STYLEREF 1 \s </w:instrText>
+      </w:r>
+      <w:r>
+        <w:rPr>
+          <w:iCs/>
+          <w:lang w:val="cs-CZ"/>
+        </w:rPr>
+        <w:fldChar w:fldCharType="separate"/>
+      </w:r>
+      <w:r>
+        <w:rPr>
+          <w:b/>
+          <w:bCs/>
+          <w:iCs/>
+          <w:lang w:val="en-GB"/>
+        </w:rPr>
+        <w:t>1</w:t>
+      </w:r>
+      <w:r>
+        <w:fldChar w:fldCharType="end"/>
+      </w:r>
+      <w:r>
+        <w:rPr>
+          <w:b/>
+          <w:bCs/>
+          <w:iCs/>
+          <w:lang w:val="en-GB"/>
+        </w:rPr>
+        <w:t>.</w:t>
+      </w:r>
+      <w:r>
+        <w:rPr>
+          <w:b/>
+          <w:bCs/>
+          <w:iCs/>
+          <w:lang w:val="cs-CZ"/>
+        </w:rPr>
+        <w:t>2</w:t>
+      </w:r>
+    </w:p>
+    <w:p>
+      <w:pPr>
+        <w:pStyle w:val="Titulek"/>
+        <w:rPr>
+          <w:i/>
+          <w:lang w:val="en-GB"/>
+        </w:rPr>
+      </w:pPr>
+      <w:r>
+        <w:rPr>
+          <w:i/>
+          <w:lang w:val="en-GB"/>
+        </w:rPr>
+        <w:t xml:space="preserve">An example XML document </w:t>
+      </w:r>
+      <w:r>
+        <w:rPr>
+          <w:i/>
+          <w:lang w:val="en-GB"/>
+        </w:rPr>
+        <w:t>(</w:t>
+      </w:r>
+      <w:r>
+        <w:rPr>
+          <w:i/>
+          <w:iCs w:val="0"/>
+        </w:rPr>
+        <w:t>Harold, 2004</w:t>
+      </w:r>
+      <w:r>
+        <w:rPr>
+          <w:i/>
+          <w:lang w:val="en-GB"/>
+        </w:rPr>
+        <w:t>)</w:t>
+      </w:r>
+    </w:p>
+    <w:p>
+      <w:pPr>
+        <w:pStyle w:val="Textprogramovhokdu"/>
+        <w:numPr>
+          <w:ilvl w:val="0"/>
+          <w:numId w:val="30"/>
+        </w:numPr>
+        <w:rPr>
+          <w:lang w:val="en-GB"/>
+        </w:rPr>
+      </w:pPr>
+      <w:r>
+        <w:rPr>
+          <w:lang w:val="en-GB"/>
+        </w:rPr>
+        <w:t>&lt;?xml version=”1.0?&gt;</w:t>
+      </w:r>
+    </w:p>
+    <w:p>
+      <w:pPr>
+        <w:pStyle w:val="Textprogramovhokdu"/>
+        <w:numPr>
+          <w:ilvl w:val="0"/>
+          <w:numId w:val="30"/>
+        </w:numPr>
+        <w:rPr>
+          <w:lang w:val="en-GB"/>
+        </w:rPr>
+      </w:pPr>
+      <w:r>
+        <w:rPr>
+          <w:lang w:val="en-GB"/>
+        </w:rPr>
+        <w:t>&lt;product barcode=”2394287410”&gt;</w:t>
+      </w:r>
+    </w:p>
+    <w:p>
+      <w:pPr>
+        <w:pStyle w:val="Textprogramovhokdu"/>
+        <w:numPr>
+          <w:ilvl w:val="0"/>
+          <w:numId w:val="30"/>
+        </w:numPr>
+        <w:rPr>
+          <w:lang w:val="en-GB"/>
+        </w:rPr>
+      </w:pPr>
+      <w:r>
+        <w:rPr>
+          <w:lang w:val="en-GB"/>
+        </w:rPr>
+        <w:t xml:space="preserve">    &lt;manufacturer&gt;Verbatim&lt;/manufacturer&gt;</w:t>
+      </w:r>
+    </w:p>
+    <w:p>
+      <w:pPr>
+        <w:pStyle w:val="Textprogramovhokdu"/>
+        <w:numPr>
+          <w:ilvl w:val="0"/>
+          <w:numId w:val="30"/>
+        </w:numPr>
+        <w:rPr>
+          <w:lang w:val="en-GB"/>
+        </w:rPr>
+      </w:pPr>
+      <w:r>
+        <w:rPr>
+          <w:lang w:val="en-GB"/>
+        </w:rPr>
+        <w:t xml:space="preserve">    &lt;name&gt;DataLife MF 2HD&lt;/name&gt;</w:t>
+      </w:r>
+    </w:p>
+    <w:p>
+      <w:pPr>
+        <w:pStyle w:val="Textprogramovhokdu"/>
+        <w:numPr>
+          <w:ilvl w:val="0"/>
+          <w:numId w:val="30"/>
+        </w:numPr>
+        <w:rPr>
+          <w:lang w:val="en-GB"/>
+        </w:rPr>
+      </w:pPr>
+      <w:r>
+        <w:rPr>
+          <w:lang w:val="en-GB"/>
+        </w:rPr>
+        <w:t xml:space="preserve">    &lt;quantity&gt;10&lt;/quantity&gt;</w:t>
+      </w:r>
+    </w:p>
+    <w:p>
+      <w:pPr>
+        <w:pStyle w:val="Textprogramovhokdu"/>
+        <w:numPr>
+          <w:ilvl w:val="0"/>
+          <w:numId w:val="30"/>
+        </w:numPr>
+        <w:rPr>
+          <w:lang w:val="en-GB"/>
+        </w:rPr>
+      </w:pPr>
+      <w:r>
+        <w:rPr>
+          <w:lang w:val="en-GB"/>
+        </w:rPr>
+        <w:t xml:space="preserve">    &lt;size&gt;3.5&lt;/size&gt;</w:t>
+      </w:r>
+    </w:p>
+    <w:p>
+      <w:pPr>
+        <w:pStyle w:val="Textprogramovhokdu"/>
+        <w:numPr>
+          <w:ilvl w:val="0"/>
+          <w:numId w:val="30"/>
+        </w:numPr>
+        <w:rPr>
+          <w:lang w:val="en-GB"/>
+        </w:rPr>
+      </w:pPr>
+      <w:r>
+        <w:rPr>
+          <w:lang w:val="en-GB"/>
+        </w:rPr>
+        <w:t xml:space="preserve">    &lt;color&gt;black&lt;/color&gt;</w:t>
+      </w:r>
+    </w:p>
+    <w:p>
+      <w:pPr>
+        <w:pStyle w:val="Textprogramovhokdu"/>
+        <w:numPr>
+          <w:ilvl w:val="0"/>
+          <w:numId w:val="30"/>
+        </w:numPr>
+        <w:rPr>
+          <w:lang w:val="en-GB"/>
+        </w:rPr>
+      </w:pPr>
+      <w:r>
+        <w:rPr>
+          <w:lang w:val="en-GB"/>
+        </w:rPr>
+        <w:t xml:space="preserve">    &lt;description&gt;floppy disks&lt;/description&gt;</w:t>
+      </w:r>
+    </w:p>
+    <w:p>
+      <w:pPr>
+        <w:pStyle w:val="Textprogramovhokdu"/>
+        <w:numPr>
+          <w:ilvl w:val="0"/>
+          <w:numId w:val="30"/>
+        </w:numPr>
+        <w:rPr>
+          <w:lang w:val="en-GB"/>
+        </w:rPr>
+      </w:pPr>
+      <w:r>
+        <w:rPr>
+          <w:lang w:val="en-GB"/>
+        </w:rPr>
+        <w:t>&lt;/product&gt;</w:t>
+      </w:r>
+    </w:p>
+    <w:p>
+      <w:r>
+        <w:t xml:space="preserve"> </w:t>
+      </w:r>
+    </w:p>
+    <w:p>
+      <w:r>
+        <w:t xml:space="preserve">In the example provided in Code 1.2, the data is enclosed in tags describing the use – </w:t>
+      </w:r>
+      <w:r>
+        <w:t xml:space="preserve">manufacturer name </w:t>
+      </w:r>
+      <w:r>
+        <w:rPr>
+          <w:rStyle w:val="TextprogramovhokduChar"/>
+          <w:rFonts w:eastAsiaTheme="minorHAnsi"/>
+        </w:rPr>
+        <w:t>Verbatim</w:t>
+      </w:r>
+      <w:r>
+        <w:t xml:space="preserve"> is enclosed in tags </w:t>
+      </w:r>
+      <w:r>
+        <w:rPr>
+          <w:rStyle w:val="TextprogramovhokduChar"/>
+          <w:rFonts w:eastAsiaTheme="minorHAnsi"/>
+        </w:rPr>
+        <w:t>&lt;manufacturer&gt;</w:t>
+      </w:r>
+      <w:r>
+        <w:t xml:space="preserve">. The ending tag also contains a </w:t>
+      </w:r>
+      <w:r>
+        <w:rPr>
+          <w:rStyle w:val="TextprogramovhokduChar"/>
+          <w:rFonts w:eastAsiaTheme="minorHAnsi"/>
+        </w:rPr>
+        <w:t>/</w:t>
+      </w:r>
+      <w:r>
+        <w:t xml:space="preserve"> preceding the name of the tag, to specify the end of the span.</w:t>
+      </w:r>
+    </w:p>
+    <w:p>
+      <w:r>
+        <w:t xml:space="preserve">For a document to be well-formed, every opening tag must also be closed with a corresponding ending tag and </w:t>
+      </w:r>
+      <w:r>
+        <w:t>cannot</w:t>
+      </w:r>
+      <w:r>
+        <w:t xml:space="preserve"> range outside of the scope of its parent element. Within these tags, there can be further descriptors, known as attributes. An example of this attribute can be seen in the second element </w:t>
+      </w:r>
+      <w:r>
+        <w:rPr>
+          <w:rStyle w:val="TextprogramovhokduChar"/>
+          <w:rFonts w:eastAsiaTheme="minorHAnsi"/>
+        </w:rPr>
+        <w:t>barcode=”2394287410”</w:t>
+      </w:r>
+      <w:r>
+        <w:t xml:space="preserve">. </w:t>
+      </w:r>
+    </w:p>
+    <w:p>
+      <w:r>
+        <w:t>XML by default has a larger array of built-in data types available. Some of those include string representation (string, normalizedstring, token), numerical representation (byte, integer, positiveInteger, int, long, decimal, double), Booleans, as well as options for date representation, such as (time, date, gMonth, gYear) or several miscellaneous data types (anyURI representing addresses as URL or URN, language representing language constants as definted by RFC 1766)</w:t>
+      </w:r>
+    </w:p>
+    <w:p>
+      <w:r>
+        <w:t>Furthermore, XML allows for the extension of these data types and creating your own, as well as utilizing commonly used community extensions. Any such extension or specification is called a schema. Import of foreign schemas is done with an &lt;xs:schema&gt; element containing a URI of the required schema.</w:t>
+      </w:r>
+      <w:r>
+        <w:t xml:space="preserve"> </w:t>
+      </w:r>
+    </w:p>
+    <w:p>
+      <w:r>
+        <w:t xml:space="preserve">These extensions define rules that the XML document must obey. A document that complies with the rules set forth by the imported schema is called </w:t>
+      </w:r>
+      <w:r>
+        <w:rPr>
+          <w:i/>
+          <w:iCs/>
+        </w:rPr>
+        <w:t xml:space="preserve">valid. </w:t>
+      </w:r>
+      <w:r>
+        <w:t xml:space="preserve">Note that documents can be both </w:t>
+      </w:r>
+      <w:r>
+        <w:rPr>
+          <w:i/>
+          <w:iCs/>
+        </w:rPr>
+        <w:t>well-formed</w:t>
+      </w:r>
+      <w:r>
+        <w:t xml:space="preserve"> and </w:t>
+      </w:r>
+      <w:r>
+        <w:rPr>
+          <w:i/>
+          <w:iCs/>
+        </w:rPr>
+        <w:t>invalid</w:t>
+      </w:r>
+      <w:r>
+        <w:t xml:space="preserve"> but cannot be </w:t>
+      </w:r>
+      <w:r>
+        <w:rPr>
+          <w:i/>
+          <w:iCs/>
+        </w:rPr>
+        <w:t xml:space="preserve">valid </w:t>
+      </w:r>
+      <w:r>
+        <w:t xml:space="preserve">but </w:t>
+      </w:r>
+      <w:r>
+        <w:t>not</w:t>
+      </w:r>
+      <w:r>
+        <w:rPr>
+          <w:i/>
+          <w:iCs/>
+        </w:rPr>
+        <w:t xml:space="preserve"> well-formed</w:t>
+      </w:r>
+      <w:r>
+        <w:t>.</w:t>
+      </w:r>
+    </w:p>
+    <w:p>
+      <w:r>
+        <w:t>Other markup languages include:</w:t>
+      </w:r>
+    </w:p>
+    <w:p>
+      <w:pPr>
+        <w:pStyle w:val="Odstavecseseznamem"/>
+        <w:numPr>
+          <w:ilvl w:val="0"/>
+          <w:numId w:val="29"/>
+        </w:numPr>
+      </w:pPr>
+      <w:r>
+        <w:t>HTML, which is widely used with browsing</w:t>
+      </w:r>
+    </w:p>
+    <w:p>
+      <w:pPr>
+        <w:pStyle w:val="Odstavecseseznamem"/>
+        <w:numPr>
+          <w:ilvl w:val="0"/>
+          <w:numId w:val="29"/>
+        </w:numPr>
+      </w:pPr>
+      <w:r>
+        <w:lastRenderedPageBreak/>
+        <w:t>LaTeX, used most commonly with typesetting and presentation of scientific publications</w:t>
+      </w:r>
+    </w:p>
+    <w:p>
+      <w:pPr>
+        <w:pStyle w:val="Odstavecseseznamem"/>
+        <w:numPr>
+          <w:ilvl w:val="0"/>
+          <w:numId w:val="29"/>
+        </w:numPr>
+        <w:jc w:val="left"/>
+      </w:pPr>
+      <w:r>
+        <w:t xml:space="preserve">Markdown, light-weight simple markup language </w:t>
+      </w:r>
+    </w:p>
+    <w:p>
+      <w:pPr>
+        <w:pStyle w:val="Nadpis3"/>
+      </w:pPr>
+      <w:bookmarkStart w:id="14" w:name="_Toc222408004"/>
+      <w:r>
+        <w:t>S</w:t>
+      </w:r>
+      <w:r>
+        <w:t>yslog</w:t>
+      </w:r>
+      <w:bookmarkEnd w:id="14"/>
+    </w:p>
+    <w:p>
+      <w:r>
+        <w:rPr>
+          <w:highlight w:val="yellow"/>
+        </w:rPr>
+        <w:t>24/7 LINKS TO CHILL / ZOTERO TO</w:t>
+      </w:r>
+    </w:p>
+    <w:p>
+      <w:hyperlink r:id="rId17" w:history="1">
+        <w:r>
+          <w:rPr>
+            <w:rStyle w:val="Hypertextovodkaz"/>
+          </w:rPr>
+          <w:t>https://www.rfc-editor.org/rfc/rfc5424?spm=a2c4g.11186623.0.0.21324a0fUixMd5</w:t>
+        </w:r>
+      </w:hyperlink>
+    </w:p>
+    <w:p>
+      <w:r>
+        <w:t>https://dskrzypiec.dev/cron/</w:t>
+      </w:r>
+    </w:p>
+    <w:p>
+      <w:r>
+        <w:t>The syslog protocol is used to convey event notification messages</w:t>
+      </w:r>
+      <w:r>
+        <w:t>, providing a simple framework for log entry, generation, storage and transfer. Many log sources either use syslog as their native logging format or offer features that allow their logging formats to be converted to syslog format.</w:t>
+      </w:r>
+    </w:p>
+    <w:p>
+      <w:r>
+        <w:t>An example syslog messages might look like the following example:</w:t>
+      </w:r>
+    </w:p>
+    <w:p>
+      <w:pPr>
+        <w:rPr>
+          <w:b/>
+          <w:bCs/>
+        </w:rPr>
+      </w:pPr>
+      <w:r>
+        <w:rPr>
+          <w:b/>
+          <w:bCs/>
+          <w:iCs/>
+          <w:lang w:val="en-GB"/>
+        </w:rPr>
+        <w:t xml:space="preserve">Code </w:t>
+      </w:r>
+      <w:r>
+        <w:rPr>
+          <w:iCs/>
+          <w:lang w:val="cs-CZ"/>
+        </w:rPr>
+        <w:fldChar w:fldCharType="begin"/>
+      </w:r>
+      <w:r>
+        <w:rPr>
+          <w:b/>
+          <w:bCs/>
+          <w:iCs/>
+          <w:lang w:val="en-GB"/>
+        </w:rPr>
+        <w:instrText xml:space="preserve"> STYLEREF 1 \s </w:instrText>
+      </w:r>
+      <w:r>
+        <w:rPr>
+          <w:iCs/>
+          <w:lang w:val="cs-CZ"/>
+        </w:rPr>
+        <w:fldChar w:fldCharType="separate"/>
+      </w:r>
+      <w:r>
+        <w:rPr>
+          <w:b/>
+          <w:bCs/>
+          <w:iCs/>
+          <w:lang w:val="en-GB"/>
+        </w:rPr>
+        <w:t>1</w:t>
+      </w:r>
+      <w:r>
+        <w:fldChar w:fldCharType="end"/>
+      </w:r>
+      <w:r>
+        <w:rPr>
+          <w:b/>
+          <w:bCs/>
+          <w:iCs/>
+          <w:lang w:val="en-GB"/>
+        </w:rPr>
+        <w:t>.</w:t>
+      </w:r>
+      <w:r>
+        <w:rPr>
+          <w:b/>
+          <w:bCs/>
+          <w:iCs/>
+          <w:lang w:val="cs-CZ"/>
+        </w:rPr>
+        <w:t>3</w:t>
+      </w:r>
+    </w:p>
+    <w:p>
+      <w:r>
+        <w:rPr>
+          <w:i/>
+          <w:lang w:val="en-GB"/>
+        </w:rPr>
+        <w:t>An example syslog message, as shown on author’s WSL instance in /var/log/syslog</w:t>
+      </w:r>
+    </w:p>
+    <w:p>
+      <w:pPr>
+        <w:pStyle w:val="Textprogramovhokdu"/>
+      </w:pPr>
+      <w:r>
+        <w:t>&lt;78&gt;Mar 9 14:48:34 cron[212]: (CRON) INFO (pidfile fd = 3)</w:t>
+      </w:r>
+      <w:r>
+        <w:br/>
+      </w:r>
+      <w:r>
+        <w:t>&lt;30&gt;Mar</w:t>
+      </w:r>
+      <w:r>
+        <w:t xml:space="preserve"> </w:t>
+      </w:r>
+      <w:r>
+        <w:t>9 14:48:34 systemd[1]: Started D-Bus System Message Bus.</w:t>
+      </w:r>
+    </w:p>
+    <w:p>
+      <w:pPr>
+        <w:pStyle w:val="Textprogramovhokdu"/>
+      </w:pPr>
+      <w:r>
+        <w:t>&lt;12&gt;Mar 9 14:48:40 pipewire-media-session[786]: mod.rt: RTKit error: org.freedesktop.DBus.Error.AccessDenied</w:t>
+      </w:r>
+    </w:p>
     <w:p/>
     <w:p>
+      <w:r>
+        <w:t>The message is made up of the following parts:</w:t>
+      </w:r>
+    </w:p>
+    <w:p>
+      <w:pPr>
+        <w:pStyle w:val="Nadpis4"/>
+      </w:pPr>
+      <w:r>
+        <w:t>PRI</w:t>
+      </w:r>
+    </w:p>
+    <w:p>
+      <w:r>
+        <w:t xml:space="preserve">The priority part of the message consists of three to five characters, starting and ending with the angle brackets </w:t>
+      </w:r>
+      <w:r>
+        <w:rPr>
+          <w:rStyle w:val="TextprogramovhokduChar"/>
+          <w:rFonts w:eastAsiaTheme="minorHAnsi"/>
+        </w:rPr>
+        <w:t>&lt;78&gt;</w:t>
+      </w:r>
+      <w:r>
+        <w:t>. As</w:t>
+      </w:r>
+      <w:r>
+        <w:t xml:space="preserve"> the name suggests, this component denotes the priority of a given message. This is important, as it allows for the filtering of messages based on their facility and severity.</w:t>
+      </w:r>
+    </w:p>
+    <w:p>
+      <w:r>
+        <w:t>The number within the angle brackets is calculated by the following expression:</w:t>
+      </w:r>
+    </w:p>
+    <w:p>
+      <w:r>
+        <w:t>PRIORITY = (FACILITY * 8) + SEVERITY</w:t>
+      </w:r>
+    </w:p>
+    <w:p>
+      <w:r>
+        <w:t>The facility component of this equation describes the origin of the message. Within the RFC 5424, facilities are assigned the following values:</w:t>
+      </w:r>
+    </w:p>
+    <w:p>
+      <w:pPr>
+        <w:pStyle w:val="Odstavecseseznamem"/>
+        <w:numPr>
+          <w:ilvl w:val="0"/>
+          <w:numId w:val="32"/>
+        </w:numPr>
+        <w:rPr>
+          <w:lang w:val="en-GB"/>
+        </w:rPr>
+      </w:pPr>
+      <w:r>
+        <w:rPr>
+          <w:lang w:val="en-GB"/>
+        </w:rPr>
+        <w:t>kernel messages</w:t>
+      </w:r>
+    </w:p>
+    <w:p>
+      <w:pPr>
+        <w:pStyle w:val="Odstavecseseznamem"/>
+        <w:numPr>
+          <w:ilvl w:val="0"/>
+          <w:numId w:val="32"/>
+        </w:numPr>
+        <w:rPr>
+          <w:lang w:val="en-GB"/>
+        </w:rPr>
+      </w:pPr>
+      <w:r>
+        <w:rPr>
+          <w:lang w:val="en-GB"/>
+        </w:rPr>
+        <w:t>user-level messages</w:t>
+      </w:r>
+    </w:p>
+    <w:p>
+      <w:pPr>
+        <w:pStyle w:val="Odstavecseseznamem"/>
+        <w:numPr>
+          <w:ilvl w:val="0"/>
+          <w:numId w:val="32"/>
+        </w:numPr>
+        <w:rPr>
+          <w:lang w:val="en-GB"/>
+        </w:rPr>
+      </w:pPr>
+      <w:r>
+        <w:rPr>
+          <w:lang w:val="en-GB"/>
+        </w:rPr>
+        <w:t>mail system</w:t>
+      </w:r>
+    </w:p>
+    <w:p>
+      <w:pPr>
+        <w:pStyle w:val="Odstavecseseznamem"/>
+        <w:numPr>
+          <w:ilvl w:val="0"/>
+          <w:numId w:val="32"/>
+        </w:numPr>
+        <w:rPr>
+          <w:lang w:val="en-GB"/>
+        </w:rPr>
+      </w:pPr>
+      <w:r>
+        <w:rPr>
+          <w:lang w:val="en-GB"/>
+        </w:rPr>
+        <w:t>system daemons</w:t>
+      </w:r>
+    </w:p>
+    <w:p>
+      <w:pPr>
+        <w:pStyle w:val="Odstavecseseznamem"/>
+        <w:numPr>
+          <w:ilvl w:val="0"/>
+          <w:numId w:val="32"/>
+        </w:numPr>
+        <w:rPr>
+          <w:lang w:val="en-GB"/>
+        </w:rPr>
+      </w:pPr>
+      <w:r>
+        <w:rPr>
+          <w:lang w:val="en-GB"/>
+        </w:rPr>
+        <w:lastRenderedPageBreak/>
+        <w:t>security/authorization messages</w:t>
+      </w:r>
+    </w:p>
+    <w:p>
+      <w:pPr>
+        <w:pStyle w:val="Odstavecseseznamem"/>
+        <w:numPr>
+          <w:ilvl w:val="0"/>
+          <w:numId w:val="32"/>
+        </w:numPr>
+        <w:rPr>
+          <w:lang w:val="en-GB"/>
+        </w:rPr>
+      </w:pPr>
+      <w:r>
+        <w:rPr>
+          <w:lang w:val="en-GB"/>
+        </w:rPr>
+        <w:t>messages generated internally by syslogd</w:t>
+      </w:r>
+    </w:p>
+    <w:p>
+      <w:pPr>
+        <w:pStyle w:val="Odstavecseseznamem"/>
+        <w:numPr>
+          <w:ilvl w:val="0"/>
+          <w:numId w:val="32"/>
+        </w:numPr>
+        <w:rPr>
+          <w:lang w:val="en-GB"/>
+        </w:rPr>
+      </w:pPr>
+      <w:r>
+        <w:rPr>
+          <w:lang w:val="en-GB"/>
+        </w:rPr>
+        <w:t>line printer subsystem</w:t>
+      </w:r>
+    </w:p>
+    <w:p>
+      <w:pPr>
+        <w:pStyle w:val="Odstavecseseznamem"/>
+        <w:numPr>
+          <w:ilvl w:val="0"/>
+          <w:numId w:val="32"/>
+        </w:numPr>
+        <w:rPr>
+          <w:lang w:val="en-GB"/>
+        </w:rPr>
+      </w:pPr>
+      <w:r>
+        <w:rPr>
+          <w:lang w:val="en-GB"/>
+        </w:rPr>
+        <w:t>network news subsystem</w:t>
+      </w:r>
+    </w:p>
+    <w:p>
+      <w:pPr>
+        <w:pStyle w:val="Odstavecseseznamem"/>
+        <w:numPr>
+          <w:ilvl w:val="0"/>
+          <w:numId w:val="32"/>
+        </w:numPr>
+        <w:rPr>
+          <w:lang w:val="en-GB"/>
+        </w:rPr>
+      </w:pPr>
+      <w:r>
+        <w:rPr>
+          <w:lang w:val="en-GB"/>
+        </w:rPr>
+        <w:t>UUCP subsystem</w:t>
+      </w:r>
+    </w:p>
+    <w:p>
+      <w:pPr>
+        <w:pStyle w:val="Odstavecseseznamem"/>
+        <w:numPr>
+          <w:ilvl w:val="0"/>
+          <w:numId w:val="32"/>
+        </w:numPr>
+        <w:rPr>
+          <w:lang w:val="en-GB"/>
+        </w:rPr>
+      </w:pPr>
+      <w:r>
+        <w:rPr>
+          <w:lang w:val="en-GB"/>
+        </w:rPr>
+        <w:t>clock daemon</w:t>
+      </w:r>
+    </w:p>
+    <w:p>
+      <w:pPr>
+        <w:pStyle w:val="Odstavecseseznamem"/>
+        <w:numPr>
+          <w:ilvl w:val="0"/>
+          <w:numId w:val="32"/>
+        </w:numPr>
+        <w:rPr>
+          <w:lang w:val="en-GB"/>
+        </w:rPr>
+      </w:pPr>
+      <w:r>
+        <w:rPr>
+          <w:lang w:val="en-GB"/>
+        </w:rPr>
+        <w:t>security/authorization messages</w:t>
+      </w:r>
+    </w:p>
+    <w:p>
+      <w:pPr>
+        <w:rPr>
+          <w:lang w:val="en-GB"/>
+        </w:rPr>
+      </w:pPr>
+      <w:r>
+        <w:rPr>
+          <w:lang w:val="en-GB"/>
+        </w:rPr>
+        <w:t>In the same document, the RFC describes</w:t>
+      </w:r>
+      <w:r>
+        <w:rPr>
+          <w:lang w:val="en-GB"/>
+        </w:rPr>
+        <w:t xml:space="preserve"> the severity levels as:</w:t>
+      </w:r>
+    </w:p>
+    <w:p>
+      <w:pPr>
+        <w:pStyle w:val="Odstavecseseznamem"/>
+        <w:numPr>
+          <w:ilvl w:val="0"/>
+          <w:numId w:val="34"/>
+        </w:numPr>
+        <w:ind w:hanging="816"/>
+        <w:rPr>
+          <w:lang w:val="en-GB"/>
+        </w:rPr>
+      </w:pPr>
+      <w:r>
+        <w:rPr>
+          <w:lang w:val="en-GB"/>
+        </w:rPr>
+        <w:t>Emergency: system is unusable</w:t>
+      </w:r>
+    </w:p>
+    <w:p>
+      <w:pPr>
+        <w:pStyle w:val="Odstavecseseznamem"/>
+        <w:numPr>
+          <w:ilvl w:val="0"/>
+          <w:numId w:val="34"/>
+        </w:numPr>
+        <w:ind w:hanging="816"/>
+        <w:rPr>
+          <w:lang w:val="en-GB"/>
+        </w:rPr>
+      </w:pPr>
+      <w:r>
+        <w:rPr>
+          <w:lang w:val="en-GB"/>
+        </w:rPr>
+        <w:t>Alert: action must be taken immediately</w:t>
+      </w:r>
+    </w:p>
+    <w:p>
+      <w:pPr>
+        <w:pStyle w:val="Odstavecseseznamem"/>
+        <w:numPr>
+          <w:ilvl w:val="0"/>
+          <w:numId w:val="34"/>
+        </w:numPr>
+        <w:ind w:hanging="816"/>
+        <w:rPr>
+          <w:lang w:val="en-GB"/>
+        </w:rPr>
+      </w:pPr>
+      <w:r>
+        <w:rPr>
+          <w:lang w:val="en-GB"/>
+        </w:rPr>
+        <w:t>Critical: critical conditions</w:t>
+      </w:r>
+    </w:p>
+    <w:p>
+      <w:pPr>
+        <w:pStyle w:val="Odstavecseseznamem"/>
+        <w:numPr>
+          <w:ilvl w:val="0"/>
+          <w:numId w:val="34"/>
+        </w:numPr>
+        <w:ind w:hanging="816"/>
+        <w:rPr>
+          <w:lang w:val="en-GB"/>
+        </w:rPr>
+      </w:pPr>
+      <w:r>
+        <w:rPr>
+          <w:lang w:val="en-GB"/>
+        </w:rPr>
+        <w:t>Error: error conditions</w:t>
+      </w:r>
+    </w:p>
+    <w:p>
+      <w:pPr>
+        <w:pStyle w:val="Odstavecseseznamem"/>
+        <w:numPr>
+          <w:ilvl w:val="0"/>
+          <w:numId w:val="34"/>
+        </w:numPr>
+        <w:ind w:hanging="816"/>
+        <w:rPr>
+          <w:lang w:val="en-GB"/>
+        </w:rPr>
+      </w:pPr>
+      <w:r>
+        <w:rPr>
+          <w:lang w:val="en-GB"/>
+        </w:rPr>
+        <w:t>Warning: warning conditions</w:t>
+      </w:r>
+    </w:p>
+    <w:p>
+      <w:pPr>
+        <w:pStyle w:val="Odstavecseseznamem"/>
+        <w:numPr>
+          <w:ilvl w:val="0"/>
+          <w:numId w:val="34"/>
+        </w:numPr>
+        <w:ind w:hanging="816"/>
+        <w:rPr>
+          <w:lang w:val="en-GB"/>
+        </w:rPr>
+      </w:pPr>
+      <w:r>
+        <w:rPr>
+          <w:lang w:val="en-GB"/>
+        </w:rPr>
+        <w:t>Notice: normal but significant condition</w:t>
+      </w:r>
+    </w:p>
+    <w:p>
+      <w:pPr>
+        <w:pStyle w:val="Odstavecseseznamem"/>
+        <w:numPr>
+          <w:ilvl w:val="0"/>
+          <w:numId w:val="34"/>
+        </w:numPr>
+        <w:ind w:hanging="816"/>
+        <w:rPr>
+          <w:lang w:val="en-GB"/>
+        </w:rPr>
+      </w:pPr>
+      <w:r>
+        <w:rPr>
+          <w:lang w:val="en-GB"/>
+        </w:rPr>
+        <w:t>Informational: informational messages</w:t>
+      </w:r>
+    </w:p>
+    <w:p>
+      <w:pPr>
+        <w:pStyle w:val="Odstavecseseznamem"/>
+        <w:numPr>
+          <w:ilvl w:val="0"/>
+          <w:numId w:val="34"/>
+        </w:numPr>
+        <w:ind w:hanging="816"/>
+        <w:rPr>
+          <w:lang w:val="en-GB"/>
+        </w:rPr>
+      </w:pPr>
+      <w:r>
+        <w:rPr>
+          <w:lang w:val="en-GB"/>
+        </w:rPr>
+        <w:t>Debug: debug-level messages</w:t>
+      </w:r>
+    </w:p>
+    <w:p>
+      <w:pPr>
+        <w:rPr>
+          <w:lang w:val="en-GB"/>
+        </w:rPr>
+      </w:pPr>
+      <w:r>
+        <w:rPr>
+          <w:lang w:val="en-GB"/>
+        </w:rPr>
+        <w:t>This means that for the example value of 78,</w:t>
+      </w:r>
+      <w:r>
+        <w:rPr>
+          <w:lang w:val="en-GB"/>
+        </w:rPr>
+        <w:t xml:space="preserve"> given by the above message with the description of </w:t>
+      </w:r>
+      <w:r>
+        <w:rPr>
+          <w:rStyle w:val="TextprogramovhokduChar"/>
+          <w:rFonts w:eastAsiaTheme="minorHAnsi"/>
+        </w:rPr>
+        <w:t>cron[212]: (CRON) INFO (pidfile fd = 3)</w:t>
+      </w:r>
+      <w:r>
+        <w:rPr>
+          <w:lang w:val="en-GB"/>
+        </w:rPr>
+        <w:t xml:space="preserve"> </w:t>
+      </w:r>
+      <w:r>
+        <w:rPr>
+          <w:lang w:val="en-GB"/>
+        </w:rPr>
+        <w:t>the severity and facility can be calculated as follows:</w:t>
+      </w:r>
+    </w:p>
+    <w:p>
+      <w:pPr>
+        <w:pStyle w:val="MTDisplayEquation"/>
+      </w:pPr>
+      <w:r>
+        <w:tab/>
+      </w:r>
+      <m:oMath>
+        <m:f>
+          <m:fPr>
+            <m:ctrlPr>
+              <w:rPr>
+                <w:rFonts w:ascii="Cambria Math" w:hAnsi="Cambria Math"/>
+                <w:i/>
+              </w:rPr>
+            </m:ctrlPr>
+          </m:fPr>
+          <m:num>
+            <m:r>
+              <w:rPr>
+                <w:rFonts w:ascii="Cambria Math" w:hAnsi="Cambria Math"/>
+              </w:rPr>
+              <m:t>78</m:t>
+            </m:r>
+          </m:num>
+          <m:den>
+            <m:r>
+              <w:rPr>
+                <w:rFonts w:ascii="Cambria Math" w:hAnsi="Cambria Math"/>
+              </w:rPr>
+              <m:t>8</m:t>
+            </m:r>
+          </m:den>
+        </m:f>
+        <m:r>
+          <w:rPr>
+            <w:rFonts w:ascii="Cambria Math" w:hAnsi="Cambria Math"/>
+          </w:rPr>
+          <m:t>=</m:t>
+        </m:r>
+        <m:r>
+          <m:rPr>
+            <m:sty m:val="bi"/>
+          </m:rPr>
+          <w:rPr>
+            <w:rFonts w:ascii="Cambria Math" w:hAnsi="Cambria Math"/>
+          </w:rPr>
+          <m:t>9</m:t>
+        </m:r>
+        <m:r>
+          <w:rPr>
+            <w:rFonts w:ascii="Cambria Math" w:hAnsi="Cambria Math"/>
+          </w:rPr>
+          <m:t xml:space="preserve">, remainder of </m:t>
+        </m:r>
+        <m:r>
+          <m:rPr>
+            <m:sty m:val="bi"/>
+          </m:rPr>
+          <w:rPr>
+            <w:rFonts w:ascii="Cambria Math" w:hAnsi="Cambria Math"/>
+          </w:rPr>
+          <m:t>6</m:t>
+        </m:r>
+      </m:oMath>
+      <w:r>
+        <w:tab/>
+      </w:r>
+      <w:r>
+        <w:fldChar w:fldCharType="begin"/>
+      </w:r>
+      <w:r>
+        <w:instrText xml:space="preserve"> MACROBUTTON MTPlaceRef \* MERGEFORMAT </w:instrText>
+      </w:r>
+      <w:r>
+        <w:fldChar w:fldCharType="begin"/>
+      </w:r>
+      <w:r>
+        <w:instrText xml:space="preserve"> SEQ MTEqn \h \* MERGEFORMAT </w:instrText>
+      </w:r>
+      <w:r>
+        <w:fldChar w:fldCharType="end"/>
+      </w:r>
+      <w:r>
+        <w:instrText>(1.1)</w:instrText>
+      </w:r>
+      <w:r>
+        <w:fldChar w:fldCharType="end"/>
+      </w:r>
+    </w:p>
+    <w:p>
+      <w:pPr>
+        <w:rPr>
+          <w:lang w:val="en-GB"/>
+        </w:rPr>
+      </w:pPr>
+      <w:r>
+        <w:rPr>
+          <w:lang w:val="en-GB"/>
+        </w:rPr>
+        <w:t>Within the tables described above, this means that the message had the severity of 6 (Informational) and the origin facility had the number 9 (clock daemon). This checks out with the content of the message and its origin, as the cron process is</w:t>
+      </w:r>
+      <w:r>
+        <w:rPr>
+          <w:lang w:val="en-GB"/>
+        </w:rPr>
+        <w:t xml:space="preserve"> in Linux</w:t>
+      </w:r>
+      <w:r>
+        <w:rPr>
+          <w:lang w:val="en-GB"/>
+        </w:rPr>
+        <w:t xml:space="preserve"> responsible for scheduling events and the message itself contains </w:t>
+      </w:r>
+      <w:r>
+        <w:rPr>
+          <w:lang w:val="en-GB"/>
+        </w:rPr>
+        <w:t>“</w:t>
+      </w:r>
+      <w:r>
+        <w:rPr>
+          <w:lang w:val="en-GB"/>
+        </w:rPr>
+        <w:t>INFO</w:t>
+      </w:r>
+      <w:r>
+        <w:rPr>
+          <w:lang w:val="en-GB"/>
+        </w:rPr>
+        <w:t>”</w:t>
+      </w:r>
+      <w:r>
+        <w:rPr>
+          <w:lang w:val="en-GB"/>
+        </w:rPr>
+        <w:t>, denoting the intent of the message.</w:t>
+      </w:r>
+    </w:p>
+    <w:p>
+      <w:pPr>
+        <w:rPr>
+          <w:lang w:val="en-GB"/>
+        </w:rPr>
+      </w:pPr>
+      <w:r>
+        <w:rPr>
+          <w:lang w:val="en-GB"/>
+        </w:rPr>
+        <w:t xml:space="preserve">Another example given above is the </w:t>
+      </w:r>
+      <w:r>
+        <w:rPr>
+          <w:lang w:val="en-GB"/>
+        </w:rPr>
+        <w:t xml:space="preserve">following </w:t>
+      </w:r>
+      <w:r>
+        <w:rPr>
+          <w:lang w:val="en-GB"/>
+        </w:rPr>
+        <w:t>message</w:t>
+      </w:r>
+      <w:r>
+        <w:rPr>
+          <w:lang w:val="en-GB"/>
+        </w:rPr>
+        <w:t>:</w:t>
+      </w:r>
+    </w:p>
+    <w:p>
+      <w:r>
+        <w:rPr>
+          <w:lang w:val="en-GB"/>
+        </w:rPr>
+        <w:t xml:space="preserve"> </w:t>
+      </w:r>
+      <w:r>
+        <w:rPr>
+          <w:rStyle w:val="TextprogramovhokduChar"/>
+          <w:rFonts w:eastAsiaTheme="minorHAnsi"/>
+        </w:rPr>
+        <w:t>&lt;12&gt;Mar 9 14:48:40 pipewire-media-session[786]: mod.rt: RTKit error</w:t>
+      </w:r>
+      <w:r>
+        <w:t xml:space="preserve"> </w:t>
+      </w:r>
+    </w:p>
+    <w:p>
+      <w:r>
+        <w:t>We can then calculate t</w:t>
+      </w:r>
+      <w:r>
+        <w:t xml:space="preserve">he severity </w:t>
+      </w:r>
+      <w:r>
+        <w:t xml:space="preserve">and facility of this message, based on the PRI component. The PRI value </w:t>
+      </w:r>
+      <w:r>
+        <w:t>of 12</w:t>
+      </w:r>
+      <w:r>
+        <w:t xml:space="preserve"> denoted in the angle brackets</w:t>
+      </w:r>
+      <w:r>
+        <w:t xml:space="preserve"> is then equal to the facility of </w:t>
+      </w:r>
+      <w:r>
+        <w:rPr>
+          <w:b/>
+          <w:bCs/>
+        </w:rPr>
+        <w:t>1</w:t>
+      </w:r>
+      <w:r>
+        <w:t xml:space="preserve"> (user-messages) and severity of </w:t>
+      </w:r>
+      <w:r>
+        <w:rPr>
+          <w:b/>
+          <w:bCs/>
+        </w:rPr>
+        <w:t>4</w:t>
+      </w:r>
+      <w:r>
+        <w:t xml:space="preserve"> (warning conditions). See calculation below. </w:t>
+      </w:r>
+    </w:p>
+    <w:p>
+      <w:pPr>
+        <w:pStyle w:val="MTDisplayEquation"/>
+      </w:pPr>
+      <w:r>
+        <w:tab/>
+      </w:r>
+      <m:oMath>
+        <m:f>
+          <m:fPr>
+            <m:ctrlPr>
+              <w:rPr>
+                <w:rFonts w:ascii="Cambria Math" w:hAnsi="Cambria Math"/>
+                <w:i/>
+              </w:rPr>
+            </m:ctrlPr>
+          </m:fPr>
+          <m:num>
+            <m:r>
+              <w:rPr>
+                <w:rFonts w:ascii="Cambria Math" w:hAnsi="Cambria Math"/>
+              </w:rPr>
+              <m:t>12</m:t>
+            </m:r>
+          </m:num>
+          <m:den>
+            <m:r>
+              <w:rPr>
+                <w:rFonts w:ascii="Cambria Math" w:hAnsi="Cambria Math"/>
+              </w:rPr>
+              <m:t>8</m:t>
+            </m:r>
+          </m:den>
+        </m:f>
+        <m:r>
+          <w:rPr>
+            <w:rFonts w:ascii="Cambria Math" w:hAnsi="Cambria Math"/>
+          </w:rPr>
+          <m:t>=</m:t>
+        </m:r>
+        <m:r>
+          <m:rPr>
+            <m:sty m:val="bi"/>
+          </m:rPr>
+          <w:rPr>
+            <w:rFonts w:ascii="Cambria Math" w:hAnsi="Cambria Math"/>
+          </w:rPr>
+          <m:t>1</m:t>
+        </m:r>
+        <m:r>
+          <w:rPr>
+            <w:rFonts w:ascii="Cambria Math" w:hAnsi="Cambria Math"/>
+          </w:rPr>
+          <m:t xml:space="preserve">, remainder of </m:t>
+        </m:r>
+        <m:r>
+          <m:rPr>
+            <m:sty m:val="bi"/>
+          </m:rPr>
+          <w:rPr>
+            <w:rFonts w:ascii="Cambria Math" w:hAnsi="Cambria Math"/>
+          </w:rPr>
+          <m:t>4</m:t>
+        </m:r>
+      </m:oMath>
+      <w:r>
+        <w:tab/>
+        <w:t>(1.2)</w:t>
+      </w:r>
+    </w:p>
+    <w:p>
+      <w:pPr>
+        <w:pStyle w:val="Nadpis4"/>
+        <w:rPr>
+          <w:lang w:val="en-GB"/>
+        </w:rPr>
+      </w:pPr>
+      <w:r>
+        <w:rPr>
+          <w:lang w:val="en-GB"/>
+        </w:rPr>
+        <w:t>Timestamp</w:t>
+      </w:r>
+    </w:p>
+    <w:p>
+      <w:r>
+        <w:rPr>
+          <w:lang w:val="en-GB"/>
+        </w:rPr>
+        <w:t xml:space="preserve">The timestamp in the sample messages is given as </w:t>
+      </w:r>
+      <w:r>
+        <w:rPr>
+          <w:rStyle w:val="TextprogramovhokduChar"/>
+          <w:rFonts w:eastAsiaTheme="minorHAnsi"/>
+        </w:rPr>
+        <w:t>Mar 9 14:48:40</w:t>
+      </w:r>
+      <w:r>
+        <w:t xml:space="preserve">. This </w:t>
+      </w:r>
+      <w:r>
+        <w:t xml:space="preserve">is </w:t>
+      </w:r>
+      <w:r>
+        <w:t>not</w:t>
+      </w:r>
+      <w:r>
+        <w:t xml:space="preserve"> compliant with the RFC 5424, which states the following:</w:t>
+      </w:r>
+    </w:p>
+    <w:p>
+      <w:pPr>
+        <w:rPr>
+          <w:i/>
+          <w:iCs/>
+          <w:lang w:val="en-GB"/>
+        </w:rPr>
+      </w:pPr>
+      <w:r>
+        <w:rPr>
+          <w:i/>
+          <w:iCs/>
+          <w:lang w:val="en-GB"/>
+        </w:rPr>
+        <w:t>The TIMESTAMP value MUS</w:t>
+      </w:r>
+      <w:r>
+        <w:rPr>
+          <w:i/>
+          <w:iCs/>
+          <w:lang w:val="en-GB"/>
+        </w:rPr>
+        <w:t xml:space="preserve">T </w:t>
+      </w:r>
+      <w:r>
+        <w:rPr>
+          <w:i/>
+          <w:iCs/>
+          <w:lang w:val="en-GB"/>
+        </w:rPr>
+        <w:t>follow these restrictions:</w:t>
+      </w:r>
+    </w:p>
+    <w:p>
+      <w:pPr>
+        <w:pStyle w:val="Odstavecseseznamem"/>
+        <w:numPr>
+          <w:ilvl w:val="0"/>
+          <w:numId w:val="28"/>
+        </w:numPr>
+        <w:rPr>
+          <w:i/>
+          <w:iCs/>
+          <w:lang w:val="en-GB"/>
+        </w:rPr>
+      </w:pPr>
+      <w:r>
+        <w:rPr>
+          <w:i/>
+          <w:iCs/>
+          <w:lang w:val="en-GB"/>
+        </w:rPr>
+        <w:lastRenderedPageBreak/>
+        <w:t>The "T" and "Z" characters in this syntax MUST be upper case.</w:t>
+      </w:r>
+    </w:p>
+    <w:p>
+      <w:pPr>
+        <w:pStyle w:val="Odstavecseseznamem"/>
+        <w:numPr>
+          <w:ilvl w:val="0"/>
+          <w:numId w:val="28"/>
+        </w:numPr>
+        <w:rPr>
+          <w:i/>
+          <w:iCs/>
+          <w:lang w:val="en-GB"/>
+        </w:rPr>
+      </w:pPr>
+      <w:r>
+        <w:rPr>
+          <w:i/>
+          <w:iCs/>
+          <w:lang w:val="en-GB"/>
+        </w:rPr>
+        <w:t>Usage of the "T" character is REQUIRED.</w:t>
+      </w:r>
+    </w:p>
+    <w:p>
+      <w:pPr>
+        <w:pStyle w:val="Odstavecseseznamem"/>
+        <w:numPr>
+          <w:ilvl w:val="0"/>
+          <w:numId w:val="28"/>
+        </w:numPr>
+        <w:rPr>
+          <w:i/>
+          <w:iCs/>
+          <w:lang w:val="en-GB"/>
+        </w:rPr>
+      </w:pPr>
+      <w:r>
+        <w:rPr>
+          <w:i/>
+          <w:iCs/>
+          <w:lang w:val="en-GB"/>
+        </w:rPr>
+        <w:t>Leap seconds MUST NOT be used.</w:t>
+      </w:r>
+    </w:p>
+    <w:p>
+      <w:pPr>
+        <w:rPr>
+          <w:lang w:val="en-GB"/>
+        </w:rPr>
+      </w:pPr>
+      <w:r>
+        <w:rPr>
+          <w:lang w:val="en-GB"/>
+        </w:rPr>
+        <w:t xml:space="preserve">Whereas the messages from certain applications do not contain the T, Z segments, neither the </w:t>
+      </w:r>
+      <w:r>
+        <w:rPr>
+          <w:i/>
+          <w:iCs/>
+          <w:lang w:val="en-GB"/>
+        </w:rPr>
+        <w:t>year</w:t>
+      </w:r>
+      <w:r>
+        <w:rPr>
+          <w:i/>
+          <w:iCs/>
+          <w:lang w:val="en-GB"/>
+        </w:rPr>
+        <w:t xml:space="preserve"> </w:t>
+      </w:r>
+      <w:r>
+        <w:rPr>
+          <w:lang w:val="en-GB"/>
+        </w:rPr>
+        <w:t xml:space="preserve">of the timestamp. It is currently unclear why that is, but it can be speculated that one of the causes of this problem can be the adherence to a previous RFC 3164, which is, however, currently obsolete and superseded by the aforementioned RFC 5424. </w:t>
+      </w:r>
+    </w:p>
+    <w:p>
+      <w:r>
+        <w:rPr>
+          <w:lang w:val="en-GB"/>
+        </w:rPr>
+        <w:t>This RFC is, however, relatively new, being released only in 2009, whereas the various Linux utilities can trace their origins back to the 19</w:t>
+      </w:r>
+      <w:r>
+        <w:rPr>
+          <w:lang w:val="en-GB"/>
+        </w:rPr>
+        <w:t>7</w:t>
+      </w:r>
+      <w:r>
+        <w:rPr>
+          <w:lang w:val="en-GB"/>
+        </w:rPr>
+        <w:t>0</w:t>
+      </w:r>
+      <w:r>
+        <w:t xml:space="preserve">s (the utility cron, mentioned in the logs above, was first released in </w:t>
+      </w:r>
+      <w:r>
+        <w:t>1979). Adherence to the RFC should then not be fully expected from these older utilities.</w:t>
+      </w:r>
+    </w:p>
+    <w:p>
+      <w:pPr>
+        <w:pStyle w:val="Nadpis4"/>
+      </w:pPr>
+      <w:r>
+        <w:t>HOSTNAME</w:t>
+      </w:r>
+    </w:p>
+    <w:p>
+      <w:r>
+        <w:t>The hostname component of the message denotes the origin system of the message. By the RFC, the hostname should have the value of the following, as sorted in priority:</w:t>
+      </w:r>
+    </w:p>
+    <w:p>
+      <w:pPr>
+        <w:pStyle w:val="Odstavecseseznamem"/>
+        <w:numPr>
+          <w:ilvl w:val="1"/>
+          <w:numId w:val="39"/>
+        </w:numPr>
+        <w:rPr>
+          <w:lang w:val="en-GB"/>
+        </w:rPr>
+      </w:pPr>
+      <w:r>
+        <w:rPr>
+          <w:lang w:val="en-GB"/>
+        </w:rPr>
+        <w:t>F</w:t>
+      </w:r>
+      <w:r>
+        <w:rPr>
+          <w:lang w:val="en-GB"/>
+        </w:rPr>
+        <w:t>ully Qualified Domain Name</w:t>
+      </w:r>
+    </w:p>
+    <w:p>
+      <w:pPr>
+        <w:pStyle w:val="Odstavecseseznamem"/>
+        <w:numPr>
+          <w:ilvl w:val="1"/>
+          <w:numId w:val="39"/>
+        </w:numPr>
+        <w:rPr>
+          <w:lang w:val="en-GB"/>
+        </w:rPr>
+      </w:pPr>
+      <w:r>
+        <w:rPr>
+          <w:lang w:val="en-GB"/>
+        </w:rPr>
+        <w:t>Static IP address</w:t>
+      </w:r>
+    </w:p>
+    <w:p>
+      <w:pPr>
+        <w:pStyle w:val="Odstavecseseznamem"/>
+        <w:numPr>
+          <w:ilvl w:val="1"/>
+          <w:numId w:val="39"/>
+        </w:numPr>
+        <w:rPr>
+          <w:lang w:val="en-GB"/>
+        </w:rPr>
+      </w:pPr>
+      <w:r>
+        <w:rPr>
+          <w:lang w:val="en-GB"/>
+        </w:rPr>
+        <w:t>hostname</w:t>
+      </w:r>
+    </w:p>
+    <w:p>
+      <w:pPr>
+        <w:pStyle w:val="Odstavecseseznamem"/>
+        <w:numPr>
+          <w:ilvl w:val="1"/>
+          <w:numId w:val="39"/>
+        </w:numPr>
+        <w:rPr>
+          <w:lang w:val="en-GB"/>
+        </w:rPr>
+      </w:pPr>
+      <w:r>
+        <w:rPr>
+          <w:lang w:val="en-GB"/>
+        </w:rPr>
+        <w:t>Dynamic IP address</w:t>
+      </w:r>
+    </w:p>
+    <w:p>
+      <w:pPr>
+        <w:pStyle w:val="Odstavecseseznamem"/>
+        <w:numPr>
+          <w:ilvl w:val="1"/>
+          <w:numId w:val="39"/>
+        </w:numPr>
+        <w:rPr>
+          <w:lang w:val="en-GB"/>
+        </w:rPr>
+      </w:pPr>
+      <w:r>
+        <w:rPr>
+          <w:lang w:val="en-GB"/>
+        </w:rPr>
+        <w:t>the NILVALUE</w:t>
+      </w:r>
+    </w:p>
+    <w:p>
+      <w:pPr>
+        <w:rPr>
+          <w:lang w:val="en-GB"/>
+        </w:rPr>
+      </w:pPr>
+      <w:r>
+        <w:rPr>
+          <w:lang w:val="en-GB"/>
+        </w:rPr>
+        <w:t>These values should, furthermore, be used as consistently as possible for as long as possible.</w:t>
+      </w:r>
+      <w:r>
+        <w:rPr>
+          <w:lang w:val="en-GB"/>
+        </w:rPr>
+        <w:t xml:space="preserve"> The use of the NILVALUE should be reserved for situations where the process has no way to obtain its real hostname, however this is highly unlikely to come to pass.</w:t>
+      </w:r>
+    </w:p>
+    <w:p>
       <w:pPr>
         <w:pStyle w:val="Nadpis3"/>
       </w:pPr>
-      <w:bookmarkStart w:id="14" w:name="_Toc222408004"/>
+      <w:bookmarkStart w:id="15" w:name="_Toc222408005"/>
+      <w:r>
+        <w:t>DMA</w:t>
+      </w:r>
+      <w:bookmarkEnd w:id="15"/>
+      <w:r>
+        <w:t>RC</w:t>
+      </w:r>
+    </w:p>
+    <w:p/>
+    <w:p/>
+    <w:p>
+      <w:pPr>
+        <w:pStyle w:val="Nadpis2"/>
+      </w:pPr>
+      <w:bookmarkStart w:id="16" w:name="_Toc222408006"/>
       <w:r>
         <w:lastRenderedPageBreak/>
-        <w:t>rsyslog</w:t>
-      </w:r>
-      <w:bookmarkEnd w:id="14"/>
-    </w:p>
-    <w:p>
-      <w:pPr>
-        <w:pStyle w:val="Nadpis3"/>
-      </w:pPr>
-      <w:bookmarkStart w:id="15" w:name="_Toc222408005"/>
-      <w:r>
-        <w:t>DMA</w:t>
-      </w:r>
-      <w:bookmarkEnd w:id="15"/>
-      <w:r>
-        <w:t>RC</w:t>
-      </w:r>
-    </w:p>
-    <w:p>
-      <w:pPr>
-        <w:pStyle w:val="Nadpis2"/>
-      </w:pPr>
-      <w:bookmarkStart w:id="16" w:name="_Toc222408006"/>
-      <w:r>
         <w:t>Storing and analyzing logs</w:t>
       </w:r>
       <w:bookmarkEnd w:id="16"/>
@@ -4795,7 +6500,7 @@
       <w:r>
         <w:t xml:space="preserve">(10). </w:t>
       </w:r>
-      <w:hyperlink r:id="rId16" w:history="1">
+      <w:hyperlink r:id="rId18" w:history="1">
         <w:r>
           <w:rPr>
             <w:rStyle w:val="Hypertextovodkaz"/>
@@ -4828,7 +6533,7 @@
       <w:r>
         <w:t xml:space="preserve">, 1393–1398. </w:t>
       </w:r>
-      <w:hyperlink r:id="rId17" w:history="1">
+      <w:hyperlink r:id="rId19" w:history="1">
         <w:r>
           <w:rPr>
             <w:rStyle w:val="Hypertextovodkaz"/>
@@ -4851,7 +6556,7 @@
       <w:r>
         <w:t xml:space="preserve">. </w:t>
       </w:r>
-      <w:hyperlink r:id="rId18" w:history="1">
+      <w:hyperlink r:id="rId20" w:history="1">
         <w:r>
           <w:rPr>
             <w:rStyle w:val="Hypertextovodkaz"/>
@@ -4866,7 +6571,7 @@
     <w:p>
       <w:pPr>
         <w:sectPr>
-          <w:footerReference w:type="default" r:id="rId19"/>
+          <w:footerReference w:type="default" r:id="rId21"/>
           <w:type w:val="continuous"/>
           <w:pgSz w:w="11906" w:h="16838" w:code="9"/>
           <w:pgMar w:top="1418" w:right="1418" w:bottom="1418" w:left="1418" w:header="709" w:footer="709" w:gutter="284"/>
@@ -4888,7 +6593,7 @@
     </w:p>
     <w:p/>
     <w:sectPr>
-      <w:footerReference w:type="first" r:id="rId20"/>
+      <w:footerReference w:type="first" r:id="rId22"/>
       <w:pgSz w:w="11906" w:h="16838" w:code="9"/>
       <w:pgMar w:top="1418" w:right="1418" w:bottom="1418" w:left="1418" w:header="709" w:footer="709" w:gutter="284"/>
       <w:pgNumType w:fmt="upperRoman" w:start="1"/>
@@ -5092,6 +6797,94 @@
 <file path=word/numbering.xml><?xml version="1.0" encoding="utf-8"?>
 <w:numbering xmlns:wpc="http://schemas.microsoft.com/office/word/2010/wordprocessingCanvas" xmlns:cx="http://schemas.microsoft.com/office/drawing/2014/chartex" xmlns:cx1="http://schemas.microsoft.com/office/drawing/2015/9/8/chartex" xmlns:cx2="http://schemas.microsoft.com/office/drawing/2015/10/21/chartex" xmlns:cx3="http://schemas.microsoft.com/office/drawing/2016/5/9/chartex" xmlns:cx4="http://schemas.microsoft.com/office/drawing/2016/5/10/chartex" xmlns:cx5="http://schemas.microsoft.com/office/drawing/2016/5/11/chartex" xmlns:cx6="http://schemas.microsoft.com/office/drawing/2016/5/12/chartex" xmlns:cx7="http://schemas.microsoft.com/office/drawing/2016/5/13/chartex" xmlns:cx8="http://schemas.microsoft.com/office/drawing/2016/5/14/chartex" xmlns:mc="http://schemas.openxmlformats.org/markup-compatibility/2006" xmlns:aink="http://schemas.microsoft.com/office/drawing/2016/ink" xmlns:am3d="http://schemas.microsoft.com/office/drawing/2017/model3d" xmlns:o="urn:schemas-microsoft-com:office:office" xmlns:oel="http://schemas.microsoft.com/office/2019/extlst" xmlns:r="http://schemas.openxmlformats.org/officeDocument/2006/relationships" xmlns:m="http://schemas.openxmlformats.org/officeDocument/2006/math" xmlns:v="urn:schemas-microsoft-com:vml" xmlns:wp14="http://schemas.microsoft.com/office/word/2010/wordprocessingDrawing" xmlns:wp="http://schemas.openxmlformats.org/drawingml/2006/wordprocessingDrawing" xmlns:w10="urn:schemas-microsoft-com:office:word" xmlns:w="http://schemas.openxmlformats.org/wordprocessingml/2006/main" xmlns:w14="http://schemas.microsoft.com/office/word/2010/wordml" xmlns:w15="http://schemas.microsoft.com/office/word/2012/wordml" xmlns:w16cex="http://schemas.microsoft.com/office/word/2018/wordml/cex" xmlns:w16cid="http://schemas.microsoft.com/office/word/2016/wordml/cid" xmlns:w16="http://schemas.microsoft.com/office/word/2018/wordml" xmlns:w16du="http://schemas.microsoft.com/office/word/2023/wordml/word16du" xmlns:w16sdtdh="http://schemas.microsoft.com/office/word/2020/wordml/sdtdatahash" xmlns:w16sdtfl="http://schemas.microsoft.com/office/word/2024/wordml/sdtformatlock" xmlns:w16se="http://schemas.microsoft.com/office/word/2015/wordml/symex" xmlns:wpg="http://schemas.microsoft.com/office/word/2010/wordprocessingGroup" xmlns:wpi="http://schemas.microsoft.com/office/word/2010/wordprocessingInk" xmlns:wne="http://schemas.microsoft.com/office/word/2006/wordml" xmlns:wps="http://schemas.microsoft.com/office/word/2010/wordprocessingShape" mc:Ignorable="w14 w15 w16se w16cid w16 w16cex w16sdtdh w16sdtfl w16du wp14">
   <w:abstractNum w:abstractNumId="0" w15:restartNumberingAfterBreak="0">
+    <w:nsid w:val="016B2126"/>
+    <w:multiLevelType w:val="hybridMultilevel"/>
+    <w:tmpl w:val="E13E8CD2"/>
+    <w:lvl w:ilvl="0" w:tplc="C494FD16">
+      <w:numFmt w:val="decimal"/>
+      <w:lvlText w:val="%1"/>
+      <w:lvlJc w:val="left"/>
+      <w:pPr>
+        <w:ind w:left="1176" w:hanging="816"/>
+      </w:pPr>
+      <w:rPr>
+        <w:rFonts w:hint="default"/>
+      </w:rPr>
+    </w:lvl>
+    <w:lvl w:ilvl="1" w:tplc="08090019">
+      <w:start w:val="1"/>
+      <w:numFmt w:val="lowerLetter"/>
+      <w:lvlText w:val="%2."/>
+      <w:lvlJc w:val="left"/>
+      <w:pPr>
+        <w:ind w:left="1440" w:hanging="360"/>
+      </w:pPr>
+    </w:lvl>
+    <w:lvl w:ilvl="2" w:tplc="0809001B" w:tentative="1">
+      <w:start w:val="1"/>
+      <w:numFmt w:val="lowerRoman"/>
+      <w:lvlText w:val="%3."/>
+      <w:lvlJc w:val="right"/>
+      <w:pPr>
+        <w:ind w:left="2160" w:hanging="180"/>
+      </w:pPr>
+    </w:lvl>
+    <w:lvl w:ilvl="3" w:tplc="0809000F" w:tentative="1">
+      <w:start w:val="1"/>
+      <w:numFmt w:val="decimal"/>
+      <w:lvlText w:val="%4."/>
+      <w:lvlJc w:val="left"/>
+      <w:pPr>
+        <w:ind w:left="2880" w:hanging="360"/>
+      </w:pPr>
+    </w:lvl>
+    <w:lvl w:ilvl="4" w:tplc="08090019" w:tentative="1">
+      <w:start w:val="1"/>
+      <w:numFmt w:val="lowerLetter"/>
+      <w:lvlText w:val="%5."/>
+      <w:lvlJc w:val="left"/>
+      <w:pPr>
+        <w:ind w:left="3600" w:hanging="360"/>
+      </w:pPr>
+    </w:lvl>
+    <w:lvl w:ilvl="5" w:tplc="0809001B" w:tentative="1">
+      <w:start w:val="1"/>
+      <w:numFmt w:val="lowerRoman"/>
+      <w:lvlText w:val="%6."/>
+      <w:lvlJc w:val="right"/>
+      <w:pPr>
+        <w:ind w:left="4320" w:hanging="180"/>
+      </w:pPr>
+    </w:lvl>
+    <w:lvl w:ilvl="6" w:tplc="0809000F" w:tentative="1">
+      <w:start w:val="1"/>
+      <w:numFmt w:val="decimal"/>
+      <w:lvlText w:val="%7."/>
+      <w:lvlJc w:val="left"/>
+      <w:pPr>
+        <w:ind w:left="5040" w:hanging="360"/>
+      </w:pPr>
+    </w:lvl>
+    <w:lvl w:ilvl="7" w:tplc="08090019" w:tentative="1">
+      <w:start w:val="1"/>
+      <w:numFmt w:val="lowerLetter"/>
+      <w:lvlText w:val="%8."/>
+      <w:lvlJc w:val="left"/>
+      <w:pPr>
+        <w:ind w:left="5760" w:hanging="360"/>
+      </w:pPr>
+    </w:lvl>
+    <w:lvl w:ilvl="8" w:tplc="0809001B" w:tentative="1">
+      <w:start w:val="1"/>
+      <w:numFmt w:val="lowerRoman"/>
+      <w:lvlText w:val="%9."/>
+      <w:lvlJc w:val="right"/>
+      <w:pPr>
+        <w:ind w:left="6480" w:hanging="180"/>
+      </w:pPr>
+    </w:lvl>
+  </w:abstractNum>
+  <w:abstractNum w:abstractNumId="1" w15:restartNumberingAfterBreak="0">
     <w:nsid w:val="02005A35"/>
     <w:multiLevelType w:val="hybridMultilevel"/>
     <w:tmpl w:val="DD14E824"/>
@@ -5204,7 +6997,7 @@
       </w:rPr>
     </w:lvl>
   </w:abstractNum>
-  <w:abstractNum w:abstractNumId="1" w15:restartNumberingAfterBreak="0">
+  <w:abstractNum w:abstractNumId="2" w15:restartNumberingAfterBreak="0">
     <w:nsid w:val="04641490"/>
     <w:multiLevelType w:val="hybridMultilevel"/>
     <w:tmpl w:val="36D2644E"/>
@@ -5317,7 +7110,179 @@
       </w:rPr>
     </w:lvl>
   </w:abstractNum>
-  <w:abstractNum w:abstractNumId="2" w15:restartNumberingAfterBreak="0">
+  <w:abstractNum w:abstractNumId="3" w15:restartNumberingAfterBreak="0">
+    <w:nsid w:val="09716B4E"/>
+    <w:multiLevelType w:val="hybridMultilevel"/>
+    <w:tmpl w:val="9B6604D8"/>
+    <w:lvl w:ilvl="0" w:tplc="0809000F">
+      <w:start w:val="1"/>
+      <w:numFmt w:val="decimal"/>
+      <w:lvlText w:val="%1."/>
+      <w:lvlJc w:val="left"/>
+      <w:pPr>
+        <w:ind w:left="720" w:hanging="360"/>
+      </w:pPr>
+    </w:lvl>
+    <w:lvl w:ilvl="1" w:tplc="08090019" w:tentative="1">
+      <w:start w:val="1"/>
+      <w:numFmt w:val="lowerLetter"/>
+      <w:lvlText w:val="%2."/>
+      <w:lvlJc w:val="left"/>
+      <w:pPr>
+        <w:ind w:left="1440" w:hanging="360"/>
+      </w:pPr>
+    </w:lvl>
+    <w:lvl w:ilvl="2" w:tplc="0809001B" w:tentative="1">
+      <w:start w:val="1"/>
+      <w:numFmt w:val="lowerRoman"/>
+      <w:lvlText w:val="%3."/>
+      <w:lvlJc w:val="right"/>
+      <w:pPr>
+        <w:ind w:left="2160" w:hanging="180"/>
+      </w:pPr>
+    </w:lvl>
+    <w:lvl w:ilvl="3" w:tplc="0809000F" w:tentative="1">
+      <w:start w:val="1"/>
+      <w:numFmt w:val="decimal"/>
+      <w:lvlText w:val="%4."/>
+      <w:lvlJc w:val="left"/>
+      <w:pPr>
+        <w:ind w:left="2880" w:hanging="360"/>
+      </w:pPr>
+    </w:lvl>
+    <w:lvl w:ilvl="4" w:tplc="08090019" w:tentative="1">
+      <w:start w:val="1"/>
+      <w:numFmt w:val="lowerLetter"/>
+      <w:lvlText w:val="%5."/>
+      <w:lvlJc w:val="left"/>
+      <w:pPr>
+        <w:ind w:left="3600" w:hanging="360"/>
+      </w:pPr>
+    </w:lvl>
+    <w:lvl w:ilvl="5" w:tplc="0809001B" w:tentative="1">
+      <w:start w:val="1"/>
+      <w:numFmt w:val="lowerRoman"/>
+      <w:lvlText w:val="%6."/>
+      <w:lvlJc w:val="right"/>
+      <w:pPr>
+        <w:ind w:left="4320" w:hanging="180"/>
+      </w:pPr>
+    </w:lvl>
+    <w:lvl w:ilvl="6" w:tplc="0809000F" w:tentative="1">
+      <w:start w:val="1"/>
+      <w:numFmt w:val="decimal"/>
+      <w:lvlText w:val="%7."/>
+      <w:lvlJc w:val="left"/>
+      <w:pPr>
+        <w:ind w:left="5040" w:hanging="360"/>
+      </w:pPr>
+    </w:lvl>
+    <w:lvl w:ilvl="7" w:tplc="08090019" w:tentative="1">
+      <w:start w:val="1"/>
+      <w:numFmt w:val="lowerLetter"/>
+      <w:lvlText w:val="%8."/>
+      <w:lvlJc w:val="left"/>
+      <w:pPr>
+        <w:ind w:left="5760" w:hanging="360"/>
+      </w:pPr>
+    </w:lvl>
+    <w:lvl w:ilvl="8" w:tplc="0809001B" w:tentative="1">
+      <w:start w:val="1"/>
+      <w:numFmt w:val="lowerRoman"/>
+      <w:lvlText w:val="%9."/>
+      <w:lvlJc w:val="right"/>
+      <w:pPr>
+        <w:ind w:left="6480" w:hanging="180"/>
+      </w:pPr>
+    </w:lvl>
+  </w:abstractNum>
+  <w:abstractNum w:abstractNumId="4" w15:restartNumberingAfterBreak="0">
+    <w:nsid w:val="0AB3247B"/>
+    <w:multiLevelType w:val="hybridMultilevel"/>
+    <w:tmpl w:val="58A2C80C"/>
+    <w:lvl w:ilvl="0" w:tplc="0809000F">
+      <w:start w:val="1"/>
+      <w:numFmt w:val="decimal"/>
+      <w:lvlText w:val="%1."/>
+      <w:lvlJc w:val="left"/>
+      <w:pPr>
+        <w:ind w:left="720" w:hanging="360"/>
+      </w:pPr>
+    </w:lvl>
+    <w:lvl w:ilvl="1" w:tplc="08090019" w:tentative="1">
+      <w:start w:val="1"/>
+      <w:numFmt w:val="lowerLetter"/>
+      <w:lvlText w:val="%2."/>
+      <w:lvlJc w:val="left"/>
+      <w:pPr>
+        <w:ind w:left="1440" w:hanging="360"/>
+      </w:pPr>
+    </w:lvl>
+    <w:lvl w:ilvl="2" w:tplc="0809001B" w:tentative="1">
+      <w:start w:val="1"/>
+      <w:numFmt w:val="lowerRoman"/>
+      <w:lvlText w:val="%3."/>
+      <w:lvlJc w:val="right"/>
+      <w:pPr>
+        <w:ind w:left="2160" w:hanging="180"/>
+      </w:pPr>
+    </w:lvl>
+    <w:lvl w:ilvl="3" w:tplc="0809000F" w:tentative="1">
+      <w:start w:val="1"/>
+      <w:numFmt w:val="decimal"/>
+      <w:lvlText w:val="%4."/>
+      <w:lvlJc w:val="left"/>
+      <w:pPr>
+        <w:ind w:left="2880" w:hanging="360"/>
+      </w:pPr>
+    </w:lvl>
+    <w:lvl w:ilvl="4" w:tplc="08090019" w:tentative="1">
+      <w:start w:val="1"/>
+      <w:numFmt w:val="lowerLetter"/>
+      <w:lvlText w:val="%5."/>
+      <w:lvlJc w:val="left"/>
+      <w:pPr>
+        <w:ind w:left="3600" w:hanging="360"/>
+      </w:pPr>
+    </w:lvl>
+    <w:lvl w:ilvl="5" w:tplc="0809001B" w:tentative="1">
+      <w:start w:val="1"/>
+      <w:numFmt w:val="lowerRoman"/>
+      <w:lvlText w:val="%6."/>
+      <w:lvlJc w:val="right"/>
+      <w:pPr>
+        <w:ind w:left="4320" w:hanging="180"/>
+      </w:pPr>
+    </w:lvl>
+    <w:lvl w:ilvl="6" w:tplc="0809000F" w:tentative="1">
+      <w:start w:val="1"/>
+      <w:numFmt w:val="decimal"/>
+      <w:lvlText w:val="%7."/>
+      <w:lvlJc w:val="left"/>
+      <w:pPr>
+        <w:ind w:left="5040" w:hanging="360"/>
+      </w:pPr>
+    </w:lvl>
+    <w:lvl w:ilvl="7" w:tplc="08090019" w:tentative="1">
+      <w:start w:val="1"/>
+      <w:numFmt w:val="lowerLetter"/>
+      <w:lvlText w:val="%8."/>
+      <w:lvlJc w:val="left"/>
+      <w:pPr>
+        <w:ind w:left="5760" w:hanging="360"/>
+      </w:pPr>
+    </w:lvl>
+    <w:lvl w:ilvl="8" w:tplc="0809001B" w:tentative="1">
+      <w:start w:val="1"/>
+      <w:numFmt w:val="lowerRoman"/>
+      <w:lvlText w:val="%9."/>
+      <w:lvlJc w:val="right"/>
+      <w:pPr>
+        <w:ind w:left="6480" w:hanging="180"/>
+      </w:pPr>
+    </w:lvl>
+  </w:abstractNum>
+  <w:abstractNum w:abstractNumId="5" w15:restartNumberingAfterBreak="0">
     <w:nsid w:val="0B515033"/>
     <w:multiLevelType w:val="hybridMultilevel"/>
     <w:tmpl w:val="F5F8C7F0"/>
@@ -5430,7 +7395,183 @@
       </w:rPr>
     </w:lvl>
   </w:abstractNum>
-  <w:abstractNum w:abstractNumId="3" w15:restartNumberingAfterBreak="0">
+  <w:abstractNum w:abstractNumId="6" w15:restartNumberingAfterBreak="0">
+    <w:nsid w:val="0D786562"/>
+    <w:multiLevelType w:val="hybridMultilevel"/>
+    <w:tmpl w:val="66D0B7CE"/>
+    <w:lvl w:ilvl="0" w:tplc="C494FD16">
+      <w:numFmt w:val="decimal"/>
+      <w:lvlText w:val="%1"/>
+      <w:lvlJc w:val="left"/>
+      <w:pPr>
+        <w:ind w:left="1176" w:hanging="816"/>
+      </w:pPr>
+      <w:rPr>
+        <w:rFonts w:hint="default"/>
+      </w:rPr>
+    </w:lvl>
+    <w:lvl w:ilvl="1" w:tplc="08090019">
+      <w:start w:val="1"/>
+      <w:numFmt w:val="lowerLetter"/>
+      <w:lvlText w:val="%2."/>
+      <w:lvlJc w:val="left"/>
+      <w:pPr>
+        <w:ind w:left="1440" w:hanging="360"/>
+      </w:pPr>
+    </w:lvl>
+    <w:lvl w:ilvl="2" w:tplc="0809001B" w:tentative="1">
+      <w:start w:val="1"/>
+      <w:numFmt w:val="lowerRoman"/>
+      <w:lvlText w:val="%3."/>
+      <w:lvlJc w:val="right"/>
+      <w:pPr>
+        <w:ind w:left="2160" w:hanging="180"/>
+      </w:pPr>
+    </w:lvl>
+    <w:lvl w:ilvl="3" w:tplc="0809000F" w:tentative="1">
+      <w:start w:val="1"/>
+      <w:numFmt w:val="decimal"/>
+      <w:lvlText w:val="%4."/>
+      <w:lvlJc w:val="left"/>
+      <w:pPr>
+        <w:ind w:left="2880" w:hanging="360"/>
+      </w:pPr>
+    </w:lvl>
+    <w:lvl w:ilvl="4" w:tplc="08090019" w:tentative="1">
+      <w:start w:val="1"/>
+      <w:numFmt w:val="lowerLetter"/>
+      <w:lvlText w:val="%5."/>
+      <w:lvlJc w:val="left"/>
+      <w:pPr>
+        <w:ind w:left="3600" w:hanging="360"/>
+      </w:pPr>
+    </w:lvl>
+    <w:lvl w:ilvl="5" w:tplc="0809001B" w:tentative="1">
+      <w:start w:val="1"/>
+      <w:numFmt w:val="lowerRoman"/>
+      <w:lvlText w:val="%6."/>
+      <w:lvlJc w:val="right"/>
+      <w:pPr>
+        <w:ind w:left="4320" w:hanging="180"/>
+      </w:pPr>
+    </w:lvl>
+    <w:lvl w:ilvl="6" w:tplc="0809000F" w:tentative="1">
+      <w:start w:val="1"/>
+      <w:numFmt w:val="decimal"/>
+      <w:lvlText w:val="%7."/>
+      <w:lvlJc w:val="left"/>
+      <w:pPr>
+        <w:ind w:left="5040" w:hanging="360"/>
+      </w:pPr>
+    </w:lvl>
+    <w:lvl w:ilvl="7" w:tplc="08090019" w:tentative="1">
+      <w:start w:val="1"/>
+      <w:numFmt w:val="lowerLetter"/>
+      <w:lvlText w:val="%8."/>
+      <w:lvlJc w:val="left"/>
+      <w:pPr>
+        <w:ind w:left="5760" w:hanging="360"/>
+      </w:pPr>
+    </w:lvl>
+    <w:lvl w:ilvl="8" w:tplc="0809001B" w:tentative="1">
+      <w:start w:val="1"/>
+      <w:numFmt w:val="lowerRoman"/>
+      <w:lvlText w:val="%9."/>
+      <w:lvlJc w:val="right"/>
+      <w:pPr>
+        <w:ind w:left="6480" w:hanging="180"/>
+      </w:pPr>
+    </w:lvl>
+  </w:abstractNum>
+  <w:abstractNum w:abstractNumId="7" w15:restartNumberingAfterBreak="0">
+    <w:nsid w:val="0D8F61FD"/>
+    <w:multiLevelType w:val="hybridMultilevel"/>
+    <w:tmpl w:val="FE4AF76E"/>
+    <w:lvl w:ilvl="0" w:tplc="C494FD16">
+      <w:numFmt w:val="decimal"/>
+      <w:lvlText w:val="%1"/>
+      <w:lvlJc w:val="left"/>
+      <w:pPr>
+        <w:ind w:left="1176" w:hanging="816"/>
+      </w:pPr>
+      <w:rPr>
+        <w:rFonts w:hint="default"/>
+      </w:rPr>
+    </w:lvl>
+    <w:lvl w:ilvl="1" w:tplc="08090019" w:tentative="1">
+      <w:start w:val="1"/>
+      <w:numFmt w:val="lowerLetter"/>
+      <w:lvlText w:val="%2."/>
+      <w:lvlJc w:val="left"/>
+      <w:pPr>
+        <w:ind w:left="1440" w:hanging="360"/>
+      </w:pPr>
+    </w:lvl>
+    <w:lvl w:ilvl="2" w:tplc="0809001B" w:tentative="1">
+      <w:start w:val="1"/>
+      <w:numFmt w:val="lowerRoman"/>
+      <w:lvlText w:val="%3."/>
+      <w:lvlJc w:val="right"/>
+      <w:pPr>
+        <w:ind w:left="2160" w:hanging="180"/>
+      </w:pPr>
+    </w:lvl>
+    <w:lvl w:ilvl="3" w:tplc="0809000F" w:tentative="1">
+      <w:start w:val="1"/>
+      <w:numFmt w:val="decimal"/>
+      <w:lvlText w:val="%4."/>
+      <w:lvlJc w:val="left"/>
+      <w:pPr>
+        <w:ind w:left="2880" w:hanging="360"/>
+      </w:pPr>
+    </w:lvl>
+    <w:lvl w:ilvl="4" w:tplc="08090019" w:tentative="1">
+      <w:start w:val="1"/>
+      <w:numFmt w:val="lowerLetter"/>
+      <w:lvlText w:val="%5."/>
+      <w:lvlJc w:val="left"/>
+      <w:pPr>
+        <w:ind w:left="3600" w:hanging="360"/>
+      </w:pPr>
+    </w:lvl>
+    <w:lvl w:ilvl="5" w:tplc="0809001B" w:tentative="1">
+      <w:start w:val="1"/>
+      <w:numFmt w:val="lowerRoman"/>
+      <w:lvlText w:val="%6."/>
+      <w:lvlJc w:val="right"/>
+      <w:pPr>
+        <w:ind w:left="4320" w:hanging="180"/>
+      </w:pPr>
+    </w:lvl>
+    <w:lvl w:ilvl="6" w:tplc="0809000F" w:tentative="1">
+      <w:start w:val="1"/>
+      <w:numFmt w:val="decimal"/>
+      <w:lvlText w:val="%7."/>
+      <w:lvlJc w:val="left"/>
+      <w:pPr>
+        <w:ind w:left="5040" w:hanging="360"/>
+      </w:pPr>
+    </w:lvl>
+    <w:lvl w:ilvl="7" w:tplc="08090019" w:tentative="1">
+      <w:start w:val="1"/>
+      <w:numFmt w:val="lowerLetter"/>
+      <w:lvlText w:val="%8."/>
+      <w:lvlJc w:val="left"/>
+      <w:pPr>
+        <w:ind w:left="5760" w:hanging="360"/>
+      </w:pPr>
+    </w:lvl>
+    <w:lvl w:ilvl="8" w:tplc="0809001B" w:tentative="1">
+      <w:start w:val="1"/>
+      <w:numFmt w:val="lowerRoman"/>
+      <w:lvlText w:val="%9."/>
+      <w:lvlJc w:val="right"/>
+      <w:pPr>
+        <w:ind w:left="6480" w:hanging="180"/>
+      </w:pPr>
+    </w:lvl>
+  </w:abstractNum>
+  <w:abstractNum w:abstractNumId="8" w15:restartNumberingAfterBreak="0">
     <w:nsid w:val="0DFA6A73"/>
     <w:multiLevelType w:val="hybridMultilevel"/>
     <w:tmpl w:val="A750381A"/>
@@ -5543,7 +7684,7 @@
       </w:rPr>
     </w:lvl>
   </w:abstractNum>
-  <w:abstractNum w:abstractNumId="4" w15:restartNumberingAfterBreak="0">
+  <w:abstractNum w:abstractNumId="9" w15:restartNumberingAfterBreak="0">
     <w:nsid w:val="0EBE37C3"/>
     <w:multiLevelType w:val="hybridMultilevel"/>
     <w:tmpl w:val="003EC7E4"/>
@@ -5656,7 +7797,7 @@
       </w:rPr>
     </w:lvl>
   </w:abstractNum>
-  <w:abstractNum w:abstractNumId="5" w15:restartNumberingAfterBreak="0">
+  <w:abstractNum w:abstractNumId="10" w15:restartNumberingAfterBreak="0">
     <w:nsid w:val="0F3476A4"/>
     <w:multiLevelType w:val="hybridMultilevel"/>
     <w:tmpl w:val="88640D26"/>
@@ -5769,7 +7910,7 @@
       </w:rPr>
     </w:lvl>
   </w:abstractNum>
-  <w:abstractNum w:abstractNumId="6" w15:restartNumberingAfterBreak="0">
+  <w:abstractNum w:abstractNumId="11" w15:restartNumberingAfterBreak="0">
     <w:nsid w:val="11B8627D"/>
     <w:multiLevelType w:val="hybridMultilevel"/>
     <w:tmpl w:val="571EA94A"/>
@@ -5882,7 +8023,7 @@
       </w:rPr>
     </w:lvl>
   </w:abstractNum>
-  <w:abstractNum w:abstractNumId="7" w15:restartNumberingAfterBreak="0">
+  <w:abstractNum w:abstractNumId="12" w15:restartNumberingAfterBreak="0">
     <w:nsid w:val="1DE8106F"/>
     <w:multiLevelType w:val="hybridMultilevel"/>
     <w:tmpl w:val="01AA4DDA"/>
@@ -5995,7 +8136,120 @@
       </w:rPr>
     </w:lvl>
   </w:abstractNum>
-  <w:abstractNum w:abstractNumId="8" w15:restartNumberingAfterBreak="0">
+  <w:abstractNum w:abstractNumId="13" w15:restartNumberingAfterBreak="0">
+    <w:nsid w:val="250C7B49"/>
+    <w:multiLevelType w:val="hybridMultilevel"/>
+    <w:tmpl w:val="D5C8E642"/>
+    <w:lvl w:ilvl="0" w:tplc="08090001">
+      <w:start w:val="1"/>
+      <w:numFmt w:val="bullet"/>
+      <w:lvlText w:val=""/>
+      <w:lvlJc w:val="left"/>
+      <w:pPr>
+        <w:ind w:left="720" w:hanging="360"/>
+      </w:pPr>
+      <w:rPr>
+        <w:rFonts w:ascii="Symbol" w:hAnsi="Symbol" w:hint="default"/>
+      </w:rPr>
+    </w:lvl>
+    <w:lvl w:ilvl="1" w:tplc="08090003" w:tentative="1">
+      <w:start w:val="1"/>
+      <w:numFmt w:val="bullet"/>
+      <w:lvlText w:val="o"/>
+      <w:lvlJc w:val="left"/>
+      <w:pPr>
+        <w:ind w:left="1440" w:hanging="360"/>
+      </w:pPr>
+      <w:rPr>
+        <w:rFonts w:ascii="Courier New" w:hAnsi="Courier New" w:cs="Courier New" w:hint="default"/>
+      </w:rPr>
+    </w:lvl>
+    <w:lvl w:ilvl="2" w:tplc="08090005" w:tentative="1">
+      <w:start w:val="1"/>
+      <w:numFmt w:val="bullet"/>
+      <w:lvlText w:val=""/>
+      <w:lvlJc w:val="left"/>
+      <w:pPr>
+        <w:ind w:left="2160" w:hanging="360"/>
+      </w:pPr>
+      <w:rPr>
+        <w:rFonts w:ascii="Wingdings" w:hAnsi="Wingdings" w:hint="default"/>
+      </w:rPr>
+    </w:lvl>
+    <w:lvl w:ilvl="3" w:tplc="08090001" w:tentative="1">
+      <w:start w:val="1"/>
+      <w:numFmt w:val="bullet"/>
+      <w:lvlText w:val=""/>
+      <w:lvlJc w:val="left"/>
+      <w:pPr>
+        <w:ind w:left="2880" w:hanging="360"/>
+      </w:pPr>
+      <w:rPr>
+        <w:rFonts w:ascii="Symbol" w:hAnsi="Symbol" w:hint="default"/>
+      </w:rPr>
+    </w:lvl>
+    <w:lvl w:ilvl="4" w:tplc="08090003" w:tentative="1">
+      <w:start w:val="1"/>
+      <w:numFmt w:val="bullet"/>
+      <w:lvlText w:val="o"/>
+      <w:lvlJc w:val="left"/>
+      <w:pPr>
+        <w:ind w:left="3600" w:hanging="360"/>
+      </w:pPr>
+      <w:rPr>
+        <w:rFonts w:ascii="Courier New" w:hAnsi="Courier New" w:cs="Courier New" w:hint="default"/>
+      </w:rPr>
+    </w:lvl>
+    <w:lvl w:ilvl="5" w:tplc="08090005" w:tentative="1">
+      <w:start w:val="1"/>
+      <w:numFmt w:val="bullet"/>
+      <w:lvlText w:val=""/>
+      <w:lvlJc w:val="left"/>
+      <w:pPr>
+        <w:ind w:left="4320" w:hanging="360"/>
+      </w:pPr>
+      <w:rPr>
+        <w:rFonts w:ascii="Wingdings" w:hAnsi="Wingdings" w:hint="default"/>
+      </w:rPr>
+    </w:lvl>
+    <w:lvl w:ilvl="6" w:tplc="08090001" w:tentative="1">
+      <w:start w:val="1"/>
+      <w:numFmt w:val="bullet"/>
+      <w:lvlText w:val=""/>
+      <w:lvlJc w:val="left"/>
+      <w:pPr>
+        <w:ind w:left="5040" w:hanging="360"/>
+      </w:pPr>
+      <w:rPr>
+        <w:rFonts w:ascii="Symbol" w:hAnsi="Symbol" w:hint="default"/>
+      </w:rPr>
+    </w:lvl>
+    <w:lvl w:ilvl="7" w:tplc="08090003" w:tentative="1">
+      <w:start w:val="1"/>
+      <w:numFmt w:val="bullet"/>
+      <w:lvlText w:val="o"/>
+      <w:lvlJc w:val="left"/>
+      <w:pPr>
+        <w:ind w:left="5760" w:hanging="360"/>
+      </w:pPr>
+      <w:rPr>
+        <w:rFonts w:ascii="Courier New" w:hAnsi="Courier New" w:cs="Courier New" w:hint="default"/>
+      </w:rPr>
+    </w:lvl>
+    <w:lvl w:ilvl="8" w:tplc="08090005" w:tentative="1">
+      <w:start w:val="1"/>
+      <w:numFmt w:val="bullet"/>
+      <w:lvlText w:val=""/>
+      <w:lvlJc w:val="left"/>
+      <w:pPr>
+        <w:ind w:left="6480" w:hanging="360"/>
+      </w:pPr>
+      <w:rPr>
+        <w:rFonts w:ascii="Wingdings" w:hAnsi="Wingdings" w:hint="default"/>
+      </w:rPr>
+    </w:lvl>
+  </w:abstractNum>
+  <w:abstractNum w:abstractNumId="14" w15:restartNumberingAfterBreak="0">
     <w:nsid w:val="25F44B3F"/>
     <w:multiLevelType w:val="hybridMultilevel"/>
     <w:tmpl w:val="C44293AC"/>
@@ -6107,7 +8361,7 @@
       </w:rPr>
     </w:lvl>
   </w:abstractNum>
-  <w:abstractNum w:abstractNumId="9" w15:restartNumberingAfterBreak="0">
+  <w:abstractNum w:abstractNumId="15" w15:restartNumberingAfterBreak="0">
     <w:nsid w:val="28AC0914"/>
     <w:multiLevelType w:val="hybridMultilevel"/>
     <w:tmpl w:val="7E66A68C"/>
@@ -6220,7 +8474,7 @@
       </w:rPr>
     </w:lvl>
   </w:abstractNum>
-  <w:abstractNum w:abstractNumId="10" w15:restartNumberingAfterBreak="0">
+  <w:abstractNum w:abstractNumId="16" w15:restartNumberingAfterBreak="0">
     <w:nsid w:val="2A5E20FB"/>
     <w:multiLevelType w:val="hybridMultilevel"/>
     <w:tmpl w:val="4798295C"/>
@@ -6333,7 +8587,7 @@
       </w:rPr>
     </w:lvl>
   </w:abstractNum>
-  <w:abstractNum w:abstractNumId="11" w15:restartNumberingAfterBreak="0">
+  <w:abstractNum w:abstractNumId="17" w15:restartNumberingAfterBreak="0">
     <w:nsid w:val="2E9C55DE"/>
     <w:multiLevelType w:val="hybridMultilevel"/>
     <w:tmpl w:val="D3AE6432"/>
@@ -6445,7 +8699,7 @@
       </w:rPr>
     </w:lvl>
   </w:abstractNum>
-  <w:abstractNum w:abstractNumId="12" w15:restartNumberingAfterBreak="0">
+  <w:abstractNum w:abstractNumId="18" w15:restartNumberingAfterBreak="0">
     <w:nsid w:val="324A72F7"/>
     <w:multiLevelType w:val="hybridMultilevel"/>
     <w:tmpl w:val="819EF9EE"/>
@@ -6558,7 +8812,7 @@
       </w:rPr>
     </w:lvl>
   </w:abstractNum>
-  <w:abstractNum w:abstractNumId="13" w15:restartNumberingAfterBreak="0">
+  <w:abstractNum w:abstractNumId="19" w15:restartNumberingAfterBreak="0">
     <w:nsid w:val="36093E53"/>
     <w:multiLevelType w:val="hybridMultilevel"/>
     <w:tmpl w:val="B0DC7B9C"/>
@@ -6670,7 +8924,7 @@
       </w:rPr>
     </w:lvl>
   </w:abstractNum>
-  <w:abstractNum w:abstractNumId="14" w15:restartNumberingAfterBreak="0">
+  <w:abstractNum w:abstractNumId="20" w15:restartNumberingAfterBreak="0">
     <w:nsid w:val="39953D46"/>
     <w:multiLevelType w:val="hybridMultilevel"/>
     <w:tmpl w:val="DD0CC1C8"/>
@@ -6783,7 +9037,7 @@
       </w:rPr>
     </w:lvl>
   </w:abstractNum>
-  <w:abstractNum w:abstractNumId="15" w15:restartNumberingAfterBreak="0">
+  <w:abstractNum w:abstractNumId="21" w15:restartNumberingAfterBreak="0">
     <w:nsid w:val="3A297E0E"/>
     <w:multiLevelType w:val="hybridMultilevel"/>
     <w:tmpl w:val="6F187ADE"/>
@@ -6896,7 +9150,7 @@
       </w:rPr>
     </w:lvl>
   </w:abstractNum>
-  <w:abstractNum w:abstractNumId="16" w15:restartNumberingAfterBreak="0">
+  <w:abstractNum w:abstractNumId="22" w15:restartNumberingAfterBreak="0">
     <w:nsid w:val="3F1C639D"/>
     <w:multiLevelType w:val="hybridMultilevel"/>
     <w:tmpl w:val="0EB23D7A"/>
@@ -7009,7 +9263,7 @@
       </w:rPr>
     </w:lvl>
   </w:abstractNum>
-  <w:abstractNum w:abstractNumId="17" w15:restartNumberingAfterBreak="0">
+  <w:abstractNum w:abstractNumId="23" w15:restartNumberingAfterBreak="0">
     <w:nsid w:val="3F764A25"/>
     <w:multiLevelType w:val="hybridMultilevel"/>
     <w:tmpl w:val="71E60104"/>
@@ -7121,7 +9375,7 @@
       </w:rPr>
     </w:lvl>
   </w:abstractNum>
-  <w:abstractNum w:abstractNumId="18" w15:restartNumberingAfterBreak="0">
+  <w:abstractNum w:abstractNumId="24" w15:restartNumberingAfterBreak="0">
     <w:nsid w:val="49A61E05"/>
     <w:multiLevelType w:val="multilevel"/>
     <w:tmpl w:val="68C8236A"/>
@@ -7236,7 +9490,7 @@
       </w:rPr>
     </w:lvl>
   </w:abstractNum>
-  <w:abstractNum w:abstractNumId="19" w15:restartNumberingAfterBreak="0">
+  <w:abstractNum w:abstractNumId="25" w15:restartNumberingAfterBreak="0">
     <w:nsid w:val="49E360DC"/>
     <w:multiLevelType w:val="hybridMultilevel"/>
     <w:tmpl w:val="650299C4"/>
@@ -7322,7 +9576,7 @@
       </w:pPr>
     </w:lvl>
   </w:abstractNum>
-  <w:abstractNum w:abstractNumId="20" w15:restartNumberingAfterBreak="0">
+  <w:abstractNum w:abstractNumId="26" w15:restartNumberingAfterBreak="0">
     <w:nsid w:val="4A084E4E"/>
     <w:multiLevelType w:val="hybridMultilevel"/>
     <w:tmpl w:val="DF5429E4"/>
@@ -7411,7 +9665,7 @@
       </w:pPr>
     </w:lvl>
   </w:abstractNum>
-  <w:abstractNum w:abstractNumId="21" w15:restartNumberingAfterBreak="0">
+  <w:abstractNum w:abstractNumId="27" w15:restartNumberingAfterBreak="0">
     <w:nsid w:val="5A6B816F"/>
     <w:multiLevelType w:val="hybridMultilevel"/>
     <w:tmpl w:val="8674763E"/>
@@ -7525,7 +9779,7 @@
       </w:rPr>
     </w:lvl>
   </w:abstractNum>
-  <w:abstractNum w:abstractNumId="22" w15:restartNumberingAfterBreak="0">
+  <w:abstractNum w:abstractNumId="28" w15:restartNumberingAfterBreak="0">
     <w:nsid w:val="5DBC5132"/>
     <w:multiLevelType w:val="hybridMultilevel"/>
     <w:tmpl w:val="782EE7CA"/>
@@ -7638,7 +9892,7 @@
       </w:rPr>
     </w:lvl>
   </w:abstractNum>
-  <w:abstractNum w:abstractNumId="23" w15:restartNumberingAfterBreak="0">
+  <w:abstractNum w:abstractNumId="29" w15:restartNumberingAfterBreak="0">
     <w:nsid w:val="631F5680"/>
     <w:multiLevelType w:val="multilevel"/>
     <w:tmpl w:val="F08CAB9E"/>
@@ -7751,7 +10005,96 @@
       </w:rPr>
     </w:lvl>
   </w:abstractNum>
-  <w:abstractNum w:abstractNumId="24" w15:restartNumberingAfterBreak="0">
+  <w:abstractNum w:abstractNumId="30" w15:restartNumberingAfterBreak="0">
+    <w:nsid w:val="63963E3C"/>
+    <w:multiLevelType w:val="hybridMultilevel"/>
+    <w:tmpl w:val="9970ECF8"/>
+    <w:lvl w:ilvl="0" w:tplc="A87888F0">
+      <w:start w:val="1"/>
+      <w:numFmt w:val="decimal"/>
+      <w:lvlText w:val="%1"/>
+      <w:lvlJc w:val="left"/>
+      <w:pPr>
+        <w:ind w:left="720" w:hanging="360"/>
+      </w:pPr>
+      <w:rPr>
+        <w:rFonts w:hint="default"/>
+      </w:rPr>
+    </w:lvl>
+    <w:lvl w:ilvl="1" w:tplc="08090019">
+      <w:start w:val="1"/>
+      <w:numFmt w:val="lowerLetter"/>
+      <w:lvlText w:val="%2."/>
+      <w:lvlJc w:val="left"/>
+      <w:pPr>
+        <w:ind w:left="1440" w:hanging="360"/>
+      </w:pPr>
+    </w:lvl>
+    <w:lvl w:ilvl="2" w:tplc="0809001B" w:tentative="1">
+      <w:start w:val="1"/>
+      <w:numFmt w:val="lowerRoman"/>
+      <w:lvlText w:val="%3."/>
+      <w:lvlJc w:val="right"/>
+      <w:pPr>
+        <w:ind w:left="2160" w:hanging="180"/>
+      </w:pPr>
+    </w:lvl>
+    <w:lvl w:ilvl="3" w:tplc="0809000F" w:tentative="1">
+      <w:start w:val="1"/>
+      <w:numFmt w:val="decimal"/>
+      <w:lvlText w:val="%4."/>
+      <w:lvlJc w:val="left"/>
+      <w:pPr>
+        <w:ind w:left="2880" w:hanging="360"/>
+      </w:pPr>
+    </w:lvl>
+    <w:lvl w:ilvl="4" w:tplc="08090019" w:tentative="1">
+      <w:start w:val="1"/>
+      <w:numFmt w:val="lowerLetter"/>
+      <w:lvlText w:val="%5."/>
+      <w:lvlJc w:val="left"/>
+      <w:pPr>
+        <w:ind w:left="3600" w:hanging="360"/>
+      </w:pPr>
+    </w:lvl>
+    <w:lvl w:ilvl="5" w:tplc="0809001B" w:tentative="1">
+      <w:start w:val="1"/>
+      <w:numFmt w:val="lowerRoman"/>
+      <w:lvlText w:val="%6."/>
+      <w:lvlJc w:val="right"/>
+      <w:pPr>
+        <w:ind w:left="4320" w:hanging="180"/>
+      </w:pPr>
+    </w:lvl>
+    <w:lvl w:ilvl="6" w:tplc="0809000F" w:tentative="1">
+      <w:start w:val="1"/>
+      <w:numFmt w:val="decimal"/>
+      <w:lvlText w:val="%7."/>
+      <w:lvlJc w:val="left"/>
+      <w:pPr>
+        <w:ind w:left="5040" w:hanging="360"/>
+      </w:pPr>
+    </w:lvl>
+    <w:lvl w:ilvl="7" w:tplc="08090019" w:tentative="1">
+      <w:start w:val="1"/>
+      <w:numFmt w:val="lowerLetter"/>
+      <w:lvlText w:val="%8."/>
+      <w:lvlJc w:val="left"/>
+      <w:pPr>
+        <w:ind w:left="5760" w:hanging="360"/>
+      </w:pPr>
+    </w:lvl>
+    <w:lvl w:ilvl="8" w:tplc="0809001B" w:tentative="1">
+      <w:start w:val="1"/>
+      <w:numFmt w:val="lowerRoman"/>
+      <w:lvlText w:val="%9."/>
+      <w:lvlJc w:val="right"/>
+      <w:pPr>
+        <w:ind w:left="6480" w:hanging="180"/>
+      </w:pPr>
+    </w:lvl>
+  </w:abstractNum>
+  <w:abstractNum w:abstractNumId="31" w15:restartNumberingAfterBreak="0">
     <w:nsid w:val="64560340"/>
     <w:multiLevelType w:val="hybridMultilevel"/>
     <w:tmpl w:val="A224F0FC"/>
@@ -7864,7 +10207,7 @@
       </w:rPr>
     </w:lvl>
   </w:abstractNum>
-  <w:abstractNum w:abstractNumId="25" w15:restartNumberingAfterBreak="0">
+  <w:abstractNum w:abstractNumId="32" w15:restartNumberingAfterBreak="0">
     <w:nsid w:val="66081024"/>
     <w:multiLevelType w:val="hybridMultilevel"/>
     <w:tmpl w:val="A9662508"/>
@@ -7976,7 +10319,7 @@
       </w:rPr>
     </w:lvl>
   </w:abstractNum>
-  <w:abstractNum w:abstractNumId="26" w15:restartNumberingAfterBreak="0">
+  <w:abstractNum w:abstractNumId="33" w15:restartNumberingAfterBreak="0">
     <w:nsid w:val="6AA21E91"/>
     <w:multiLevelType w:val="multilevel"/>
     <w:tmpl w:val="FFFA9DB4"/>
@@ -8101,7 +10444,7 @@
       </w:rPr>
     </w:lvl>
   </w:abstractNum>
-  <w:abstractNum w:abstractNumId="27" w15:restartNumberingAfterBreak="0">
+  <w:abstractNum w:abstractNumId="34" w15:restartNumberingAfterBreak="0">
     <w:nsid w:val="6C4D14B0"/>
     <w:multiLevelType w:val="hybridMultilevel"/>
     <w:tmpl w:val="38824C30"/>
@@ -8214,7 +10557,95 @@
       </w:rPr>
     </w:lvl>
   </w:abstractNum>
-  <w:abstractNum w:abstractNumId="28" w15:restartNumberingAfterBreak="0">
+  <w:abstractNum w:abstractNumId="35" w15:restartNumberingAfterBreak="0">
+    <w:nsid w:val="7551022D"/>
+    <w:multiLevelType w:val="hybridMultilevel"/>
+    <w:tmpl w:val="4FE6B7FC"/>
+    <w:lvl w:ilvl="0" w:tplc="2DC4FE8E">
+      <w:numFmt w:val="decimal"/>
+      <w:lvlText w:val="%1"/>
+      <w:lvlJc w:val="left"/>
+      <w:pPr>
+        <w:ind w:left="1248" w:hanging="504"/>
+      </w:pPr>
+      <w:rPr>
+        <w:rFonts w:hint="default"/>
+      </w:rPr>
+    </w:lvl>
+    <w:lvl w:ilvl="1" w:tplc="08090019" w:tentative="1">
+      <w:start w:val="1"/>
+      <w:numFmt w:val="lowerLetter"/>
+      <w:lvlText w:val="%2."/>
+      <w:lvlJc w:val="left"/>
+      <w:pPr>
+        <w:ind w:left="1824" w:hanging="360"/>
+      </w:pPr>
+    </w:lvl>
+    <w:lvl w:ilvl="2" w:tplc="0809001B" w:tentative="1">
+      <w:start w:val="1"/>
+      <w:numFmt w:val="lowerRoman"/>
+      <w:lvlText w:val="%3."/>
+      <w:lvlJc w:val="right"/>
+      <w:pPr>
+        <w:ind w:left="2544" w:hanging="180"/>
+      </w:pPr>
+    </w:lvl>
+    <w:lvl w:ilvl="3" w:tplc="0809000F" w:tentative="1">
+      <w:start w:val="1"/>
+      <w:numFmt w:val="decimal"/>
+      <w:lvlText w:val="%4."/>
+      <w:lvlJc w:val="left"/>
+      <w:pPr>
+        <w:ind w:left="3264" w:hanging="360"/>
+      </w:pPr>
+    </w:lvl>
+    <w:lvl w:ilvl="4" w:tplc="08090019" w:tentative="1">
+      <w:start w:val="1"/>
+      <w:numFmt w:val="lowerLetter"/>
+      <w:lvlText w:val="%5."/>
+      <w:lvlJc w:val="left"/>
+      <w:pPr>
+        <w:ind w:left="3984" w:hanging="360"/>
+      </w:pPr>
+    </w:lvl>
+    <w:lvl w:ilvl="5" w:tplc="0809001B" w:tentative="1">
+      <w:start w:val="1"/>
+      <w:numFmt w:val="lowerRoman"/>
+      <w:lvlText w:val="%6."/>
+      <w:lvlJc w:val="right"/>
+      <w:pPr>
+        <w:ind w:left="4704" w:hanging="180"/>
+      </w:pPr>
+    </w:lvl>
+    <w:lvl w:ilvl="6" w:tplc="0809000F" w:tentative="1">
+      <w:start w:val="1"/>
+      <w:numFmt w:val="decimal"/>
+      <w:lvlText w:val="%7."/>
+      <w:lvlJc w:val="left"/>
+      <w:pPr>
+        <w:ind w:left="5424" w:hanging="360"/>
+      </w:pPr>
+    </w:lvl>
+    <w:lvl w:ilvl="7" w:tplc="08090019" w:tentative="1">
+      <w:start w:val="1"/>
+      <w:numFmt w:val="lowerLetter"/>
+      <w:lvlText w:val="%8."/>
+      <w:lvlJc w:val="left"/>
+      <w:pPr>
+        <w:ind w:left="6144" w:hanging="360"/>
+      </w:pPr>
+    </w:lvl>
+    <w:lvl w:ilvl="8" w:tplc="0809001B" w:tentative="1">
+      <w:start w:val="1"/>
+      <w:numFmt w:val="lowerRoman"/>
+      <w:lvlText w:val="%9."/>
+      <w:lvlJc w:val="right"/>
+      <w:pPr>
+        <w:ind w:left="6864" w:hanging="180"/>
+      </w:pPr>
+    </w:lvl>
+  </w:abstractNum>
+  <w:abstractNum w:abstractNumId="36" w15:restartNumberingAfterBreak="0">
     <w:nsid w:val="776F1C4E"/>
     <w:multiLevelType w:val="hybridMultilevel"/>
     <w:tmpl w:val="79BED6E8"/>
@@ -8327,92 +10758,299 @@
       </w:rPr>
     </w:lvl>
   </w:abstractNum>
+  <w:abstractNum w:abstractNumId="37" w15:restartNumberingAfterBreak="0">
+    <w:nsid w:val="7A35285D"/>
+    <w:multiLevelType w:val="hybridMultilevel"/>
+    <w:tmpl w:val="18EC5B6E"/>
+    <w:lvl w:ilvl="0" w:tplc="C494FD16">
+      <w:numFmt w:val="decimal"/>
+      <w:lvlText w:val="%1"/>
+      <w:lvlJc w:val="left"/>
+      <w:pPr>
+        <w:ind w:left="1176" w:hanging="816"/>
+      </w:pPr>
+      <w:rPr>
+        <w:rFonts w:hint="default"/>
+      </w:rPr>
+    </w:lvl>
+    <w:lvl w:ilvl="1" w:tplc="E2741DA4">
+      <w:start w:val="1"/>
+      <w:numFmt w:val="decimal"/>
+      <w:lvlText w:val="%2."/>
+      <w:lvlJc w:val="left"/>
+      <w:pPr>
+        <w:ind w:left="1440" w:hanging="360"/>
+      </w:pPr>
+      <w:rPr>
+        <w:rFonts w:hint="default"/>
+      </w:rPr>
+    </w:lvl>
+    <w:lvl w:ilvl="2" w:tplc="0809001B" w:tentative="1">
+      <w:start w:val="1"/>
+      <w:numFmt w:val="lowerRoman"/>
+      <w:lvlText w:val="%3."/>
+      <w:lvlJc w:val="right"/>
+      <w:pPr>
+        <w:ind w:left="2160" w:hanging="180"/>
+      </w:pPr>
+    </w:lvl>
+    <w:lvl w:ilvl="3" w:tplc="0809000F" w:tentative="1">
+      <w:start w:val="1"/>
+      <w:numFmt w:val="decimal"/>
+      <w:lvlText w:val="%4."/>
+      <w:lvlJc w:val="left"/>
+      <w:pPr>
+        <w:ind w:left="2880" w:hanging="360"/>
+      </w:pPr>
+    </w:lvl>
+    <w:lvl w:ilvl="4" w:tplc="08090019" w:tentative="1">
+      <w:start w:val="1"/>
+      <w:numFmt w:val="lowerLetter"/>
+      <w:lvlText w:val="%5."/>
+      <w:lvlJc w:val="left"/>
+      <w:pPr>
+        <w:ind w:left="3600" w:hanging="360"/>
+      </w:pPr>
+    </w:lvl>
+    <w:lvl w:ilvl="5" w:tplc="0809001B" w:tentative="1">
+      <w:start w:val="1"/>
+      <w:numFmt w:val="lowerRoman"/>
+      <w:lvlText w:val="%6."/>
+      <w:lvlJc w:val="right"/>
+      <w:pPr>
+        <w:ind w:left="4320" w:hanging="180"/>
+      </w:pPr>
+    </w:lvl>
+    <w:lvl w:ilvl="6" w:tplc="0809000F" w:tentative="1">
+      <w:start w:val="1"/>
+      <w:numFmt w:val="decimal"/>
+      <w:lvlText w:val="%7."/>
+      <w:lvlJc w:val="left"/>
+      <w:pPr>
+        <w:ind w:left="5040" w:hanging="360"/>
+      </w:pPr>
+    </w:lvl>
+    <w:lvl w:ilvl="7" w:tplc="08090019" w:tentative="1">
+      <w:start w:val="1"/>
+      <w:numFmt w:val="lowerLetter"/>
+      <w:lvlText w:val="%8."/>
+      <w:lvlJc w:val="left"/>
+      <w:pPr>
+        <w:ind w:left="5760" w:hanging="360"/>
+      </w:pPr>
+    </w:lvl>
+    <w:lvl w:ilvl="8" w:tplc="0809001B" w:tentative="1">
+      <w:start w:val="1"/>
+      <w:numFmt w:val="lowerRoman"/>
+      <w:lvlText w:val="%9."/>
+      <w:lvlJc w:val="right"/>
+      <w:pPr>
+        <w:ind w:left="6480" w:hanging="180"/>
+      </w:pPr>
+    </w:lvl>
+  </w:abstractNum>
+  <w:abstractNum w:abstractNumId="38" w15:restartNumberingAfterBreak="0">
+    <w:nsid w:val="7FC56F47"/>
+    <w:multiLevelType w:val="hybridMultilevel"/>
+    <w:tmpl w:val="6FB60EBC"/>
+    <w:lvl w:ilvl="0" w:tplc="0809000F">
+      <w:start w:val="1"/>
+      <w:numFmt w:val="decimal"/>
+      <w:lvlText w:val="%1."/>
+      <w:lvlJc w:val="left"/>
+      <w:pPr>
+        <w:ind w:left="720" w:hanging="360"/>
+      </w:pPr>
+    </w:lvl>
+    <w:lvl w:ilvl="1" w:tplc="08090019">
+      <w:start w:val="1"/>
+      <w:numFmt w:val="lowerLetter"/>
+      <w:lvlText w:val="%2."/>
+      <w:lvlJc w:val="left"/>
+      <w:pPr>
+        <w:ind w:left="1440" w:hanging="360"/>
+      </w:pPr>
+    </w:lvl>
+    <w:lvl w:ilvl="2" w:tplc="0809001B" w:tentative="1">
+      <w:start w:val="1"/>
+      <w:numFmt w:val="lowerRoman"/>
+      <w:lvlText w:val="%3."/>
+      <w:lvlJc w:val="right"/>
+      <w:pPr>
+        <w:ind w:left="2160" w:hanging="180"/>
+      </w:pPr>
+    </w:lvl>
+    <w:lvl w:ilvl="3" w:tplc="0809000F" w:tentative="1">
+      <w:start w:val="1"/>
+      <w:numFmt w:val="decimal"/>
+      <w:lvlText w:val="%4."/>
+      <w:lvlJc w:val="left"/>
+      <w:pPr>
+        <w:ind w:left="2880" w:hanging="360"/>
+      </w:pPr>
+    </w:lvl>
+    <w:lvl w:ilvl="4" w:tplc="08090019" w:tentative="1">
+      <w:start w:val="1"/>
+      <w:numFmt w:val="lowerLetter"/>
+      <w:lvlText w:val="%5."/>
+      <w:lvlJc w:val="left"/>
+      <w:pPr>
+        <w:ind w:left="3600" w:hanging="360"/>
+      </w:pPr>
+    </w:lvl>
+    <w:lvl w:ilvl="5" w:tplc="0809001B" w:tentative="1">
+      <w:start w:val="1"/>
+      <w:numFmt w:val="lowerRoman"/>
+      <w:lvlText w:val="%6."/>
+      <w:lvlJc w:val="right"/>
+      <w:pPr>
+        <w:ind w:left="4320" w:hanging="180"/>
+      </w:pPr>
+    </w:lvl>
+    <w:lvl w:ilvl="6" w:tplc="0809000F" w:tentative="1">
+      <w:start w:val="1"/>
+      <w:numFmt w:val="decimal"/>
+      <w:lvlText w:val="%7."/>
+      <w:lvlJc w:val="left"/>
+      <w:pPr>
+        <w:ind w:left="5040" w:hanging="360"/>
+      </w:pPr>
+    </w:lvl>
+    <w:lvl w:ilvl="7" w:tplc="08090019" w:tentative="1">
+      <w:start w:val="1"/>
+      <w:numFmt w:val="lowerLetter"/>
+      <w:lvlText w:val="%8."/>
+      <w:lvlJc w:val="left"/>
+      <w:pPr>
+        <w:ind w:left="5760" w:hanging="360"/>
+      </w:pPr>
+    </w:lvl>
+    <w:lvl w:ilvl="8" w:tplc="0809001B" w:tentative="1">
+      <w:start w:val="1"/>
+      <w:numFmt w:val="lowerRoman"/>
+      <w:lvlText w:val="%9."/>
+      <w:lvlJc w:val="right"/>
+      <w:pPr>
+        <w:ind w:left="6480" w:hanging="180"/>
+      </w:pPr>
+    </w:lvl>
+  </w:abstractNum>
   <w:num w:numId="1" w16cid:durableId="944732855">
+    <w:abstractNumId w:val="33"/>
+  </w:num>
+  <w:num w:numId="2" w16cid:durableId="136922467">
+    <w:abstractNumId w:val="29"/>
+  </w:num>
+  <w:num w:numId="3" w16cid:durableId="1191992487">
+    <w:abstractNumId w:val="24"/>
+  </w:num>
+  <w:num w:numId="4" w16cid:durableId="1589192832">
+    <w:abstractNumId w:val="23"/>
+  </w:num>
+  <w:num w:numId="5" w16cid:durableId="562180158">
+    <w:abstractNumId w:val="22"/>
+  </w:num>
+  <w:num w:numId="6" w16cid:durableId="1181777835">
+    <w:abstractNumId w:val="25"/>
+  </w:num>
+  <w:num w:numId="7" w16cid:durableId="418911056">
+    <w:abstractNumId w:val="36"/>
+  </w:num>
+  <w:num w:numId="8" w16cid:durableId="1196117197">
+    <w:abstractNumId w:val="17"/>
+  </w:num>
+  <w:num w:numId="9" w16cid:durableId="722606638">
+    <w:abstractNumId w:val="12"/>
+  </w:num>
+  <w:num w:numId="10" w16cid:durableId="1181358229">
+    <w:abstractNumId w:val="8"/>
+  </w:num>
+  <w:num w:numId="11" w16cid:durableId="66197232">
+    <w:abstractNumId w:val="21"/>
+  </w:num>
+  <w:num w:numId="12" w16cid:durableId="54087011">
+    <w:abstractNumId w:val="31"/>
+  </w:num>
+  <w:num w:numId="13" w16cid:durableId="1495760012">
+    <w:abstractNumId w:val="5"/>
+  </w:num>
+  <w:num w:numId="14" w16cid:durableId="1716347460">
+    <w:abstractNumId w:val="18"/>
+  </w:num>
+  <w:num w:numId="15" w16cid:durableId="1837114021">
+    <w:abstractNumId w:val="10"/>
+  </w:num>
+  <w:num w:numId="16" w16cid:durableId="1523863412">
+    <w:abstractNumId w:val="20"/>
+  </w:num>
+  <w:num w:numId="17" w16cid:durableId="1214536231">
+    <w:abstractNumId w:val="27"/>
+  </w:num>
+  <w:num w:numId="18" w16cid:durableId="483859003">
+    <w:abstractNumId w:val="28"/>
+  </w:num>
+  <w:num w:numId="19" w16cid:durableId="57439879">
+    <w:abstractNumId w:val="15"/>
+  </w:num>
+  <w:num w:numId="20" w16cid:durableId="1958826030">
+    <w:abstractNumId w:val="11"/>
+  </w:num>
+  <w:num w:numId="21" w16cid:durableId="123622904">
+    <w:abstractNumId w:val="1"/>
+  </w:num>
+  <w:num w:numId="22" w16cid:durableId="637537357">
+    <w:abstractNumId w:val="19"/>
+  </w:num>
+  <w:num w:numId="23" w16cid:durableId="63140882">
+    <w:abstractNumId w:val="16"/>
+  </w:num>
+  <w:num w:numId="24" w16cid:durableId="1632202433">
+    <w:abstractNumId w:val="32"/>
+  </w:num>
+  <w:num w:numId="25" w16cid:durableId="584460224">
+    <w:abstractNumId w:val="14"/>
+  </w:num>
+  <w:num w:numId="26" w16cid:durableId="1696954710">
+    <w:abstractNumId w:val="34"/>
+  </w:num>
+  <w:num w:numId="27" w16cid:durableId="1424034111">
     <w:abstractNumId w:val="26"/>
   </w:num>
-  <w:num w:numId="2" w16cid:durableId="136922467">
-    <w:abstractNumId w:val="23"/>
+  <w:num w:numId="28" w16cid:durableId="823737647">
+    <w:abstractNumId w:val="9"/>
   </w:num>
-  <w:num w:numId="3" w16cid:durableId="1191992487">
-    <w:abstractNumId w:val="18"/>
+  <w:num w:numId="29" w16cid:durableId="711273832">
+    <w:abstractNumId w:val="2"/>
   </w:num>
-  <w:num w:numId="4" w16cid:durableId="1589192832">
-    <w:abstractNumId w:val="17"/>
+  <w:num w:numId="30" w16cid:durableId="242301541">
+    <w:abstractNumId w:val="30"/>
   </w:num>
-  <w:num w:numId="5" w16cid:durableId="562180158">
-    <w:abstractNumId w:val="16"/>
+  <w:num w:numId="31" w16cid:durableId="974411067">
+    <w:abstractNumId w:val="3"/>
   </w:num>
-  <w:num w:numId="6" w16cid:durableId="1181777835">
-    <w:abstractNumId w:val="19"/>
+  <w:num w:numId="32" w16cid:durableId="479737047">
+    <w:abstractNumId w:val="37"/>
   </w:num>
-  <w:num w:numId="7" w16cid:durableId="418911056">
-    <w:abstractNumId w:val="28"/>
-  </w:num>
-  <w:num w:numId="8" w16cid:durableId="1196117197">
-    <w:abstractNumId w:val="11"/>
-  </w:num>
-  <w:num w:numId="9" w16cid:durableId="722606638">
+  <w:num w:numId="33" w16cid:durableId="2021539256">
     <w:abstractNumId w:val="7"/>
   </w:num>
-  <w:num w:numId="10" w16cid:durableId="1181358229">
-    <w:abstractNumId w:val="3"/>
+  <w:num w:numId="34" w16cid:durableId="483468373">
+    <w:abstractNumId w:val="35"/>
   </w:num>
-  <w:num w:numId="11" w16cid:durableId="66197232">
-    <w:abstractNumId w:val="15"/>
+  <w:num w:numId="35" w16cid:durableId="789666635">
+    <w:abstractNumId w:val="13"/>
   </w:num>
-  <w:num w:numId="12" w16cid:durableId="54087011">
-    <w:abstractNumId w:val="24"/>
+  <w:num w:numId="36" w16cid:durableId="559512824">
+    <w:abstractNumId w:val="4"/>
   </w:num>
-  <w:num w:numId="13" w16cid:durableId="1495760012">
-    <w:abstractNumId w:val="2"/>
+  <w:num w:numId="37" w16cid:durableId="1615598832">
+    <w:abstractNumId w:val="0"/>
   </w:num>
-  <w:num w:numId="14" w16cid:durableId="1716347460">
-    <w:abstractNumId w:val="12"/>
-  </w:num>
-  <w:num w:numId="15" w16cid:durableId="1837114021">
-    <w:abstractNumId w:val="5"/>
-  </w:num>
-  <w:num w:numId="16" w16cid:durableId="1523863412">
-    <w:abstractNumId w:val="14"/>
-  </w:num>
-  <w:num w:numId="17" w16cid:durableId="1214536231">
-    <w:abstractNumId w:val="21"/>
-  </w:num>
-  <w:num w:numId="18" w16cid:durableId="483859003">
-    <w:abstractNumId w:val="22"/>
-  </w:num>
-  <w:num w:numId="19" w16cid:durableId="57439879">
-    <w:abstractNumId w:val="9"/>
-  </w:num>
-  <w:num w:numId="20" w16cid:durableId="1958826030">
+  <w:num w:numId="38" w16cid:durableId="822545171">
     <w:abstractNumId w:val="6"/>
   </w:num>
-  <w:num w:numId="21" w16cid:durableId="123622904">
-    <w:abstractNumId w:val="0"/>
-  </w:num>
-  <w:num w:numId="22" w16cid:durableId="637537357">
-    <w:abstractNumId w:val="13"/>
-  </w:num>
-  <w:num w:numId="23" w16cid:durableId="63140882">
-    <w:abstractNumId w:val="10"/>
-  </w:num>
-  <w:num w:numId="24" w16cid:durableId="1632202433">
-    <w:abstractNumId w:val="25"/>
-  </w:num>
-  <w:num w:numId="25" w16cid:durableId="584460224">
-    <w:abstractNumId w:val="8"/>
-  </w:num>
-  <w:num w:numId="26" w16cid:durableId="1696954710">
-    <w:abstractNumId w:val="27"/>
-  </w:num>
-  <w:num w:numId="27" w16cid:durableId="1424034111">
-    <w:abstractNumId w:val="20"/>
-  </w:num>
-  <w:num w:numId="28" w16cid:durableId="823737647">
-    <w:abstractNumId w:val="4"/>
-  </w:num>
-  <w:num w:numId="29" w16cid:durableId="711273832">
-    <w:abstractNumId w:val="1"/>
+  <w:num w:numId="39" w16cid:durableId="1122771933">
+    <w:abstractNumId w:val="38"/>
   </w:num>
 </w:numbering>
 </file>
@@ -8816,7 +11454,7 @@
     <w:name w:val="Normal"/>
     <w:aliases w:val="Běžný odstavec"/>
     <w:qFormat/>
-    <w:rsid w:val="00406F72"/>
+    <w:rsid w:val="002917AA"/>
     <w:pPr>
       <w:spacing w:after="220" w:line="288" w:lineRule="auto"/>
       <w:jc w:val="both"/>
@@ -8828,7 +11466,6 @@
   </w:style>
   <w:style w:type="paragraph" w:styleId="Nadpis1">
     <w:name w:val="heading 1"/>
-    <w:aliases w:val="Heading 1"/>
     <w:basedOn w:val="Normln"/>
     <w:next w:val="Normln"/>
     <w:link w:val="Nadpis1Char"/>
@@ -8921,6 +11558,7 @@
   <w:style w:type="character" w:default="1" w:styleId="Standardnpsmoodstavce">
     <w:name w:val="Default Paragraph Font"/>
     <w:uiPriority w:val="1"/>
+    <w:semiHidden/>
     <w:unhideWhenUsed/>
   </w:style>
   <w:style w:type="table" w:default="1" w:styleId="Normlntabulka">
@@ -8946,7 +11584,6 @@
   </w:style>
   <w:style w:type="character" w:customStyle="1" w:styleId="Nadpis1Char">
     <w:name w:val="Nadpis 1 Char"/>
-    <w:aliases w:val="Heading 1 Char"/>
     <w:basedOn w:val="Standardnpsmoodstavce"/>
     <w:link w:val="Nadpis1"/>
     <w:uiPriority w:val="3"/>
@@ -10656,49 +13293,29 @@
 </file>
 
 <file path=customXml/item1.xml><?xml version="1.0" encoding="utf-8"?>
-<p:properties xmlns:p="http://schemas.microsoft.com/office/2006/metadata/properties" xmlns:xsi="http://www.w3.org/2001/XMLSchema-instance" xmlns:pc="http://schemas.microsoft.com/office/infopath/2007/PartnerControls">
-  <documentManagement>
-    <lcf76f155ced4ddcb4097134ff3c332f xmlns="7fe71cfb-81ed-4b9d-9a1f-cae1a72b62ba">
-      <Terms xmlns="http://schemas.microsoft.com/office/infopath/2007/PartnerControls"/>
-    </lcf76f155ced4ddcb4097134ff3c332f>
-    <TaxCatchAll xmlns="184be059-f9c1-47a1-baeb-6b78fb5c2cd7" xsi:nil="true"/>
-  </documentManagement>
-</p:properties>
-</file>
-
-<file path=customXml/item2.xml><?xml version="1.0" encoding="utf-8"?>
-<?mso-contentType ?>
-<FormTemplates xmlns="http://schemas.microsoft.com/sharepoint/v3/contenttype/forms">
-  <Display>DocumentLibraryForm</Display>
-  <Edit>DocumentLibraryForm</Edit>
-  <New>DocumentLibraryForm</New>
-</FormTemplates>
-</file>
-
-<file path=customXml/item3.xml><?xml version="1.0" encoding="utf-8"?>
-<ct:contentTypeSchema xmlns:ct="http://schemas.microsoft.com/office/2006/metadata/contentType" xmlns:ma="http://schemas.microsoft.com/office/2006/metadata/properties/metaAttributes" ct:_="" ma:_="" ma:contentTypeName="Dokument" ma:contentTypeID="0x010100A5EAD61CDED85140BF5B934B48DD3484" ma:contentTypeVersion="15" ma:contentTypeDescription="Vytvoří nový dokument" ma:contentTypeScope="" ma:versionID="650a80ffac071b00940b99789c030117">
-  <xsd:schema xmlns:xsd="http://www.w3.org/2001/XMLSchema" xmlns:xs="http://www.w3.org/2001/XMLSchema" xmlns:p="http://schemas.microsoft.com/office/2006/metadata/properties" xmlns:ns2="7fe71cfb-81ed-4b9d-9a1f-cae1a72b62ba" xmlns:ns3="184be059-f9c1-47a1-baeb-6b78fb5c2cd7" targetNamespace="http://schemas.microsoft.com/office/2006/metadata/properties" ma:root="true" ma:fieldsID="84f9754f55100dee04bb21cdbbf205ea" ns2:_="" ns3:_="">
-    <xsd:import namespace="7fe71cfb-81ed-4b9d-9a1f-cae1a72b62ba"/>
-    <xsd:import namespace="184be059-f9c1-47a1-baeb-6b78fb5c2cd7"/>
+<ct:contentTypeSchema xmlns:ct="http://schemas.microsoft.com/office/2006/metadata/contentType" xmlns:ma="http://schemas.microsoft.com/office/2006/metadata/properties/metaAttributes" ct:_="" ma:_="" ma:contentTypeName="Dokument" ma:contentTypeID="0x010100F82B63CFAAC2CC4FBE913F345A73421E" ma:contentTypeVersion="13" ma:contentTypeDescription="Vytvoří nový dokument" ma:contentTypeScope="" ma:versionID="85eb4e9195bcf29d63e544e65fb36e86">
+  <xsd:schema xmlns:xsd="http://www.w3.org/2001/XMLSchema" xmlns:xs="http://www.w3.org/2001/XMLSchema" xmlns:p="http://schemas.microsoft.com/office/2006/metadata/properties" xmlns:ns3="46b7e223-2a40-47fd-8a1f-72a5ff16262c" xmlns:ns4="5b934a60-2dfe-4482-be73-409e6d45bca9" targetNamespace="http://schemas.microsoft.com/office/2006/metadata/properties" ma:root="true" ma:fieldsID="f76afa7a6ab98686defe55ec40dd2633" ns3:_="" ns4:_="">
+    <xsd:import namespace="46b7e223-2a40-47fd-8a1f-72a5ff16262c"/>
+    <xsd:import namespace="5b934a60-2dfe-4482-be73-409e6d45bca9"/>
     <xsd:element name="properties">
       <xsd:complexType>
         <xsd:sequence>
           <xsd:element name="documentManagement">
             <xsd:complexType>
               <xsd:all>
-                <xsd:element ref="ns2:MediaServiceMetadata" minOccurs="0"/>
-                <xsd:element ref="ns2:MediaServiceFastMetadata" minOccurs="0"/>
-                <xsd:element ref="ns3:SharedWithUsers" minOccurs="0"/>
-                <xsd:element ref="ns3:SharedWithDetails" minOccurs="0"/>
-                <xsd:element ref="ns2:MediaServiceDateTaken" minOccurs="0"/>
-                <xsd:element ref="ns2:MediaServiceOCR" minOccurs="0"/>
-                <xsd:element ref="ns2:MediaServiceGenerationTime" minOccurs="0"/>
-                <xsd:element ref="ns2:MediaServiceEventHashCode" minOccurs="0"/>
-                <xsd:element ref="ns2:MediaLengthInSeconds" minOccurs="0"/>
-                <xsd:element ref="ns2:lcf76f155ced4ddcb4097134ff3c332f" minOccurs="0"/>
-                <xsd:element ref="ns3:TaxCatchAll" minOccurs="0"/>
-                <xsd:element ref="ns2:MediaServiceSearchProperties" minOccurs="0"/>
-                <xsd:element ref="ns2:MediaServiceObjectDetectorVersions" minOccurs="0"/>
+                <xsd:element ref="ns3:MediaServiceMetadata" minOccurs="0"/>
+                <xsd:element ref="ns3:MediaServiceFastMetadata" minOccurs="0"/>
+                <xsd:element ref="ns3:MediaServiceSearchProperties" minOccurs="0"/>
+                <xsd:element ref="ns3:MediaServiceObjectDetectorVersions" minOccurs="0"/>
+                <xsd:element ref="ns3:_activity" minOccurs="0"/>
+                <xsd:element ref="ns4:SharedWithUsers" minOccurs="0"/>
+                <xsd:element ref="ns4:SharedWithDetails" minOccurs="0"/>
+                <xsd:element ref="ns4:SharingHintHash" minOccurs="0"/>
+                <xsd:element ref="ns3:MediaServiceDateTaken" minOccurs="0"/>
+                <xsd:element ref="ns3:MediaServiceSystemTags" minOccurs="0"/>
+                <xsd:element ref="ns3:MediaServiceOCR" minOccurs="0"/>
+                <xsd:element ref="ns3:MediaServiceGenerationTime" minOccurs="0"/>
+                <xsd:element ref="ns3:MediaServiceEventHashCode" minOccurs="0"/>
               </xsd:all>
             </xsd:complexType>
           </xsd:element>
@@ -10706,7 +13323,7 @@
       </xsd:complexType>
     </xsd:element>
   </xsd:schema>
-  <xsd:schema xmlns:xsd="http://www.w3.org/2001/XMLSchema" xmlns:xs="http://www.w3.org/2001/XMLSchema" xmlns:dms="http://schemas.microsoft.com/office/2006/documentManagement/types" xmlns:pc="http://schemas.microsoft.com/office/infopath/2007/PartnerControls" targetNamespace="7fe71cfb-81ed-4b9d-9a1f-cae1a72b62ba" elementFormDefault="qualified">
+  <xsd:schema xmlns:xsd="http://www.w3.org/2001/XMLSchema" xmlns:xs="http://www.w3.org/2001/XMLSchema" xmlns:dms="http://schemas.microsoft.com/office/2006/documentManagement/types" xmlns:pc="http://schemas.microsoft.com/office/infopath/2007/PartnerControls" targetNamespace="46b7e223-2a40-47fd-8a1f-72a5ff16262c" elementFormDefault="qualified">
     <xsd:import namespace="http://schemas.microsoft.com/office/2006/documentManagement/types"/>
     <xsd:import namespace="http://schemas.microsoft.com/office/infopath/2007/PartnerControls"/>
     <xsd:element name="MediaServiceMetadata" ma:index="8" nillable="true" ma:displayName="MediaServiceMetadata" ma:hidden="true" ma:internalName="MediaServiceMetadata" ma:readOnly="true">
@@ -10719,55 +13336,53 @@
         <xsd:restriction base="dms:Note"/>
       </xsd:simpleType>
     </xsd:element>
-    <xsd:element name="MediaServiceDateTaken" ma:index="12" nillable="true" ma:displayName="MediaServiceDateTaken" ma:hidden="true" ma:internalName="MediaServiceDateTaken" ma:readOnly="true">
+    <xsd:element name="MediaServiceSearchProperties" ma:index="10" nillable="true" ma:displayName="MediaServiceSearchProperties" ma:hidden="true" ma:internalName="MediaServiceSearchProperties" ma:readOnly="true">
+      <xsd:simpleType>
+        <xsd:restriction base="dms:Note"/>
+      </xsd:simpleType>
+    </xsd:element>
+    <xsd:element name="MediaServiceObjectDetectorVersions" ma:index="11" nillable="true" ma:displayName="MediaServiceObjectDetectorVersions" ma:hidden="true" ma:indexed="true" ma:internalName="MediaServiceObjectDetectorVersions" ma:readOnly="true">
       <xsd:simpleType>
         <xsd:restriction base="dms:Text"/>
       </xsd:simpleType>
     </xsd:element>
-    <xsd:element name="MediaServiceOCR" ma:index="13" nillable="true" ma:displayName="Extracted Text" ma:internalName="MediaServiceOCR" ma:readOnly="true">
+    <xsd:element name="_activity" ma:index="12" nillable="true" ma:displayName="_activity" ma:hidden="true" ma:internalName="_activity">
+      <xsd:simpleType>
+        <xsd:restriction base="dms:Note"/>
+      </xsd:simpleType>
+    </xsd:element>
+    <xsd:element name="MediaServiceDateTaken" ma:index="16" nillable="true" ma:displayName="MediaServiceDateTaken" ma:hidden="true" ma:indexed="true" ma:internalName="MediaServiceDateTaken" ma:readOnly="true">
+      <xsd:simpleType>
+        <xsd:restriction base="dms:Text"/>
+      </xsd:simpleType>
+    </xsd:element>
+    <xsd:element name="MediaServiceSystemTags" ma:index="17" nillable="true" ma:displayName="MediaServiceSystemTags" ma:hidden="true" ma:internalName="MediaServiceSystemTags" ma:readOnly="true">
+      <xsd:simpleType>
+        <xsd:restriction base="dms:Note"/>
+      </xsd:simpleType>
+    </xsd:element>
+    <xsd:element name="MediaServiceOCR" ma:index="18" nillable="true" ma:displayName="Extracted Text" ma:internalName="MediaServiceOCR" ma:readOnly="true">
       <xsd:simpleType>
         <xsd:restriction base="dms:Note">
           <xsd:maxLength value="255"/>
         </xsd:restriction>
       </xsd:simpleType>
     </xsd:element>
-    <xsd:element name="MediaServiceGenerationTime" ma:index="14" nillable="true" ma:displayName="MediaServiceGenerationTime" ma:hidden="true" ma:internalName="MediaServiceGenerationTime" ma:readOnly="true">
+    <xsd:element name="MediaServiceGenerationTime" ma:index="19" nillable="true" ma:displayName="MediaServiceGenerationTime" ma:hidden="true" ma:internalName="MediaServiceGenerationTime" ma:readOnly="true">
       <xsd:simpleType>
         <xsd:restriction base="dms:Text"/>
       </xsd:simpleType>
     </xsd:element>
-    <xsd:element name="MediaServiceEventHashCode" ma:index="15" nillable="true" ma:displayName="MediaServiceEventHashCode" ma:hidden="true" ma:internalName="MediaServiceEventHashCode" ma:readOnly="true">
-      <xsd:simpleType>
-        <xsd:restriction base="dms:Text"/>
-      </xsd:simpleType>
-    </xsd:element>
-    <xsd:element name="MediaLengthInSeconds" ma:index="16" nillable="true" ma:displayName="Length (seconds)" ma:internalName="MediaLengthInSeconds" ma:readOnly="true">
-      <xsd:simpleType>
-        <xsd:restriction base="dms:Unknown"/>
-      </xsd:simpleType>
-    </xsd:element>
-    <xsd:element name="lcf76f155ced4ddcb4097134ff3c332f" ma:index="18" nillable="true" ma:taxonomy="true" ma:internalName="lcf76f155ced4ddcb4097134ff3c332f" ma:taxonomyFieldName="MediaServiceImageTags" ma:displayName="Značky obrázků" ma:readOnly="false" ma:fieldId="{5cf76f15-5ced-4ddc-b409-7134ff3c332f}" ma:taxonomyMulti="true" ma:sspId="babb5542-b20f-476f-b885-dfe2db7716bd" ma:termSetId="09814cd3-568e-fe90-9814-8d621ff8fb84" ma:anchorId="fba54fb3-c3e1-fe81-a776-ca4b69148c4d" ma:open="true" ma:isKeyword="false">
-      <xsd:complexType>
-        <xsd:sequence>
-          <xsd:element ref="pc:Terms" minOccurs="0" maxOccurs="1"/>
-        </xsd:sequence>
-      </xsd:complexType>
-    </xsd:element>
-    <xsd:element name="MediaServiceSearchProperties" ma:index="20" nillable="true" ma:displayName="MediaServiceSearchProperties" ma:hidden="true" ma:internalName="MediaServiceSearchProperties" ma:readOnly="true">
-      <xsd:simpleType>
-        <xsd:restriction base="dms:Note"/>
-      </xsd:simpleType>
-    </xsd:element>
-    <xsd:element name="MediaServiceObjectDetectorVersions" ma:index="21" nillable="true" ma:displayName="MediaServiceObjectDetectorVersions" ma:hidden="true" ma:indexed="true" ma:internalName="MediaServiceObjectDetectorVersions" ma:readOnly="true">
+    <xsd:element name="MediaServiceEventHashCode" ma:index="20" nillable="true" ma:displayName="MediaServiceEventHashCode" ma:hidden="true" ma:internalName="MediaServiceEventHashCode" ma:readOnly="true">
       <xsd:simpleType>
         <xsd:restriction base="dms:Text"/>
       </xsd:simpleType>
     </xsd:element>
   </xsd:schema>
-  <xsd:schema xmlns:xsd="http://www.w3.org/2001/XMLSchema" xmlns:xs="http://www.w3.org/2001/XMLSchema" xmlns:dms="http://schemas.microsoft.com/office/2006/documentManagement/types" xmlns:pc="http://schemas.microsoft.com/office/infopath/2007/PartnerControls" targetNamespace="184be059-f9c1-47a1-baeb-6b78fb5c2cd7" elementFormDefault="qualified">
+  <xsd:schema xmlns:xsd="http://www.w3.org/2001/XMLSchema" xmlns:xs="http://www.w3.org/2001/XMLSchema" xmlns:dms="http://schemas.microsoft.com/office/2006/documentManagement/types" xmlns:pc="http://schemas.microsoft.com/office/infopath/2007/PartnerControls" targetNamespace="5b934a60-2dfe-4482-be73-409e6d45bca9" elementFormDefault="qualified">
     <xsd:import namespace="http://schemas.microsoft.com/office/2006/documentManagement/types"/>
     <xsd:import namespace="http://schemas.microsoft.com/office/infopath/2007/PartnerControls"/>
-    <xsd:element name="SharedWithUsers" ma:index="10" nillable="true" ma:displayName="Sdílí se s" ma:internalName="SharedWithUsers" ma:readOnly="true">
+    <xsd:element name="SharedWithUsers" ma:index="13" nillable="true" ma:displayName="Sdílí se s" ma:internalName="SharedWithUsers" ma:readOnly="true">
       <xsd:complexType>
         <xsd:complexContent>
           <xsd:extension base="dms:UserMulti">
@@ -10786,23 +13401,17 @@
         </xsd:complexContent>
       </xsd:complexType>
     </xsd:element>
-    <xsd:element name="SharedWithDetails" ma:index="11" nillable="true" ma:displayName="Sdílené s podrobnostmi" ma:internalName="SharedWithDetails" ma:readOnly="true">
+    <xsd:element name="SharedWithDetails" ma:index="14" nillable="true" ma:displayName="Sdílené s podrobnostmi" ma:internalName="SharedWithDetails" ma:readOnly="true">
       <xsd:simpleType>
         <xsd:restriction base="dms:Note">
           <xsd:maxLength value="255"/>
         </xsd:restriction>
       </xsd:simpleType>
     </xsd:element>
-    <xsd:element name="TaxCatchAll" ma:index="19" nillable="true" ma:displayName="Taxonomy Catch All Column" ma:hidden="true" ma:list="{5e9b24e3-0751-412a-b275-2d618e008197}" ma:internalName="TaxCatchAll" ma:showField="CatchAllData" ma:web="184be059-f9c1-47a1-baeb-6b78fb5c2cd7">
-      <xsd:complexType>
-        <xsd:complexContent>
-          <xsd:extension base="dms:MultiChoiceLookup">
-            <xsd:sequence>
-              <xsd:element name="Value" type="dms:Lookup" maxOccurs="unbounded" minOccurs="0" nillable="true"/>
-            </xsd:sequence>
-          </xsd:extension>
-        </xsd:complexContent>
-      </xsd:complexType>
+    <xsd:element name="SharingHintHash" ma:index="15" nillable="true" ma:displayName="Hodnota hash upozornění na sdílení" ma:hidden="true" ma:internalName="SharingHintHash" ma:readOnly="true">
+      <xsd:simpleType>
+        <xsd:restriction base="dms:Text"/>
+      </xsd:simpleType>
     </xsd:element>
   </xsd:schema>
   <xsd:schema xmlns="http://schemas.openxmlformats.org/package/2006/metadata/core-properties" xmlns:xsd="http://www.w3.org/2001/XMLSchema" xmlns:xsi="http://www.w3.org/2001/XMLSchema-instance" xmlns:dc="http://purl.org/dc/elements/1.1/" xmlns:dcterms="http://purl.org/dc/terms/" xmlns:odoc="http://schemas.microsoft.com/internal/obd" targetNamespace="http://schemas.openxmlformats.org/package/2006/metadata/core-properties" elementFormDefault="qualified" attributeFormDefault="unqualified" blockDefault="#all">
@@ -10902,6 +13511,23 @@
     <xs:element name="TermId" type="xs:string"/>
   </xs:schema>
 </ct:contentTypeSchema>
+</file>
+
+<file path=customXml/item2.xml><?xml version="1.0" encoding="utf-8"?>
+<p:properties xmlns:p="http://schemas.microsoft.com/office/2006/metadata/properties" xmlns:xsi="http://www.w3.org/2001/XMLSchema-instance" xmlns:pc="http://schemas.microsoft.com/office/infopath/2007/PartnerControls">
+  <documentManagement>
+    <_activity xmlns="46b7e223-2a40-47fd-8a1f-72a5ff16262c" xsi:nil="true"/>
+  </documentManagement>
+</p:properties>
+</file>
+
+<file path=customXml/item3.xml><?xml version="1.0" encoding="utf-8"?>
+<?mso-contentType ?>
+<FormTemplates xmlns="http://schemas.microsoft.com/sharepoint/v3/contenttype/forms">
+  <Display>DocumentLibraryForm</Display>
+  <Edit>DocumentLibraryForm</Edit>
+  <New>DocumentLibraryForm</New>
+</FormTemplates>
 </file>
 
 <file path=customXml/item4.xml><?xml version="1.0" encoding="utf-8"?>
@@ -11021,39 +13647,38 @@
 </file>
 
 <file path=customXml/itemProps1.xml><?xml version="1.0" encoding="utf-8"?>
-<ds:datastoreItem xmlns:ds="http://schemas.openxmlformats.org/officeDocument/2006/customXml" ds:itemID="{D04EB944-32B9-4763-86CC-835324F34208}">
-  <ds:schemaRefs>
-    <ds:schemaRef ds:uri="http://schemas.microsoft.com/office/2006/metadata/properties"/>
-    <ds:schemaRef ds:uri="http://schemas.microsoft.com/office/infopath/2007/PartnerControls"/>
-    <ds:schemaRef ds:uri="7fe71cfb-81ed-4b9d-9a1f-cae1a72b62ba"/>
-    <ds:schemaRef ds:uri="184be059-f9c1-47a1-baeb-6b78fb5c2cd7"/>
-  </ds:schemaRefs>
-</ds:datastoreItem>
-</file>
-
-<file path=customXml/itemProps2.xml><?xml version="1.0" encoding="utf-8"?>
-<ds:datastoreItem xmlns:ds="http://schemas.openxmlformats.org/officeDocument/2006/customXml" ds:itemID="{B20E3A8B-6AD5-4C75-B663-202B302D3610}">
-  <ds:schemaRefs>
-    <ds:schemaRef ds:uri="http://schemas.microsoft.com/sharepoint/v3/contenttype/forms"/>
-  </ds:schemaRefs>
-</ds:datastoreItem>
-</file>
-
-<file path=customXml/itemProps3.xml><?xml version="1.0" encoding="utf-8"?>
-<ds:datastoreItem xmlns:ds="http://schemas.openxmlformats.org/officeDocument/2006/customXml" ds:itemID="{8905DAC8-6CAE-4D14-B6E7-353AD22F862D}">
+<ds:datastoreItem xmlns:ds="http://schemas.openxmlformats.org/officeDocument/2006/customXml" ds:itemID="{B12BA53A-2680-4D51-904A-501FB605258D}">
   <ds:schemaRefs>
     <ds:schemaRef ds:uri="http://schemas.microsoft.com/office/2006/metadata/contentType"/>
     <ds:schemaRef ds:uri="http://schemas.microsoft.com/office/2006/metadata/properties/metaAttributes"/>
     <ds:schemaRef ds:uri="http://www.w3.org/2001/XMLSchema"/>
     <ds:schemaRef ds:uri="http://schemas.microsoft.com/office/2006/metadata/properties"/>
-    <ds:schemaRef ds:uri="7fe71cfb-81ed-4b9d-9a1f-cae1a72b62ba"/>
-    <ds:schemaRef ds:uri="184be059-f9c1-47a1-baeb-6b78fb5c2cd7"/>
+    <ds:schemaRef ds:uri="46b7e223-2a40-47fd-8a1f-72a5ff16262c"/>
+    <ds:schemaRef ds:uri="5b934a60-2dfe-4482-be73-409e6d45bca9"/>
     <ds:schemaRef ds:uri="http://schemas.microsoft.com/office/2006/documentManagement/types"/>
     <ds:schemaRef ds:uri="http://schemas.microsoft.com/office/infopath/2007/PartnerControls"/>
     <ds:schemaRef ds:uri="http://schemas.openxmlformats.org/package/2006/metadata/core-properties"/>
     <ds:schemaRef ds:uri="http://purl.org/dc/elements/1.1/"/>
     <ds:schemaRef ds:uri="http://purl.org/dc/terms/"/>
     <ds:schemaRef ds:uri="http://schemas.microsoft.com/internal/obd"/>
+  </ds:schemaRefs>
+</ds:datastoreItem>
+</file>
+
+<file path=customXml/itemProps2.xml><?xml version="1.0" encoding="utf-8"?>
+<ds:datastoreItem xmlns:ds="http://schemas.openxmlformats.org/officeDocument/2006/customXml" ds:itemID="{D04EB944-32B9-4763-86CC-835324F34208}">
+  <ds:schemaRefs>
+    <ds:schemaRef ds:uri="http://schemas.microsoft.com/office/2006/metadata/properties"/>
+    <ds:schemaRef ds:uri="http://schemas.microsoft.com/office/infopath/2007/PartnerControls"/>
+    <ds:schemaRef ds:uri="46b7e223-2a40-47fd-8a1f-72a5ff16262c"/>
+  </ds:schemaRefs>
+</ds:datastoreItem>
+</file>
+
+<file path=customXml/itemProps3.xml><?xml version="1.0" encoding="utf-8"?>
+<ds:datastoreItem xmlns:ds="http://schemas.openxmlformats.org/officeDocument/2006/customXml" ds:itemID="{B20E3A8B-6AD5-4C75-B663-202B302D3610}">
+  <ds:schemaRefs>
+    <ds:schemaRef ds:uri="http://schemas.microsoft.com/sharepoint/v3/contenttype/forms"/>
   </ds:schemaRefs>
 </ds:datastoreItem>
 </file>

</xml_diff>

<commit_message>
Hourly snapshot: 16:13 26/03/11
</commit_message>
<xml_diff>
--- a/mitterpach_bp_en.docx
+++ b/mitterpach_bp_en.docx
@@ -618,7 +618,7 @@
             </w:rPr>
             <w:fldChar w:fldCharType="separate"/>
           </w:r>
-          <w:hyperlink w:anchor="_Toc222407992" w:history="1">
+          <w:hyperlink w:anchor="_Toc224131570" w:history="1">
             <w:r>
               <w:rPr>
                 <w:rStyle w:val="Hypertextovodkaz"/>
@@ -645,7 +645,7 @@
                 <w:noProof/>
                 <w:webHidden/>
               </w:rPr>
-              <w:instrText xml:space="preserve"> PAGEREF _Toc222407992 \h </w:instrText>
+              <w:instrText xml:space="preserve"> PAGEREF _Toc224131570 \h </w:instrText>
             </w:r>
             <w:r>
               <w:rPr>
@@ -693,7 +693,7 @@
               <w14:numForm w14:val="default"/>
             </w:rPr>
           </w:pPr>
-          <w:hyperlink w:anchor="_Toc222407993" w:history="1">
+          <w:hyperlink w:anchor="_Toc224131571" w:history="1">
             <w:r>
               <w:rPr>
                 <w:rStyle w:val="Hypertextovodkaz"/>
@@ -720,7 +720,7 @@
                 <w:noProof/>
                 <w:webHidden/>
               </w:rPr>
-              <w:instrText xml:space="preserve"> PAGEREF _Toc222407993 \h </w:instrText>
+              <w:instrText xml:space="preserve"> PAGEREF _Toc224131571 \h </w:instrText>
             </w:r>
             <w:r>
               <w:rPr>
@@ -768,7 +768,7 @@
               <w14:numForm w14:val="default"/>
             </w:rPr>
           </w:pPr>
-          <w:hyperlink w:anchor="_Toc222407994" w:history="1">
+          <w:hyperlink w:anchor="_Toc224131572" w:history="1">
             <w:r>
               <w:rPr>
                 <w:rStyle w:val="Hypertextovodkaz"/>
@@ -795,7 +795,7 @@
                 <w:noProof/>
                 <w:webHidden/>
               </w:rPr>
-              <w:instrText xml:space="preserve"> PAGEREF _Toc222407994 \h </w:instrText>
+              <w:instrText xml:space="preserve"> PAGEREF _Toc224131572 \h </w:instrText>
             </w:r>
             <w:r>
               <w:rPr>
@@ -843,7 +843,7 @@
               <w14:numForm w14:val="default"/>
             </w:rPr>
           </w:pPr>
-          <w:hyperlink w:anchor="_Toc222407995" w:history="1">
+          <w:hyperlink w:anchor="_Toc224131573" w:history="1">
             <w:r>
               <w:rPr>
                 <w:rStyle w:val="Hypertextovodkaz"/>
@@ -870,7 +870,7 @@
                 <w:noProof/>
                 <w:webHidden/>
               </w:rPr>
-              <w:instrText xml:space="preserve"> PAGEREF _Toc222407995 \h </w:instrText>
+              <w:instrText xml:space="preserve"> PAGEREF _Toc224131573 \h </w:instrText>
             </w:r>
             <w:r>
               <w:rPr>
@@ -918,7 +918,7 @@
               <w14:numForm w14:val="default"/>
             </w:rPr>
           </w:pPr>
-          <w:hyperlink w:anchor="_Toc222407996" w:history="1">
+          <w:hyperlink w:anchor="_Toc224131574" w:history="1">
             <w:r>
               <w:rPr>
                 <w:rStyle w:val="Hypertextovodkaz"/>
@@ -945,7 +945,7 @@
                 <w:noProof/>
                 <w:webHidden/>
               </w:rPr>
-              <w:instrText xml:space="preserve"> PAGEREF _Toc222407996 \h </w:instrText>
+              <w:instrText xml:space="preserve"> PAGEREF _Toc224131574 \h </w:instrText>
             </w:r>
             <w:r>
               <w:rPr>
@@ -993,7 +993,7 @@
               <w14:numForm w14:val="default"/>
             </w:rPr>
           </w:pPr>
-          <w:hyperlink w:anchor="_Toc222407997" w:history="1">
+          <w:hyperlink w:anchor="_Toc224131575" w:history="1">
             <w:r>
               <w:rPr>
                 <w:rStyle w:val="Hypertextovodkaz"/>
@@ -1020,7 +1020,7 @@
                 <w:noProof/>
                 <w:webHidden/>
               </w:rPr>
-              <w:instrText xml:space="preserve"> PAGEREF _Toc222407997 \h </w:instrText>
+              <w:instrText xml:space="preserve"> PAGEREF _Toc224131575 \h </w:instrText>
             </w:r>
             <w:r>
               <w:rPr>
@@ -1068,13 +1068,13 @@
               <w14:numForm w14:val="default"/>
             </w:rPr>
           </w:pPr>
-          <w:hyperlink w:anchor="_Toc222407998" w:history="1">
+          <w:hyperlink w:anchor="_Toc224131576" w:history="1">
             <w:r>
               <w:rPr>
                 <w:rStyle w:val="Hypertextovodkaz"/>
                 <w:noProof/>
               </w:rPr>
-              <w:t>1.3.2 Effects of large outages on business</w:t>
+              <w:t>1.3.2 Prevention</w:t>
             </w:r>
             <w:r>
               <w:rPr>
@@ -1095,7 +1095,7 @@
                 <w:noProof/>
                 <w:webHidden/>
               </w:rPr>
-              <w:instrText xml:space="preserve"> PAGEREF _Toc222407998 \h </w:instrText>
+              <w:instrText xml:space="preserve"> PAGEREF _Toc224131576 \h </w:instrText>
             </w:r>
             <w:r>
               <w:rPr>
@@ -1116,6 +1116,156 @@
                 <w:webHidden/>
               </w:rPr>
               <w:t>10</w:t>
+            </w:r>
+            <w:r>
+              <w:rPr>
+                <w:noProof/>
+                <w:webHidden/>
+              </w:rPr>
+              <w:fldChar w:fldCharType="end"/>
+            </w:r>
+          </w:hyperlink>
+        </w:p>
+        <w:p>
+          <w:pPr>
+            <w:pStyle w:val="Obsah1"/>
+            <w:tabs>
+              <w:tab w:val="right" w:leader="dot" w:pos="8776"/>
+            </w:tabs>
+            <w:rPr>
+              <w:rFonts w:eastAsiaTheme="minorEastAsia"/>
+              <w:noProof/>
+              <w:kern w:val="2"/>
+              <w:sz w:val="24"/>
+              <w:szCs w:val="24"/>
+              <w:lang w:val="cs-CZ" w:eastAsia="cs-CZ"/>
+              <w14:ligatures w14:val="standardContextual"/>
+              <w14:numForm w14:val="default"/>
+            </w:rPr>
+          </w:pPr>
+          <w:hyperlink w:anchor="_Toc224131577" w:history="1">
+            <w:r>
+              <w:rPr>
+                <w:rStyle w:val="Hypertextovodkaz"/>
+                <w:noProof/>
+              </w:rPr>
+              <w:t>2 Logging and Monitoring</w:t>
+            </w:r>
+            <w:r>
+              <w:rPr>
+                <w:noProof/>
+                <w:webHidden/>
+              </w:rPr>
+              <w:tab/>
+            </w:r>
+            <w:r>
+              <w:rPr>
+                <w:noProof/>
+                <w:webHidden/>
+              </w:rPr>
+              <w:fldChar w:fldCharType="begin"/>
+            </w:r>
+            <w:r>
+              <w:rPr>
+                <w:noProof/>
+                <w:webHidden/>
+              </w:rPr>
+              <w:instrText xml:space="preserve"> PAGEREF _Toc224131577 \h </w:instrText>
+            </w:r>
+            <w:r>
+              <w:rPr>
+                <w:noProof/>
+                <w:webHidden/>
+              </w:rPr>
+            </w:r>
+            <w:r>
+              <w:rPr>
+                <w:noProof/>
+                <w:webHidden/>
+              </w:rPr>
+              <w:fldChar w:fldCharType="separate"/>
+            </w:r>
+            <w:r>
+              <w:rPr>
+                <w:noProof/>
+                <w:webHidden/>
+              </w:rPr>
+              <w:t>11</w:t>
+            </w:r>
+            <w:r>
+              <w:rPr>
+                <w:noProof/>
+                <w:webHidden/>
+              </w:rPr>
+              <w:fldChar w:fldCharType="end"/>
+            </w:r>
+          </w:hyperlink>
+        </w:p>
+        <w:p>
+          <w:pPr>
+            <w:pStyle w:val="Obsah2"/>
+            <w:tabs>
+              <w:tab w:val="right" w:leader="dot" w:pos="8776"/>
+            </w:tabs>
+            <w:rPr>
+              <w:rFonts w:eastAsiaTheme="minorEastAsia"/>
+              <w:noProof/>
+              <w:kern w:val="2"/>
+              <w:sz w:val="24"/>
+              <w:szCs w:val="24"/>
+              <w:lang w:val="cs-CZ" w:eastAsia="cs-CZ"/>
+              <w14:ligatures w14:val="standardContextual"/>
+              <w14:numForm w14:val="default"/>
+            </w:rPr>
+          </w:pPr>
+          <w:hyperlink w:anchor="_Toc224131578" w:history="1">
+            <w:r>
+              <w:rPr>
+                <w:rStyle w:val="Hypertextovodkaz"/>
+                <w:noProof/>
+              </w:rPr>
+              <w:t>2.1 Logging Formats</w:t>
+            </w:r>
+            <w:r>
+              <w:rPr>
+                <w:noProof/>
+                <w:webHidden/>
+              </w:rPr>
+              <w:tab/>
+            </w:r>
+            <w:r>
+              <w:rPr>
+                <w:noProof/>
+                <w:webHidden/>
+              </w:rPr>
+              <w:fldChar w:fldCharType="begin"/>
+            </w:r>
+            <w:r>
+              <w:rPr>
+                <w:noProof/>
+                <w:webHidden/>
+              </w:rPr>
+              <w:instrText xml:space="preserve"> PAGEREF _Toc224131578 \h </w:instrText>
+            </w:r>
+            <w:r>
+              <w:rPr>
+                <w:noProof/>
+                <w:webHidden/>
+              </w:rPr>
+            </w:r>
+            <w:r>
+              <w:rPr>
+                <w:noProof/>
+                <w:webHidden/>
+              </w:rPr>
+              <w:fldChar w:fldCharType="separate"/>
+            </w:r>
+            <w:r>
+              <w:rPr>
+                <w:noProof/>
+                <w:webHidden/>
+              </w:rPr>
+              <w:t>12</w:t>
             </w:r>
             <w:r>
               <w:rPr>
@@ -1143,13 +1293,13 @@
               <w14:numForm w14:val="default"/>
             </w:rPr>
           </w:pPr>
-          <w:hyperlink w:anchor="_Toc222407999" w:history="1">
+          <w:hyperlink w:anchor="_Toc224131579" w:history="1">
             <w:r>
               <w:rPr>
                 <w:rStyle w:val="Hypertextovodkaz"/>
                 <w:noProof/>
               </w:rPr>
-              <w:t>1.3.3 Prevention</w:t>
+              <w:t>2.1.1 JSON</w:t>
             </w:r>
             <w:r>
               <w:rPr>
@@ -1170,7 +1320,7 @@
                 <w:noProof/>
                 <w:webHidden/>
               </w:rPr>
-              <w:instrText xml:space="preserve"> PAGEREF _Toc222407999 \h </w:instrText>
+              <w:instrText xml:space="preserve"> PAGEREF _Toc224131579 \h </w:instrText>
             </w:r>
             <w:r>
               <w:rPr>
@@ -1190,7 +1340,982 @@
                 <w:noProof/>
                 <w:webHidden/>
               </w:rPr>
-              <w:t>10</w:t>
+              <w:t>12</w:t>
+            </w:r>
+            <w:r>
+              <w:rPr>
+                <w:noProof/>
+                <w:webHidden/>
+              </w:rPr>
+              <w:fldChar w:fldCharType="end"/>
+            </w:r>
+          </w:hyperlink>
+        </w:p>
+        <w:p>
+          <w:pPr>
+            <w:pStyle w:val="Obsah3"/>
+            <w:tabs>
+              <w:tab w:val="right" w:leader="dot" w:pos="8776"/>
+            </w:tabs>
+            <w:rPr>
+              <w:rFonts w:eastAsiaTheme="minorEastAsia"/>
+              <w:noProof/>
+              <w:kern w:val="2"/>
+              <w:sz w:val="24"/>
+              <w:szCs w:val="24"/>
+              <w:lang w:val="cs-CZ" w:eastAsia="cs-CZ"/>
+              <w14:ligatures w14:val="standardContextual"/>
+              <w14:numForm w14:val="default"/>
+            </w:rPr>
+          </w:pPr>
+          <w:hyperlink w:anchor="_Toc224131580" w:history="1">
+            <w:r>
+              <w:rPr>
+                <w:rStyle w:val="Hypertextovodkaz"/>
+                <w:noProof/>
+              </w:rPr>
+              <w:t>2.1.2 XML and other markup languages</w:t>
+            </w:r>
+            <w:r>
+              <w:rPr>
+                <w:noProof/>
+                <w:webHidden/>
+              </w:rPr>
+              <w:tab/>
+            </w:r>
+            <w:r>
+              <w:rPr>
+                <w:noProof/>
+                <w:webHidden/>
+              </w:rPr>
+              <w:fldChar w:fldCharType="begin"/>
+            </w:r>
+            <w:r>
+              <w:rPr>
+                <w:noProof/>
+                <w:webHidden/>
+              </w:rPr>
+              <w:instrText xml:space="preserve"> PAGEREF _Toc224131580 \h </w:instrText>
+            </w:r>
+            <w:r>
+              <w:rPr>
+                <w:noProof/>
+                <w:webHidden/>
+              </w:rPr>
+            </w:r>
+            <w:r>
+              <w:rPr>
+                <w:noProof/>
+                <w:webHidden/>
+              </w:rPr>
+              <w:fldChar w:fldCharType="separate"/>
+            </w:r>
+            <w:r>
+              <w:rPr>
+                <w:noProof/>
+                <w:webHidden/>
+              </w:rPr>
+              <w:t>13</w:t>
+            </w:r>
+            <w:r>
+              <w:rPr>
+                <w:noProof/>
+                <w:webHidden/>
+              </w:rPr>
+              <w:fldChar w:fldCharType="end"/>
+            </w:r>
+          </w:hyperlink>
+        </w:p>
+        <w:p>
+          <w:pPr>
+            <w:pStyle w:val="Obsah3"/>
+            <w:tabs>
+              <w:tab w:val="right" w:leader="dot" w:pos="8776"/>
+            </w:tabs>
+            <w:rPr>
+              <w:rFonts w:eastAsiaTheme="minorEastAsia"/>
+              <w:noProof/>
+              <w:kern w:val="2"/>
+              <w:sz w:val="24"/>
+              <w:szCs w:val="24"/>
+              <w:lang w:val="cs-CZ" w:eastAsia="cs-CZ"/>
+              <w14:ligatures w14:val="standardContextual"/>
+              <w14:numForm w14:val="default"/>
+            </w:rPr>
+          </w:pPr>
+          <w:hyperlink w:anchor="_Toc224131581" w:history="1">
+            <w:r>
+              <w:rPr>
+                <w:rStyle w:val="Hypertextovodkaz"/>
+                <w:noProof/>
+              </w:rPr>
+              <w:t>2.1.3 Syslog</w:t>
+            </w:r>
+            <w:r>
+              <w:rPr>
+                <w:noProof/>
+                <w:webHidden/>
+              </w:rPr>
+              <w:tab/>
+            </w:r>
+            <w:r>
+              <w:rPr>
+                <w:noProof/>
+                <w:webHidden/>
+              </w:rPr>
+              <w:fldChar w:fldCharType="begin"/>
+            </w:r>
+            <w:r>
+              <w:rPr>
+                <w:noProof/>
+                <w:webHidden/>
+              </w:rPr>
+              <w:instrText xml:space="preserve"> PAGEREF _Toc224131581 \h </w:instrText>
+            </w:r>
+            <w:r>
+              <w:rPr>
+                <w:noProof/>
+                <w:webHidden/>
+              </w:rPr>
+            </w:r>
+            <w:r>
+              <w:rPr>
+                <w:noProof/>
+                <w:webHidden/>
+              </w:rPr>
+              <w:fldChar w:fldCharType="separate"/>
+            </w:r>
+            <w:r>
+              <w:rPr>
+                <w:noProof/>
+                <w:webHidden/>
+              </w:rPr>
+              <w:t>15</w:t>
+            </w:r>
+            <w:r>
+              <w:rPr>
+                <w:noProof/>
+                <w:webHidden/>
+              </w:rPr>
+              <w:fldChar w:fldCharType="end"/>
+            </w:r>
+          </w:hyperlink>
+        </w:p>
+        <w:p>
+          <w:pPr>
+            <w:pStyle w:val="Obsah3"/>
+            <w:tabs>
+              <w:tab w:val="right" w:leader="dot" w:pos="8776"/>
+            </w:tabs>
+            <w:rPr>
+              <w:rFonts w:eastAsiaTheme="minorEastAsia"/>
+              <w:noProof/>
+              <w:kern w:val="2"/>
+              <w:sz w:val="24"/>
+              <w:szCs w:val="24"/>
+              <w:lang w:val="cs-CZ" w:eastAsia="cs-CZ"/>
+              <w14:ligatures w14:val="standardContextual"/>
+              <w14:numForm w14:val="default"/>
+            </w:rPr>
+          </w:pPr>
+          <w:hyperlink w:anchor="_Toc224131582" w:history="1">
+            <w:r>
+              <w:rPr>
+                <w:rStyle w:val="Hypertextovodkaz"/>
+                <w:noProof/>
+              </w:rPr>
+              <w:t>2.1.4 DMARC</w:t>
+            </w:r>
+            <w:r>
+              <w:rPr>
+                <w:noProof/>
+                <w:webHidden/>
+              </w:rPr>
+              <w:tab/>
+            </w:r>
+            <w:r>
+              <w:rPr>
+                <w:noProof/>
+                <w:webHidden/>
+              </w:rPr>
+              <w:fldChar w:fldCharType="begin"/>
+            </w:r>
+            <w:r>
+              <w:rPr>
+                <w:noProof/>
+                <w:webHidden/>
+              </w:rPr>
+              <w:instrText xml:space="preserve"> PAGEREF _Toc224131582 \h </w:instrText>
+            </w:r>
+            <w:r>
+              <w:rPr>
+                <w:noProof/>
+                <w:webHidden/>
+              </w:rPr>
+            </w:r>
+            <w:r>
+              <w:rPr>
+                <w:noProof/>
+                <w:webHidden/>
+              </w:rPr>
+              <w:fldChar w:fldCharType="separate"/>
+            </w:r>
+            <w:r>
+              <w:rPr>
+                <w:noProof/>
+                <w:webHidden/>
+              </w:rPr>
+              <w:t>18</w:t>
+            </w:r>
+            <w:r>
+              <w:rPr>
+                <w:noProof/>
+                <w:webHidden/>
+              </w:rPr>
+              <w:fldChar w:fldCharType="end"/>
+            </w:r>
+          </w:hyperlink>
+        </w:p>
+        <w:p>
+          <w:pPr>
+            <w:pStyle w:val="Obsah2"/>
+            <w:tabs>
+              <w:tab w:val="right" w:leader="dot" w:pos="8776"/>
+            </w:tabs>
+            <w:rPr>
+              <w:rFonts w:eastAsiaTheme="minorEastAsia"/>
+              <w:noProof/>
+              <w:kern w:val="2"/>
+              <w:sz w:val="24"/>
+              <w:szCs w:val="24"/>
+              <w:lang w:val="cs-CZ" w:eastAsia="cs-CZ"/>
+              <w14:ligatures w14:val="standardContextual"/>
+              <w14:numForm w14:val="default"/>
+            </w:rPr>
+          </w:pPr>
+          <w:hyperlink w:anchor="_Toc224131583" w:history="1">
+            <w:r>
+              <w:rPr>
+                <w:rStyle w:val="Hypertextovodkaz"/>
+                <w:noProof/>
+              </w:rPr>
+              <w:t>2.2 Creating logs</w:t>
+            </w:r>
+            <w:r>
+              <w:rPr>
+                <w:noProof/>
+                <w:webHidden/>
+              </w:rPr>
+              <w:tab/>
+            </w:r>
+            <w:r>
+              <w:rPr>
+                <w:noProof/>
+                <w:webHidden/>
+              </w:rPr>
+              <w:fldChar w:fldCharType="begin"/>
+            </w:r>
+            <w:r>
+              <w:rPr>
+                <w:noProof/>
+                <w:webHidden/>
+              </w:rPr>
+              <w:instrText xml:space="preserve"> PAGEREF _Toc224131583 \h </w:instrText>
+            </w:r>
+            <w:r>
+              <w:rPr>
+                <w:noProof/>
+                <w:webHidden/>
+              </w:rPr>
+            </w:r>
+            <w:r>
+              <w:rPr>
+                <w:noProof/>
+                <w:webHidden/>
+              </w:rPr>
+              <w:fldChar w:fldCharType="separate"/>
+            </w:r>
+            <w:r>
+              <w:rPr>
+                <w:noProof/>
+                <w:webHidden/>
+              </w:rPr>
+              <w:t>18</w:t>
+            </w:r>
+            <w:r>
+              <w:rPr>
+                <w:noProof/>
+                <w:webHidden/>
+              </w:rPr>
+              <w:fldChar w:fldCharType="end"/>
+            </w:r>
+          </w:hyperlink>
+        </w:p>
+        <w:p>
+          <w:pPr>
+            <w:pStyle w:val="Obsah2"/>
+            <w:tabs>
+              <w:tab w:val="right" w:leader="dot" w:pos="8776"/>
+            </w:tabs>
+            <w:rPr>
+              <w:rFonts w:eastAsiaTheme="minorEastAsia"/>
+              <w:noProof/>
+              <w:kern w:val="2"/>
+              <w:sz w:val="24"/>
+              <w:szCs w:val="24"/>
+              <w:lang w:val="cs-CZ" w:eastAsia="cs-CZ"/>
+              <w14:ligatures w14:val="standardContextual"/>
+              <w14:numForm w14:val="default"/>
+            </w:rPr>
+          </w:pPr>
+          <w:hyperlink w:anchor="_Toc224131584" w:history="1">
+            <w:r>
+              <w:rPr>
+                <w:rStyle w:val="Hypertextovodkaz"/>
+                <w:noProof/>
+              </w:rPr>
+              <w:t>2.3 Storing and analyzing logs</w:t>
+            </w:r>
+            <w:r>
+              <w:rPr>
+                <w:noProof/>
+                <w:webHidden/>
+              </w:rPr>
+              <w:tab/>
+            </w:r>
+            <w:r>
+              <w:rPr>
+                <w:noProof/>
+                <w:webHidden/>
+              </w:rPr>
+              <w:fldChar w:fldCharType="begin"/>
+            </w:r>
+            <w:r>
+              <w:rPr>
+                <w:noProof/>
+                <w:webHidden/>
+              </w:rPr>
+              <w:instrText xml:space="preserve"> PAGEREF _Toc224131584 \h </w:instrText>
+            </w:r>
+            <w:r>
+              <w:rPr>
+                <w:noProof/>
+                <w:webHidden/>
+              </w:rPr>
+            </w:r>
+            <w:r>
+              <w:rPr>
+                <w:noProof/>
+                <w:webHidden/>
+              </w:rPr>
+              <w:fldChar w:fldCharType="separate"/>
+            </w:r>
+            <w:r>
+              <w:rPr>
+                <w:noProof/>
+                <w:webHidden/>
+              </w:rPr>
+              <w:t>18</w:t>
+            </w:r>
+            <w:r>
+              <w:rPr>
+                <w:noProof/>
+                <w:webHidden/>
+              </w:rPr>
+              <w:fldChar w:fldCharType="end"/>
+            </w:r>
+          </w:hyperlink>
+        </w:p>
+        <w:p>
+          <w:pPr>
+            <w:pStyle w:val="Obsah3"/>
+            <w:tabs>
+              <w:tab w:val="right" w:leader="dot" w:pos="8776"/>
+            </w:tabs>
+            <w:rPr>
+              <w:rFonts w:eastAsiaTheme="minorEastAsia"/>
+              <w:noProof/>
+              <w:kern w:val="2"/>
+              <w:sz w:val="24"/>
+              <w:szCs w:val="24"/>
+              <w:lang w:val="cs-CZ" w:eastAsia="cs-CZ"/>
+              <w14:ligatures w14:val="standardContextual"/>
+              <w14:numForm w14:val="default"/>
+            </w:rPr>
+          </w:pPr>
+          <w:hyperlink w:anchor="_Toc224131585" w:history="1">
+            <w:r>
+              <w:rPr>
+                <w:rStyle w:val="Hypertextovodkaz"/>
+                <w:noProof/>
+              </w:rPr>
+              <w:t>2.3.1 System Logs</w:t>
+            </w:r>
+            <w:r>
+              <w:rPr>
+                <w:noProof/>
+                <w:webHidden/>
+              </w:rPr>
+              <w:tab/>
+            </w:r>
+            <w:r>
+              <w:rPr>
+                <w:noProof/>
+                <w:webHidden/>
+              </w:rPr>
+              <w:fldChar w:fldCharType="begin"/>
+            </w:r>
+            <w:r>
+              <w:rPr>
+                <w:noProof/>
+                <w:webHidden/>
+              </w:rPr>
+              <w:instrText xml:space="preserve"> PAGEREF _Toc224131585 \h </w:instrText>
+            </w:r>
+            <w:r>
+              <w:rPr>
+                <w:noProof/>
+                <w:webHidden/>
+              </w:rPr>
+            </w:r>
+            <w:r>
+              <w:rPr>
+                <w:noProof/>
+                <w:webHidden/>
+              </w:rPr>
+              <w:fldChar w:fldCharType="separate"/>
+            </w:r>
+            <w:r>
+              <w:rPr>
+                <w:noProof/>
+                <w:webHidden/>
+              </w:rPr>
+              <w:t>19</w:t>
+            </w:r>
+            <w:r>
+              <w:rPr>
+                <w:noProof/>
+                <w:webHidden/>
+              </w:rPr>
+              <w:fldChar w:fldCharType="end"/>
+            </w:r>
+          </w:hyperlink>
+        </w:p>
+        <w:p>
+          <w:pPr>
+            <w:pStyle w:val="Obsah3"/>
+            <w:tabs>
+              <w:tab w:val="right" w:leader="dot" w:pos="8776"/>
+            </w:tabs>
+            <w:rPr>
+              <w:rFonts w:eastAsiaTheme="minorEastAsia"/>
+              <w:noProof/>
+              <w:kern w:val="2"/>
+              <w:sz w:val="24"/>
+              <w:szCs w:val="24"/>
+              <w:lang w:val="cs-CZ" w:eastAsia="cs-CZ"/>
+              <w14:ligatures w14:val="standardContextual"/>
+              <w14:numForm w14:val="default"/>
+            </w:rPr>
+          </w:pPr>
+          <w:hyperlink w:anchor="_Toc224131586" w:history="1">
+            <w:r>
+              <w:rPr>
+                <w:rStyle w:val="Hypertextovodkaz"/>
+                <w:noProof/>
+              </w:rPr>
+              <w:t>2.3.2 Storage requirements and costs</w:t>
+            </w:r>
+            <w:r>
+              <w:rPr>
+                <w:noProof/>
+                <w:webHidden/>
+              </w:rPr>
+              <w:tab/>
+            </w:r>
+            <w:r>
+              <w:rPr>
+                <w:noProof/>
+                <w:webHidden/>
+              </w:rPr>
+              <w:fldChar w:fldCharType="begin"/>
+            </w:r>
+            <w:r>
+              <w:rPr>
+                <w:noProof/>
+                <w:webHidden/>
+              </w:rPr>
+              <w:instrText xml:space="preserve"> PAGEREF _Toc224131586 \h </w:instrText>
+            </w:r>
+            <w:r>
+              <w:rPr>
+                <w:noProof/>
+                <w:webHidden/>
+              </w:rPr>
+            </w:r>
+            <w:r>
+              <w:rPr>
+                <w:noProof/>
+                <w:webHidden/>
+              </w:rPr>
+              <w:fldChar w:fldCharType="separate"/>
+            </w:r>
+            <w:r>
+              <w:rPr>
+                <w:noProof/>
+                <w:webHidden/>
+              </w:rPr>
+              <w:t>19</w:t>
+            </w:r>
+            <w:r>
+              <w:rPr>
+                <w:noProof/>
+                <w:webHidden/>
+              </w:rPr>
+              <w:fldChar w:fldCharType="end"/>
+            </w:r>
+          </w:hyperlink>
+        </w:p>
+        <w:p>
+          <w:pPr>
+            <w:pStyle w:val="Obsah2"/>
+            <w:tabs>
+              <w:tab w:val="right" w:leader="dot" w:pos="8776"/>
+            </w:tabs>
+            <w:rPr>
+              <w:rFonts w:eastAsiaTheme="minorEastAsia"/>
+              <w:noProof/>
+              <w:kern w:val="2"/>
+              <w:sz w:val="24"/>
+              <w:szCs w:val="24"/>
+              <w:lang w:val="cs-CZ" w:eastAsia="cs-CZ"/>
+              <w14:ligatures w14:val="standardContextual"/>
+              <w14:numForm w14:val="default"/>
+            </w:rPr>
+          </w:pPr>
+          <w:hyperlink w:anchor="_Toc224131587" w:history="1">
+            <w:r>
+              <w:rPr>
+                <w:rStyle w:val="Hypertextovodkaz"/>
+                <w:noProof/>
+              </w:rPr>
+              <w:t>2.4 Monitoring</w:t>
+            </w:r>
+            <w:r>
+              <w:rPr>
+                <w:noProof/>
+                <w:webHidden/>
+              </w:rPr>
+              <w:tab/>
+            </w:r>
+            <w:r>
+              <w:rPr>
+                <w:noProof/>
+                <w:webHidden/>
+              </w:rPr>
+              <w:fldChar w:fldCharType="begin"/>
+            </w:r>
+            <w:r>
+              <w:rPr>
+                <w:noProof/>
+                <w:webHidden/>
+              </w:rPr>
+              <w:instrText xml:space="preserve"> PAGEREF _Toc224131587 \h </w:instrText>
+            </w:r>
+            <w:r>
+              <w:rPr>
+                <w:noProof/>
+                <w:webHidden/>
+              </w:rPr>
+            </w:r>
+            <w:r>
+              <w:rPr>
+                <w:noProof/>
+                <w:webHidden/>
+              </w:rPr>
+              <w:fldChar w:fldCharType="separate"/>
+            </w:r>
+            <w:r>
+              <w:rPr>
+                <w:noProof/>
+                <w:webHidden/>
+              </w:rPr>
+              <w:t>19</w:t>
+            </w:r>
+            <w:r>
+              <w:rPr>
+                <w:noProof/>
+                <w:webHidden/>
+              </w:rPr>
+              <w:fldChar w:fldCharType="end"/>
+            </w:r>
+          </w:hyperlink>
+        </w:p>
+        <w:p>
+          <w:pPr>
+            <w:pStyle w:val="Obsah3"/>
+            <w:tabs>
+              <w:tab w:val="right" w:leader="dot" w:pos="8776"/>
+            </w:tabs>
+            <w:rPr>
+              <w:rFonts w:eastAsiaTheme="minorEastAsia"/>
+              <w:noProof/>
+              <w:kern w:val="2"/>
+              <w:sz w:val="24"/>
+              <w:szCs w:val="24"/>
+              <w:lang w:val="cs-CZ" w:eastAsia="cs-CZ"/>
+              <w14:ligatures w14:val="standardContextual"/>
+              <w14:numForm w14:val="default"/>
+            </w:rPr>
+          </w:pPr>
+          <w:hyperlink w:anchor="_Toc224131588" w:history="1">
+            <w:r>
+              <w:rPr>
+                <w:rStyle w:val="Hypertextovodkaz"/>
+                <w:noProof/>
+              </w:rPr>
+              <w:t>2.4.1 Real-time monitoring</w:t>
+            </w:r>
+            <w:r>
+              <w:rPr>
+                <w:noProof/>
+                <w:webHidden/>
+              </w:rPr>
+              <w:tab/>
+            </w:r>
+            <w:r>
+              <w:rPr>
+                <w:noProof/>
+                <w:webHidden/>
+              </w:rPr>
+              <w:fldChar w:fldCharType="begin"/>
+            </w:r>
+            <w:r>
+              <w:rPr>
+                <w:noProof/>
+                <w:webHidden/>
+              </w:rPr>
+              <w:instrText xml:space="preserve"> PAGEREF _Toc224131588 \h </w:instrText>
+            </w:r>
+            <w:r>
+              <w:rPr>
+                <w:noProof/>
+                <w:webHidden/>
+              </w:rPr>
+            </w:r>
+            <w:r>
+              <w:rPr>
+                <w:noProof/>
+                <w:webHidden/>
+              </w:rPr>
+              <w:fldChar w:fldCharType="separate"/>
+            </w:r>
+            <w:r>
+              <w:rPr>
+                <w:noProof/>
+                <w:webHidden/>
+              </w:rPr>
+              <w:t>19</w:t>
+            </w:r>
+            <w:r>
+              <w:rPr>
+                <w:noProof/>
+                <w:webHidden/>
+              </w:rPr>
+              <w:fldChar w:fldCharType="end"/>
+            </w:r>
+          </w:hyperlink>
+        </w:p>
+        <w:p>
+          <w:pPr>
+            <w:pStyle w:val="Obsah3"/>
+            <w:tabs>
+              <w:tab w:val="right" w:leader="dot" w:pos="8776"/>
+            </w:tabs>
+            <w:rPr>
+              <w:rFonts w:eastAsiaTheme="minorEastAsia"/>
+              <w:noProof/>
+              <w:kern w:val="2"/>
+              <w:sz w:val="24"/>
+              <w:szCs w:val="24"/>
+              <w:lang w:val="cs-CZ" w:eastAsia="cs-CZ"/>
+              <w14:ligatures w14:val="standardContextual"/>
+              <w14:numForm w14:val="default"/>
+            </w:rPr>
+          </w:pPr>
+          <w:hyperlink w:anchor="_Toc224131589" w:history="1">
+            <w:r>
+              <w:rPr>
+                <w:rStyle w:val="Hypertextovodkaz"/>
+                <w:noProof/>
+              </w:rPr>
+              <w:t>2.4.2 Dashboards and Single Pane of Glass</w:t>
+            </w:r>
+            <w:r>
+              <w:rPr>
+                <w:noProof/>
+                <w:webHidden/>
+              </w:rPr>
+              <w:tab/>
+            </w:r>
+            <w:r>
+              <w:rPr>
+                <w:noProof/>
+                <w:webHidden/>
+              </w:rPr>
+              <w:fldChar w:fldCharType="begin"/>
+            </w:r>
+            <w:r>
+              <w:rPr>
+                <w:noProof/>
+                <w:webHidden/>
+              </w:rPr>
+              <w:instrText xml:space="preserve"> PAGEREF _Toc224131589 \h </w:instrText>
+            </w:r>
+            <w:r>
+              <w:rPr>
+                <w:noProof/>
+                <w:webHidden/>
+              </w:rPr>
+            </w:r>
+            <w:r>
+              <w:rPr>
+                <w:noProof/>
+                <w:webHidden/>
+              </w:rPr>
+              <w:fldChar w:fldCharType="separate"/>
+            </w:r>
+            <w:r>
+              <w:rPr>
+                <w:noProof/>
+                <w:webHidden/>
+              </w:rPr>
+              <w:t>19</w:t>
+            </w:r>
+            <w:r>
+              <w:rPr>
+                <w:noProof/>
+                <w:webHidden/>
+              </w:rPr>
+              <w:fldChar w:fldCharType="end"/>
+            </w:r>
+          </w:hyperlink>
+        </w:p>
+        <w:p>
+          <w:pPr>
+            <w:pStyle w:val="Obsah2"/>
+            <w:tabs>
+              <w:tab w:val="right" w:leader="dot" w:pos="8776"/>
+            </w:tabs>
+            <w:rPr>
+              <w:rFonts w:eastAsiaTheme="minorEastAsia"/>
+              <w:noProof/>
+              <w:kern w:val="2"/>
+              <w:sz w:val="24"/>
+              <w:szCs w:val="24"/>
+              <w:lang w:val="cs-CZ" w:eastAsia="cs-CZ"/>
+              <w14:ligatures w14:val="standardContextual"/>
+              <w14:numForm w14:val="default"/>
+            </w:rPr>
+          </w:pPr>
+          <w:hyperlink w:anchor="_Toc224131590" w:history="1">
+            <w:r>
+              <w:rPr>
+                <w:rStyle w:val="Hypertextovodkaz"/>
+                <w:noProof/>
+              </w:rPr>
+              <w:t>2.5 Alerting</w:t>
+            </w:r>
+            <w:r>
+              <w:rPr>
+                <w:noProof/>
+                <w:webHidden/>
+              </w:rPr>
+              <w:tab/>
+            </w:r>
+            <w:r>
+              <w:rPr>
+                <w:noProof/>
+                <w:webHidden/>
+              </w:rPr>
+              <w:fldChar w:fldCharType="begin"/>
+            </w:r>
+            <w:r>
+              <w:rPr>
+                <w:noProof/>
+                <w:webHidden/>
+              </w:rPr>
+              <w:instrText xml:space="preserve"> PAGEREF _Toc224131590 \h </w:instrText>
+            </w:r>
+            <w:r>
+              <w:rPr>
+                <w:noProof/>
+                <w:webHidden/>
+              </w:rPr>
+            </w:r>
+            <w:r>
+              <w:rPr>
+                <w:noProof/>
+                <w:webHidden/>
+              </w:rPr>
+              <w:fldChar w:fldCharType="separate"/>
+            </w:r>
+            <w:r>
+              <w:rPr>
+                <w:noProof/>
+                <w:webHidden/>
+              </w:rPr>
+              <w:t>19</w:t>
+            </w:r>
+            <w:r>
+              <w:rPr>
+                <w:noProof/>
+                <w:webHidden/>
+              </w:rPr>
+              <w:fldChar w:fldCharType="end"/>
+            </w:r>
+          </w:hyperlink>
+        </w:p>
+        <w:p>
+          <w:pPr>
+            <w:pStyle w:val="Obsah3"/>
+            <w:tabs>
+              <w:tab w:val="right" w:leader="dot" w:pos="8776"/>
+            </w:tabs>
+            <w:rPr>
+              <w:rFonts w:eastAsiaTheme="minorEastAsia"/>
+              <w:noProof/>
+              <w:kern w:val="2"/>
+              <w:sz w:val="24"/>
+              <w:szCs w:val="24"/>
+              <w:lang w:val="cs-CZ" w:eastAsia="cs-CZ"/>
+              <w14:ligatures w14:val="standardContextual"/>
+              <w14:numForm w14:val="default"/>
+            </w:rPr>
+          </w:pPr>
+          <w:hyperlink w:anchor="_Toc224131591" w:history="1">
+            <w:r>
+              <w:rPr>
+                <w:rStyle w:val="Hypertextovodkaz"/>
+                <w:noProof/>
+              </w:rPr>
+              <w:t>2.5.1 Methods of Alerting</w:t>
+            </w:r>
+            <w:r>
+              <w:rPr>
+                <w:noProof/>
+                <w:webHidden/>
+              </w:rPr>
+              <w:tab/>
+            </w:r>
+            <w:r>
+              <w:rPr>
+                <w:noProof/>
+                <w:webHidden/>
+              </w:rPr>
+              <w:fldChar w:fldCharType="begin"/>
+            </w:r>
+            <w:r>
+              <w:rPr>
+                <w:noProof/>
+                <w:webHidden/>
+              </w:rPr>
+              <w:instrText xml:space="preserve"> PAGEREF _Toc224131591 \h </w:instrText>
+            </w:r>
+            <w:r>
+              <w:rPr>
+                <w:noProof/>
+                <w:webHidden/>
+              </w:rPr>
+            </w:r>
+            <w:r>
+              <w:rPr>
+                <w:noProof/>
+                <w:webHidden/>
+              </w:rPr>
+              <w:fldChar w:fldCharType="separate"/>
+            </w:r>
+            <w:r>
+              <w:rPr>
+                <w:noProof/>
+                <w:webHidden/>
+              </w:rPr>
+              <w:t>19</w:t>
+            </w:r>
+            <w:r>
+              <w:rPr>
+                <w:noProof/>
+                <w:webHidden/>
+              </w:rPr>
+              <w:fldChar w:fldCharType="end"/>
+            </w:r>
+          </w:hyperlink>
+        </w:p>
+        <w:p>
+          <w:pPr>
+            <w:pStyle w:val="Obsah3"/>
+            <w:tabs>
+              <w:tab w:val="right" w:leader="dot" w:pos="8776"/>
+            </w:tabs>
+            <w:rPr>
+              <w:rFonts w:eastAsiaTheme="minorEastAsia"/>
+              <w:noProof/>
+              <w:kern w:val="2"/>
+              <w:sz w:val="24"/>
+              <w:szCs w:val="24"/>
+              <w:lang w:val="cs-CZ" w:eastAsia="cs-CZ"/>
+              <w14:ligatures w14:val="standardContextual"/>
+              <w14:numForm w14:val="default"/>
+            </w:rPr>
+          </w:pPr>
+          <w:hyperlink w:anchor="_Toc224131592" w:history="1">
+            <w:r>
+              <w:rPr>
+                <w:rStyle w:val="Hypertextovodkaz"/>
+                <w:noProof/>
+              </w:rPr>
+              <w:t>2.5.2 Alert Fatigue</w:t>
+            </w:r>
+            <w:r>
+              <w:rPr>
+                <w:noProof/>
+                <w:webHidden/>
+              </w:rPr>
+              <w:tab/>
+            </w:r>
+            <w:r>
+              <w:rPr>
+                <w:noProof/>
+                <w:webHidden/>
+              </w:rPr>
+              <w:fldChar w:fldCharType="begin"/>
+            </w:r>
+            <w:r>
+              <w:rPr>
+                <w:noProof/>
+                <w:webHidden/>
+              </w:rPr>
+              <w:instrText xml:space="preserve"> PAGEREF _Toc224131592 \h </w:instrText>
+            </w:r>
+            <w:r>
+              <w:rPr>
+                <w:noProof/>
+                <w:webHidden/>
+              </w:rPr>
+            </w:r>
+            <w:r>
+              <w:rPr>
+                <w:noProof/>
+                <w:webHidden/>
+              </w:rPr>
+              <w:fldChar w:fldCharType="separate"/>
+            </w:r>
+            <w:r>
+              <w:rPr>
+                <w:noProof/>
+                <w:webHidden/>
+              </w:rPr>
+              <w:t>19</w:t>
             </w:r>
             <w:r>
               <w:rPr>
@@ -1218,13 +2343,13 @@
               <w14:numForm w14:val="default"/>
             </w:rPr>
           </w:pPr>
-          <w:hyperlink w:anchor="_Toc222408000" w:history="1">
+          <w:hyperlink w:anchor="_Toc224131593" w:history="1">
             <w:r>
               <w:rPr>
                 <w:rStyle w:val="Hypertextovodkaz"/>
                 <w:noProof/>
               </w:rPr>
-              <w:t>2 Monitoring and Logging</w:t>
+              <w:t>3 Application Implementation</w:t>
             </w:r>
             <w:r>
               <w:rPr>
@@ -1245,7 +2370,7 @@
                 <w:noProof/>
                 <w:webHidden/>
               </w:rPr>
-              <w:instrText xml:space="preserve"> PAGEREF _Toc222408000 \h </w:instrText>
+              <w:instrText xml:space="preserve"> PAGEREF _Toc224131593 \h </w:instrText>
             </w:r>
             <w:r>
               <w:rPr>
@@ -1265,7 +2390,7 @@
                 <w:noProof/>
                 <w:webHidden/>
               </w:rPr>
-              <w:t>11</w:t>
+              <w:t>20</w:t>
             </w:r>
             <w:r>
               <w:rPr>
@@ -1293,13 +2418,13 @@
               <w14:numForm w14:val="default"/>
             </w:rPr>
           </w:pPr>
-          <w:hyperlink w:anchor="_Toc222408001" w:history="1">
+          <w:hyperlink w:anchor="_Toc224131594" w:history="1">
             <w:r>
               <w:rPr>
                 <w:rStyle w:val="Hypertextovodkaz"/>
                 <w:noProof/>
               </w:rPr>
-              <w:t>2.1 Logging Formats</w:t>
+              <w:t>3.1 Requirements</w:t>
             </w:r>
             <w:r>
               <w:rPr>
@@ -1320,7 +2445,7 @@
                 <w:noProof/>
                 <w:webHidden/>
               </w:rPr>
-              <w:instrText xml:space="preserve"> PAGEREF _Toc222408001 \h </w:instrText>
+              <w:instrText xml:space="preserve"> PAGEREF _Toc224131594 \h </w:instrText>
             </w:r>
             <w:r>
               <w:rPr>
@@ -1340,307 +2465,7 @@
                 <w:noProof/>
                 <w:webHidden/>
               </w:rPr>
-              <w:t>11</w:t>
-            </w:r>
-            <w:r>
-              <w:rPr>
-                <w:noProof/>
-                <w:webHidden/>
-              </w:rPr>
-              <w:fldChar w:fldCharType="end"/>
-            </w:r>
-          </w:hyperlink>
-        </w:p>
-        <w:p>
-          <w:pPr>
-            <w:pStyle w:val="Obsah3"/>
-            <w:tabs>
-              <w:tab w:val="right" w:leader="dot" w:pos="8776"/>
-            </w:tabs>
-            <w:rPr>
-              <w:rFonts w:eastAsiaTheme="minorEastAsia"/>
-              <w:noProof/>
-              <w:kern w:val="2"/>
-              <w:sz w:val="24"/>
-              <w:szCs w:val="24"/>
-              <w:lang w:val="cs-CZ" w:eastAsia="cs-CZ"/>
-              <w14:ligatures w14:val="standardContextual"/>
-              <w14:numForm w14:val="default"/>
-            </w:rPr>
-          </w:pPr>
-          <w:hyperlink w:anchor="_Toc222408002" w:history="1">
-            <w:r>
-              <w:rPr>
-                <w:rStyle w:val="Hypertextovodkaz"/>
-                <w:noProof/>
-              </w:rPr>
-              <w:t>2.1.1 JSON</w:t>
-            </w:r>
-            <w:r>
-              <w:rPr>
-                <w:noProof/>
-                <w:webHidden/>
-              </w:rPr>
-              <w:tab/>
-            </w:r>
-            <w:r>
-              <w:rPr>
-                <w:noProof/>
-                <w:webHidden/>
-              </w:rPr>
-              <w:fldChar w:fldCharType="begin"/>
-            </w:r>
-            <w:r>
-              <w:rPr>
-                <w:noProof/>
-                <w:webHidden/>
-              </w:rPr>
-              <w:instrText xml:space="preserve"> PAGEREF _Toc222408002 \h </w:instrText>
-            </w:r>
-            <w:r>
-              <w:rPr>
-                <w:noProof/>
-                <w:webHidden/>
-              </w:rPr>
-            </w:r>
-            <w:r>
-              <w:rPr>
-                <w:noProof/>
-                <w:webHidden/>
-              </w:rPr>
-              <w:fldChar w:fldCharType="separate"/>
-            </w:r>
-            <w:r>
-              <w:rPr>
-                <w:noProof/>
-                <w:webHidden/>
-              </w:rPr>
-              <w:t>11</w:t>
-            </w:r>
-            <w:r>
-              <w:rPr>
-                <w:noProof/>
-                <w:webHidden/>
-              </w:rPr>
-              <w:fldChar w:fldCharType="end"/>
-            </w:r>
-          </w:hyperlink>
-        </w:p>
-        <w:p>
-          <w:pPr>
-            <w:pStyle w:val="Obsah3"/>
-            <w:tabs>
-              <w:tab w:val="right" w:leader="dot" w:pos="8776"/>
-            </w:tabs>
-            <w:rPr>
-              <w:rFonts w:eastAsiaTheme="minorEastAsia"/>
-              <w:noProof/>
-              <w:kern w:val="2"/>
-              <w:sz w:val="24"/>
-              <w:szCs w:val="24"/>
-              <w:lang w:val="cs-CZ" w:eastAsia="cs-CZ"/>
-              <w14:ligatures w14:val="standardContextual"/>
-              <w14:numForm w14:val="default"/>
-            </w:rPr>
-          </w:pPr>
-          <w:hyperlink w:anchor="_Toc222408003" w:history="1">
-            <w:r>
-              <w:rPr>
-                <w:rStyle w:val="Hypertextovodkaz"/>
-                <w:noProof/>
-              </w:rPr>
-              <w:t>2.1.2 XML</w:t>
-            </w:r>
-            <w:r>
-              <w:rPr>
-                <w:noProof/>
-                <w:webHidden/>
-              </w:rPr>
-              <w:tab/>
-            </w:r>
-            <w:r>
-              <w:rPr>
-                <w:noProof/>
-                <w:webHidden/>
-              </w:rPr>
-              <w:fldChar w:fldCharType="begin"/>
-            </w:r>
-            <w:r>
-              <w:rPr>
-                <w:noProof/>
-                <w:webHidden/>
-              </w:rPr>
-              <w:instrText xml:space="preserve"> PAGEREF _Toc222408003 \h </w:instrText>
-            </w:r>
-            <w:r>
-              <w:rPr>
-                <w:noProof/>
-                <w:webHidden/>
-              </w:rPr>
-            </w:r>
-            <w:r>
-              <w:rPr>
-                <w:noProof/>
-                <w:webHidden/>
-              </w:rPr>
-              <w:fldChar w:fldCharType="separate"/>
-            </w:r>
-            <w:r>
-              <w:rPr>
-                <w:noProof/>
-                <w:webHidden/>
-              </w:rPr>
-              <w:t>11</w:t>
-            </w:r>
-            <w:r>
-              <w:rPr>
-                <w:noProof/>
-                <w:webHidden/>
-              </w:rPr>
-              <w:fldChar w:fldCharType="end"/>
-            </w:r>
-          </w:hyperlink>
-        </w:p>
-        <w:p>
-          <w:pPr>
-            <w:pStyle w:val="Obsah3"/>
-            <w:tabs>
-              <w:tab w:val="right" w:leader="dot" w:pos="8776"/>
-            </w:tabs>
-            <w:rPr>
-              <w:rFonts w:eastAsiaTheme="minorEastAsia"/>
-              <w:noProof/>
-              <w:kern w:val="2"/>
-              <w:sz w:val="24"/>
-              <w:szCs w:val="24"/>
-              <w:lang w:val="cs-CZ" w:eastAsia="cs-CZ"/>
-              <w14:ligatures w14:val="standardContextual"/>
-              <w14:numForm w14:val="default"/>
-            </w:rPr>
-          </w:pPr>
-          <w:hyperlink w:anchor="_Toc222408004" w:history="1">
-            <w:r>
-              <w:rPr>
-                <w:rStyle w:val="Hypertextovodkaz"/>
-                <w:noProof/>
-              </w:rPr>
-              <w:t>2.1.3 rsyslog</w:t>
-            </w:r>
-            <w:r>
-              <w:rPr>
-                <w:noProof/>
-                <w:webHidden/>
-              </w:rPr>
-              <w:tab/>
-            </w:r>
-            <w:r>
-              <w:rPr>
-                <w:noProof/>
-                <w:webHidden/>
-              </w:rPr>
-              <w:fldChar w:fldCharType="begin"/>
-            </w:r>
-            <w:r>
-              <w:rPr>
-                <w:noProof/>
-                <w:webHidden/>
-              </w:rPr>
-              <w:instrText xml:space="preserve"> PAGEREF _Toc222408004 \h </w:instrText>
-            </w:r>
-            <w:r>
-              <w:rPr>
-                <w:noProof/>
-                <w:webHidden/>
-              </w:rPr>
-            </w:r>
-            <w:r>
-              <w:rPr>
-                <w:noProof/>
-                <w:webHidden/>
-              </w:rPr>
-              <w:fldChar w:fldCharType="separate"/>
-            </w:r>
-            <w:r>
-              <w:rPr>
-                <w:noProof/>
-                <w:webHidden/>
-              </w:rPr>
-              <w:t>11</w:t>
-            </w:r>
-            <w:r>
-              <w:rPr>
-                <w:noProof/>
-                <w:webHidden/>
-              </w:rPr>
-              <w:fldChar w:fldCharType="end"/>
-            </w:r>
-          </w:hyperlink>
-        </w:p>
-        <w:p>
-          <w:pPr>
-            <w:pStyle w:val="Obsah3"/>
-            <w:tabs>
-              <w:tab w:val="right" w:leader="dot" w:pos="8776"/>
-            </w:tabs>
-            <w:rPr>
-              <w:rFonts w:eastAsiaTheme="minorEastAsia"/>
-              <w:noProof/>
-              <w:kern w:val="2"/>
-              <w:sz w:val="24"/>
-              <w:szCs w:val="24"/>
-              <w:lang w:val="cs-CZ" w:eastAsia="cs-CZ"/>
-              <w14:ligatures w14:val="standardContextual"/>
-              <w14:numForm w14:val="default"/>
-            </w:rPr>
-          </w:pPr>
-          <w:hyperlink w:anchor="_Toc222408005" w:history="1">
-            <w:r>
-              <w:rPr>
-                <w:rStyle w:val="Hypertextovodkaz"/>
-                <w:noProof/>
-              </w:rPr>
-              <w:t>2.1.4 DMACT</w:t>
-            </w:r>
-            <w:r>
-              <w:rPr>
-                <w:noProof/>
-                <w:webHidden/>
-              </w:rPr>
-              <w:tab/>
-            </w:r>
-            <w:r>
-              <w:rPr>
-                <w:noProof/>
-                <w:webHidden/>
-              </w:rPr>
-              <w:fldChar w:fldCharType="begin"/>
-            </w:r>
-            <w:r>
-              <w:rPr>
-                <w:noProof/>
-                <w:webHidden/>
-              </w:rPr>
-              <w:instrText xml:space="preserve"> PAGEREF _Toc222408005 \h </w:instrText>
-            </w:r>
-            <w:r>
-              <w:rPr>
-                <w:noProof/>
-                <w:webHidden/>
-              </w:rPr>
-            </w:r>
-            <w:r>
-              <w:rPr>
-                <w:noProof/>
-                <w:webHidden/>
-              </w:rPr>
-              <w:fldChar w:fldCharType="separate"/>
-            </w:r>
-            <w:r>
-              <w:rPr>
-                <w:noProof/>
-                <w:webHidden/>
-              </w:rPr>
-              <w:t>11</w:t>
+              <w:t>20</w:t>
             </w:r>
             <w:r>
               <w:rPr>
@@ -1668,13 +2493,13 @@
               <w14:numForm w14:val="default"/>
             </w:rPr>
           </w:pPr>
-          <w:hyperlink w:anchor="_Toc222408006" w:history="1">
+          <w:hyperlink w:anchor="_Toc224131595" w:history="1">
             <w:r>
               <w:rPr>
                 <w:rStyle w:val="Hypertextovodkaz"/>
                 <w:noProof/>
               </w:rPr>
-              <w:t>2.2 Storing and analyzing logs</w:t>
+              <w:t>3.2 Specification</w:t>
             </w:r>
             <w:r>
               <w:rPr>
@@ -1695,7 +2520,7 @@
                 <w:noProof/>
                 <w:webHidden/>
               </w:rPr>
-              <w:instrText xml:space="preserve"> PAGEREF _Toc222408006 \h </w:instrText>
+              <w:instrText xml:space="preserve"> PAGEREF _Toc224131595 \h </w:instrText>
             </w:r>
             <w:r>
               <w:rPr>
@@ -1715,232 +2540,7 @@
                 <w:noProof/>
                 <w:webHidden/>
               </w:rPr>
-              <w:t>11</w:t>
-            </w:r>
-            <w:r>
-              <w:rPr>
-                <w:noProof/>
-                <w:webHidden/>
-              </w:rPr>
-              <w:fldChar w:fldCharType="end"/>
-            </w:r>
-          </w:hyperlink>
-        </w:p>
-        <w:p>
-          <w:pPr>
-            <w:pStyle w:val="Obsah3"/>
-            <w:tabs>
-              <w:tab w:val="right" w:leader="dot" w:pos="8776"/>
-            </w:tabs>
-            <w:rPr>
-              <w:rFonts w:eastAsiaTheme="minorEastAsia"/>
-              <w:noProof/>
-              <w:kern w:val="2"/>
-              <w:sz w:val="24"/>
-              <w:szCs w:val="24"/>
-              <w:lang w:val="cs-CZ" w:eastAsia="cs-CZ"/>
-              <w14:ligatures w14:val="standardContextual"/>
-              <w14:numForm w14:val="default"/>
-            </w:rPr>
-          </w:pPr>
-          <w:hyperlink w:anchor="_Toc222408007" w:history="1">
-            <w:r>
-              <w:rPr>
-                <w:rStyle w:val="Hypertextovodkaz"/>
-                <w:noProof/>
-              </w:rPr>
-              <w:t>2.2.1 System Logs</w:t>
-            </w:r>
-            <w:r>
-              <w:rPr>
-                <w:noProof/>
-                <w:webHidden/>
-              </w:rPr>
-              <w:tab/>
-            </w:r>
-            <w:r>
-              <w:rPr>
-                <w:noProof/>
-                <w:webHidden/>
-              </w:rPr>
-              <w:fldChar w:fldCharType="begin"/>
-            </w:r>
-            <w:r>
-              <w:rPr>
-                <w:noProof/>
-                <w:webHidden/>
-              </w:rPr>
-              <w:instrText xml:space="preserve"> PAGEREF _Toc222408007 \h </w:instrText>
-            </w:r>
-            <w:r>
-              <w:rPr>
-                <w:noProof/>
-                <w:webHidden/>
-              </w:rPr>
-            </w:r>
-            <w:r>
-              <w:rPr>
-                <w:noProof/>
-                <w:webHidden/>
-              </w:rPr>
-              <w:fldChar w:fldCharType="separate"/>
-            </w:r>
-            <w:r>
-              <w:rPr>
-                <w:noProof/>
-                <w:webHidden/>
-              </w:rPr>
-              <w:t>11</w:t>
-            </w:r>
-            <w:r>
-              <w:rPr>
-                <w:noProof/>
-                <w:webHidden/>
-              </w:rPr>
-              <w:fldChar w:fldCharType="end"/>
-            </w:r>
-          </w:hyperlink>
-        </w:p>
-        <w:p>
-          <w:pPr>
-            <w:pStyle w:val="Obsah3"/>
-            <w:tabs>
-              <w:tab w:val="right" w:leader="dot" w:pos="8776"/>
-            </w:tabs>
-            <w:rPr>
-              <w:rFonts w:eastAsiaTheme="minorEastAsia"/>
-              <w:noProof/>
-              <w:kern w:val="2"/>
-              <w:sz w:val="24"/>
-              <w:szCs w:val="24"/>
-              <w:lang w:val="cs-CZ" w:eastAsia="cs-CZ"/>
-              <w14:ligatures w14:val="standardContextual"/>
-              <w14:numForm w14:val="default"/>
-            </w:rPr>
-          </w:pPr>
-          <w:hyperlink w:anchor="_Toc222408008" w:history="1">
-            <w:r>
-              <w:rPr>
-                <w:rStyle w:val="Hypertextovodkaz"/>
-                <w:noProof/>
-              </w:rPr>
-              <w:t>2.2.2 Aggregate Reports</w:t>
-            </w:r>
-            <w:r>
-              <w:rPr>
-                <w:noProof/>
-                <w:webHidden/>
-              </w:rPr>
-              <w:tab/>
-            </w:r>
-            <w:r>
-              <w:rPr>
-                <w:noProof/>
-                <w:webHidden/>
-              </w:rPr>
-              <w:fldChar w:fldCharType="begin"/>
-            </w:r>
-            <w:r>
-              <w:rPr>
-                <w:noProof/>
-                <w:webHidden/>
-              </w:rPr>
-              <w:instrText xml:space="preserve"> PAGEREF _Toc222408008 \h </w:instrText>
-            </w:r>
-            <w:r>
-              <w:rPr>
-                <w:noProof/>
-                <w:webHidden/>
-              </w:rPr>
-            </w:r>
-            <w:r>
-              <w:rPr>
-                <w:noProof/>
-                <w:webHidden/>
-              </w:rPr>
-              <w:fldChar w:fldCharType="separate"/>
-            </w:r>
-            <w:r>
-              <w:rPr>
-                <w:noProof/>
-                <w:webHidden/>
-              </w:rPr>
-              <w:t>11</w:t>
-            </w:r>
-            <w:r>
-              <w:rPr>
-                <w:noProof/>
-                <w:webHidden/>
-              </w:rPr>
-              <w:fldChar w:fldCharType="end"/>
-            </w:r>
-          </w:hyperlink>
-        </w:p>
-        <w:p>
-          <w:pPr>
-            <w:pStyle w:val="Obsah3"/>
-            <w:tabs>
-              <w:tab w:val="right" w:leader="dot" w:pos="8776"/>
-            </w:tabs>
-            <w:rPr>
-              <w:rFonts w:eastAsiaTheme="minorEastAsia"/>
-              <w:noProof/>
-              <w:kern w:val="2"/>
-              <w:sz w:val="24"/>
-              <w:szCs w:val="24"/>
-              <w:lang w:val="cs-CZ" w:eastAsia="cs-CZ"/>
-              <w14:ligatures w14:val="standardContextual"/>
-              <w14:numForm w14:val="default"/>
-            </w:rPr>
-          </w:pPr>
-          <w:hyperlink w:anchor="_Toc222408009" w:history="1">
-            <w:r>
-              <w:rPr>
-                <w:rStyle w:val="Hypertextovodkaz"/>
-                <w:noProof/>
-              </w:rPr>
-              <w:t>2.2.3 Storage requirements and costs</w:t>
-            </w:r>
-            <w:r>
-              <w:rPr>
-                <w:noProof/>
-                <w:webHidden/>
-              </w:rPr>
-              <w:tab/>
-            </w:r>
-            <w:r>
-              <w:rPr>
-                <w:noProof/>
-                <w:webHidden/>
-              </w:rPr>
-              <w:fldChar w:fldCharType="begin"/>
-            </w:r>
-            <w:r>
-              <w:rPr>
-                <w:noProof/>
-                <w:webHidden/>
-              </w:rPr>
-              <w:instrText xml:space="preserve"> PAGEREF _Toc222408009 \h </w:instrText>
-            </w:r>
-            <w:r>
-              <w:rPr>
-                <w:noProof/>
-                <w:webHidden/>
-              </w:rPr>
-            </w:r>
-            <w:r>
-              <w:rPr>
-                <w:noProof/>
-                <w:webHidden/>
-              </w:rPr>
-              <w:fldChar w:fldCharType="separate"/>
-            </w:r>
-            <w:r>
-              <w:rPr>
-                <w:noProof/>
-                <w:webHidden/>
-              </w:rPr>
-              <w:t>11</w:t>
+              <w:t>20</w:t>
             </w:r>
             <w:r>
               <w:rPr>
@@ -1968,13 +2568,13 @@
               <w14:numForm w14:val="default"/>
             </w:rPr>
           </w:pPr>
-          <w:hyperlink w:anchor="_Toc222408010" w:history="1">
+          <w:hyperlink w:anchor="_Toc224131596" w:history="1">
             <w:r>
               <w:rPr>
                 <w:rStyle w:val="Hypertextovodkaz"/>
                 <w:noProof/>
               </w:rPr>
-              <w:t>2.3 Monitoring</w:t>
+              <w:t>3.3 Implementation</w:t>
             </w:r>
             <w:r>
               <w:rPr>
@@ -1995,7 +2595,7 @@
                 <w:noProof/>
                 <w:webHidden/>
               </w:rPr>
-              <w:instrText xml:space="preserve"> PAGEREF _Toc222408010 \h </w:instrText>
+              <w:instrText xml:space="preserve"> PAGEREF _Toc224131596 \h </w:instrText>
             </w:r>
             <w:r>
               <w:rPr>
@@ -2015,157 +2615,7 @@
                 <w:noProof/>
                 <w:webHidden/>
               </w:rPr>
-              <w:t>11</w:t>
-            </w:r>
-            <w:r>
-              <w:rPr>
-                <w:noProof/>
-                <w:webHidden/>
-              </w:rPr>
-              <w:fldChar w:fldCharType="end"/>
-            </w:r>
-          </w:hyperlink>
-        </w:p>
-        <w:p>
-          <w:pPr>
-            <w:pStyle w:val="Obsah3"/>
-            <w:tabs>
-              <w:tab w:val="right" w:leader="dot" w:pos="8776"/>
-            </w:tabs>
-            <w:rPr>
-              <w:rFonts w:eastAsiaTheme="minorEastAsia"/>
-              <w:noProof/>
-              <w:kern w:val="2"/>
-              <w:sz w:val="24"/>
-              <w:szCs w:val="24"/>
-              <w:lang w:val="cs-CZ" w:eastAsia="cs-CZ"/>
-              <w14:ligatures w14:val="standardContextual"/>
-              <w14:numForm w14:val="default"/>
-            </w:rPr>
-          </w:pPr>
-          <w:hyperlink w:anchor="_Toc222408011" w:history="1">
-            <w:r>
-              <w:rPr>
-                <w:rStyle w:val="Hypertextovodkaz"/>
-                <w:noProof/>
-              </w:rPr>
-              <w:t>2.3.1 Real-time monitoring</w:t>
-            </w:r>
-            <w:r>
-              <w:rPr>
-                <w:noProof/>
-                <w:webHidden/>
-              </w:rPr>
-              <w:tab/>
-            </w:r>
-            <w:r>
-              <w:rPr>
-                <w:noProof/>
-                <w:webHidden/>
-              </w:rPr>
-              <w:fldChar w:fldCharType="begin"/>
-            </w:r>
-            <w:r>
-              <w:rPr>
-                <w:noProof/>
-                <w:webHidden/>
-              </w:rPr>
-              <w:instrText xml:space="preserve"> PAGEREF _Toc222408011 \h </w:instrText>
-            </w:r>
-            <w:r>
-              <w:rPr>
-                <w:noProof/>
-                <w:webHidden/>
-              </w:rPr>
-            </w:r>
-            <w:r>
-              <w:rPr>
-                <w:noProof/>
-                <w:webHidden/>
-              </w:rPr>
-              <w:fldChar w:fldCharType="separate"/>
-            </w:r>
-            <w:r>
-              <w:rPr>
-                <w:noProof/>
-                <w:webHidden/>
-              </w:rPr>
-              <w:t>11</w:t>
-            </w:r>
-            <w:r>
-              <w:rPr>
-                <w:noProof/>
-                <w:webHidden/>
-              </w:rPr>
-              <w:fldChar w:fldCharType="end"/>
-            </w:r>
-          </w:hyperlink>
-        </w:p>
-        <w:p>
-          <w:pPr>
-            <w:pStyle w:val="Obsah3"/>
-            <w:tabs>
-              <w:tab w:val="right" w:leader="dot" w:pos="8776"/>
-            </w:tabs>
-            <w:rPr>
-              <w:rFonts w:eastAsiaTheme="minorEastAsia"/>
-              <w:noProof/>
-              <w:kern w:val="2"/>
-              <w:sz w:val="24"/>
-              <w:szCs w:val="24"/>
-              <w:lang w:val="cs-CZ" w:eastAsia="cs-CZ"/>
-              <w14:ligatures w14:val="standardContextual"/>
-              <w14:numForm w14:val="default"/>
-            </w:rPr>
-          </w:pPr>
-          <w:hyperlink w:anchor="_Toc222408012" w:history="1">
-            <w:r>
-              <w:rPr>
-                <w:rStyle w:val="Hypertextovodkaz"/>
-                <w:noProof/>
-              </w:rPr>
-              <w:t>2.3.2 Dashboards and Single Pane of Glass</w:t>
-            </w:r>
-            <w:r>
-              <w:rPr>
-                <w:noProof/>
-                <w:webHidden/>
-              </w:rPr>
-              <w:tab/>
-            </w:r>
-            <w:r>
-              <w:rPr>
-                <w:noProof/>
-                <w:webHidden/>
-              </w:rPr>
-              <w:fldChar w:fldCharType="begin"/>
-            </w:r>
-            <w:r>
-              <w:rPr>
-                <w:noProof/>
-                <w:webHidden/>
-              </w:rPr>
-              <w:instrText xml:space="preserve"> PAGEREF _Toc222408012 \h </w:instrText>
-            </w:r>
-            <w:r>
-              <w:rPr>
-                <w:noProof/>
-                <w:webHidden/>
-              </w:rPr>
-            </w:r>
-            <w:r>
-              <w:rPr>
-                <w:noProof/>
-                <w:webHidden/>
-              </w:rPr>
-              <w:fldChar w:fldCharType="separate"/>
-            </w:r>
-            <w:r>
-              <w:rPr>
-                <w:noProof/>
-                <w:webHidden/>
-              </w:rPr>
-              <w:t>11</w:t>
+              <w:t>20</w:t>
             </w:r>
             <w:r>
               <w:rPr>
@@ -2193,13 +2643,13 @@
               <w14:numForm w14:val="default"/>
             </w:rPr>
           </w:pPr>
-          <w:hyperlink w:anchor="_Toc222408013" w:history="1">
+          <w:hyperlink w:anchor="_Toc224131597" w:history="1">
             <w:r>
               <w:rPr>
                 <w:rStyle w:val="Hypertextovodkaz"/>
                 <w:noProof/>
               </w:rPr>
-              <w:t>2.4 Alerting</w:t>
+              <w:t>3.4 Testing and CI/CD</w:t>
             </w:r>
             <w:r>
               <w:rPr>
@@ -2220,7 +2670,7 @@
                 <w:noProof/>
                 <w:webHidden/>
               </w:rPr>
-              <w:instrText xml:space="preserve"> PAGEREF _Toc222408013 \h </w:instrText>
+              <w:instrText xml:space="preserve"> PAGEREF _Toc224131597 \h </w:instrText>
             </w:r>
             <w:r>
               <w:rPr>
@@ -2240,157 +2690,7 @@
                 <w:noProof/>
                 <w:webHidden/>
               </w:rPr>
-              <w:t>11</w:t>
-            </w:r>
-            <w:r>
-              <w:rPr>
-                <w:noProof/>
-                <w:webHidden/>
-              </w:rPr>
-              <w:fldChar w:fldCharType="end"/>
-            </w:r>
-          </w:hyperlink>
-        </w:p>
-        <w:p>
-          <w:pPr>
-            <w:pStyle w:val="Obsah3"/>
-            <w:tabs>
-              <w:tab w:val="right" w:leader="dot" w:pos="8776"/>
-            </w:tabs>
-            <w:rPr>
-              <w:rFonts w:eastAsiaTheme="minorEastAsia"/>
-              <w:noProof/>
-              <w:kern w:val="2"/>
-              <w:sz w:val="24"/>
-              <w:szCs w:val="24"/>
-              <w:lang w:val="cs-CZ" w:eastAsia="cs-CZ"/>
-              <w14:ligatures w14:val="standardContextual"/>
-              <w14:numForm w14:val="default"/>
-            </w:rPr>
-          </w:pPr>
-          <w:hyperlink w:anchor="_Toc222408014" w:history="1">
-            <w:r>
-              <w:rPr>
-                <w:rStyle w:val="Hypertextovodkaz"/>
-                <w:noProof/>
-              </w:rPr>
-              <w:t>2.4.1 Methods of Alerting</w:t>
-            </w:r>
-            <w:r>
-              <w:rPr>
-                <w:noProof/>
-                <w:webHidden/>
-              </w:rPr>
-              <w:tab/>
-            </w:r>
-            <w:r>
-              <w:rPr>
-                <w:noProof/>
-                <w:webHidden/>
-              </w:rPr>
-              <w:fldChar w:fldCharType="begin"/>
-            </w:r>
-            <w:r>
-              <w:rPr>
-                <w:noProof/>
-                <w:webHidden/>
-              </w:rPr>
-              <w:instrText xml:space="preserve"> PAGEREF _Toc222408014 \h </w:instrText>
-            </w:r>
-            <w:r>
-              <w:rPr>
-                <w:noProof/>
-                <w:webHidden/>
-              </w:rPr>
-            </w:r>
-            <w:r>
-              <w:rPr>
-                <w:noProof/>
-                <w:webHidden/>
-              </w:rPr>
-              <w:fldChar w:fldCharType="separate"/>
-            </w:r>
-            <w:r>
-              <w:rPr>
-                <w:noProof/>
-                <w:webHidden/>
-              </w:rPr>
-              <w:t>11</w:t>
-            </w:r>
-            <w:r>
-              <w:rPr>
-                <w:noProof/>
-                <w:webHidden/>
-              </w:rPr>
-              <w:fldChar w:fldCharType="end"/>
-            </w:r>
-          </w:hyperlink>
-        </w:p>
-        <w:p>
-          <w:pPr>
-            <w:pStyle w:val="Obsah3"/>
-            <w:tabs>
-              <w:tab w:val="right" w:leader="dot" w:pos="8776"/>
-            </w:tabs>
-            <w:rPr>
-              <w:rFonts w:eastAsiaTheme="minorEastAsia"/>
-              <w:noProof/>
-              <w:kern w:val="2"/>
-              <w:sz w:val="24"/>
-              <w:szCs w:val="24"/>
-              <w:lang w:val="cs-CZ" w:eastAsia="cs-CZ"/>
-              <w14:ligatures w14:val="standardContextual"/>
-              <w14:numForm w14:val="default"/>
-            </w:rPr>
-          </w:pPr>
-          <w:hyperlink w:anchor="_Toc222408015" w:history="1">
-            <w:r>
-              <w:rPr>
-                <w:rStyle w:val="Hypertextovodkaz"/>
-                <w:noProof/>
-              </w:rPr>
-              <w:t>2.4.2 Alert Fatigue</w:t>
-            </w:r>
-            <w:r>
-              <w:rPr>
-                <w:noProof/>
-                <w:webHidden/>
-              </w:rPr>
-              <w:tab/>
-            </w:r>
-            <w:r>
-              <w:rPr>
-                <w:noProof/>
-                <w:webHidden/>
-              </w:rPr>
-              <w:fldChar w:fldCharType="begin"/>
-            </w:r>
-            <w:r>
-              <w:rPr>
-                <w:noProof/>
-                <w:webHidden/>
-              </w:rPr>
-              <w:instrText xml:space="preserve"> PAGEREF _Toc222408015 \h </w:instrText>
-            </w:r>
-            <w:r>
-              <w:rPr>
-                <w:noProof/>
-                <w:webHidden/>
-              </w:rPr>
-            </w:r>
-            <w:r>
-              <w:rPr>
-                <w:noProof/>
-                <w:webHidden/>
-              </w:rPr>
-              <w:fldChar w:fldCharType="separate"/>
-            </w:r>
-            <w:r>
-              <w:rPr>
-                <w:noProof/>
-                <w:webHidden/>
-              </w:rPr>
-              <w:t>12</w:t>
+              <w:t>20</w:t>
             </w:r>
             <w:r>
               <w:rPr>
@@ -2418,13 +2718,13 @@
               <w14:numForm w14:val="default"/>
             </w:rPr>
           </w:pPr>
-          <w:hyperlink w:anchor="_Toc222408016" w:history="1">
+          <w:hyperlink w:anchor="_Toc224131598" w:history="1">
             <w:r>
               <w:rPr>
                 <w:rStyle w:val="Hypertextovodkaz"/>
                 <w:noProof/>
               </w:rPr>
-              <w:t>3 Application Implementation</w:t>
+              <w:t>4 Discussion to implementation</w:t>
             </w:r>
             <w:r>
               <w:rPr>
@@ -2445,7 +2745,7 @@
                 <w:noProof/>
                 <w:webHidden/>
               </w:rPr>
-              <w:instrText xml:space="preserve"> PAGEREF _Toc222408016 \h </w:instrText>
+              <w:instrText xml:space="preserve"> PAGEREF _Toc224131598 \h </w:instrText>
             </w:r>
             <w:r>
               <w:rPr>
@@ -2465,307 +2765,7 @@
                 <w:noProof/>
                 <w:webHidden/>
               </w:rPr>
-              <w:t>13</w:t>
-            </w:r>
-            <w:r>
-              <w:rPr>
-                <w:noProof/>
-                <w:webHidden/>
-              </w:rPr>
-              <w:fldChar w:fldCharType="end"/>
-            </w:r>
-          </w:hyperlink>
-        </w:p>
-        <w:p>
-          <w:pPr>
-            <w:pStyle w:val="Obsah2"/>
-            <w:tabs>
-              <w:tab w:val="right" w:leader="dot" w:pos="8776"/>
-            </w:tabs>
-            <w:rPr>
-              <w:rFonts w:eastAsiaTheme="minorEastAsia"/>
-              <w:noProof/>
-              <w:kern w:val="2"/>
-              <w:sz w:val="24"/>
-              <w:szCs w:val="24"/>
-              <w:lang w:val="cs-CZ" w:eastAsia="cs-CZ"/>
-              <w14:ligatures w14:val="standardContextual"/>
-              <w14:numForm w14:val="default"/>
-            </w:rPr>
-          </w:pPr>
-          <w:hyperlink w:anchor="_Toc222408017" w:history="1">
-            <w:r>
-              <w:rPr>
-                <w:rStyle w:val="Hypertextovodkaz"/>
-                <w:noProof/>
-              </w:rPr>
-              <w:t>3.1 Requirements</w:t>
-            </w:r>
-            <w:r>
-              <w:rPr>
-                <w:noProof/>
-                <w:webHidden/>
-              </w:rPr>
-              <w:tab/>
-            </w:r>
-            <w:r>
-              <w:rPr>
-                <w:noProof/>
-                <w:webHidden/>
-              </w:rPr>
-              <w:fldChar w:fldCharType="begin"/>
-            </w:r>
-            <w:r>
-              <w:rPr>
-                <w:noProof/>
-                <w:webHidden/>
-              </w:rPr>
-              <w:instrText xml:space="preserve"> PAGEREF _Toc222408017 \h </w:instrText>
-            </w:r>
-            <w:r>
-              <w:rPr>
-                <w:noProof/>
-                <w:webHidden/>
-              </w:rPr>
-            </w:r>
-            <w:r>
-              <w:rPr>
-                <w:noProof/>
-                <w:webHidden/>
-              </w:rPr>
-              <w:fldChar w:fldCharType="separate"/>
-            </w:r>
-            <w:r>
-              <w:rPr>
-                <w:noProof/>
-                <w:webHidden/>
-              </w:rPr>
-              <w:t>13</w:t>
-            </w:r>
-            <w:r>
-              <w:rPr>
-                <w:noProof/>
-                <w:webHidden/>
-              </w:rPr>
-              <w:fldChar w:fldCharType="end"/>
-            </w:r>
-          </w:hyperlink>
-        </w:p>
-        <w:p>
-          <w:pPr>
-            <w:pStyle w:val="Obsah2"/>
-            <w:tabs>
-              <w:tab w:val="right" w:leader="dot" w:pos="8776"/>
-            </w:tabs>
-            <w:rPr>
-              <w:rFonts w:eastAsiaTheme="minorEastAsia"/>
-              <w:noProof/>
-              <w:kern w:val="2"/>
-              <w:sz w:val="24"/>
-              <w:szCs w:val="24"/>
-              <w:lang w:val="cs-CZ" w:eastAsia="cs-CZ"/>
-              <w14:ligatures w14:val="standardContextual"/>
-              <w14:numForm w14:val="default"/>
-            </w:rPr>
-          </w:pPr>
-          <w:hyperlink w:anchor="_Toc222408018" w:history="1">
-            <w:r>
-              <w:rPr>
-                <w:rStyle w:val="Hypertextovodkaz"/>
-                <w:noProof/>
-              </w:rPr>
-              <w:t>3.2 Specification</w:t>
-            </w:r>
-            <w:r>
-              <w:rPr>
-                <w:noProof/>
-                <w:webHidden/>
-              </w:rPr>
-              <w:tab/>
-            </w:r>
-            <w:r>
-              <w:rPr>
-                <w:noProof/>
-                <w:webHidden/>
-              </w:rPr>
-              <w:fldChar w:fldCharType="begin"/>
-            </w:r>
-            <w:r>
-              <w:rPr>
-                <w:noProof/>
-                <w:webHidden/>
-              </w:rPr>
-              <w:instrText xml:space="preserve"> PAGEREF _Toc222408018 \h </w:instrText>
-            </w:r>
-            <w:r>
-              <w:rPr>
-                <w:noProof/>
-                <w:webHidden/>
-              </w:rPr>
-            </w:r>
-            <w:r>
-              <w:rPr>
-                <w:noProof/>
-                <w:webHidden/>
-              </w:rPr>
-              <w:fldChar w:fldCharType="separate"/>
-            </w:r>
-            <w:r>
-              <w:rPr>
-                <w:noProof/>
-                <w:webHidden/>
-              </w:rPr>
-              <w:t>13</w:t>
-            </w:r>
-            <w:r>
-              <w:rPr>
-                <w:noProof/>
-                <w:webHidden/>
-              </w:rPr>
-              <w:fldChar w:fldCharType="end"/>
-            </w:r>
-          </w:hyperlink>
-        </w:p>
-        <w:p>
-          <w:pPr>
-            <w:pStyle w:val="Obsah2"/>
-            <w:tabs>
-              <w:tab w:val="right" w:leader="dot" w:pos="8776"/>
-            </w:tabs>
-            <w:rPr>
-              <w:rFonts w:eastAsiaTheme="minorEastAsia"/>
-              <w:noProof/>
-              <w:kern w:val="2"/>
-              <w:sz w:val="24"/>
-              <w:szCs w:val="24"/>
-              <w:lang w:val="cs-CZ" w:eastAsia="cs-CZ"/>
-              <w14:ligatures w14:val="standardContextual"/>
-              <w14:numForm w14:val="default"/>
-            </w:rPr>
-          </w:pPr>
-          <w:hyperlink w:anchor="_Toc222408019" w:history="1">
-            <w:r>
-              <w:rPr>
-                <w:rStyle w:val="Hypertextovodkaz"/>
-                <w:noProof/>
-              </w:rPr>
-              <w:t>3.3 Implementation</w:t>
-            </w:r>
-            <w:r>
-              <w:rPr>
-                <w:noProof/>
-                <w:webHidden/>
-              </w:rPr>
-              <w:tab/>
-            </w:r>
-            <w:r>
-              <w:rPr>
-                <w:noProof/>
-                <w:webHidden/>
-              </w:rPr>
-              <w:fldChar w:fldCharType="begin"/>
-            </w:r>
-            <w:r>
-              <w:rPr>
-                <w:noProof/>
-                <w:webHidden/>
-              </w:rPr>
-              <w:instrText xml:space="preserve"> PAGEREF _Toc222408019 \h </w:instrText>
-            </w:r>
-            <w:r>
-              <w:rPr>
-                <w:noProof/>
-                <w:webHidden/>
-              </w:rPr>
-            </w:r>
-            <w:r>
-              <w:rPr>
-                <w:noProof/>
-                <w:webHidden/>
-              </w:rPr>
-              <w:fldChar w:fldCharType="separate"/>
-            </w:r>
-            <w:r>
-              <w:rPr>
-                <w:noProof/>
-                <w:webHidden/>
-              </w:rPr>
-              <w:t>13</w:t>
-            </w:r>
-            <w:r>
-              <w:rPr>
-                <w:noProof/>
-                <w:webHidden/>
-              </w:rPr>
-              <w:fldChar w:fldCharType="end"/>
-            </w:r>
-          </w:hyperlink>
-        </w:p>
-        <w:p>
-          <w:pPr>
-            <w:pStyle w:val="Obsah2"/>
-            <w:tabs>
-              <w:tab w:val="right" w:leader="dot" w:pos="8776"/>
-            </w:tabs>
-            <w:rPr>
-              <w:rFonts w:eastAsiaTheme="minorEastAsia"/>
-              <w:noProof/>
-              <w:kern w:val="2"/>
-              <w:sz w:val="24"/>
-              <w:szCs w:val="24"/>
-              <w:lang w:val="cs-CZ" w:eastAsia="cs-CZ"/>
-              <w14:ligatures w14:val="standardContextual"/>
-              <w14:numForm w14:val="default"/>
-            </w:rPr>
-          </w:pPr>
-          <w:hyperlink w:anchor="_Toc222408020" w:history="1">
-            <w:r>
-              <w:rPr>
-                <w:rStyle w:val="Hypertextovodkaz"/>
-                <w:noProof/>
-              </w:rPr>
-              <w:t>3.4 Testing and CI/CD</w:t>
-            </w:r>
-            <w:r>
-              <w:rPr>
-                <w:noProof/>
-                <w:webHidden/>
-              </w:rPr>
-              <w:tab/>
-            </w:r>
-            <w:r>
-              <w:rPr>
-                <w:noProof/>
-                <w:webHidden/>
-              </w:rPr>
-              <w:fldChar w:fldCharType="begin"/>
-            </w:r>
-            <w:r>
-              <w:rPr>
-                <w:noProof/>
-                <w:webHidden/>
-              </w:rPr>
-              <w:instrText xml:space="preserve"> PAGEREF _Toc222408020 \h </w:instrText>
-            </w:r>
-            <w:r>
-              <w:rPr>
-                <w:noProof/>
-                <w:webHidden/>
-              </w:rPr>
-            </w:r>
-            <w:r>
-              <w:rPr>
-                <w:noProof/>
-                <w:webHidden/>
-              </w:rPr>
-              <w:fldChar w:fldCharType="separate"/>
-            </w:r>
-            <w:r>
-              <w:rPr>
-                <w:noProof/>
-                <w:webHidden/>
-              </w:rPr>
-              <w:t>13</w:t>
+              <w:t>21</w:t>
             </w:r>
             <w:r>
               <w:rPr>
@@ -2793,13 +2793,13 @@
               <w14:numForm w14:val="default"/>
             </w:rPr>
           </w:pPr>
-          <w:hyperlink w:anchor="_Toc222408021" w:history="1">
+          <w:hyperlink w:anchor="_Toc224131599" w:history="1">
             <w:r>
               <w:rPr>
                 <w:rStyle w:val="Hypertextovodkaz"/>
                 <w:noProof/>
               </w:rPr>
-              <w:t>4 Discussion to implementation</w:t>
+              <w:t>5 Conclusions</w:t>
             </w:r>
             <w:r>
               <w:rPr>
@@ -2820,7 +2820,7 @@
                 <w:noProof/>
                 <w:webHidden/>
               </w:rPr>
-              <w:instrText xml:space="preserve"> PAGEREF _Toc222408021 \h </w:instrText>
+              <w:instrText xml:space="preserve"> PAGEREF _Toc224131599 \h </w:instrText>
             </w:r>
             <w:r>
               <w:rPr>
@@ -2840,7 +2840,7 @@
                 <w:noProof/>
                 <w:webHidden/>
               </w:rPr>
-              <w:t>14</w:t>
+              <w:t>22</w:t>
             </w:r>
             <w:r>
               <w:rPr>
@@ -2868,13 +2868,13 @@
               <w14:numForm w14:val="default"/>
             </w:rPr>
           </w:pPr>
-          <w:hyperlink w:anchor="_Toc222408022" w:history="1">
+          <w:hyperlink w:anchor="_Toc224131600" w:history="1">
             <w:r>
               <w:rPr>
                 <w:rStyle w:val="Hypertextovodkaz"/>
                 <w:noProof/>
               </w:rPr>
-              <w:t>5 Conclusions</w:t>
+              <w:t>6 List of references</w:t>
             </w:r>
             <w:r>
               <w:rPr>
@@ -2895,7 +2895,7 @@
                 <w:noProof/>
                 <w:webHidden/>
               </w:rPr>
-              <w:instrText xml:space="preserve"> PAGEREF _Toc222408022 \h </w:instrText>
+              <w:instrText xml:space="preserve"> PAGEREF _Toc224131600 \h </w:instrText>
             </w:r>
             <w:r>
               <w:rPr>
@@ -2915,7 +2915,7 @@
                 <w:noProof/>
                 <w:webHidden/>
               </w:rPr>
-              <w:t>15</w:t>
+              <w:t>23</w:t>
             </w:r>
             <w:r>
               <w:rPr>
@@ -2943,13 +2943,13 @@
               <w14:numForm w14:val="default"/>
             </w:rPr>
           </w:pPr>
-          <w:hyperlink w:anchor="_Toc222408023" w:history="1">
+          <w:hyperlink w:anchor="_Toc224131601" w:history="1">
             <w:r>
               <w:rPr>
                 <w:rStyle w:val="Hypertextovodkaz"/>
                 <w:noProof/>
               </w:rPr>
-              <w:t>6 List of references</w:t>
+              <w:t>Appendices</w:t>
             </w:r>
             <w:r>
               <w:rPr>
@@ -2970,82 +2970,7 @@
                 <w:noProof/>
                 <w:webHidden/>
               </w:rPr>
-              <w:instrText xml:space="preserve"> PAGEREF _Toc222408023 \h </w:instrText>
-            </w:r>
-            <w:r>
-              <w:rPr>
-                <w:noProof/>
-                <w:webHidden/>
-              </w:rPr>
-            </w:r>
-            <w:r>
-              <w:rPr>
-                <w:noProof/>
-                <w:webHidden/>
-              </w:rPr>
-              <w:fldChar w:fldCharType="separate"/>
-            </w:r>
-            <w:r>
-              <w:rPr>
-                <w:noProof/>
-                <w:webHidden/>
-              </w:rPr>
-              <w:t>16</w:t>
-            </w:r>
-            <w:r>
-              <w:rPr>
-                <w:noProof/>
-                <w:webHidden/>
-              </w:rPr>
-              <w:fldChar w:fldCharType="end"/>
-            </w:r>
-          </w:hyperlink>
-        </w:p>
-        <w:p>
-          <w:pPr>
-            <w:pStyle w:val="Obsah1"/>
-            <w:tabs>
-              <w:tab w:val="right" w:leader="dot" w:pos="8776"/>
-            </w:tabs>
-            <w:rPr>
-              <w:rFonts w:eastAsiaTheme="minorEastAsia"/>
-              <w:noProof/>
-              <w:kern w:val="2"/>
-              <w:sz w:val="24"/>
-              <w:szCs w:val="24"/>
-              <w:lang w:val="cs-CZ" w:eastAsia="cs-CZ"/>
-              <w14:ligatures w14:val="standardContextual"/>
-              <w14:numForm w14:val="default"/>
-            </w:rPr>
-          </w:pPr>
-          <w:hyperlink w:anchor="_Toc222408024" w:history="1">
-            <w:r>
-              <w:rPr>
-                <w:rStyle w:val="Hypertextovodkaz"/>
-                <w:noProof/>
-              </w:rPr>
-              <w:t>Appendices</w:t>
-            </w:r>
-            <w:r>
-              <w:rPr>
-                <w:noProof/>
-                <w:webHidden/>
-              </w:rPr>
-              <w:tab/>
-            </w:r>
-            <w:r>
-              <w:rPr>
-                <w:noProof/>
-                <w:webHidden/>
-              </w:rPr>
-              <w:fldChar w:fldCharType="begin"/>
-            </w:r>
-            <w:r>
-              <w:rPr>
-                <w:noProof/>
-                <w:webHidden/>
-              </w:rPr>
-              <w:instrText xml:space="preserve"> PAGEREF _Toc222408024 \h </w:instrText>
+              <w:instrText xml:space="preserve"> PAGEREF _Toc224131601 \h </w:instrText>
             </w:r>
             <w:r>
               <w:rPr>
@@ -3191,10 +3116,62 @@
       </w:r>
     </w:p>
     <w:p>
+      <w:r>
+        <w:t>XML</w:t>
+      </w:r>
+      <w:r>
+        <w:tab/>
+      </w:r>
+      <w:r>
+        <w:tab/>
+      </w:r>
+      <w:r>
+        <w:tab/>
+      </w:r>
+      <w:r>
+        <w:t xml:space="preserve">Extensible </w:t>
+      </w:r>
+      <w:r>
+        <w:t>Markup Language</w:t>
+      </w:r>
+    </w:p>
+    <w:p>
+      <w:r>
+        <w:t>JSON</w:t>
+      </w:r>
+      <w:r>
+        <w:tab/>
+      </w:r>
+      <w:r>
+        <w:tab/>
+      </w:r>
+      <w:r>
+        <w:tab/>
+        <w:t>JavaScript Object Notation</w:t>
+      </w:r>
+    </w:p>
+    <w:p>
+      <w:r>
+        <w:t>HTTP</w:t>
+      </w:r>
+      <w:r>
+        <w:tab/>
+      </w:r>
+      <w:r>
+        <w:tab/>
+      </w:r>
+      <w:r>
+        <w:tab/>
+        <w:t>Hypertext Transport Protocol</w:t>
+      </w:r>
+    </w:p>
+    <w:p/>
+    <w:p/>
+    <w:p>
       <w:pPr>
         <w:pStyle w:val="Nadpis1neslovan"/>
       </w:pPr>
-      <w:bookmarkStart w:id="0" w:name="_Toc222407992"/>
+      <w:bookmarkStart w:id="0" w:name="_Toc224131570"/>
       <w:r>
         <w:lastRenderedPageBreak/>
         <w:t>Introduction</w:t>
@@ -3272,7 +3249,7 @@
       <w:pPr>
         <w:pStyle w:val="Nadpis1"/>
       </w:pPr>
-      <w:bookmarkStart w:id="1" w:name="_Toc222407993"/>
+      <w:bookmarkStart w:id="1" w:name="_Toc224131571"/>
       <w:r>
         <w:lastRenderedPageBreak/>
         <w:t>Observability</w:t>
@@ -3283,7 +3260,7 @@
       <w:pPr>
         <w:pStyle w:val="Nadpis2"/>
       </w:pPr>
-      <w:bookmarkStart w:id="2" w:name="_Toc222407994"/>
+      <w:bookmarkStart w:id="2" w:name="_Toc224131572"/>
       <w:r>
         <w:t>Definition</w:t>
       </w:r>
@@ -3400,7 +3377,7 @@
       <w:pPr>
         <w:pStyle w:val="Nadpis2"/>
       </w:pPr>
-      <w:bookmarkStart w:id="3" w:name="_Toc222407995"/>
+      <w:bookmarkStart w:id="3" w:name="_Toc224131573"/>
       <w:r>
         <w:t>DevOps and SRE</w:t>
       </w:r>
@@ -3530,7 +3507,7 @@
       <w:pPr>
         <w:pStyle w:val="Nadpis2"/>
       </w:pPr>
-      <w:bookmarkStart w:id="4" w:name="_Toc222407996"/>
+      <w:bookmarkStart w:id="4" w:name="_Toc224131574"/>
       <w:r>
         <w:t>Costs and Benefits</w:t>
       </w:r>
@@ -3538,6 +3515,9 @@
     </w:p>
     <w:p>
       <w:r>
+        <w:rPr>
+          <w:highlight w:val="yellow"/>
+        </w:rPr>
         <w:t>ADD INTRO TO COSTS AND BENEFITS</w:t>
       </w:r>
     </w:p>
@@ -3545,7 +3525,7 @@
       <w:pPr>
         <w:pStyle w:val="Nadpis3"/>
       </w:pPr>
-      <w:bookmarkStart w:id="5" w:name="_Toc222407997"/>
+      <w:bookmarkStart w:id="5" w:name="_Toc224131575"/>
       <w:r>
         <w:t>Problems with auto-scaling systems</w:t>
       </w:r>
@@ -3716,17 +3696,21 @@
       <w:r>
         <w:t xml:space="preserve">. </w:t>
       </w:r>
-      <w:bookmarkStart w:id="6" w:name="_Toc222407998"/>
       <w:r>
         <w:t>Effects of large outages on business</w:t>
       </w:r>
-      <w:bookmarkEnd w:id="6"/>
     </w:p>
     <w:p>
       <w:pPr>
         <w:pStyle w:val="Nadpis4"/>
-      </w:pPr>
-      <w:r>
+        <w:rPr>
+          <w:highlight w:val="yellow"/>
+        </w:rPr>
+      </w:pPr>
+      <w:r>
+        <w:rPr>
+          <w:highlight w:val="yellow"/>
+        </w:rPr>
         <w:lastRenderedPageBreak/>
         <w:t>CrowdStrike Outage</w:t>
       </w:r>
@@ -3734,20 +3718,32 @@
     <w:p>
       <w:pPr>
         <w:pStyle w:val="Nadpis4"/>
-      </w:pPr>
-      <w:r>
+        <w:rPr>
+          <w:highlight w:val="yellow"/>
+        </w:rPr>
+      </w:pPr>
+      <w:r>
+        <w:rPr>
+          <w:highlight w:val="yellow"/>
+        </w:rPr>
         <w:t>Knight Capital implosion</w:t>
       </w:r>
     </w:p>
     <w:p>
       <w:pPr>
         <w:pStyle w:val="Nadpis3"/>
-      </w:pPr>
-      <w:bookmarkStart w:id="7" w:name="_Toc222407999"/>
-      <w:r>
+        <w:rPr>
+          <w:highlight w:val="yellow"/>
+        </w:rPr>
+      </w:pPr>
+      <w:bookmarkStart w:id="6" w:name="_Toc224131576"/>
+      <w:r>
+        <w:rPr>
+          <w:highlight w:val="yellow"/>
+        </w:rPr>
         <w:t>Prevention</w:t>
       </w:r>
-      <w:bookmarkEnd w:id="7"/>
+      <w:bookmarkEnd w:id="6"/>
     </w:p>
     <w:p>
       <w:pPr>
@@ -3762,16 +3758,22 @@
       <w:pPr>
         <w:pStyle w:val="Nadpis1"/>
       </w:pPr>
-      <w:bookmarkStart w:id="8" w:name="_Toc222408000"/>
+      <w:bookmarkStart w:id="7" w:name="_Toc224131577"/>
       <w:r>
         <w:lastRenderedPageBreak/>
-        <w:t>Monitoring and Logging</w:t>
-      </w:r>
-      <w:bookmarkEnd w:id="8"/>
-    </w:p>
-    <w:p>
-      <w:r>
-        <w:t>Monitoring is the process of gathering application measurement data to diagnose, prevent or recover from application errors. (Tamburri, 2020) During this process, the application itself or programs associated with the application observe, collect and send data that describe how the application is running</w:t>
+        <w:t>Logging and Monitoring</w:t>
+      </w:r>
+      <w:bookmarkEnd w:id="7"/>
+    </w:p>
+    <w:p>
+      <w:r>
+        <w:t>Monitoring</w:t>
+      </w:r>
+      <w:r>
+        <w:t>, within software development,</w:t>
+      </w:r>
+      <w:r>
+        <w:t xml:space="preserve"> is the process of gathering application measurement data to diagnose, prevent or recover from application errors. (Tamburri, 2020) During this process, the application itself or programs associated with the application observe, collect and send data that describe how the application is running</w:t>
       </w:r>
       <w:r>
         <w:t>, this data being called logs</w:t>
@@ -3785,7 +3787,13 @@
         <w:t xml:space="preserve">Logs (or traces) </w:t>
       </w:r>
       <w:r>
-        <w:t xml:space="preserve">are pieces of text that detail the current state of the system, such as the current working state of the application - values of variables, thread count and load currently placed upon the application. </w:t>
+        <w:t xml:space="preserve">are </w:t>
+      </w:r>
+      <w:r>
+        <w:t xml:space="preserve">concise </w:t>
+      </w:r>
+      <w:r>
+        <w:t xml:space="preserve">pieces of text that detail the current state of the system, such as the current working state of the application - values of variables, thread count and load currently placed upon the application. </w:t>
       </w:r>
       <w:r>
         <w:t xml:space="preserve">The specific format of the logs depends on the application itself and can vary greatly based on use and specific concerns of the developers. </w:t>
@@ -3804,7 +3812,19 @@
     </w:p>
     <w:p>
       <w:r>
-        <w:t xml:space="preserve">Monitoring also allows the business to notice anything has gone wrong. As detailed in chapter 1.2.2 Knight Capital, a company can lose half a billion dollars in an hour because of a rudimentary bug. To prevent such a catastrophic loss, it is necessary for companies to have proper alert systems in place. </w:t>
+        <w:t xml:space="preserve">Monitoring also allows the business to notice anything has gone wrong. As detailed in chapter 1.2.2 Knight Capital, a company can lose half a billion dollars in an hour </w:t>
+      </w:r>
+      <w:r>
+        <w:t xml:space="preserve">thanks to </w:t>
+      </w:r>
+      <w:r>
+        <w:t>a rudimentary bug</w:t>
+      </w:r>
+      <w:r>
+        <w:t xml:space="preserve"> that goes unnoticed for too long</w:t>
+      </w:r>
+      <w:r>
+        <w:t xml:space="preserve">. To prevent such a catastrophic loss, it is necessary for companies to have proper alert systems in place. </w:t>
       </w:r>
     </w:p>
     <w:p>
@@ -3892,53 +3912,81 @@
     </w:p>
     <w:p>
       <w:r>
-        <w:t>And many more. To make sure that problems with the application are discovered as soon as possible, teams often utilize testing environments, in which the code is deployed before being given to the customers (so called production environment). To make sure that testing environment has a chance to catch problems that would’ve shown up in production environment otherwise, it is of great importance to make sure that the two are as similar as possible..</w:t>
-      </w:r>
-    </w:p>
-    <w:p>
-      <w:pPr>
-        <w:spacing w:after="160" w:line="259" w:lineRule="auto"/>
-        <w:jc w:val="left"/>
-      </w:pPr>
-      <w:r>
-        <w:br w:type="page"/>
+        <w:t>And many more. To make sure that problems with the application are discovered as soon as possible, teams often utilize testing environments, in which the code is deployed before being given to the customers (so called production environment)</w:t>
+      </w:r>
+      <w:r>
+        <w:t xml:space="preserve"> and run through a variability of different tests that attempt to simulate real working conditions – customers entering incorrect data, utilizing the application in unsupported ways, foreign actors attempting to exploit vulnerabilities in the software itself</w:t>
+      </w:r>
+      <w:r>
+        <w:t>.</w:t>
+      </w:r>
+      <w:r>
+        <w:t xml:space="preserve"> Most deficiencies of software programs are discovered before the code is distributed.</w:t>
+      </w:r>
+      <w:r>
+        <w:t xml:space="preserve"> </w:t>
+      </w:r>
+    </w:p>
+    <w:p>
+      <w:r>
+        <w:lastRenderedPageBreak/>
+        <w:t>To make sure that testing environment has a chance to catch problems that would’ve shown up in production environment otherwise, it is of great importance to make sure that the two are as similar as possible.</w:t>
       </w:r>
     </w:p>
     <w:p>
       <w:pPr>
         <w:pStyle w:val="Nadpis2"/>
       </w:pPr>
-      <w:bookmarkStart w:id="9" w:name="_Toc222408001"/>
-      <w:r>
-        <w:lastRenderedPageBreak/>
+      <w:bookmarkStart w:id="8" w:name="_Toc224131578"/>
+      <w:r>
         <w:t>Logging Formats</w:t>
       </w:r>
+      <w:bookmarkEnd w:id="8"/>
+    </w:p>
+    <w:p>
+      <w:r>
+        <w:t xml:space="preserve">As different development teams have different requirements, so too do their needs for logging differ. Some applications may require </w:t>
+      </w:r>
+      <w:proofErr w:type="gramStart"/>
+      <w:r>
+        <w:t>a large number of</w:t>
+      </w:r>
+      <w:proofErr w:type="gramEnd"/>
+      <w:r>
+        <w:t xml:space="preserve"> logs to be processed in a short amount of time, some place large importance on the data integrity and log all actions taken by the software multiple times </w:t>
+      </w:r>
+      <w:r>
+        <w:t>i</w:t>
+      </w:r>
+      <w:r>
+        <w:t>n multiple different places. Some teams may be locked into working with specific formats based on their software vendors, customers or due to regulations defined by the law.</w:t>
+      </w:r>
+    </w:p>
+    <w:p>
+      <w:r>
+        <w:t>For the reasons detailed above, several logging formats have emerged from the developer community. The specifics and abilities of each format can differ greatly. The following chapters detail the commonly used formats</w:t>
+      </w:r>
+      <w:r>
+        <w:t xml:space="preserve"> for logging in software development</w:t>
+      </w:r>
+      <w:r>
+        <w:t>.</w:t>
+      </w:r>
+    </w:p>
+    <w:p>
+      <w:r>
+        <w:t>Note that Syslog and DMARC formats will be discussed at length, as their formats are critical to the practical part of this thesis.</w:t>
+      </w:r>
+    </w:p>
+    <w:p>
+      <w:pPr>
+        <w:pStyle w:val="Nadpis3"/>
+      </w:pPr>
+      <w:bookmarkStart w:id="9" w:name="_Toc224131579"/>
+      <w:r>
+        <w:t>JSON</w:t>
+      </w:r>
       <w:bookmarkEnd w:id="9"/>
-    </w:p>
-    <w:p>
-      <w:r>
-        <w:t>As different development teams have different requirements, so too do their needs for logging differ. Some applications may require a large number of logs to be processed in a short amount of time, some place large importance on the data integrity and log all actions taken by the software multiple times on multiple different places. Some teams may be locked into working with specific formats based on their software vendors, customers or due to regulations defined by the law.</w:t>
-      </w:r>
-    </w:p>
-    <w:p>
-      <w:r>
-        <w:t>For the reasons detailed above, several logging formats have emerged from the developer community. The specifics and abilities of each format can differ greatly. The following chapters detail the commonly used formats, as well as the formats for the specific reporting standards that the application developed in the practical part of this thesis standardizes.</w:t>
-      </w:r>
-    </w:p>
-    <w:p>
-      <w:r>
-        <w:t>Note that Syslog and DMARC formats will be discussed at length, as their formats are critical to the practical part of this thesis and should then be looked at in great detail.</w:t>
-      </w:r>
-    </w:p>
-    <w:p>
-      <w:pPr>
-        <w:pStyle w:val="Nadpis3"/>
-      </w:pPr>
-      <w:bookmarkStart w:id="10" w:name="_Toc222408002"/>
-      <w:r>
-        <w:t>JSON</w:t>
-      </w:r>
-      <w:bookmarkEnd w:id="10"/>
     </w:p>
     <w:p>
       <w:r>
@@ -4066,8 +4114,8 @@
       </w:r>
     </w:p>
     <w:p>
-      <w:bookmarkStart w:id="11" w:name="_Ref7017310"/>
-      <w:bookmarkStart w:id="12" w:name="_Toc7017593"/>
+      <w:bookmarkStart w:id="10" w:name="_Ref7017310"/>
+      <w:bookmarkStart w:id="11" w:name="_Toc7017593"/>
       <w:r>
         <w:rPr>
           <w:b/>
@@ -4156,7 +4204,7 @@
       <w:r>
         <w:fldChar w:fldCharType="end"/>
       </w:r>
-      <w:bookmarkEnd w:id="11"/>
+      <w:bookmarkEnd w:id="10"/>
     </w:p>
     <w:p>
       <w:pPr>
@@ -4181,7 +4229,7 @@
         <w:t>(Bourhis et al., 2020)</w:t>
       </w:r>
     </w:p>
-    <w:bookmarkEnd w:id="12"/>
+    <w:bookmarkEnd w:id="11"/>
     <w:p>
       <w:pPr>
         <w:pStyle w:val="Textprogramovhokdu"/>
@@ -4286,6 +4334,7 @@
         <w:rPr>
           <w:lang w:val="en-GB"/>
         </w:rPr>
+        <w:lastRenderedPageBreak/>
         <w:t xml:space="preserve">    </w:t>
       </w:r>
       <w:r>
@@ -4349,7 +4398,6 @@
         <w:rPr>
           <w:lang w:val="en-GB"/>
         </w:rPr>
-        <w:lastRenderedPageBreak/>
         <w:t>}</w:t>
       </w:r>
     </w:p>
@@ -4383,10 +4431,22 @@
         <w:t xml:space="preserve">As much of the web runs on JavaScript, having a data format which can be used natively with the language is a big benefit. A JSON object can be copied and pasted into a JavaScript code directly without any additional work in translating. </w:t>
       </w:r>
       <w:r>
-        <w:t>For API applications which send large amounts of data over the HTTP protocol, JSON is currently the default format.</w:t>
-      </w:r>
-      <w:r>
-        <w:t xml:space="preserve"> Additionally, JSON is much used in database systems built around the NoSQL paradigm.</w:t>
+        <w:t xml:space="preserve">For API applications which send large amounts of data over the HTTP protocol, JSON is </w:t>
+      </w:r>
+      <w:r>
+        <w:t xml:space="preserve">thought of as </w:t>
+      </w:r>
+      <w:r>
+        <w:t>the default format.</w:t>
+      </w:r>
+      <w:r>
+        <w:t xml:space="preserve"> Additionally, JSON </w:t>
+      </w:r>
+      <w:r>
+        <w:t xml:space="preserve">files are frequently </w:t>
+      </w:r>
+      <w:r>
+        <w:t>used in database systems built around the NoSQL paradigm.</w:t>
       </w:r>
     </w:p>
     <w:p>
@@ -4397,7 +4457,19 @@
         <w:t xml:space="preserve"> has several problems which may</w:t>
       </w:r>
       <w:r>
-        <w:t xml:space="preserve"> lead it to be unsuitable </w:t>
+        <w:t xml:space="preserve"> lead </w:t>
+      </w:r>
+      <w:r>
+        <w:t>to it</w:t>
+      </w:r>
+      <w:r>
+        <w:t xml:space="preserve"> </w:t>
+      </w:r>
+      <w:r>
+        <w:t>being</w:t>
+      </w:r>
+      <w:r>
+        <w:t xml:space="preserve"> unsuitable </w:t>
       </w:r>
       <w:r>
         <w:t>for</w:t>
@@ -4477,8 +4549,13 @@
         <w:t>Despite these issues, JSON remains overall a commonly used and very attractive format for storing and representing data. Additionally, research has shown good compatibility with modern AI systems</w:t>
       </w:r>
       <w:r>
-        <w:t>, which may lead to even further adoption in the near future</w:t>
-      </w:r>
+        <w:t xml:space="preserve">, which may lead to even further adoption </w:t>
+      </w:r>
+      <w:proofErr w:type="gramStart"/>
+      <w:r>
+        <w:t>in the near future</w:t>
+      </w:r>
+      <w:proofErr w:type="gramEnd"/>
       <w:r>
         <w:t xml:space="preserve">. </w:t>
       </w:r>
@@ -4491,17 +4568,17 @@
       <w:pPr>
         <w:pStyle w:val="Nadpis3"/>
       </w:pPr>
-      <w:bookmarkStart w:id="13" w:name="_Toc222408003"/>
+      <w:bookmarkStart w:id="12" w:name="_Toc224131580"/>
       <w:r>
         <w:t>X</w:t>
       </w:r>
       <w:r>
         <w:t>ML</w:t>
       </w:r>
-      <w:bookmarkEnd w:id="13"/>
       <w:r>
         <w:t xml:space="preserve"> and other markup languages</w:t>
       </w:r>
+      <w:bookmarkEnd w:id="12"/>
     </w:p>
     <w:p>
       <w:r>
@@ -4548,12 +4625,15 @@
     </w:p>
     <w:p>
       <w:r>
-        <w:t>Data is included in XML documents as strings of text, surrounded by a text markup that describes the data. The basic unit of data and mark up is called an element, and XML is rather permissive when it comes to implementing elements – after all, the X in XML stands for extensible. Any developer can create new elements as required – genealogy requires representation of various genomes, chemistry requires elements that describe molecules, atoms, reactions.</w:t>
-      </w:r>
-    </w:p>
-    <w:p>
+        <w:t xml:space="preserve">Data is included in XML documents as strings of text, surrounded by a text markup that describes the data. The basic unit of data and mark up is called an element, and XML is </w:t>
+      </w:r>
       <w:r>
         <w:lastRenderedPageBreak/>
+        <w:t>rather permissive when it comes to implementing elements – after all, the X in XML stands for extensible. Any developer can create new elements as required – genealogy requires representation of various genomes, chemistry requires elements that describe molecules, atoms, reactions.</w:t>
+      </w:r>
+    </w:p>
+    <w:p>
+      <w:r>
         <w:t xml:space="preserve">What is not extensible, however, is the grammar </w:t>
       </w:r>
       <w:r>
@@ -4752,7 +4832,21 @@
         <w:rPr>
           <w:lang w:val="en-GB"/>
         </w:rPr>
-        <w:t xml:space="preserve">    &lt;name&gt;DataLife MF 2HD&lt;/name&gt;</w:t>
+        <w:t xml:space="preserve">    &lt;name&gt;</w:t>
+      </w:r>
+      <w:proofErr w:type="spellStart"/>
+      <w:r>
+        <w:rPr>
+          <w:lang w:val="en-GB"/>
+        </w:rPr>
+        <w:t>DataLife</w:t>
+      </w:r>
+      <w:proofErr w:type="spellEnd"/>
+      <w:r>
+        <w:rPr>
+          <w:lang w:val="en-GB"/>
+        </w:rPr>
+        <w:t xml:space="preserve"> MF 2HD&lt;/name&gt;</w:t>
       </w:r>
     </w:p>
     <w:p>
@@ -4806,7 +4900,35 @@
         <w:rPr>
           <w:lang w:val="en-GB"/>
         </w:rPr>
-        <w:t xml:space="preserve">    &lt;color&gt;black&lt;/color&gt;</w:t>
+        <w:t xml:space="preserve">    &lt;</w:t>
+      </w:r>
+      <w:proofErr w:type="spellStart"/>
+      <w:r>
+        <w:rPr>
+          <w:lang w:val="en-GB"/>
+        </w:rPr>
+        <w:t>color</w:t>
+      </w:r>
+      <w:proofErr w:type="spellEnd"/>
+      <w:r>
+        <w:rPr>
+          <w:lang w:val="en-GB"/>
+        </w:rPr>
+        <w:t>&gt;black&lt;/</w:t>
+      </w:r>
+      <w:proofErr w:type="spellStart"/>
+      <w:r>
+        <w:rPr>
+          <w:lang w:val="en-GB"/>
+        </w:rPr>
+        <w:t>color</w:t>
+      </w:r>
+      <w:proofErr w:type="spellEnd"/>
+      <w:r>
+        <w:rPr>
+          <w:lang w:val="en-GB"/>
+        </w:rPr>
+        <w:t>&gt;</w:t>
       </w:r>
     </w:p>
     <w:p>
@@ -4875,7 +4997,10 @@
         <w:t>&lt;manufacturer&gt;</w:t>
       </w:r>
       <w:r>
-        <w:t xml:space="preserve">. The ending tag also contains a </w:t>
+        <w:t xml:space="preserve">. The ending tag contains </w:t>
+      </w:r>
+      <w:r>
+        <w:t xml:space="preserve">the slash character </w:t>
       </w:r>
       <w:r>
         <w:rPr>
@@ -4896,7 +5021,13 @@
         <w:t>cannot</w:t>
       </w:r>
       <w:r>
-        <w:t xml:space="preserve"> range outside of the scope of its parent element. Within these tags, there can be further descriptors, known as attributes. An example of this attribute can be seen in the second element </w:t>
+        <w:t xml:space="preserve"> range outside of the scope of its parent element. Within these tags</w:t>
+      </w:r>
+      <w:r>
+        <w:t xml:space="preserve"> further descriptors can be placed, </w:t>
+      </w:r>
+      <w:r>
+        <w:t xml:space="preserve">known as attributes. An example of this attribute can be seen in the second element </w:t>
       </w:r>
       <w:r>
         <w:rPr>
@@ -4911,12 +5042,196 @@
     </w:p>
     <w:p>
       <w:r>
-        <w:t>XML by default has a larger array of built-in data types available. Some of those include string representation (string, normalizedstring, token), numerical representation (byte, integer, positiveInteger, int, long, decimal, double), Booleans, as well as options for date representation, such as (time, date, gMonth, gYear) or several miscellaneous data types (anyURI representing addresses as URL or URN, language representing language constants as definted by RFC 1766)</w:t>
-      </w:r>
-    </w:p>
-    <w:p>
-      <w:r>
-        <w:t>Furthermore, XML allows for the extension of these data types and creating your own, as well as utilizing commonly used community extensions. Any such extension or specification is called a schema. Import of foreign schemas is done with an &lt;xs:schema&gt; element containing a URI of the required schema.</w:t>
+        <w:t>XML by default has a larger array of built-in data types available. Some of those include string representation (</w:t>
+      </w:r>
+      <w:r>
+        <w:rPr>
+          <w:rStyle w:val="TextprogramovhokduChar"/>
+          <w:rFonts w:eastAsiaTheme="minorHAnsi"/>
+        </w:rPr>
+        <w:t>string</w:t>
+      </w:r>
+      <w:r>
+        <w:t xml:space="preserve">, </w:t>
+      </w:r>
+      <w:r>
+        <w:rPr>
+          <w:rStyle w:val="TextprogramovhokduChar"/>
+          <w:rFonts w:eastAsiaTheme="minorHAnsi"/>
+        </w:rPr>
+        <w:t>normalized</w:t>
+      </w:r>
+      <w:r>
+        <w:rPr>
+          <w:rStyle w:val="TextprogramovhokduChar"/>
+          <w:rFonts w:eastAsiaTheme="minorHAnsi"/>
+        </w:rPr>
+        <w:t>s</w:t>
+      </w:r>
+      <w:r>
+        <w:rPr>
+          <w:rStyle w:val="TextprogramovhokduChar"/>
+          <w:rFonts w:eastAsiaTheme="minorHAnsi"/>
+        </w:rPr>
+        <w:t>tring</w:t>
+      </w:r>
+      <w:r>
+        <w:t xml:space="preserve">, </w:t>
+      </w:r>
+      <w:r>
+        <w:rPr>
+          <w:rStyle w:val="TextprogramovhokduChar"/>
+          <w:rFonts w:eastAsiaTheme="minorHAnsi"/>
+        </w:rPr>
+        <w:t>token</w:t>
+      </w:r>
+      <w:r>
+        <w:t>), numerical representation (</w:t>
+      </w:r>
+      <w:r>
+        <w:rPr>
+          <w:rStyle w:val="TextprogramovhokduChar"/>
+          <w:rFonts w:eastAsiaTheme="minorHAnsi"/>
+        </w:rPr>
+        <w:t>byte</w:t>
+      </w:r>
+      <w:r>
+        <w:t xml:space="preserve">, </w:t>
+      </w:r>
+      <w:r>
+        <w:rPr>
+          <w:rStyle w:val="TextprogramovhokduChar"/>
+          <w:rFonts w:eastAsiaTheme="minorHAnsi"/>
+        </w:rPr>
+        <w:t>integer</w:t>
+      </w:r>
+      <w:r>
+        <w:t xml:space="preserve">, </w:t>
+      </w:r>
+      <w:r>
+        <w:rPr>
+          <w:rStyle w:val="TextprogramovhokduChar"/>
+          <w:rFonts w:eastAsiaTheme="minorHAnsi"/>
+        </w:rPr>
+        <w:t>positiveInteger</w:t>
+      </w:r>
+      <w:r>
+        <w:t xml:space="preserve">, </w:t>
+      </w:r>
+      <w:r>
+        <w:rPr>
+          <w:rStyle w:val="TextprogramovhokduChar"/>
+          <w:rFonts w:eastAsiaTheme="minorHAnsi"/>
+        </w:rPr>
+        <w:t>int</w:t>
+      </w:r>
+      <w:r>
+        <w:t xml:space="preserve">, </w:t>
+      </w:r>
+      <w:r>
+        <w:rPr>
+          <w:rStyle w:val="TextprogramovhokduChar"/>
+          <w:rFonts w:eastAsiaTheme="minorHAnsi"/>
+        </w:rPr>
+        <w:t>long</w:t>
+      </w:r>
+      <w:r>
+        <w:t xml:space="preserve">, </w:t>
+      </w:r>
+      <w:r>
+        <w:rPr>
+          <w:rStyle w:val="TextprogramovhokduChar"/>
+          <w:rFonts w:eastAsiaTheme="minorHAnsi"/>
+        </w:rPr>
+        <w:t>decimal</w:t>
+      </w:r>
+      <w:r>
+        <w:t xml:space="preserve">, </w:t>
+      </w:r>
+      <w:r>
+        <w:rPr>
+          <w:rStyle w:val="TextprogramovhokduChar"/>
+          <w:rFonts w:eastAsiaTheme="minorHAnsi"/>
+        </w:rPr>
+        <w:t>double</w:t>
+      </w:r>
+      <w:r>
+        <w:t>), Booleans, as well as options for date representation, such as (</w:t>
+      </w:r>
+      <w:r>
+        <w:rPr>
+          <w:rStyle w:val="TextprogramovhokduChar"/>
+          <w:rFonts w:eastAsiaTheme="minorHAnsi"/>
+        </w:rPr>
+        <w:t>time</w:t>
+      </w:r>
+      <w:r>
+        <w:t xml:space="preserve">, </w:t>
+      </w:r>
+      <w:r>
+        <w:rPr>
+          <w:rStyle w:val="TextprogramovhokduChar"/>
+          <w:rFonts w:eastAsiaTheme="minorHAnsi"/>
+        </w:rPr>
+        <w:t>date</w:t>
+      </w:r>
+      <w:r>
+        <w:t xml:space="preserve">, </w:t>
+      </w:r>
+      <w:r>
+        <w:rPr>
+          <w:rStyle w:val="TextprogramovhokduChar"/>
+          <w:rFonts w:eastAsiaTheme="minorHAnsi"/>
+        </w:rPr>
+        <w:t>gMonth</w:t>
+      </w:r>
+      <w:r>
+        <w:t xml:space="preserve">, </w:t>
+      </w:r>
+      <w:r>
+        <w:rPr>
+          <w:rStyle w:val="TextprogramovhokduChar"/>
+          <w:rFonts w:eastAsiaTheme="minorHAnsi"/>
+        </w:rPr>
+        <w:t>gYear</w:t>
+      </w:r>
+      <w:r>
+        <w:t>) or several miscellaneous data types (</w:t>
+      </w:r>
+      <w:r>
+        <w:rPr>
+          <w:rStyle w:val="TextprogramovhokduChar"/>
+          <w:rFonts w:eastAsiaTheme="minorHAnsi"/>
+        </w:rPr>
+        <w:t>anyURI</w:t>
+      </w:r>
+      <w:r>
+        <w:t xml:space="preserve"> representing addresses as URL or URN, </w:t>
+      </w:r>
+      <w:r>
+        <w:rPr>
+          <w:rStyle w:val="TextprogramovhokduChar"/>
+          <w:rFonts w:eastAsiaTheme="minorHAnsi"/>
+        </w:rPr>
+        <w:t>language</w:t>
+      </w:r>
+      <w:r>
+        <w:t xml:space="preserve"> representing language constants as defined by RFC 1766)</w:t>
+      </w:r>
+    </w:p>
+    <w:p>
+      <w:r>
+        <w:t>Furthermore, XML allows for the extension of these data types and creating your own, as well as utilizing commonly used community extensions. Any such extension or specification is called a schema. Import of foreign schemas is done with an &lt;</w:t>
+      </w:r>
+      <w:proofErr w:type="spellStart"/>
+      <w:proofErr w:type="gramStart"/>
+      <w:r>
+        <w:t>xs:schema</w:t>
+      </w:r>
+      <w:proofErr w:type="spellEnd"/>
+      <w:proofErr w:type="gramEnd"/>
+      <w:r>
+        <w:t>&gt; element containing a URI of the required schema.</w:t>
       </w:r>
       <w:r>
         <w:t xml:space="preserve"> </w:t>
@@ -4924,6 +5239,7 @@
     </w:p>
     <w:p>
       <w:r>
+        <w:lastRenderedPageBreak/>
         <w:t xml:space="preserve">These extensions define rules that the XML document must obey. A document that complies with the rules set forth by the imported schema is called </w:t>
       </w:r>
       <w:r>
@@ -5006,8 +5322,15 @@
         </w:numPr>
       </w:pPr>
       <w:r>
-        <w:lastRenderedPageBreak/>
-        <w:t>LaTeX, used most commonly with typesetting and presentation of scientific publications</w:t>
+        <w:t xml:space="preserve">LaTeX, </w:t>
+      </w:r>
+      <w:proofErr w:type="gramStart"/>
+      <w:r>
+        <w:t>used most commonly</w:t>
+      </w:r>
+      <w:proofErr w:type="gramEnd"/>
+      <w:r>
+        <w:t xml:space="preserve"> with typesetting and presentation of scientific publications</w:t>
       </w:r>
     </w:p>
     <w:p>
@@ -5027,35 +5350,20 @@
       <w:pPr>
         <w:pStyle w:val="Nadpis3"/>
       </w:pPr>
-      <w:bookmarkStart w:id="14" w:name="_Toc222408004"/>
+      <w:bookmarkStart w:id="13" w:name="_Toc224131581"/>
       <w:r>
         <w:t>S</w:t>
       </w:r>
       <w:r>
         <w:t>yslog</w:t>
       </w:r>
-      <w:bookmarkEnd w:id="14"/>
+      <w:bookmarkEnd w:id="13"/>
     </w:p>
     <w:p>
       <w:r>
         <w:rPr>
           <w:highlight w:val="yellow"/>
         </w:rPr>
-        <w:t>24/7 LINKS TO CHILL / ZOTERO TO</w:t>
-      </w:r>
-    </w:p>
-    <w:p>
-      <w:hyperlink r:id="rId17" w:history="1">
-        <w:r>
-          <w:rPr>
-            <w:rStyle w:val="Hypertextovodkaz"/>
-          </w:rPr>
-          <w:t>https://www.rfc-editor.org/rfc/rfc5424?spm=a2c4g.11186623.0.0.21324a0fUixMd5</w:t>
-        </w:r>
-      </w:hyperlink>
-    </w:p>
-    <w:p>
-      <w:r>
         <w:t>https://dskrzypiec.dev/cron/</w:t>
       </w:r>
     </w:p>
@@ -5066,10 +5374,22 @@
       <w:r>
         <w:t>, providing a simple framework for log entry, generation, storage and transfer. Many log sources either use syslog as their native logging format or offer features that allow their logging formats to be converted to syslog format.</w:t>
       </w:r>
-    </w:p>
-    <w:p>
-      <w:r>
-        <w:t>An example syslog messages might look like the following example:</w:t>
+      <w:r>
+        <w:t xml:space="preserve"> </w:t>
+      </w:r>
+      <w:r>
+        <w:t>(Gerhards, 2009)</w:t>
+      </w:r>
+    </w:p>
+    <w:p>
+      <w:r>
+        <w:t xml:space="preserve">An example syslog </w:t>
+      </w:r>
+      <w:r>
+        <w:t>message</w:t>
+      </w:r>
+      <w:r>
+        <w:t xml:space="preserve"> might look like the following example:</w:t>
       </w:r>
     </w:p>
     <w:p>
@@ -5156,7 +5476,36 @@
         <w:pStyle w:val="Textprogramovhokdu"/>
       </w:pPr>
       <w:r>
-        <w:t>&lt;78&gt;Mar 9 14:48:34 cron[212]: (CRON) INFO (pidfile fd = 3)</w:t>
+        <w:t xml:space="preserve">&lt;78&gt;Mar 9 14:48:34 </w:t>
+      </w:r>
+      <w:proofErr w:type="spellStart"/>
+      <w:proofErr w:type="gramStart"/>
+      <w:r>
+        <w:t>cron</w:t>
+      </w:r>
+      <w:proofErr w:type="spellEnd"/>
+      <w:r>
+        <w:t>[</w:t>
+      </w:r>
+      <w:proofErr w:type="gramEnd"/>
+      <w:r>
+        <w:t>212]: (CRON) INFO (</w:t>
+      </w:r>
+      <w:proofErr w:type="spellStart"/>
+      <w:r>
+        <w:t>pidfile</w:t>
+      </w:r>
+      <w:proofErr w:type="spellEnd"/>
+      <w:r>
+        <w:t xml:space="preserve"> </w:t>
+      </w:r>
+      <w:proofErr w:type="spellStart"/>
+      <w:r>
+        <w:t>fd</w:t>
+      </w:r>
+      <w:proofErr w:type="spellEnd"/>
+      <w:r>
+        <w:t xml:space="preserve"> = 3)</w:t>
       </w:r>
       <w:r>
         <w:br/>
@@ -5168,7 +5517,20 @@
         <w:t xml:space="preserve"> </w:t>
       </w:r>
       <w:r>
-        <w:t>9 14:48:34 systemd[1]: Started D-Bus System Message Bus.</w:t>
+        <w:t xml:space="preserve">9 14:48:34 </w:t>
+      </w:r>
+      <w:proofErr w:type="spellStart"/>
+      <w:proofErr w:type="gramStart"/>
+      <w:r>
+        <w:t>systemd</w:t>
+      </w:r>
+      <w:proofErr w:type="spellEnd"/>
+      <w:r>
+        <w:t>[</w:t>
+      </w:r>
+      <w:proofErr w:type="gramEnd"/>
+      <w:r>
+        <w:t>1]: Started D-Bus System Message Bus.</w:t>
       </w:r>
     </w:p>
     <w:p>
@@ -5176,8 +5538,57 @@
         <w:pStyle w:val="Textprogramovhokdu"/>
       </w:pPr>
       <w:r>
-        <w:t>&lt;12&gt;Mar 9 14:48:40 pipewire-media-session[786]: mod.rt: RTKit error: org.freedesktop.DBus.Error.AccessDenied</w:t>
-      </w:r>
+        <w:t xml:space="preserve">&lt;12&gt;Mar 9 14:48:40 </w:t>
+      </w:r>
+      <w:proofErr w:type="spellStart"/>
+      <w:r>
+        <w:t>pipewire</w:t>
+      </w:r>
+      <w:proofErr w:type="spellEnd"/>
+      <w:r>
+        <w:t>-media-</w:t>
+      </w:r>
+      <w:proofErr w:type="gramStart"/>
+      <w:r>
+        <w:t>session[</w:t>
+      </w:r>
+      <w:proofErr w:type="gramEnd"/>
+      <w:r>
+        <w:t xml:space="preserve">786]: </w:t>
+      </w:r>
+      <w:proofErr w:type="spellStart"/>
+      <w:proofErr w:type="gramStart"/>
+      <w:r>
+        <w:t>mod.rt</w:t>
+      </w:r>
+      <w:proofErr w:type="spellEnd"/>
+      <w:proofErr w:type="gramEnd"/>
+      <w:r>
+        <w:t xml:space="preserve">: </w:t>
+      </w:r>
+      <w:proofErr w:type="spellStart"/>
+      <w:r>
+        <w:t>RTKit</w:t>
+      </w:r>
+      <w:proofErr w:type="spellEnd"/>
+      <w:r>
+        <w:t xml:space="preserve"> error: </w:t>
+      </w:r>
+      <w:proofErr w:type="spellStart"/>
+      <w:proofErr w:type="gramStart"/>
+      <w:r>
+        <w:t>org.freedesktop</w:t>
+      </w:r>
+      <w:proofErr w:type="gramEnd"/>
+      <w:r>
+        <w:t>.</w:t>
+      </w:r>
+      <w:proofErr w:type="gramStart"/>
+      <w:r>
+        <w:t>DBus.Error.AccessDenied</w:t>
+      </w:r>
+      <w:proofErr w:type="spellEnd"/>
+      <w:proofErr w:type="gramEnd"/>
     </w:p>
     <w:p/>
     <w:p>
@@ -5210,6 +5621,9 @@
       <w:r>
         <w:t xml:space="preserve"> the name suggests, this component denotes the priority of a given message. This is important, as it allows for the filtering of messages based on their facility and severity.</w:t>
       </w:r>
+      <w:r>
+        <w:t xml:space="preserve"> </w:t>
+      </w:r>
     </w:p>
     <w:p>
       <w:r>
@@ -5223,7 +5637,34 @@
     </w:p>
     <w:p>
       <w:r>
-        <w:t>The facility component of this equation describes the origin of the message. Within the RFC 5424, facilities are assigned the following values:</w:t>
+        <w:t xml:space="preserve">The facility component of this equation describes the origin of the message. </w:t>
+      </w:r>
+      <w:r>
+        <w:t>RFC</w:t>
+      </w:r>
+      <w:r>
+        <w:t xml:space="preserve"> 5424</w:t>
+      </w:r>
+      <w:r>
+        <w:t xml:space="preserve"> assigns the following values to</w:t>
+      </w:r>
+      <w:r>
+        <w:t xml:space="preserve"> </w:t>
+      </w:r>
+      <w:r>
+        <w:t xml:space="preserve">different </w:t>
+      </w:r>
+      <w:r>
+        <w:t>facilities</w:t>
+      </w:r>
+      <w:r>
+        <w:t xml:space="preserve"> </w:t>
+      </w:r>
+      <w:r>
+        <w:t>(Gerhards, 2009)</w:t>
+      </w:r>
+      <w:r>
+        <w:t>:</w:t>
       </w:r>
     </w:p>
     <w:p>
@@ -5259,6 +5700,7 @@
         <w:rPr>
           <w:lang w:val="en-GB"/>
         </w:rPr>
+        <w:lastRenderedPageBreak/>
         <w:t>user-level messages</w:t>
       </w:r>
     </w:p>
@@ -5313,7 +5755,6 @@
         <w:rPr>
           <w:lang w:val="en-GB"/>
         </w:rPr>
-        <w:lastRenderedPageBreak/>
         <w:t>security/authorization messages</w:t>
       </w:r>
     </w:p>
@@ -5332,8 +5773,16 @@
         <w:rPr>
           <w:lang w:val="en-GB"/>
         </w:rPr>
-        <w:t>messages generated internally by syslogd</w:t>
-      </w:r>
+        <w:t xml:space="preserve">messages generated internally by </w:t>
+      </w:r>
+      <w:proofErr w:type="spellStart"/>
+      <w:r>
+        <w:rPr>
+          <w:lang w:val="en-GB"/>
+        </w:rPr>
+        <w:t>syslogd</w:t>
+      </w:r>
+      <w:proofErr w:type="spellEnd"/>
     </w:p>
     <w:p>
       <w:pPr>
@@ -5619,7 +6068,71 @@
           <w:rStyle w:val="TextprogramovhokduChar"/>
           <w:rFonts w:eastAsiaTheme="minorHAnsi"/>
         </w:rPr>
-        <w:t>cron[212]: (CRON) INFO (pidfile fd = 3)</w:t>
+        <w:t>&lt;78&gt;Mar 9 14:48:34</w:t>
+      </w:r>
+      <w:r>
+        <w:rPr>
+          <w:rStyle w:val="TextprogramovhokduChar"/>
+          <w:rFonts w:eastAsiaTheme="minorHAnsi"/>
+        </w:rPr>
+        <w:t xml:space="preserve"> </w:t>
+      </w:r>
+      <w:proofErr w:type="spellStart"/>
+      <w:proofErr w:type="gramStart"/>
+      <w:r>
+        <w:rPr>
+          <w:rStyle w:val="TextprogramovhokduChar"/>
+          <w:rFonts w:eastAsiaTheme="minorHAnsi"/>
+        </w:rPr>
+        <w:t>cron</w:t>
+      </w:r>
+      <w:proofErr w:type="spellEnd"/>
+      <w:r>
+        <w:rPr>
+          <w:rStyle w:val="TextprogramovhokduChar"/>
+          <w:rFonts w:eastAsiaTheme="minorHAnsi"/>
+        </w:rPr>
+        <w:t>[</w:t>
+      </w:r>
+      <w:proofErr w:type="gramEnd"/>
+      <w:r>
+        <w:rPr>
+          <w:rStyle w:val="TextprogramovhokduChar"/>
+          <w:rFonts w:eastAsiaTheme="minorHAnsi"/>
+        </w:rPr>
+        <w:t>212]: (CRON) INFO (</w:t>
+      </w:r>
+      <w:proofErr w:type="spellStart"/>
+      <w:r>
+        <w:rPr>
+          <w:rStyle w:val="TextprogramovhokduChar"/>
+          <w:rFonts w:eastAsiaTheme="minorHAnsi"/>
+        </w:rPr>
+        <w:t>pidfile</w:t>
+      </w:r>
+      <w:proofErr w:type="spellEnd"/>
+      <w:r>
+        <w:rPr>
+          <w:rStyle w:val="TextprogramovhokduChar"/>
+          <w:rFonts w:eastAsiaTheme="minorHAnsi"/>
+        </w:rPr>
+        <w:t xml:space="preserve"> </w:t>
+      </w:r>
+      <w:proofErr w:type="spellStart"/>
+      <w:r>
+        <w:rPr>
+          <w:rStyle w:val="TextprogramovhokduChar"/>
+          <w:rFonts w:eastAsiaTheme="minorHAnsi"/>
+        </w:rPr>
+        <w:t>fd</w:t>
+      </w:r>
+      <w:proofErr w:type="spellEnd"/>
+      <w:r>
+        <w:rPr>
+          <w:rStyle w:val="TextprogramovhokduChar"/>
+          <w:rFonts w:eastAsiaTheme="minorHAnsi"/>
+        </w:rPr>
+        <w:t xml:space="preserve"> = 3)</w:t>
       </w:r>
       <w:r>
         <w:rPr>
@@ -5734,19 +6247,63 @@
         <w:rPr>
           <w:lang w:val="en-GB"/>
         </w:rPr>
-        <w:t>Within the tables described above, this means that the message had the severity of 6 (Informational) and the origin facility had the number 9 (clock daemon). This checks out with the content of the message and its origin, as the cron process is</w:t>
-      </w:r>
-      <w:r>
-        <w:rPr>
-          <w:lang w:val="en-GB"/>
-        </w:rPr>
-        <w:t xml:space="preserve"> in Linux</w:t>
-      </w:r>
-      <w:r>
-        <w:rPr>
-          <w:lang w:val="en-GB"/>
-        </w:rPr>
-        <w:t xml:space="preserve"> responsible for scheduling events and the message itself contains </w:t>
+        <w:t xml:space="preserve">Within the tables described above, this means that the message had the severity of 6 (Informational) and the origin facility had the number 9 (clock daemon). This checks out with the content of the message and its origin, as </w:t>
+      </w:r>
+      <w:r>
+        <w:rPr>
+          <w:lang w:val="en-GB"/>
+        </w:rPr>
+        <w:t>in Linux</w:t>
+      </w:r>
+      <w:r>
+        <w:rPr>
+          <w:lang w:val="en-GB"/>
+        </w:rPr>
+        <w:t>,</w:t>
+      </w:r>
+      <w:r>
+        <w:rPr>
+          <w:lang w:val="en-GB"/>
+        </w:rPr>
+        <w:t xml:space="preserve"> </w:t>
+      </w:r>
+      <w:r>
+        <w:rPr>
+          <w:lang w:val="en-GB"/>
+        </w:rPr>
+        <w:t xml:space="preserve">the process </w:t>
+      </w:r>
+      <w:proofErr w:type="spellStart"/>
+      <w:r>
+        <w:rPr>
+          <w:lang w:val="en-GB"/>
+        </w:rPr>
+        <w:t>cron</w:t>
+      </w:r>
+      <w:proofErr w:type="spellEnd"/>
+      <w:r>
+        <w:rPr>
+          <w:lang w:val="en-GB"/>
+        </w:rPr>
+        <w:t xml:space="preserve"> </w:t>
+      </w:r>
+      <w:r>
+        <w:rPr>
+          <w:lang w:val="en-GB"/>
+        </w:rPr>
+        <w:t>is</w:t>
+      </w:r>
+      <w:r>
+        <w:rPr>
+          <w:lang w:val="en-GB"/>
+        </w:rPr>
+        <w:t xml:space="preserve"> </w:t>
+      </w:r>
+      <w:r>
+        <w:rPr>
+          <w:lang w:val="en-GB"/>
+        </w:rPr>
+        <w:t xml:space="preserve">responsible for scheduling events and the message itself contains </w:t>
       </w:r>
       <w:r>
         <w:rPr>
@@ -5771,6 +6328,12 @@
           <w:lang w:val="en-GB"/>
         </w:rPr>
         <w:t>, denoting the intent of the message.</w:t>
+      </w:r>
+      <w:r>
+        <w:rPr>
+          <w:lang w:val="en-GB"/>
+        </w:rPr>
+        <w:t xml:space="preserve"> </w:t>
       </w:r>
     </w:p>
     <w:p>
@@ -5816,7 +6379,89 @@
           <w:rStyle w:val="TextprogramovhokduChar"/>
           <w:rFonts w:eastAsiaTheme="minorHAnsi"/>
         </w:rPr>
-        <w:t>&lt;12&gt;Mar 9 14:48:40 pipewire-media-session[786]: mod.rt: RTKit error</w:t>
+        <w:t xml:space="preserve">&lt;12&gt;Mar 9 </w:t>
+      </w:r>
+      <w:proofErr w:type="gramStart"/>
+      <w:r>
+        <w:rPr>
+          <w:rStyle w:val="TextprogramovhokduChar"/>
+          <w:rFonts w:eastAsiaTheme="minorHAnsi"/>
+        </w:rPr>
+        <w:t>14</w:t>
+      </w:r>
+      <w:proofErr w:type="gramEnd"/>
+      <w:r>
+        <w:rPr>
+          <w:rStyle w:val="TextprogramovhokduChar"/>
+          <w:rFonts w:eastAsiaTheme="minorHAnsi"/>
+        </w:rPr>
+        <w:t xml:space="preserve">:48:40 </w:t>
+      </w:r>
+      <w:proofErr w:type="spellStart"/>
+      <w:r>
+        <w:rPr>
+          <w:rStyle w:val="TextprogramovhokduChar"/>
+          <w:rFonts w:eastAsiaTheme="minorHAnsi"/>
+        </w:rPr>
+        <w:t>pipewire</w:t>
+      </w:r>
+      <w:proofErr w:type="spellEnd"/>
+      <w:r>
+        <w:rPr>
+          <w:rStyle w:val="TextprogramovhokduChar"/>
+          <w:rFonts w:eastAsiaTheme="minorHAnsi"/>
+        </w:rPr>
+        <w:t>-media-</w:t>
+      </w:r>
+      <w:proofErr w:type="gramStart"/>
+      <w:r>
+        <w:rPr>
+          <w:rStyle w:val="TextprogramovhokduChar"/>
+          <w:rFonts w:eastAsiaTheme="minorHAnsi"/>
+        </w:rPr>
+        <w:t>session[</w:t>
+      </w:r>
+      <w:proofErr w:type="gramEnd"/>
+      <w:r>
+        <w:rPr>
+          <w:rStyle w:val="TextprogramovhokduChar"/>
+          <w:rFonts w:eastAsiaTheme="minorHAnsi"/>
+        </w:rPr>
+        <w:t xml:space="preserve">786]: </w:t>
+      </w:r>
+      <w:proofErr w:type="spellStart"/>
+      <w:proofErr w:type="gramStart"/>
+      <w:r>
+        <w:rPr>
+          <w:rStyle w:val="TextprogramovhokduChar"/>
+          <w:rFonts w:eastAsiaTheme="minorHAnsi"/>
+        </w:rPr>
+        <w:t>mod.rt</w:t>
+      </w:r>
+      <w:proofErr w:type="spellEnd"/>
+      <w:proofErr w:type="gramEnd"/>
+      <w:r>
+        <w:rPr>
+          <w:rStyle w:val="TextprogramovhokduChar"/>
+          <w:rFonts w:eastAsiaTheme="minorHAnsi"/>
+        </w:rPr>
+        <w:t xml:space="preserve">: </w:t>
+      </w:r>
+      <w:proofErr w:type="spellStart"/>
+      <w:r>
+        <w:rPr>
+          <w:rStyle w:val="TextprogramovhokduChar"/>
+          <w:rFonts w:eastAsiaTheme="minorHAnsi"/>
+        </w:rPr>
+        <w:t>RTKit</w:t>
+      </w:r>
+      <w:proofErr w:type="spellEnd"/>
+      <w:r>
+        <w:rPr>
+          <w:rStyle w:val="TextprogramovhokduChar"/>
+          <w:rFonts w:eastAsiaTheme="minorHAnsi"/>
+        </w:rPr>
+        <w:t xml:space="preserve"> error</w:t>
       </w:r>
       <w:r>
         <w:t xml:space="preserve"> </w:t>
@@ -5987,6 +6632,7 @@
           <w:iCs/>
           <w:lang w:val="en-GB"/>
         </w:rPr>
+        <w:lastRenderedPageBreak/>
         <w:t>The TIMESTAMP value MUS</w:t>
       </w:r>
       <w:r>
@@ -6025,7 +6671,6 @@
           <w:iCs/>
           <w:lang w:val="en-GB"/>
         </w:rPr>
-        <w:lastRenderedPageBreak/>
         <w:t>The "T" and "Z" characters in this syntax MUST be upper case.</w:t>
       </w:r>
     </w:p>
@@ -6105,7 +6750,21 @@
         <w:rPr>
           <w:lang w:val="en-GB"/>
         </w:rPr>
-        <w:t xml:space="preserve">of the timestamp. It is currently unclear why that is, but it can be speculated that one of the causes of this problem can be the adherence to a previous RFC 3164, which is, however, currently obsolete and superseded by the aforementioned RFC 5424. </w:t>
+        <w:t xml:space="preserve">of the timestamp. It is currently unclear why that is, but it can be speculated that one of the causes of this problem can be the adherence to a previous RFC 3164, which is, however, currently obsolete and superseded by the </w:t>
+      </w:r>
+      <w:proofErr w:type="gramStart"/>
+      <w:r>
+        <w:rPr>
+          <w:lang w:val="en-GB"/>
+        </w:rPr>
+        <w:t>aforementioned RFC</w:t>
+      </w:r>
+      <w:proofErr w:type="gramEnd"/>
+      <w:r>
+        <w:rPr>
+          <w:lang w:val="en-GB"/>
+        </w:rPr>
+        <w:t xml:space="preserve"> 5424. </w:t>
       </w:r>
     </w:p>
     <w:p>
@@ -6128,11 +6787,22 @@
         <w:t>0</w:t>
       </w:r>
       <w:r>
-        <w:t xml:space="preserve">s (the utility cron, mentioned in the logs above, was first released in </w:t>
+        <w:t xml:space="preserve">s (the utility </w:t>
+      </w:r>
+      <w:proofErr w:type="spellStart"/>
+      <w:r>
+        <w:t>cron</w:t>
+      </w:r>
+      <w:proofErr w:type="spellEnd"/>
+      <w:r>
+        <w:t xml:space="preserve">, mentioned in the logs above, was first released in </w:t>
       </w:r>
       <w:r>
         <w:t>1979). Adherence to the RFC should then not be fully expected from these older utilities.</w:t>
       </w:r>
+      <w:r>
+        <w:t xml:space="preserve"> </w:t>
+      </w:r>
     </w:p>
     <w:p>
       <w:pPr>
@@ -6144,7 +6814,23 @@
     </w:p>
     <w:p>
       <w:r>
-        <w:t>The hostname component of the message denotes the origin system of the message. By the RFC, the hostname should have the value of the following, as sorted in priority:</w:t>
+        <w:t xml:space="preserve">The hostname component of the message denotes the </w:t>
+      </w:r>
+      <w:proofErr w:type="gramStart"/>
+      <w:r>
+        <w:t>origin</w:t>
+      </w:r>
+      <w:proofErr w:type="gramEnd"/>
+      <w:r>
+        <w:t xml:space="preserve"> system of the message. By </w:t>
+      </w:r>
+      <w:proofErr w:type="gramStart"/>
+      <w:r>
+        <w:t>the RFC</w:t>
+      </w:r>
+      <w:proofErr w:type="gramEnd"/>
+      <w:r>
+        <w:t>, the hostname should have the value of the following, as sorted in priority:</w:t>
       </w:r>
     </w:p>
     <w:p>
@@ -6264,136 +6950,421 @@
     </w:p>
     <w:p>
       <w:pPr>
+        <w:pStyle w:val="Nadpis4"/>
+        <w:rPr>
+          <w:lang w:val="en-GB"/>
+        </w:rPr>
+      </w:pPr>
+      <w:r>
+        <w:rPr>
+          <w:lang w:val="en-GB"/>
+        </w:rPr>
+        <w:t>APP-NAME</w:t>
+      </w:r>
+    </w:p>
+    <w:p>
+      <w:r>
+        <w:rPr>
+          <w:lang w:val="en-GB"/>
+        </w:rPr>
+        <w:t xml:space="preserve">The APP-NAME, as its name suggests, should identify the device or application that originated the message. This field is intended for filtering messages on a relay or collector based on its origin. </w:t>
+      </w:r>
+      <w:r>
+        <w:t>(Gerhards, 2009)</w:t>
+      </w:r>
+    </w:p>
+    <w:p>
+      <w:pPr>
+        <w:pStyle w:val="Nadpis4"/>
+        <w:rPr>
+          <w:lang w:val="cs-CZ"/>
+        </w:rPr>
+      </w:pPr>
+      <w:r>
+        <w:rPr>
+          <w:lang w:val="cs-CZ"/>
+        </w:rPr>
+        <w:t>PROCID</w:t>
+      </w:r>
+    </w:p>
+    <w:p>
+      <w:pPr>
+        <w:rPr>
+          <w:lang w:val="en-GB"/>
+        </w:rPr>
+      </w:pPr>
+      <w:r>
+        <w:rPr>
+          <w:lang w:val="en-GB"/>
+        </w:rPr>
+        <w:t xml:space="preserve">The PROCID denotes the ID of the process that the message originated in. The number by itself does not have any interoperable meaning, however discontinuity within PROCID may be detected by a change in PROCID – if the process </w:t>
+      </w:r>
+      <w:proofErr w:type="spellStart"/>
+      <w:r>
+        <w:rPr>
+          <w:lang w:val="en-GB"/>
+        </w:rPr>
+        <w:t>cron</w:t>
+      </w:r>
+      <w:proofErr w:type="spellEnd"/>
+      <w:r>
+        <w:rPr>
+          <w:lang w:val="en-GB"/>
+        </w:rPr>
+        <w:t xml:space="preserve"> first reports its PROCID as </w:t>
+      </w:r>
+      <w:r>
+        <w:rPr>
+          <w:rStyle w:val="TextprogramovhokduChar"/>
+          <w:rFonts w:eastAsiaTheme="minorHAnsi"/>
+          <w:lang w:val="en-GB"/>
+        </w:rPr>
+        <w:t>212</w:t>
+      </w:r>
+      <w:r>
+        <w:rPr>
+          <w:lang w:val="en-GB"/>
+        </w:rPr>
+        <w:t xml:space="preserve"> and later were to report its PROCID as, for example, 10983, this may point to the process having been restarted. It should be noted, however, that a process may receive the same PROCID from the host system upon restart, and thus this should not be used as an assured way to tell that a discontinuity in the reporting process has not occurred.</w:t>
+      </w:r>
+    </w:p>
+    <w:p>
+      <w:pPr>
+        <w:pStyle w:val="Nadpis4"/>
+        <w:rPr>
+          <w:lang w:val="en-GB"/>
+        </w:rPr>
+      </w:pPr>
+      <w:r>
+        <w:rPr>
+          <w:lang w:val="en-GB"/>
+        </w:rPr>
+        <w:lastRenderedPageBreak/>
+        <w:t>MSGID</w:t>
+      </w:r>
+    </w:p>
+    <w:p>
+      <w:pPr>
+        <w:rPr>
+          <w:lang w:val="en-GB"/>
+        </w:rPr>
+      </w:pPr>
+      <w:r>
+        <w:rPr>
+          <w:lang w:val="en-GB"/>
+        </w:rPr>
+        <w:t>The field MSGID is described in the RFC 5424 the following:</w:t>
+      </w:r>
+    </w:p>
+    <w:p>
+      <w:pPr>
+        <w:pStyle w:val="Citt"/>
+        <w:rPr>
+          <w:lang w:val="en-GB"/>
+        </w:rPr>
+      </w:pPr>
+      <w:r>
+        <w:rPr>
+          <w:lang w:val="en-GB"/>
+        </w:rPr>
+        <w:t>The MSGID</w:t>
+      </w:r>
+      <w:r>
+        <w:rPr>
+          <w:lang w:val="en-GB"/>
+        </w:rPr>
+        <w:t xml:space="preserve"> </w:t>
+      </w:r>
+      <w:r>
+        <w:rPr>
+          <w:lang w:val="en-GB"/>
+        </w:rPr>
+        <w:t>SHOULD identify the type of message.  For example,</w:t>
+      </w:r>
+      <w:r>
+        <w:rPr>
+          <w:lang w:val="en-GB"/>
+        </w:rPr>
+        <w:t xml:space="preserve"> </w:t>
+      </w:r>
+      <w:r>
+        <w:rPr>
+          <w:lang w:val="en-GB"/>
+        </w:rPr>
+        <w:t>a</w:t>
+      </w:r>
+      <w:r>
+        <w:rPr>
+          <w:lang w:val="en-GB"/>
+        </w:rPr>
+        <w:t xml:space="preserve"> </w:t>
+      </w:r>
+      <w:r>
+        <w:rPr>
+          <w:lang w:val="en-GB"/>
+        </w:rPr>
+        <w:t>firewall might use the MSGID "TCPIN" for incoming TCP traffic and the MSGID</w:t>
+      </w:r>
+      <w:r>
+        <w:rPr>
+          <w:lang w:val="en-GB"/>
+        </w:rPr>
+        <w:t xml:space="preserve"> </w:t>
+      </w:r>
+      <w:r>
+        <w:rPr>
+          <w:lang w:val="en-GB"/>
+        </w:rPr>
+        <w:t>"TCPOUT" for outgoing TCP traffic.  Messages with the same</w:t>
+      </w:r>
+      <w:r>
+        <w:rPr>
+          <w:lang w:val="en-GB"/>
+        </w:rPr>
+        <w:t xml:space="preserve"> </w:t>
+      </w:r>
+      <w:r>
+        <w:rPr>
+          <w:lang w:val="en-GB"/>
+        </w:rPr>
+        <w:t>MSGID should reflect events of the same semantics.  The MSGID itself</w:t>
+      </w:r>
+      <w:r>
+        <w:rPr>
+          <w:lang w:val="en-GB"/>
+        </w:rPr>
+        <w:t xml:space="preserve"> </w:t>
+      </w:r>
+      <w:r>
+        <w:rPr>
+          <w:lang w:val="en-GB"/>
+        </w:rPr>
+        <w:t>is a string without further semantics.  It is intended for filtering messages on a relay or collector.</w:t>
+      </w:r>
+    </w:p>
+    <w:p>
+      <w:pPr>
+        <w:rPr>
+          <w:lang w:val="en-GB"/>
+        </w:rPr>
+      </w:pPr>
+      <w:r>
+        <w:rPr>
+          <w:lang w:val="en-GB"/>
+        </w:rPr>
+        <w:t xml:space="preserve">MSGID should thus be an </w:t>
+      </w:r>
+      <w:proofErr w:type="spellStart"/>
+      <w:r>
+        <w:rPr>
+          <w:lang w:val="en-GB"/>
+        </w:rPr>
+        <w:t>identificator</w:t>
+      </w:r>
+      <w:proofErr w:type="spellEnd"/>
+      <w:r>
+        <w:rPr>
+          <w:lang w:val="en-GB"/>
+        </w:rPr>
+        <w:t xml:space="preserve"> for the message and offer further insight into the origin, purpose or destination of the message. In the logs captured in Code 1.3, these MSGIDs referred to the </w:t>
+      </w:r>
+      <w:proofErr w:type="spellStart"/>
+      <w:r>
+        <w:rPr>
+          <w:lang w:val="en-GB"/>
+        </w:rPr>
+        <w:t>basename</w:t>
+      </w:r>
+      <w:proofErr w:type="spellEnd"/>
+      <w:r>
+        <w:rPr>
+          <w:lang w:val="en-GB"/>
+        </w:rPr>
+        <w:t xml:space="preserve"> of the process generating the messages.</w:t>
+      </w:r>
+    </w:p>
+    <w:p>
+      <w:pPr>
+        <w:rPr>
+          <w:lang w:val="en-GB"/>
+        </w:rPr>
+      </w:pPr>
+      <w:r>
+        <w:rPr>
+          <w:lang w:val="en-GB"/>
+        </w:rPr>
+        <w:t xml:space="preserve"> </w:t>
+      </w:r>
+      <w:r>
+        <w:rPr>
+          <w:lang w:val="en-GB"/>
+        </w:rPr>
+        <w:t xml:space="preserve"> </w:t>
+      </w:r>
+    </w:p>
+    <w:p>
+      <w:pPr>
+        <w:pStyle w:val="Nadpis4"/>
+        <w:rPr>
+          <w:lang w:val="en-GB"/>
+        </w:rPr>
+      </w:pPr>
+      <w:r>
+        <w:rPr>
+          <w:highlight w:val="yellow"/>
+          <w:lang w:val="en-GB"/>
+        </w:rPr>
+        <w:t>STRUCTURED-DATA</w:t>
+      </w:r>
+    </w:p>
+    <w:p>
+      <w:pPr>
+        <w:rPr>
+          <w:lang w:val="en-GB"/>
+        </w:rPr>
+      </w:pPr>
+    </w:p>
+    <w:p>
+      <w:pPr>
         <w:pStyle w:val="Nadpis3"/>
-      </w:pPr>
-      <w:bookmarkStart w:id="15" w:name="_Toc222408005"/>
-      <w:r>
-        <w:t>DMA</w:t>
+        <w:rPr>
+          <w:highlight w:val="yellow"/>
+        </w:rPr>
+      </w:pPr>
+      <w:bookmarkStart w:id="14" w:name="_Toc224131582"/>
+      <w:r>
+        <w:rPr>
+          <w:highlight w:val="yellow"/>
+        </w:rPr>
+        <w:t>DMARC</w:t>
+      </w:r>
+      <w:bookmarkEnd w:id="14"/>
+    </w:p>
+    <w:p/>
+    <w:p>
+      <w:pPr>
+        <w:pStyle w:val="Nadpis2"/>
+      </w:pPr>
+      <w:bookmarkStart w:id="15" w:name="_Toc224131583"/>
+      <w:r>
+        <w:t>Creating logs</w:t>
       </w:r>
       <w:bookmarkEnd w:id="15"/>
-      <w:r>
-        <w:t>RC</w:t>
-      </w:r>
+    </w:p>
+    <w:p>
+      <w:r>
+        <w:t xml:space="preserve">On average across a plethora of open-source software applications, 1 line of logging code is included for every 30 lines of code. </w:t>
+      </w:r>
+      <w:r>
+        <w:t>(Yuan et al., 2012)</w:t>
+      </w:r>
+      <w:r>
+        <w:t xml:space="preserve"> </w:t>
+      </w:r>
+      <w:r>
+        <w:t xml:space="preserve">This shows the amount of importance that open-source software places on the act of logging – especially as development on these projects is done by hundreds of people from different countries.  </w:t>
+      </w:r>
+    </w:p>
+    <w:p>
+      <w:pPr>
+        <w:pStyle w:val="Nadpis2"/>
+      </w:pPr>
+      <w:bookmarkStart w:id="16" w:name="_Toc224131584"/>
+      <w:r>
+        <w:t>Storing and analyzing logs</w:t>
+      </w:r>
+      <w:bookmarkEnd w:id="16"/>
     </w:p>
     <w:p/>
-    <w:p/>
+    <w:p>
+      <w:pPr>
+        <w:pStyle w:val="Nadpis3"/>
+      </w:pPr>
+      <w:bookmarkStart w:id="17" w:name="_Toc224131585"/>
+      <w:r>
+        <w:lastRenderedPageBreak/>
+        <w:t>System Logs</w:t>
+      </w:r>
+      <w:bookmarkEnd w:id="17"/>
+    </w:p>
+    <w:p>
+      <w:pPr>
+        <w:pStyle w:val="Nadpis3"/>
+      </w:pPr>
+      <w:bookmarkStart w:id="18" w:name="_Toc224131586"/>
+      <w:r>
+        <w:t>Storage requirements and costs</w:t>
+      </w:r>
+      <w:bookmarkEnd w:id="18"/>
+    </w:p>
     <w:p>
       <w:pPr>
         <w:pStyle w:val="Nadpis2"/>
       </w:pPr>
-      <w:bookmarkStart w:id="16" w:name="_Toc222408006"/>
-      <w:r>
-        <w:lastRenderedPageBreak/>
-        <w:t>Storing and analyzing logs</w:t>
-      </w:r>
-      <w:bookmarkEnd w:id="16"/>
+      <w:bookmarkStart w:id="19" w:name="_Toc224131587"/>
+      <w:r>
+        <w:t>Monitoring</w:t>
+      </w:r>
+      <w:bookmarkEnd w:id="19"/>
     </w:p>
     <w:p>
       <w:pPr>
         <w:pStyle w:val="Nadpis3"/>
       </w:pPr>
-      <w:bookmarkStart w:id="17" w:name="_Toc222408007"/>
-      <w:r>
-        <w:t>System Logs</w:t>
-      </w:r>
-      <w:bookmarkEnd w:id="17"/>
+      <w:bookmarkStart w:id="20" w:name="_Toc224131588"/>
+      <w:r>
+        <w:t>Real-time monitoring</w:t>
+      </w:r>
+      <w:bookmarkEnd w:id="20"/>
     </w:p>
     <w:p>
       <w:pPr>
         <w:pStyle w:val="Nadpis3"/>
       </w:pPr>
-      <w:bookmarkStart w:id="18" w:name="_Toc222408008"/>
-      <w:r>
-        <w:t>Aggregate Reports</w:t>
-      </w:r>
-      <w:bookmarkEnd w:id="18"/>
+      <w:bookmarkStart w:id="21" w:name="_Toc224131589"/>
+      <w:r>
+        <w:t>Dashboards and Single Pane of Glass</w:t>
+      </w:r>
+      <w:bookmarkEnd w:id="21"/>
+    </w:p>
+    <w:p>
+      <w:pPr>
+        <w:pStyle w:val="Nadpis2"/>
+      </w:pPr>
+      <w:bookmarkStart w:id="22" w:name="_Toc224131590"/>
+      <w:r>
+        <w:t>Alerting</w:t>
+      </w:r>
+      <w:bookmarkEnd w:id="22"/>
     </w:p>
     <w:p>
       <w:pPr>
         <w:pStyle w:val="Nadpis3"/>
       </w:pPr>
-      <w:bookmarkStart w:id="19" w:name="_Toc222408009"/>
-      <w:r>
-        <w:t>Storage requirements and costs</w:t>
-      </w:r>
-      <w:bookmarkEnd w:id="19"/>
-    </w:p>
-    <w:p>
-      <w:pPr>
-        <w:pStyle w:val="Nadpis4"/>
-      </w:pPr>
-      <w:r>
-        <w:t>Reducing storage costs</w:t>
-      </w:r>
-    </w:p>
-    <w:p>
-      <w:pPr>
-        <w:pStyle w:val="Nadpis2"/>
-      </w:pPr>
-      <w:bookmarkStart w:id="20" w:name="_Toc222408010"/>
-      <w:r>
-        <w:t>Monitoring</w:t>
-      </w:r>
-      <w:bookmarkEnd w:id="20"/>
+      <w:bookmarkStart w:id="23" w:name="_Toc224131591"/>
+      <w:r>
+        <w:t>Methods of Alerting</w:t>
+      </w:r>
+      <w:bookmarkEnd w:id="23"/>
     </w:p>
     <w:p>
       <w:pPr>
         <w:pStyle w:val="Nadpis3"/>
       </w:pPr>
-      <w:bookmarkStart w:id="21" w:name="_Toc222408011"/>
-      <w:r>
-        <w:t>Real-time monitoring</w:t>
-      </w:r>
-      <w:bookmarkEnd w:id="21"/>
-    </w:p>
-    <w:p>
-      <w:pPr>
-        <w:pStyle w:val="Nadpis3"/>
-      </w:pPr>
-      <w:bookmarkStart w:id="22" w:name="_Toc222408012"/>
-      <w:r>
-        <w:t>Dashboards and Single Pane of Glass</w:t>
-      </w:r>
-      <w:bookmarkEnd w:id="22"/>
-    </w:p>
-    <w:p>
-      <w:pPr>
-        <w:pStyle w:val="Nadpis2"/>
-      </w:pPr>
-      <w:bookmarkStart w:id="23" w:name="_Toc222408013"/>
-      <w:r>
-        <w:t>Alerting</w:t>
-      </w:r>
-      <w:bookmarkEnd w:id="23"/>
-    </w:p>
-    <w:p>
-      <w:pPr>
-        <w:pStyle w:val="Nadpis3"/>
-      </w:pPr>
-      <w:bookmarkStart w:id="24" w:name="_Toc222408014"/>
-      <w:r>
-        <w:t>Methods of Alerting</w:t>
+      <w:r>
+        <w:tab/>
+      </w:r>
+      <w:bookmarkStart w:id="24" w:name="_Toc224131592"/>
+      <w:r>
+        <w:t>Alert Fatigue</w:t>
       </w:r>
       <w:bookmarkEnd w:id="24"/>
     </w:p>
     <w:p>
       <w:pPr>
-        <w:pStyle w:val="Nadpis3"/>
-      </w:pPr>
-      <w:r>
-        <w:tab/>
-      </w:r>
-      <w:bookmarkStart w:id="25" w:name="_Toc222408015"/>
-      <w:r>
-        <w:t>Alert Fatigue</w:t>
-      </w:r>
-      <w:bookmarkEnd w:id="25"/>
-    </w:p>
-    <w:p>
-      <w:pPr>
         <w:pStyle w:val="Nadpis1"/>
       </w:pPr>
-      <w:bookmarkStart w:id="26" w:name="_Toc222408016"/>
+      <w:bookmarkStart w:id="25" w:name="_Toc224131593"/>
       <w:r>
         <w:lastRenderedPageBreak/>
         <w:t>Application</w:t>
@@ -6401,15 +7372,25 @@
       <w:r>
         <w:t xml:space="preserve"> Implementation</w:t>
       </w:r>
+      <w:bookmarkEnd w:id="25"/>
+    </w:p>
+    <w:p>
+      <w:pPr>
+        <w:pStyle w:val="Nadpis2"/>
+      </w:pPr>
+      <w:bookmarkStart w:id="26" w:name="_Toc224131594"/>
+      <w:r>
+        <w:t>Requirements</w:t>
+      </w:r>
       <w:bookmarkEnd w:id="26"/>
     </w:p>
     <w:p>
       <w:pPr>
         <w:pStyle w:val="Nadpis2"/>
       </w:pPr>
-      <w:bookmarkStart w:id="27" w:name="_Toc222408017"/>
-      <w:r>
-        <w:t>Requirements</w:t>
+      <w:bookmarkStart w:id="27" w:name="_Toc224131595"/>
+      <w:r>
+        <w:t>Specification</w:t>
       </w:r>
       <w:bookmarkEnd w:id="27"/>
     </w:p>
@@ -6417,9 +7398,9 @@
       <w:pPr>
         <w:pStyle w:val="Nadpis2"/>
       </w:pPr>
-      <w:bookmarkStart w:id="28" w:name="_Toc222408018"/>
-      <w:r>
-        <w:t>Specification</w:t>
+      <w:bookmarkStart w:id="28" w:name="_Toc224131596"/>
+      <w:r>
+        <w:t>Implementation</w:t>
       </w:r>
       <w:bookmarkEnd w:id="28"/>
     </w:p>
@@ -6427,54 +7408,44 @@
       <w:pPr>
         <w:pStyle w:val="Nadpis2"/>
       </w:pPr>
-      <w:bookmarkStart w:id="29" w:name="_Toc222408019"/>
-      <w:r>
-        <w:t>Implementation</w:t>
+      <w:bookmarkStart w:id="29" w:name="_Toc224131597"/>
+      <w:r>
+        <w:t>Testing and CI/CD</w:t>
       </w:r>
       <w:bookmarkEnd w:id="29"/>
     </w:p>
     <w:p>
       <w:pPr>
-        <w:pStyle w:val="Nadpis2"/>
-      </w:pPr>
-      <w:bookmarkStart w:id="30" w:name="_Toc222408020"/>
-      <w:r>
-        <w:t>Testing and CI/CD</w:t>
-      </w:r>
-      <w:bookmarkEnd w:id="30"/>
-    </w:p>
-    <w:p>
-      <w:pPr>
         <w:pStyle w:val="Nadpis1"/>
       </w:pPr>
-      <w:bookmarkStart w:id="31" w:name="_Toc222408021"/>
+      <w:bookmarkStart w:id="30" w:name="_Toc224131598"/>
       <w:r>
         <w:lastRenderedPageBreak/>
         <w:t>Discussion to implementation</w:t>
       </w:r>
-      <w:bookmarkEnd w:id="31"/>
+      <w:bookmarkEnd w:id="30"/>
     </w:p>
     <w:p>
       <w:pPr>
         <w:pStyle w:val="Nadpis1"/>
       </w:pPr>
-      <w:bookmarkStart w:id="32" w:name="_Toc222408022"/>
+      <w:bookmarkStart w:id="31" w:name="_Toc224131599"/>
       <w:r>
         <w:lastRenderedPageBreak/>
         <w:t>Conclusions</w:t>
       </w:r>
-      <w:bookmarkEnd w:id="32"/>
+      <w:bookmarkEnd w:id="31"/>
     </w:p>
     <w:p>
       <w:pPr>
         <w:pStyle w:val="Nadpis1"/>
       </w:pPr>
-      <w:bookmarkStart w:id="33" w:name="_Toc222408023"/>
+      <w:bookmarkStart w:id="32" w:name="_Toc224131600"/>
       <w:r>
         <w:lastRenderedPageBreak/>
         <w:t>List of references</w:t>
       </w:r>
-      <w:bookmarkEnd w:id="33"/>
+      <w:bookmarkEnd w:id="32"/>
     </w:p>
     <w:p>
       <w:r>
@@ -6500,7 +7471,7 @@
       <w:r>
         <w:t xml:space="preserve">(10). </w:t>
       </w:r>
-      <w:hyperlink r:id="rId18" w:history="1">
+      <w:hyperlink r:id="rId17" w:history="1">
         <w:r>
           <w:rPr>
             <w:rStyle w:val="Hypertextovodkaz"/>
@@ -6533,7 +7504,7 @@
       <w:r>
         <w:t xml:space="preserve">, 1393–1398. </w:t>
       </w:r>
-      <w:hyperlink r:id="rId19" w:history="1">
+      <w:hyperlink r:id="rId18" w:history="1">
         <w:r>
           <w:rPr>
             <w:rStyle w:val="Hypertextovodkaz"/>
@@ -6556,7 +7527,7 @@
       <w:r>
         <w:t xml:space="preserve">. </w:t>
       </w:r>
-      <w:hyperlink r:id="rId20" w:history="1">
+      <w:hyperlink r:id="rId19" w:history="1">
         <w:r>
           <w:rPr>
             <w:rStyle w:val="Hypertextovodkaz"/>
@@ -6571,7 +7542,7 @@
     <w:p>
       <w:pPr>
         <w:sectPr>
-          <w:footerReference w:type="default" r:id="rId21"/>
+          <w:footerReference w:type="default" r:id="rId20"/>
           <w:type w:val="continuous"/>
           <w:pgSz w:w="11906" w:h="16838" w:code="9"/>
           <w:pgMar w:top="1418" w:right="1418" w:bottom="1418" w:left="1418" w:header="709" w:footer="709" w:gutter="284"/>
@@ -6584,16 +7555,16 @@
       <w:pPr>
         <w:pStyle w:val="Nadpis1neslovan"/>
       </w:pPr>
-      <w:bookmarkStart w:id="34" w:name="_Toc222408024"/>
+      <w:bookmarkStart w:id="33" w:name="_Toc224131601"/>
       <w:r>
         <w:lastRenderedPageBreak/>
         <w:t>Appendices</w:t>
       </w:r>
-      <w:bookmarkEnd w:id="34"/>
+      <w:bookmarkEnd w:id="33"/>
     </w:p>
     <w:p/>
     <w:sectPr>
-      <w:footerReference w:type="first" r:id="rId22"/>
+      <w:footerReference w:type="first" r:id="rId21"/>
       <w:pgSz w:w="11906" w:h="16838" w:code="9"/>
       <w:pgMar w:top="1418" w:right="1418" w:bottom="1418" w:left="1418" w:header="709" w:footer="709" w:gutter="284"/>
       <w:pgNumType w:fmt="upperRoman" w:start="1"/>
@@ -11558,7 +12529,6 @@
   <w:style w:type="character" w:default="1" w:styleId="Standardnpsmoodstavce">
     <w:name w:val="Default Paragraph Font"/>
     <w:uiPriority w:val="1"/>
-    <w:semiHidden/>
     <w:unhideWhenUsed/>
   </w:style>
   <w:style w:type="table" w:default="1" w:styleId="Normlntabulka">

</xml_diff>

<commit_message>
Hourly snapshot: 15:29 26/03/13
</commit_message>
<xml_diff>
--- a/mitterpach_bp_en.docx
+++ b/mitterpach_bp_en.docx
@@ -496,7 +496,13 @@
     </w:p>
     <w:p>
       <w:r>
-        <w:t>This thesis addresses the problems of observability in modern software development and the growing need for open-source adaptability layers between different monitoring applications. Main goal stated for the thesis is the development of a Flask application that translates inputs from multiple reporting formats into one common format, which allows for the centralization of reporting from numerous different parts of the software stack into one common database.</w:t>
+        <w:t xml:space="preserve">This thesis addresses the problems of observability in modern software development and the growing need for open-source adaptability layers between different monitoring applications. Main goal stated for the thesis is the development of a Flask application that translates inputs from multiple reporting formats into one common format, which allows for the centralization of reporting from numerous different parts of </w:t>
+      </w:r>
+      <w:r>
+        <w:t>a</w:t>
+      </w:r>
+      <w:r>
+        <w:t xml:space="preserve"> software stack into one common database.</w:t>
       </w:r>
     </w:p>
     <w:p>
@@ -3370,273 +3376,206 @@
       </w:r>
       <w:r>
         <w:br/>
-        <w:t xml:space="preserve">Site Reliability Engineering is closely related to the term DevOps, which describes the culture that places high importance on observability, tight feedback loops and automation of recurring processes. </w:t>
+        <w:t>Site Reliability Engineering is closely related to the term DevOps, which describes</w:t>
+      </w:r>
+      <w:r>
+        <w:t xml:space="preserve"> a</w:t>
+      </w:r>
+      <w:r>
+        <w:t xml:space="preserve"> culture </w:t>
+      </w:r>
+      <w:r>
+        <w:t xml:space="preserve">in software development </w:t>
+      </w:r>
+      <w:r>
+        <w:t>that places high importance on observability, tight feedback loops and automation of recurring processes</w:t>
+      </w:r>
+      <w:r>
+        <w:t xml:space="preserve"> ADD SOURCE</w:t>
+      </w:r>
+      <w:r>
+        <w:t xml:space="preserve">. </w:t>
       </w:r>
     </w:p>
     <w:p>
       <w:pPr>
         <w:pStyle w:val="Nadpis2"/>
       </w:pPr>
-      <w:bookmarkStart w:id="3" w:name="_Toc224131573"/>
-      <w:r>
-        <w:t>DevOps and SRE</w:t>
+      <w:bookmarkStart w:id="3" w:name="_Toc224131574"/>
+      <w:r>
+        <w:t>Costs and Benefits</w:t>
       </w:r>
       <w:bookmarkEnd w:id="3"/>
     </w:p>
     <w:p>
       <w:r>
-        <w:t xml:space="preserve">Historically, software development used to be split into Development and Operations. While </w:t>
-      </w:r>
-      <w:r>
-        <w:t xml:space="preserve">Development </w:t>
-      </w:r>
-      <w:r>
-        <w:t>was tasked with creating new features for the software and updating them, the actual deployment</w:t>
-      </w:r>
-      <w:r>
-        <w:t xml:space="preserve"> of code</w:t>
-      </w:r>
-      <w:r>
-        <w:t xml:space="preserve"> to the servers and their ongoing maintenance was left to </w:t>
-      </w:r>
-      <w:r>
-        <w:t>Operations</w:t>
-      </w:r>
-      <w:r>
-        <w:t xml:space="preserve">. </w:t>
-      </w:r>
-      <w:r>
-        <w:t>(Wiedemann et al., 2023)</w:t>
-      </w:r>
-      <w:r>
-        <w:t xml:space="preserve"> </w:t>
-      </w:r>
-    </w:p>
-    <w:p>
-      <w:r>
-        <w:t xml:space="preserve">To streamline the deployment process and assure stable development, a new culture began to emerge in the late 2010s, called </w:t>
+        <w:t xml:space="preserve">When budgeting for a software application, great care should be placed on not just the initial, up-front costs of the creation of the application, but also on the ongoing development maintenance. Software engineering is a </w:t>
+      </w:r>
+      <w:r>
+        <w:t xml:space="preserve">not as rigid as other engineering disciplines – requirements change quickly, with the most common requests including providing more features, fixing quality issues, connecting to other web services, internationalizing and expanding the software, allowing it to run on multiple platforms </w:t>
+      </w:r>
+      <w:r>
+        <w:t>(Ogheneovo, 2014)</w:t>
+      </w:r>
+    </w:p>
+    <w:p>
+      <w:r>
+        <w:lastRenderedPageBreak/>
+        <w:t xml:space="preserve">The cost </w:t>
+      </w:r>
+      <w:r>
+        <w:t>of maintaining</w:t>
+      </w:r>
+      <w:r>
+        <w:t xml:space="preserve"> software is only expanding – while first applications often required only a single developer, modern applications often require well over 1500 technical staff.</w:t>
+      </w:r>
+    </w:p>
+    <w:p>
+      <w:r>
+        <w:t xml:space="preserve">It is estimated that while one of the first version of the Windows operating system, Windows NT 3.0 was supported by two hundred developers, that number has ballooned, with Windows 8, released 19 years later, required over 3000 developers to create and maintain, with the costs of yearly maintenance going up from 28 billion dollars to 192 billion dollars per year. </w:t>
+      </w:r>
+      <w:r>
+        <w:t>(Ogheneovo, 2014)</w:t>
+      </w:r>
+    </w:p>
+    <w:p>
+      <w:r>
+        <w:t xml:space="preserve">As observability is essential for the maintenance, the costs of observability have risen at a similar rate – the software performs more actions, creates more logs, has a larger surface vector for foreign hostile attacks. </w:t>
+      </w:r>
+    </w:p>
+    <w:p>
+      <w:r>
+        <w:t xml:space="preserve">The most notable benefit of observability in software development is the fact that problems can be discovered and prevented before they interfere with stable business operations. As described in the chapter 2.2 Monitoring, effective alerts can be placed when system is nearing critical conditions – sudden high demand can quickly take down a site if resources are not allocated properly. </w:t>
+      </w:r>
+      <w:r>
+        <w:t>Such allocation is either done manually, or through auto-scaling systems.</w:t>
+      </w:r>
+    </w:p>
+    <w:p>
+      <w:pPr>
+        <w:pStyle w:val="Nadpis3"/>
+      </w:pPr>
+      <w:bookmarkStart w:id="4" w:name="_Toc224131575"/>
+      <w:r>
+        <w:t>A</w:t>
+      </w:r>
+      <w:r>
+        <w:t>uto</w:t>
+      </w:r>
+      <w:r>
+        <w:t>matically s</w:t>
+      </w:r>
+      <w:r>
+        <w:t>caling systems</w:t>
+      </w:r>
+      <w:bookmarkEnd w:id="4"/>
+    </w:p>
+    <w:p>
+      <w:r>
+        <w:t xml:space="preserve">Many software projects utilize </w:t>
       </w:r>
       <w:r>
         <w:rPr>
           <w:i/>
           <w:iCs/>
         </w:rPr>
-        <w:t>DevOps</w:t>
-      </w:r>
-      <w:r>
-        <w:t xml:space="preserve">. DevOps attempts to bridge the gap between </w:t>
-      </w:r>
-      <w:r>
-        <w:lastRenderedPageBreak/>
-        <w:t>Development and Operations and connects the two teams together. That way, development teams take part in deployment and operations play an active role in development.</w:t>
-      </w:r>
-    </w:p>
-    <w:p>
-      <w:pPr>
-        <w:rPr>
-          <w:highlight w:val="yellow"/>
-        </w:rPr>
-      </w:pPr>
-      <w:r>
-        <w:rPr>
-          <w:highlight w:val="yellow"/>
-        </w:rPr>
-        <w:t xml:space="preserve">The term would further develop into the 2020s, </w:t>
-      </w:r>
-      <w:r>
-        <w:rPr>
-          <w:highlight w:val="yellow"/>
-        </w:rPr>
-        <w:t>however, m</w:t>
-      </w:r>
-      <w:r>
-        <w:rPr>
-          <w:highlight w:val="yellow"/>
-        </w:rPr>
-        <w:t xml:space="preserve">any critics warn that DevOps has steered too far away from </w:t>
-      </w:r>
-      <w:r>
-        <w:rPr>
-          <w:highlight w:val="yellow"/>
-        </w:rPr>
-        <w:t>its</w:t>
-      </w:r>
-      <w:r>
-        <w:rPr>
-          <w:highlight w:val="yellow"/>
-        </w:rPr>
-        <w:t xml:space="preserve"> original purpose, becoming </w:t>
-      </w:r>
-      <w:r>
-        <w:rPr>
-          <w:highlight w:val="yellow"/>
-        </w:rPr>
-        <w:t>its</w:t>
-      </w:r>
-      <w:r>
-        <w:rPr>
-          <w:highlight w:val="yellow"/>
-        </w:rPr>
-        <w:t xml:space="preserve"> own discipline, rather than a culture bridging two cooperating disciplines. </w:t>
-      </w:r>
-    </w:p>
-    <w:p>
-      <w:r>
-        <w:rPr>
-          <w:highlight w:val="yellow"/>
-        </w:rPr>
-        <w:t>Developers who describe themselves as "DevOps</w:t>
-      </w:r>
-      <w:r>
-        <w:rPr>
-          <w:highlight w:val="yellow"/>
-        </w:rPr>
-        <w:t xml:space="preserve"> developers</w:t>
-      </w:r>
-      <w:r>
-        <w:rPr>
-          <w:highlight w:val="yellow"/>
-        </w:rPr>
-        <w:t>" now make up 2.5% of the workforce, according to the latest StackOverflow developer survey. This marks a large increase from the 1.3% reported in 2015.</w:t>
-      </w:r>
-      <w:r>
-        <w:t xml:space="preserve"> REWORK, ELABORATE</w:t>
-      </w:r>
-    </w:p>
-    <w:p>
-      <w:pPr>
-        <w:pStyle w:val="Nadpis2"/>
-      </w:pPr>
-      <w:bookmarkStart w:id="4" w:name="_Toc224131574"/>
-      <w:r>
-        <w:t>Costs and Benefits</w:t>
-      </w:r>
-      <w:bookmarkEnd w:id="4"/>
-    </w:p>
-    <w:p>
-      <w:r>
-        <w:rPr>
-          <w:highlight w:val="yellow"/>
-        </w:rPr>
-        <w:t>ADD INTRO TO COSTS AND BENEFITS</w:t>
-      </w:r>
-    </w:p>
-    <w:p>
-      <w:pPr>
-        <w:pStyle w:val="Nadpis3"/>
-      </w:pPr>
-      <w:bookmarkStart w:id="5" w:name="_Toc224131575"/>
-      <w:r>
-        <w:t>Problems with auto-scaling systems</w:t>
-      </w:r>
-      <w:bookmarkEnd w:id="5"/>
-    </w:p>
-    <w:p>
-      <w:r>
-        <w:t xml:space="preserve">Many software projects utilize </w:t>
+        <w:t>virtualization</w:t>
+      </w:r>
+      <w:r>
+        <w:t xml:space="preserve">, which </w:t>
+      </w:r>
+      <w:r>
+        <w:t>allows</w:t>
+      </w:r>
+      <w:r>
+        <w:t xml:space="preserve"> software to run on virtual machines or containers</w:t>
+      </w:r>
+      <w:r>
+        <w:t>, rather than being tied to specific hardware</w:t>
+      </w:r>
+      <w:r>
+        <w:t xml:space="preserve">. This process, combined with </w:t>
+      </w:r>
+      <w:r>
+        <w:t xml:space="preserve">widely available </w:t>
+      </w:r>
+      <w:r>
+        <w:t>cloud hosting</w:t>
+      </w:r>
+      <w:r>
+        <w:t xml:space="preserve"> services</w:t>
+      </w:r>
+      <w:r>
+        <w:t xml:space="preserve">, allows for automated scaling of memory / disk-space available to the application based on its current needs. If an application is running out of memory during intensive operations, it is trivial to add more processing cores and </w:t>
+      </w:r>
+      <w:r>
+        <w:t>increase available memory</w:t>
+      </w:r>
+      <w:r>
+        <w:t xml:space="preserve">. </w:t>
+      </w:r>
+    </w:p>
+    <w:p>
+      <w:r>
+        <w:t xml:space="preserve">Such scaling can be done manually, but </w:t>
+      </w:r>
+      <w:r>
+        <w:t>increasingly</w:t>
+      </w:r>
+      <w:r>
+        <w:t xml:space="preserve"> often this scaling is automated and can respond within seconds to increased demand. This is done to make sure the application </w:t>
+      </w:r>
+      <w:r>
+        <w:t xml:space="preserve">runs unimpeded </w:t>
+      </w:r>
+      <w:r>
+        <w:t xml:space="preserve">even during unusually high traffic, such as during specific holidays or </w:t>
+      </w:r>
+      <w:r>
+        <w:t>events</w:t>
+      </w:r>
+      <w:r>
+        <w:t xml:space="preserve">. </w:t>
+      </w:r>
+    </w:p>
+    <w:p>
+      <w:r>
+        <w:t xml:space="preserve">However, these resources come at a cost. A program which incorrectly or inefficiently utilizes space or memory </w:t>
+      </w:r>
+      <w:r>
+        <w:t xml:space="preserve">wastes resources at a large </w:t>
+      </w:r>
+      <w:r>
+        <w:t>cost</w:t>
+      </w:r>
+      <w:r>
+        <w:t xml:space="preserve"> </w:t>
+      </w:r>
+      <w:r>
+        <w:t>to the business. It is very often difficult to catch such inefficiencies, as finding out which process takes too much time or runs inefficiently requires an in-depth understanding of the system.</w:t>
+      </w:r>
+    </w:p>
+    <w:p>
+      <w:r>
+        <w:t xml:space="preserve">This is where observability can be most useful, as all aspects of the system can be recorded and </w:t>
+      </w:r>
+      <w:r>
+        <w:t>analyzed</w:t>
+      </w:r>
+      <w:r>
+        <w:t xml:space="preserve"> for inefficiencies. The process of </w:t>
+      </w:r>
+      <w:r>
+        <w:t>analyzing</w:t>
+      </w:r>
+      <w:r>
+        <w:t xml:space="preserve"> such system traces for space or time complexity is called </w:t>
       </w:r>
       <w:r>
         <w:rPr>
           <w:i/>
           <w:iCs/>
         </w:rPr>
-        <w:t>virtualization</w:t>
-      </w:r>
-      <w:r>
-        <w:t xml:space="preserve">, which </w:t>
-      </w:r>
-      <w:r>
-        <w:t>allows</w:t>
-      </w:r>
-      <w:r>
-        <w:t xml:space="preserve"> software to run on virtual machines or containers</w:t>
-      </w:r>
-      <w:r>
-        <w:t>, rather than being tied to specific hardware</w:t>
-      </w:r>
-      <w:r>
-        <w:t xml:space="preserve">. This process, combined with </w:t>
-      </w:r>
-      <w:r>
-        <w:t xml:space="preserve">widely available </w:t>
-      </w:r>
-      <w:r>
-        <w:t>cloud hosting</w:t>
-      </w:r>
-      <w:r>
-        <w:t xml:space="preserve"> services</w:t>
-      </w:r>
-      <w:r>
-        <w:t xml:space="preserve">, allows for automated scaling of memory / disk-space available to the application based on its current needs. If an application is running out of memory during intensive operations, it is trivial to add more processing cores and </w:t>
-      </w:r>
-      <w:r>
-        <w:t>increase available memory</w:t>
-      </w:r>
-      <w:r>
-        <w:t xml:space="preserve">. </w:t>
-      </w:r>
-    </w:p>
-    <w:p>
-      <w:r>
-        <w:t xml:space="preserve">Such scaling can be done manually, but </w:t>
-      </w:r>
-      <w:r>
-        <w:t>increasingly</w:t>
-      </w:r>
-      <w:r>
-        <w:t xml:space="preserve"> often this scaling is automated and can respond within seconds to increased demand. This is done to make sure the application </w:t>
-      </w:r>
-      <w:r>
-        <w:t xml:space="preserve">runs unimpeded </w:t>
-      </w:r>
-      <w:r>
-        <w:t xml:space="preserve">even during unusually high traffic, such as during specific holidays or </w:t>
-      </w:r>
-      <w:r>
-        <w:t>events</w:t>
-      </w:r>
-      <w:r>
-        <w:t xml:space="preserve">. </w:t>
-      </w:r>
-    </w:p>
-    <w:p>
-      <w:r>
-        <w:t xml:space="preserve">However, these resources come at a cost. A program which incorrectly or inefficiently utilizes space or memory </w:t>
-      </w:r>
-      <w:r>
-        <w:t xml:space="preserve">wastes resources at a large </w:t>
-      </w:r>
-      <w:r>
-        <w:t>cost</w:t>
-      </w:r>
-      <w:r>
-        <w:t xml:space="preserve"> </w:t>
-      </w:r>
-      <w:r>
-        <w:t>to the business. It is very often difficult to catch such inefficiencies, as finding out which process takes too much time or runs inefficiently requires an in-depth understanding of the system.</w:t>
-      </w:r>
-    </w:p>
-    <w:p>
-      <w:r>
-        <w:t xml:space="preserve">This is where observability can be most useful, as all aspects of the system can be recorded and </w:t>
-      </w:r>
-      <w:r>
-        <w:t>analyzed</w:t>
-      </w:r>
-      <w:r>
-        <w:t xml:space="preserve"> for inefficiencies. The process of </w:t>
-      </w:r>
-      <w:r>
-        <w:t>analyzing</w:t>
-      </w:r>
-      <w:r>
-        <w:t xml:space="preserve"> such system traces for space or time complexity is called </w:t>
-      </w:r>
-      <w:r>
-        <w:rPr>
-          <w:i/>
-          <w:iCs/>
-        </w:rPr>
         <w:t>profiling</w:t>
       </w:r>
       <w:r>
@@ -3650,54 +3589,16 @@
       </w:r>
     </w:p>
     <w:p>
-      <w:r>
-        <w:t xml:space="preserve">Common pitfalls might include inefficient database reads or calculation algorithms. When reading from a database, such as to retrieve a username, it is often </w:t>
-      </w:r>
-      <w:r>
-        <w:t xml:space="preserve">for the query to look at all </w:t>
-      </w:r>
-      <w:r>
-        <w:t>element</w:t>
-      </w:r>
-      <w:r>
-        <w:t>s within a database</w:t>
-      </w:r>
-      <w:r>
-        <w:t xml:space="preserve">. Instead, correct indexing and search algorithms can be used to access the user much faster, which places </w:t>
-      </w:r>
-      <w:r>
-        <w:t>less</w:t>
-      </w:r>
-      <w:r>
-        <w:t xml:space="preserve"> pressure on the system itself. </w:t>
-      </w:r>
-    </w:p>
-    <w:p>
-      <w:pPr>
-        <w:tabs>
-          <w:tab w:val="left" w:pos="1276"/>
-        </w:tabs>
-      </w:pPr>
-      <w:r>
-        <w:t>T</w:t>
-      </w:r>
-      <w:r>
-        <w:t xml:space="preserve">hese inefficiencies often only show up </w:t>
-      </w:r>
-      <w:r>
-        <w:t xml:space="preserve">when the software is running </w:t>
-      </w:r>
-      <w:r>
-        <w:t>at a large scale</w:t>
-      </w:r>
-      <w:r>
-        <w:t>, and can be thus difficult to catch</w:t>
-      </w:r>
-      <w:r>
-        <w:t xml:space="preserve">. </w:t>
-      </w:r>
-      <w:r>
-        <w:t>Effects of large outages on business</w:t>
+      <w:pPr>
+        <w:pStyle w:val="Nadpis3"/>
+      </w:pPr>
+      <w:r>
+        <w:t>Outages</w:t>
+      </w:r>
+    </w:p>
+    <w:p>
+      <w:r>
+        <w:t xml:space="preserve">Special attention should be placed on outages </w:t>
       </w:r>
     </w:p>
     <w:p>
@@ -3731,22 +3632,6 @@
     </w:p>
     <w:p>
       <w:pPr>
-        <w:pStyle w:val="Nadpis3"/>
-        <w:rPr>
-          <w:highlight w:val="yellow"/>
-        </w:rPr>
-      </w:pPr>
-      <w:bookmarkStart w:id="6" w:name="_Toc224131576"/>
-      <w:r>
-        <w:rPr>
-          <w:highlight w:val="yellow"/>
-        </w:rPr>
-        <w:t>Prevention</w:t>
-      </w:r>
-      <w:bookmarkEnd w:id="6"/>
-    </w:p>
-    <w:p>
-      <w:pPr>
         <w:spacing w:after="160" w:line="259" w:lineRule="auto"/>
         <w:jc w:val="left"/>
       </w:pPr>
@@ -3758,12 +3643,12 @@
       <w:pPr>
         <w:pStyle w:val="Nadpis1"/>
       </w:pPr>
-      <w:bookmarkStart w:id="7" w:name="_Toc224131577"/>
+      <w:bookmarkStart w:id="5" w:name="_Toc224131577"/>
       <w:r>
         <w:lastRenderedPageBreak/>
         <w:t>Logging and Monitoring</w:t>
       </w:r>
-      <w:bookmarkEnd w:id="7"/>
+      <w:bookmarkEnd w:id="5"/>
     </w:p>
     <w:p>
       <w:r>
@@ -3937,23 +3822,15 @@
       <w:pPr>
         <w:pStyle w:val="Nadpis2"/>
       </w:pPr>
-      <w:bookmarkStart w:id="8" w:name="_Toc224131578"/>
+      <w:bookmarkStart w:id="6" w:name="_Toc224131578"/>
       <w:r>
         <w:t>Logging Formats</w:t>
       </w:r>
-      <w:bookmarkEnd w:id="8"/>
-    </w:p>
-    <w:p>
-      <w:r>
-        <w:t xml:space="preserve">As different development teams have different requirements, so too do their needs for logging differ. Some applications may require </w:t>
-      </w:r>
-      <w:proofErr w:type="gramStart"/>
-      <w:r>
-        <w:t>a large number of</w:t>
-      </w:r>
-      <w:proofErr w:type="gramEnd"/>
-      <w:r>
-        <w:t xml:space="preserve"> logs to be processed in a short amount of time, some place large importance on the data integrity and log all actions taken by the software multiple times </w:t>
+      <w:bookmarkEnd w:id="6"/>
+    </w:p>
+    <w:p>
+      <w:r>
+        <w:t xml:space="preserve">As different development teams have different requirements, so too do their needs for logging differ. Some applications may require a large number of logs to be processed in a short amount of time, some place large importance on the data integrity and log all actions taken by the software multiple times </w:t>
       </w:r>
       <w:r>
         <w:t>i</w:t>
@@ -3982,11 +3859,11 @@
       <w:pPr>
         <w:pStyle w:val="Nadpis3"/>
       </w:pPr>
-      <w:bookmarkStart w:id="9" w:name="_Toc224131579"/>
+      <w:bookmarkStart w:id="7" w:name="_Toc224131579"/>
       <w:r>
         <w:t>JSON</w:t>
       </w:r>
-      <w:bookmarkEnd w:id="9"/>
+      <w:bookmarkEnd w:id="7"/>
     </w:p>
     <w:p>
       <w:r>
@@ -4114,8 +3991,8 @@
       </w:r>
     </w:p>
     <w:p>
-      <w:bookmarkStart w:id="10" w:name="_Ref7017310"/>
-      <w:bookmarkStart w:id="11" w:name="_Toc7017593"/>
+      <w:bookmarkStart w:id="8" w:name="_Ref7017310"/>
+      <w:bookmarkStart w:id="9" w:name="_Toc7017593"/>
       <w:r>
         <w:rPr>
           <w:b/>
@@ -4204,7 +4081,7 @@
       <w:r>
         <w:fldChar w:fldCharType="end"/>
       </w:r>
-      <w:bookmarkEnd w:id="10"/>
+      <w:bookmarkEnd w:id="8"/>
     </w:p>
     <w:p>
       <w:pPr>
@@ -4229,7 +4106,7 @@
         <w:t>(Bourhis et al., 2020)</w:t>
       </w:r>
     </w:p>
-    <w:bookmarkEnd w:id="11"/>
+    <w:bookmarkEnd w:id="9"/>
     <w:p>
       <w:pPr>
         <w:pStyle w:val="Textprogramovhokdu"/>
@@ -4549,13 +4426,8 @@
         <w:t>Despite these issues, JSON remains overall a commonly used and very attractive format for storing and representing data. Additionally, research has shown good compatibility with modern AI systems</w:t>
       </w:r>
       <w:r>
-        <w:t xml:space="preserve">, which may lead to even further adoption </w:t>
-      </w:r>
-      <w:proofErr w:type="gramStart"/>
-      <w:r>
-        <w:t>in the near future</w:t>
-      </w:r>
-      <w:proofErr w:type="gramEnd"/>
+        <w:t>, which may lead to even further adoption in the near future</w:t>
+      </w:r>
       <w:r>
         <w:t xml:space="preserve">. </w:t>
       </w:r>
@@ -4568,7 +4440,7 @@
       <w:pPr>
         <w:pStyle w:val="Nadpis3"/>
       </w:pPr>
-      <w:bookmarkStart w:id="12" w:name="_Toc224131580"/>
+      <w:bookmarkStart w:id="10" w:name="_Toc224131580"/>
       <w:r>
         <w:t>X</w:t>
       </w:r>
@@ -4578,7 +4450,7 @@
       <w:r>
         <w:t xml:space="preserve"> and other markup languages</w:t>
       </w:r>
-      <w:bookmarkEnd w:id="12"/>
+      <w:bookmarkEnd w:id="10"/>
     </w:p>
     <w:p>
       <w:r>
@@ -4832,21 +4704,7 @@
         <w:rPr>
           <w:lang w:val="en-GB"/>
         </w:rPr>
-        <w:t xml:space="preserve">    &lt;name&gt;</w:t>
-      </w:r>
-      <w:proofErr w:type="spellStart"/>
-      <w:r>
-        <w:rPr>
-          <w:lang w:val="en-GB"/>
-        </w:rPr>
-        <w:t>DataLife</w:t>
-      </w:r>
-      <w:proofErr w:type="spellEnd"/>
-      <w:r>
-        <w:rPr>
-          <w:lang w:val="en-GB"/>
-        </w:rPr>
-        <w:t xml:space="preserve"> MF 2HD&lt;/name&gt;</w:t>
+        <w:t xml:space="preserve">    &lt;name&gt;DataLife MF 2HD&lt;/name&gt;</w:t>
       </w:r>
     </w:p>
     <w:p>
@@ -4900,35 +4758,7 @@
         <w:rPr>
           <w:lang w:val="en-GB"/>
         </w:rPr>
-        <w:t xml:space="preserve">    &lt;</w:t>
-      </w:r>
-      <w:proofErr w:type="spellStart"/>
-      <w:r>
-        <w:rPr>
-          <w:lang w:val="en-GB"/>
-        </w:rPr>
-        <w:t>color</w:t>
-      </w:r>
-      <w:proofErr w:type="spellEnd"/>
-      <w:r>
-        <w:rPr>
-          <w:lang w:val="en-GB"/>
-        </w:rPr>
-        <w:t>&gt;black&lt;/</w:t>
-      </w:r>
-      <w:proofErr w:type="spellStart"/>
-      <w:r>
-        <w:rPr>
-          <w:lang w:val="en-GB"/>
-        </w:rPr>
-        <w:t>color</w:t>
-      </w:r>
-      <w:proofErr w:type="spellEnd"/>
-      <w:r>
-        <w:rPr>
-          <w:lang w:val="en-GB"/>
-        </w:rPr>
-        <w:t>&gt;</w:t>
+        <w:t xml:space="preserve">    &lt;color&gt;black&lt;/color&gt;</w:t>
       </w:r>
     </w:p>
     <w:p>
@@ -5221,17 +5051,7 @@
     </w:p>
     <w:p>
       <w:r>
-        <w:t>Furthermore, XML allows for the extension of these data types and creating your own, as well as utilizing commonly used community extensions. Any such extension or specification is called a schema. Import of foreign schemas is done with an &lt;</w:t>
-      </w:r>
-      <w:proofErr w:type="spellStart"/>
-      <w:proofErr w:type="gramStart"/>
-      <w:r>
-        <w:t>xs:schema</w:t>
-      </w:r>
-      <w:proofErr w:type="spellEnd"/>
-      <w:proofErr w:type="gramEnd"/>
-      <w:r>
-        <w:t>&gt; element containing a URI of the required schema.</w:t>
+        <w:t>Furthermore, XML allows for the extension of these data types and creating your own, as well as utilizing commonly used community extensions. Any such extension or specification is called a schema. Import of foreign schemas is done with an &lt;xs:schema&gt; element containing a URI of the required schema.</w:t>
       </w:r>
       <w:r>
         <w:t xml:space="preserve"> </w:t>
@@ -5322,15 +5142,7 @@
         </w:numPr>
       </w:pPr>
       <w:r>
-        <w:t xml:space="preserve">LaTeX, </w:t>
-      </w:r>
-      <w:proofErr w:type="gramStart"/>
-      <w:r>
-        <w:t>used most commonly</w:t>
-      </w:r>
-      <w:proofErr w:type="gramEnd"/>
-      <w:r>
-        <w:t xml:space="preserve"> with typesetting and presentation of scientific publications</w:t>
+        <w:t>LaTeX, used most commonly with typesetting and presentation of scientific publications</w:t>
       </w:r>
     </w:p>
     <w:p>
@@ -5350,14 +5162,14 @@
       <w:pPr>
         <w:pStyle w:val="Nadpis3"/>
       </w:pPr>
-      <w:bookmarkStart w:id="13" w:name="_Toc224131581"/>
+      <w:bookmarkStart w:id="11" w:name="_Toc224131581"/>
       <w:r>
         <w:t>S</w:t>
       </w:r>
       <w:r>
         <w:t>yslog</w:t>
       </w:r>
-      <w:bookmarkEnd w:id="13"/>
+      <w:bookmarkEnd w:id="11"/>
     </w:p>
     <w:p>
       <w:r>
@@ -5476,61 +5288,19 @@
         <w:pStyle w:val="Textprogramovhokdu"/>
       </w:pPr>
       <w:r>
-        <w:t xml:space="preserve">&lt;78&gt;Mar 9 14:48:34 </w:t>
-      </w:r>
-      <w:proofErr w:type="spellStart"/>
-      <w:proofErr w:type="gramStart"/>
-      <w:r>
-        <w:t>cron</w:t>
-      </w:r>
-      <w:proofErr w:type="spellEnd"/>
-      <w:r>
-        <w:t>[</w:t>
-      </w:r>
-      <w:proofErr w:type="gramEnd"/>
-      <w:r>
-        <w:t>212]: (CRON) INFO (</w:t>
-      </w:r>
-      <w:proofErr w:type="spellStart"/>
-      <w:r>
-        <w:t>pidfile</w:t>
-      </w:r>
-      <w:proofErr w:type="spellEnd"/>
+        <w:t>&lt;78&gt;Mar 9 14:48:34 cron[212]: (CRON) INFO (pidfile fd = 3)</w:t>
+      </w:r>
+      <w:r>
+        <w:br/>
+      </w:r>
+      <w:r>
+        <w:t>&lt;30&gt;Mar</w:t>
+      </w:r>
       <w:r>
         <w:t xml:space="preserve"> </w:t>
       </w:r>
-      <w:proofErr w:type="spellStart"/>
-      <w:r>
-        <w:t>fd</w:t>
-      </w:r>
-      <w:proofErr w:type="spellEnd"/>
-      <w:r>
-        <w:t xml:space="preserve"> = 3)</w:t>
-      </w:r>
-      <w:r>
-        <w:br/>
-      </w:r>
-      <w:r>
-        <w:t>&lt;30&gt;Mar</w:t>
-      </w:r>
-      <w:r>
-        <w:t xml:space="preserve"> </w:t>
-      </w:r>
-      <w:r>
-        <w:t xml:space="preserve">9 14:48:34 </w:t>
-      </w:r>
-      <w:proofErr w:type="spellStart"/>
-      <w:proofErr w:type="gramStart"/>
-      <w:r>
-        <w:t>systemd</w:t>
-      </w:r>
-      <w:proofErr w:type="spellEnd"/>
-      <w:r>
-        <w:t>[</w:t>
-      </w:r>
-      <w:proofErr w:type="gramEnd"/>
-      <w:r>
-        <w:t>1]: Started D-Bus System Message Bus.</w:t>
+      <w:r>
+        <w:t>9 14:48:34 systemd[1]: Started D-Bus System Message Bus.</w:t>
       </w:r>
     </w:p>
     <w:p>
@@ -5538,57 +5308,8 @@
         <w:pStyle w:val="Textprogramovhokdu"/>
       </w:pPr>
       <w:r>
-        <w:t xml:space="preserve">&lt;12&gt;Mar 9 14:48:40 </w:t>
-      </w:r>
-      <w:proofErr w:type="spellStart"/>
-      <w:r>
-        <w:t>pipewire</w:t>
-      </w:r>
-      <w:proofErr w:type="spellEnd"/>
-      <w:r>
-        <w:t>-media-</w:t>
-      </w:r>
-      <w:proofErr w:type="gramStart"/>
-      <w:r>
-        <w:t>session[</w:t>
-      </w:r>
-      <w:proofErr w:type="gramEnd"/>
-      <w:r>
-        <w:t xml:space="preserve">786]: </w:t>
-      </w:r>
-      <w:proofErr w:type="spellStart"/>
-      <w:proofErr w:type="gramStart"/>
-      <w:r>
-        <w:t>mod.rt</w:t>
-      </w:r>
-      <w:proofErr w:type="spellEnd"/>
-      <w:proofErr w:type="gramEnd"/>
-      <w:r>
-        <w:t xml:space="preserve">: </w:t>
-      </w:r>
-      <w:proofErr w:type="spellStart"/>
-      <w:r>
-        <w:t>RTKit</w:t>
-      </w:r>
-      <w:proofErr w:type="spellEnd"/>
-      <w:r>
-        <w:t xml:space="preserve"> error: </w:t>
-      </w:r>
-      <w:proofErr w:type="spellStart"/>
-      <w:proofErr w:type="gramStart"/>
-      <w:r>
-        <w:t>org.freedesktop</w:t>
-      </w:r>
-      <w:proofErr w:type="gramEnd"/>
-      <w:r>
-        <w:t>.</w:t>
-      </w:r>
-      <w:proofErr w:type="gramStart"/>
-      <w:r>
-        <w:t>DBus.Error.AccessDenied</w:t>
-      </w:r>
-      <w:proofErr w:type="spellEnd"/>
-      <w:proofErr w:type="gramEnd"/>
+        <w:t>&lt;12&gt;Mar 9 14:48:40 pipewire-media-session[786]: mod.rt: RTKit error: org.freedesktop.DBus.Error.AccessDenied</w:t>
+      </w:r>
     </w:p>
     <w:p/>
     <w:p>
@@ -5773,16 +5494,8 @@
         <w:rPr>
           <w:lang w:val="en-GB"/>
         </w:rPr>
-        <w:t xml:space="preserve">messages generated internally by </w:t>
-      </w:r>
-      <w:proofErr w:type="spellStart"/>
-      <w:r>
-        <w:rPr>
-          <w:lang w:val="en-GB"/>
-        </w:rPr>
-        <w:t>syslogd</w:t>
-      </w:r>
-      <w:proofErr w:type="spellEnd"/>
+        <w:t>messages generated internally by syslogd</w:t>
+      </w:r>
     </w:p>
     <w:p>
       <w:pPr>
@@ -6077,62 +5790,12 @@
         </w:rPr>
         <w:t xml:space="preserve"> </w:t>
       </w:r>
-      <w:proofErr w:type="spellStart"/>
-      <w:proofErr w:type="gramStart"/>
       <w:r>
         <w:rPr>
           <w:rStyle w:val="TextprogramovhokduChar"/>
           <w:rFonts w:eastAsiaTheme="minorHAnsi"/>
         </w:rPr>
-        <w:t>cron</w:t>
-      </w:r>
-      <w:proofErr w:type="spellEnd"/>
-      <w:r>
-        <w:rPr>
-          <w:rStyle w:val="TextprogramovhokduChar"/>
-          <w:rFonts w:eastAsiaTheme="minorHAnsi"/>
-        </w:rPr>
-        <w:t>[</w:t>
-      </w:r>
-      <w:proofErr w:type="gramEnd"/>
-      <w:r>
-        <w:rPr>
-          <w:rStyle w:val="TextprogramovhokduChar"/>
-          <w:rFonts w:eastAsiaTheme="minorHAnsi"/>
-        </w:rPr>
-        <w:t>212]: (CRON) INFO (</w:t>
-      </w:r>
-      <w:proofErr w:type="spellStart"/>
-      <w:r>
-        <w:rPr>
-          <w:rStyle w:val="TextprogramovhokduChar"/>
-          <w:rFonts w:eastAsiaTheme="minorHAnsi"/>
-        </w:rPr>
-        <w:t>pidfile</w:t>
-      </w:r>
-      <w:proofErr w:type="spellEnd"/>
-      <w:r>
-        <w:rPr>
-          <w:rStyle w:val="TextprogramovhokduChar"/>
-          <w:rFonts w:eastAsiaTheme="minorHAnsi"/>
-        </w:rPr>
-        <w:t xml:space="preserve"> </w:t>
-      </w:r>
-      <w:proofErr w:type="spellStart"/>
-      <w:r>
-        <w:rPr>
-          <w:rStyle w:val="TextprogramovhokduChar"/>
-          <w:rFonts w:eastAsiaTheme="minorHAnsi"/>
-        </w:rPr>
-        <w:t>fd</w:t>
-      </w:r>
-      <w:proofErr w:type="spellEnd"/>
-      <w:r>
-        <w:rPr>
-          <w:rStyle w:val="TextprogramovhokduChar"/>
-          <w:rFonts w:eastAsiaTheme="minorHAnsi"/>
-        </w:rPr>
-        <w:t xml:space="preserve"> = 3)</w:t>
+        <w:t>cron[212]: (CRON) INFO (pidfile fd = 3)</w:t>
       </w:r>
       <w:r>
         <w:rPr>
@@ -6273,19 +5936,11 @@
         </w:rPr>
         <w:t xml:space="preserve">the process </w:t>
       </w:r>
-      <w:proofErr w:type="spellStart"/>
-      <w:r>
-        <w:rPr>
-          <w:lang w:val="en-GB"/>
-        </w:rPr>
-        <w:t>cron</w:t>
-      </w:r>
-      <w:proofErr w:type="spellEnd"/>
-      <w:r>
-        <w:rPr>
-          <w:lang w:val="en-GB"/>
-        </w:rPr>
-        <w:t xml:space="preserve"> </w:t>
+      <w:r>
+        <w:rPr>
+          <w:lang w:val="en-GB"/>
+        </w:rPr>
+        <w:t xml:space="preserve">cron </w:t>
       </w:r>
       <w:r>
         <w:rPr>
@@ -6379,89 +6034,7 @@
           <w:rStyle w:val="TextprogramovhokduChar"/>
           <w:rFonts w:eastAsiaTheme="minorHAnsi"/>
         </w:rPr>
-        <w:t xml:space="preserve">&lt;12&gt;Mar 9 </w:t>
-      </w:r>
-      <w:proofErr w:type="gramStart"/>
-      <w:r>
-        <w:rPr>
-          <w:rStyle w:val="TextprogramovhokduChar"/>
-          <w:rFonts w:eastAsiaTheme="minorHAnsi"/>
-        </w:rPr>
-        <w:t>14</w:t>
-      </w:r>
-      <w:proofErr w:type="gramEnd"/>
-      <w:r>
-        <w:rPr>
-          <w:rStyle w:val="TextprogramovhokduChar"/>
-          <w:rFonts w:eastAsiaTheme="minorHAnsi"/>
-        </w:rPr>
-        <w:t xml:space="preserve">:48:40 </w:t>
-      </w:r>
-      <w:proofErr w:type="spellStart"/>
-      <w:r>
-        <w:rPr>
-          <w:rStyle w:val="TextprogramovhokduChar"/>
-          <w:rFonts w:eastAsiaTheme="minorHAnsi"/>
-        </w:rPr>
-        <w:t>pipewire</w:t>
-      </w:r>
-      <w:proofErr w:type="spellEnd"/>
-      <w:r>
-        <w:rPr>
-          <w:rStyle w:val="TextprogramovhokduChar"/>
-          <w:rFonts w:eastAsiaTheme="minorHAnsi"/>
-        </w:rPr>
-        <w:t>-media-</w:t>
-      </w:r>
-      <w:proofErr w:type="gramStart"/>
-      <w:r>
-        <w:rPr>
-          <w:rStyle w:val="TextprogramovhokduChar"/>
-          <w:rFonts w:eastAsiaTheme="minorHAnsi"/>
-        </w:rPr>
-        <w:t>session[</w:t>
-      </w:r>
-      <w:proofErr w:type="gramEnd"/>
-      <w:r>
-        <w:rPr>
-          <w:rStyle w:val="TextprogramovhokduChar"/>
-          <w:rFonts w:eastAsiaTheme="minorHAnsi"/>
-        </w:rPr>
-        <w:t xml:space="preserve">786]: </w:t>
-      </w:r>
-      <w:proofErr w:type="spellStart"/>
-      <w:proofErr w:type="gramStart"/>
-      <w:r>
-        <w:rPr>
-          <w:rStyle w:val="TextprogramovhokduChar"/>
-          <w:rFonts w:eastAsiaTheme="minorHAnsi"/>
-        </w:rPr>
-        <w:t>mod.rt</w:t>
-      </w:r>
-      <w:proofErr w:type="spellEnd"/>
-      <w:proofErr w:type="gramEnd"/>
-      <w:r>
-        <w:rPr>
-          <w:rStyle w:val="TextprogramovhokduChar"/>
-          <w:rFonts w:eastAsiaTheme="minorHAnsi"/>
-        </w:rPr>
-        <w:t xml:space="preserve">: </w:t>
-      </w:r>
-      <w:proofErr w:type="spellStart"/>
-      <w:r>
-        <w:rPr>
-          <w:rStyle w:val="TextprogramovhokduChar"/>
-          <w:rFonts w:eastAsiaTheme="minorHAnsi"/>
-        </w:rPr>
-        <w:t>RTKit</w:t>
-      </w:r>
-      <w:proofErr w:type="spellEnd"/>
-      <w:r>
-        <w:rPr>
-          <w:rStyle w:val="TextprogramovhokduChar"/>
-          <w:rFonts w:eastAsiaTheme="minorHAnsi"/>
-        </w:rPr>
-        <w:t xml:space="preserve"> error</w:t>
+        <w:t>&lt;12&gt;Mar 9 14:48:40 pipewire-media-session[786]: mod.rt: RTKit error</w:t>
       </w:r>
       <w:r>
         <w:t xml:space="preserve"> </w:t>
@@ -6750,21 +6323,7 @@
         <w:rPr>
           <w:lang w:val="en-GB"/>
         </w:rPr>
-        <w:t xml:space="preserve">of the timestamp. It is currently unclear why that is, but it can be speculated that one of the causes of this problem can be the adherence to a previous RFC 3164, which is, however, currently obsolete and superseded by the </w:t>
-      </w:r>
-      <w:proofErr w:type="gramStart"/>
-      <w:r>
-        <w:rPr>
-          <w:lang w:val="en-GB"/>
-        </w:rPr>
-        <w:t>aforementioned RFC</w:t>
-      </w:r>
-      <w:proofErr w:type="gramEnd"/>
-      <w:r>
-        <w:rPr>
-          <w:lang w:val="en-GB"/>
-        </w:rPr>
-        <w:t xml:space="preserve"> 5424. </w:t>
+        <w:t xml:space="preserve">of the timestamp. It is currently unclear why that is, but it can be speculated that one of the causes of this problem can be the adherence to a previous RFC 3164, which is, however, currently obsolete and superseded by the aforementioned RFC 5424. </w:t>
       </w:r>
     </w:p>
     <w:p>
@@ -6787,15 +6346,7 @@
         <w:t>0</w:t>
       </w:r>
       <w:r>
-        <w:t xml:space="preserve">s (the utility </w:t>
-      </w:r>
-      <w:proofErr w:type="spellStart"/>
-      <w:r>
-        <w:t>cron</w:t>
-      </w:r>
-      <w:proofErr w:type="spellEnd"/>
-      <w:r>
-        <w:t xml:space="preserve">, mentioned in the logs above, was first released in </w:t>
+        <w:t xml:space="preserve">s (the utility cron, mentioned in the logs above, was first released in </w:t>
       </w:r>
       <w:r>
         <w:t>1979). Adherence to the RFC should then not be fully expected from these older utilities.</w:t>
@@ -6814,23 +6365,7 @@
     </w:p>
     <w:p>
       <w:r>
-        <w:t xml:space="preserve">The hostname component of the message denotes the </w:t>
-      </w:r>
-      <w:proofErr w:type="gramStart"/>
-      <w:r>
-        <w:t>origin</w:t>
-      </w:r>
-      <w:proofErr w:type="gramEnd"/>
-      <w:r>
-        <w:t xml:space="preserve"> system of the message. By </w:t>
-      </w:r>
-      <w:proofErr w:type="gramStart"/>
-      <w:r>
-        <w:t>the RFC</w:t>
-      </w:r>
-      <w:proofErr w:type="gramEnd"/>
-      <w:r>
-        <w:t>, the hostname should have the value of the following, as sorted in priority:</w:t>
+        <w:t>The hostname component of the message denotes the origin system of the message. By the RFC, the hostname should have the value of the following, as sorted in priority:</w:t>
       </w:r>
     </w:p>
     <w:p>
@@ -6997,21 +6532,7 @@
         <w:rPr>
           <w:lang w:val="en-GB"/>
         </w:rPr>
-        <w:t xml:space="preserve">The PROCID denotes the ID of the process that the message originated in. The number by itself does not have any interoperable meaning, however discontinuity within PROCID may be detected by a change in PROCID – if the process </w:t>
-      </w:r>
-      <w:proofErr w:type="spellStart"/>
-      <w:r>
-        <w:rPr>
-          <w:lang w:val="en-GB"/>
-        </w:rPr>
-        <w:t>cron</w:t>
-      </w:r>
-      <w:proofErr w:type="spellEnd"/>
-      <w:r>
-        <w:rPr>
-          <w:lang w:val="en-GB"/>
-        </w:rPr>
-        <w:t xml:space="preserve"> first reports its PROCID as </w:t>
+        <w:t xml:space="preserve">The PROCID denotes the ID of the process that the message originated in. The number by itself does not have any interoperable meaning, however discontinuity within PROCID may be detected by a change in PROCID – if the process cron first reports its PROCID as </w:t>
       </w:r>
       <w:r>
         <w:rPr>
@@ -7152,35 +6673,7 @@
         <w:rPr>
           <w:lang w:val="en-GB"/>
         </w:rPr>
-        <w:t xml:space="preserve">MSGID should thus be an </w:t>
-      </w:r>
-      <w:proofErr w:type="spellStart"/>
-      <w:r>
-        <w:rPr>
-          <w:lang w:val="en-GB"/>
-        </w:rPr>
-        <w:t>identificator</w:t>
-      </w:r>
-      <w:proofErr w:type="spellEnd"/>
-      <w:r>
-        <w:rPr>
-          <w:lang w:val="en-GB"/>
-        </w:rPr>
-        <w:t xml:space="preserve"> for the message and offer further insight into the origin, purpose or destination of the message. In the logs captured in Code 1.3, these MSGIDs referred to the </w:t>
-      </w:r>
-      <w:proofErr w:type="spellStart"/>
-      <w:r>
-        <w:rPr>
-          <w:lang w:val="en-GB"/>
-        </w:rPr>
-        <w:t>basename</w:t>
-      </w:r>
-      <w:proofErr w:type="spellEnd"/>
-      <w:r>
-        <w:rPr>
-          <w:lang w:val="en-GB"/>
-        </w:rPr>
-        <w:t xml:space="preserve"> of the process generating the messages.</w:t>
+        <w:t>MSGID should thus be an identificator for the message and offer further insight into the origin, purpose or destination of the message. In the logs captured in Code 1.3, these MSGIDs referred to the basename of the process generating the messages.</w:t>
       </w:r>
     </w:p>
     <w:p>
@@ -7231,140 +6724,1084 @@
           <w:highlight w:val="yellow"/>
         </w:rPr>
       </w:pPr>
-      <w:bookmarkStart w:id="14" w:name="_Toc224131582"/>
+      <w:bookmarkStart w:id="12" w:name="_Toc224131582"/>
       <w:r>
         <w:rPr>
           <w:highlight w:val="yellow"/>
         </w:rPr>
         <w:t>DMARC</w:t>
       </w:r>
+      <w:bookmarkEnd w:id="12"/>
+    </w:p>
+    <w:p/>
+    <w:p>
+      <w:pPr>
+        <w:pStyle w:val="Nadpis2"/>
+      </w:pPr>
+      <w:bookmarkStart w:id="13" w:name="_Toc224131583"/>
+      <w:r>
+        <w:t>Creating logs</w:t>
+      </w:r>
+      <w:bookmarkEnd w:id="13"/>
+    </w:p>
+    <w:p>
+      <w:r>
+        <w:t xml:space="preserve">On average across a plethora of open-source software applications, 1 line of logging code is included for every 30 lines of code. </w:t>
+      </w:r>
+      <w:r>
+        <w:t>(Yuan et al., 2012)</w:t>
+      </w:r>
+      <w:r>
+        <w:t xml:space="preserve"> </w:t>
+      </w:r>
+      <w:r>
+        <w:t xml:space="preserve">This shows the amount of importance that open-source software places on the act of logging – especially as development on these projects is done by hundreds of people from different countries. </w:t>
+      </w:r>
+    </w:p>
+    <w:p>
+      <w:r>
+        <w:t xml:space="preserve">These log lines usually contain the message of the log, as well as the severity. The other relevant information – time, date, current thread, current location in code – is usually added by the logger itself, with strict format being enforced on the </w:t>
+      </w:r>
+      <w:r>
+        <w:t>message to</w:t>
+      </w:r>
+      <w:r>
+        <w:t xml:space="preserve"> assure that all logs have similar </w:t>
+      </w:r>
+      <w:r>
+        <w:t xml:space="preserve">formatting and are as consistent as possible. </w:t>
+      </w:r>
+    </w:p>
+    <w:p>
+      <w:r>
+        <w:t xml:space="preserve">The documentation </w:t>
+      </w:r>
+      <w:r>
+        <w:t xml:space="preserve">for the framework </w:t>
+      </w:r>
+      <w:r>
+        <w:t>Flask</w:t>
+      </w:r>
+      <w:r>
+        <w:t xml:space="preserve">, used within the practical part of this thesis, </w:t>
+      </w:r>
+      <w:r>
+        <w:t>gives the following sample code for how a logger may be utilized within a login function:</w:t>
+      </w:r>
+    </w:p>
+    <w:p>
+      <w:pPr>
+        <w:rPr>
+          <w:b/>
+          <w:bCs/>
+        </w:rPr>
+      </w:pPr>
+      <w:r>
+        <w:rPr>
+          <w:b/>
+          <w:bCs/>
+          <w:iCs/>
+          <w:lang w:val="en-GB"/>
+        </w:rPr>
+        <w:t xml:space="preserve">Code </w:t>
+      </w:r>
+      <w:r>
+        <w:rPr>
+          <w:iCs/>
+          <w:lang w:val="cs-CZ"/>
+        </w:rPr>
+        <w:fldChar w:fldCharType="begin"/>
+      </w:r>
+      <w:r>
+        <w:rPr>
+          <w:b/>
+          <w:bCs/>
+          <w:iCs/>
+          <w:lang w:val="en-GB"/>
+        </w:rPr>
+        <w:instrText xml:space="preserve"> STYLEREF 1 \s </w:instrText>
+      </w:r>
+      <w:r>
+        <w:rPr>
+          <w:iCs/>
+          <w:lang w:val="cs-CZ"/>
+        </w:rPr>
+        <w:fldChar w:fldCharType="separate"/>
+      </w:r>
+      <w:r>
+        <w:rPr>
+          <w:b/>
+          <w:bCs/>
+          <w:iCs/>
+          <w:lang w:val="en-GB"/>
+        </w:rPr>
+        <w:t>1</w:t>
+      </w:r>
+      <w:r>
+        <w:fldChar w:fldCharType="end"/>
+      </w:r>
+      <w:r>
+        <w:rPr>
+          <w:b/>
+          <w:bCs/>
+          <w:iCs/>
+          <w:lang w:val="en-GB"/>
+        </w:rPr>
+        <w:t>.</w:t>
+      </w:r>
+      <w:r>
+        <w:rPr>
+          <w:b/>
+          <w:bCs/>
+          <w:iCs/>
+          <w:lang w:val="cs-CZ"/>
+        </w:rPr>
+        <w:t>4</w:t>
+      </w:r>
+    </w:p>
+    <w:p>
+      <w:r>
+        <w:rPr>
+          <w:i/>
+          <w:lang w:val="en-GB"/>
+        </w:rPr>
+        <w:t>A</w:t>
+      </w:r>
+      <w:r>
+        <w:rPr>
+          <w:i/>
+          <w:lang w:val="en-GB"/>
+        </w:rPr>
+        <w:t xml:space="preserve"> sample logging code from the Flask documentation</w:t>
+      </w:r>
+      <w:r>
+        <w:rPr>
+          <w:i/>
+          <w:lang w:val="en-GB"/>
+        </w:rPr>
+        <w:t xml:space="preserve"> </w:t>
+      </w:r>
+    </w:p>
+    <w:p>
+      <w:pPr>
+        <w:pStyle w:val="Textprogramovhokdu"/>
+        <w:numPr>
+          <w:ilvl w:val="0"/>
+          <w:numId w:val="40"/>
+        </w:numPr>
+      </w:pPr>
+      <w:r>
+        <w:rPr>
+          <w:rFonts w:eastAsiaTheme="majorEastAsia"/>
+        </w:rPr>
+        <w:t>@app.</w:t>
+      </w:r>
+      <w:r>
+        <w:t>route(</w:t>
+      </w:r>
+      <w:r>
+        <w:rPr>
+          <w:rFonts w:eastAsiaTheme="majorEastAsia"/>
+        </w:rPr>
+        <w:t>'/login'</w:t>
+      </w:r>
+      <w:r>
+        <w:t>, methods</w:t>
+      </w:r>
+      <w:r>
+        <w:rPr>
+          <w:rFonts w:eastAsiaTheme="majorEastAsia"/>
+        </w:rPr>
+        <w:t>=</w:t>
+      </w:r>
+      <w:r>
+        <w:t>[</w:t>
+      </w:r>
+      <w:r>
+        <w:rPr>
+          <w:rFonts w:eastAsiaTheme="majorEastAsia"/>
+        </w:rPr>
+        <w:t>'POST'</w:t>
+      </w:r>
+      <w:r>
+        <w:t>])</w:t>
+      </w:r>
+    </w:p>
+    <w:p>
+      <w:pPr>
+        <w:pStyle w:val="Textprogramovhokdu"/>
+        <w:numPr>
+          <w:ilvl w:val="0"/>
+          <w:numId w:val="40"/>
+        </w:numPr>
+      </w:pPr>
+      <w:r>
+        <w:rPr>
+          <w:rFonts w:eastAsiaTheme="majorEastAsia"/>
+        </w:rPr>
+        <w:t>def</w:t>
+      </w:r>
+      <w:r>
+        <w:t xml:space="preserve"> login():</w:t>
+      </w:r>
+    </w:p>
+    <w:p>
+      <w:pPr>
+        <w:pStyle w:val="Textprogramovhokdu"/>
+        <w:numPr>
+          <w:ilvl w:val="0"/>
+          <w:numId w:val="40"/>
+        </w:numPr>
+      </w:pPr>
+      <w:r>
+        <w:t xml:space="preserve">user </w:t>
+      </w:r>
+      <w:r>
+        <w:rPr>
+          <w:rFonts w:eastAsiaTheme="majorEastAsia"/>
+        </w:rPr>
+        <w:t>=</w:t>
+      </w:r>
+      <w:r>
+        <w:t xml:space="preserve"> get_user(request</w:t>
+      </w:r>
+      <w:r>
+        <w:rPr>
+          <w:rFonts w:eastAsiaTheme="majorEastAsia"/>
+        </w:rPr>
+        <w:t>.</w:t>
+      </w:r>
+      <w:r>
+        <w:t>form[</w:t>
+      </w:r>
+      <w:r>
+        <w:rPr>
+          <w:rFonts w:eastAsiaTheme="majorEastAsia"/>
+        </w:rPr>
+        <w:t>'username'</w:t>
+      </w:r>
+      <w:r>
+        <w:t>])</w:t>
+      </w:r>
+    </w:p>
+    <w:p>
+      <w:pPr>
+        <w:pStyle w:val="Textprogramovhokdu"/>
+        <w:numPr>
+          <w:ilvl w:val="0"/>
+          <w:numId w:val="40"/>
+        </w:numPr>
+      </w:pPr>
+    </w:p>
+    <w:p>
+      <w:pPr>
+        <w:pStyle w:val="Textprogramovhokdu"/>
+        <w:numPr>
+          <w:ilvl w:val="0"/>
+          <w:numId w:val="40"/>
+        </w:numPr>
+      </w:pPr>
+      <w:r>
+        <w:rPr>
+          <w:rFonts w:eastAsiaTheme="majorEastAsia"/>
+        </w:rPr>
+        <w:lastRenderedPageBreak/>
+        <w:t>if</w:t>
+      </w:r>
+      <w:r>
+        <w:t xml:space="preserve"> user</w:t>
+      </w:r>
+      <w:r>
+        <w:rPr>
+          <w:rFonts w:eastAsiaTheme="majorEastAsia"/>
+        </w:rPr>
+        <w:t>.</w:t>
+      </w:r>
+      <w:r>
+        <w:t>check_password(request</w:t>
+      </w:r>
+      <w:r>
+        <w:rPr>
+          <w:rFonts w:eastAsiaTheme="majorEastAsia"/>
+        </w:rPr>
+        <w:t>.</w:t>
+      </w:r>
+      <w:r>
+        <w:t>form[</w:t>
+      </w:r>
+      <w:r>
+        <w:rPr>
+          <w:rFonts w:eastAsiaTheme="majorEastAsia"/>
+        </w:rPr>
+        <w:t>'password'</w:t>
+      </w:r>
+      <w:r>
+        <w:t>]):</w:t>
+      </w:r>
+    </w:p>
+    <w:p>
+      <w:pPr>
+        <w:pStyle w:val="Textprogramovhokdu"/>
+        <w:numPr>
+          <w:ilvl w:val="0"/>
+          <w:numId w:val="40"/>
+        </w:numPr>
+      </w:pPr>
+      <w:r>
+        <w:t xml:space="preserve">    </w:t>
+      </w:r>
+      <w:r>
+        <w:t>login_user(user)</w:t>
+      </w:r>
+    </w:p>
+    <w:p>
+      <w:pPr>
+        <w:pStyle w:val="Textprogramovhokdu"/>
+        <w:numPr>
+          <w:ilvl w:val="0"/>
+          <w:numId w:val="40"/>
+        </w:numPr>
+      </w:pPr>
+      <w:r>
+        <w:t xml:space="preserve">    </w:t>
+      </w:r>
+      <w:r>
+        <w:t>app</w:t>
+      </w:r>
+      <w:r>
+        <w:rPr>
+          <w:rFonts w:eastAsiaTheme="majorEastAsia"/>
+        </w:rPr>
+        <w:t>.</w:t>
+      </w:r>
+      <w:r>
+        <w:t>logger</w:t>
+      </w:r>
+      <w:r>
+        <w:rPr>
+          <w:rFonts w:eastAsiaTheme="majorEastAsia"/>
+        </w:rPr>
+        <w:t>.</w:t>
+      </w:r>
+      <w:r>
+        <w:t>info(</w:t>
+      </w:r>
+      <w:r>
+        <w:rPr>
+          <w:rFonts w:eastAsiaTheme="majorEastAsia"/>
+        </w:rPr>
+        <w:t>'</w:t>
+      </w:r>
+      <w:r>
+        <w:t>%s</w:t>
+      </w:r>
+      <w:r>
+        <w:rPr>
+          <w:rFonts w:eastAsiaTheme="majorEastAsia"/>
+        </w:rPr>
+        <w:t xml:space="preserve"> logged in successfully'</w:t>
+      </w:r>
+      <w:r>
+        <w:t>, user</w:t>
+      </w:r>
+      <w:r>
+        <w:rPr>
+          <w:rFonts w:eastAsiaTheme="majorEastAsia"/>
+        </w:rPr>
+        <w:t>.</w:t>
+      </w:r>
+      <w:r>
+        <w:t>username)</w:t>
+      </w:r>
+    </w:p>
+    <w:p>
+      <w:pPr>
+        <w:pStyle w:val="Textprogramovhokdu"/>
+        <w:numPr>
+          <w:ilvl w:val="0"/>
+          <w:numId w:val="40"/>
+        </w:numPr>
+      </w:pPr>
+      <w:r>
+        <w:rPr>
+          <w:rFonts w:eastAsiaTheme="majorEastAsia"/>
+        </w:rPr>
+        <w:t xml:space="preserve">    </w:t>
+      </w:r>
+      <w:r>
+        <w:rPr>
+          <w:rFonts w:eastAsiaTheme="majorEastAsia"/>
+        </w:rPr>
+        <w:t>return</w:t>
+      </w:r>
+      <w:r>
+        <w:t xml:space="preserve"> redirect(url_for(</w:t>
+      </w:r>
+      <w:r>
+        <w:rPr>
+          <w:rFonts w:eastAsiaTheme="majorEastAsia"/>
+        </w:rPr>
+        <w:t>'index'</w:t>
+      </w:r>
+      <w:r>
+        <w:t>))</w:t>
+      </w:r>
+    </w:p>
+    <w:p>
+      <w:pPr>
+        <w:pStyle w:val="Textprogramovhokdu"/>
+        <w:numPr>
+          <w:ilvl w:val="0"/>
+          <w:numId w:val="40"/>
+        </w:numPr>
+      </w:pPr>
+      <w:r>
+        <w:rPr>
+          <w:rFonts w:eastAsiaTheme="majorEastAsia"/>
+        </w:rPr>
+        <w:t>else</w:t>
+      </w:r>
+      <w:r>
+        <w:t>:</w:t>
+      </w:r>
+    </w:p>
+    <w:p>
+      <w:pPr>
+        <w:pStyle w:val="Textprogramovhokdu"/>
+        <w:numPr>
+          <w:ilvl w:val="0"/>
+          <w:numId w:val="40"/>
+        </w:numPr>
+      </w:pPr>
+      <w:r>
+        <w:t xml:space="preserve">    </w:t>
+      </w:r>
+      <w:r>
+        <w:t>app</w:t>
+      </w:r>
+      <w:r>
+        <w:rPr>
+          <w:rFonts w:eastAsiaTheme="majorEastAsia"/>
+        </w:rPr>
+        <w:t>.</w:t>
+      </w:r>
+      <w:r>
+        <w:t>logger</w:t>
+      </w:r>
+      <w:r>
+        <w:rPr>
+          <w:rFonts w:eastAsiaTheme="majorEastAsia"/>
+        </w:rPr>
+        <w:t>.</w:t>
+      </w:r>
+      <w:r>
+        <w:t>info(</w:t>
+      </w:r>
+      <w:r>
+        <w:rPr>
+          <w:rFonts w:eastAsiaTheme="majorEastAsia"/>
+        </w:rPr>
+        <w:t>'</w:t>
+      </w:r>
+      <w:r>
+        <w:t>%s</w:t>
+      </w:r>
+      <w:r>
+        <w:rPr>
+          <w:rFonts w:eastAsiaTheme="majorEastAsia"/>
+        </w:rPr>
+        <w:t xml:space="preserve"> failed to log in'</w:t>
+      </w:r>
+      <w:r>
+        <w:t>, user</w:t>
+      </w:r>
+      <w:r>
+        <w:rPr>
+          <w:rFonts w:eastAsiaTheme="majorEastAsia"/>
+        </w:rPr>
+        <w:t>.</w:t>
+      </w:r>
+      <w:r>
+        <w:t>username)</w:t>
+      </w:r>
+    </w:p>
+    <w:p>
+      <w:pPr>
+        <w:pStyle w:val="Textprogramovhokdu"/>
+        <w:numPr>
+          <w:ilvl w:val="0"/>
+          <w:numId w:val="40"/>
+        </w:numPr>
+      </w:pPr>
+      <w:r>
+        <w:t xml:space="preserve">    </w:t>
+      </w:r>
+      <w:r>
+        <w:t>abort(401)</w:t>
+      </w:r>
+    </w:p>
+    <w:p/>
+    <w:p>
+      <w:r>
+        <w:t>Of note are here the following line</w:t>
+      </w:r>
+      <w:r>
+        <w:t>s</w:t>
+      </w:r>
+      <w:r>
+        <w:t>:</w:t>
+      </w:r>
+    </w:p>
+    <w:p>
+      <w:pPr>
+        <w:pStyle w:val="Textprogramovhokdu"/>
+        <w:numPr>
+          <w:ilvl w:val="0"/>
+          <w:numId w:val="44"/>
+        </w:numPr>
+      </w:pPr>
+      <w:r>
+        <w:t>app</w:t>
+      </w:r>
+      <w:r>
+        <w:rPr>
+          <w:rFonts w:eastAsiaTheme="majorEastAsia"/>
+        </w:rPr>
+        <w:t>.</w:t>
+      </w:r>
+      <w:r>
+        <w:t>logger</w:t>
+      </w:r>
+      <w:r>
+        <w:rPr>
+          <w:rFonts w:eastAsiaTheme="majorEastAsia"/>
+        </w:rPr>
+        <w:t>.</w:t>
+      </w:r>
+      <w:r>
+        <w:t>info(</w:t>
+      </w:r>
+      <w:r>
+        <w:rPr>
+          <w:rFonts w:eastAsiaTheme="majorEastAsia"/>
+        </w:rPr>
+        <w:t>'</w:t>
+      </w:r>
+      <w:r>
+        <w:t>%s</w:t>
+      </w:r>
+      <w:r>
+        <w:rPr>
+          <w:rFonts w:eastAsiaTheme="majorEastAsia"/>
+        </w:rPr>
+        <w:t xml:space="preserve"> logged in successfully'</w:t>
+      </w:r>
+      <w:r>
+        <w:t>, user</w:t>
+      </w:r>
+      <w:r>
+        <w:rPr>
+          <w:rFonts w:eastAsiaTheme="majorEastAsia"/>
+        </w:rPr>
+        <w:t>.</w:t>
+      </w:r>
+      <w:r>
+        <w:t>username)</w:t>
+      </w:r>
+    </w:p>
+    <w:p>
+      <w:pPr>
+        <w:pStyle w:val="Textprogramovhokdu"/>
+      </w:pPr>
+      <w:r>
+        <w:t xml:space="preserve">- </w:t>
+      </w:r>
+    </w:p>
+    <w:p>
+      <w:pPr>
+        <w:pStyle w:val="Textprogramovhokdu"/>
+      </w:pPr>
+      <w:r>
+        <w:t xml:space="preserve">10  </w:t>
+      </w:r>
+      <w:r>
+        <w:t>app</w:t>
+      </w:r>
+      <w:r>
+        <w:rPr>
+          <w:rFonts w:eastAsiaTheme="majorEastAsia"/>
+        </w:rPr>
+        <w:t>.</w:t>
+      </w:r>
+      <w:r>
+        <w:t>logger</w:t>
+      </w:r>
+      <w:r>
+        <w:rPr>
+          <w:rFonts w:eastAsiaTheme="majorEastAsia"/>
+        </w:rPr>
+        <w:t>.</w:t>
+      </w:r>
+      <w:r>
+        <w:t>info(</w:t>
+      </w:r>
+      <w:r>
+        <w:rPr>
+          <w:rFonts w:eastAsiaTheme="majorEastAsia"/>
+        </w:rPr>
+        <w:t>'</w:t>
+      </w:r>
+      <w:r>
+        <w:t>%s</w:t>
+      </w:r>
+      <w:r>
+        <w:rPr>
+          <w:rFonts w:eastAsiaTheme="majorEastAsia"/>
+        </w:rPr>
+        <w:t xml:space="preserve"> failed to log in'</w:t>
+      </w:r>
+      <w:r>
+        <w:t>, user</w:t>
+      </w:r>
+      <w:r>
+        <w:rPr>
+          <w:rFonts w:eastAsiaTheme="majorEastAsia"/>
+        </w:rPr>
+        <w:t>.</w:t>
+      </w:r>
+      <w:r>
+        <w:t>username)</w:t>
+      </w:r>
+    </w:p>
+    <w:p/>
+    <w:p>
+      <w:r>
+        <w:t>Before these lines are run, the app.logger object is preconfigured to handle the messages within the info function in a specific way. This can be done in a multitude of ways – printing to the terminal, saving to a file, sending over by an HTTP POST request or mailing to the developer directly.</w:t>
+      </w:r>
+    </w:p>
+    <w:p>
+      <w:r>
+        <w:t xml:space="preserve">Note that with the exception of </w:t>
+      </w:r>
+      <w:r>
+        <w:rPr>
+          <w:rStyle w:val="TextprogramovhokduChar"/>
+          <w:rFonts w:eastAsiaTheme="minorHAnsi"/>
+        </w:rPr>
+        <w:t>.info</w:t>
+      </w:r>
+      <w:r>
+        <w:t xml:space="preserve">, </w:t>
+      </w:r>
+      <w:r>
+        <w:rPr>
+          <w:rStyle w:val="TextprogramovhokduChar"/>
+          <w:rFonts w:eastAsiaTheme="minorHAnsi"/>
+        </w:rPr>
+        <w:t>app.logger</w:t>
+      </w:r>
+      <w:r>
+        <w:t xml:space="preserve"> can also send </w:t>
+      </w:r>
+      <w:r>
+        <w:rPr>
+          <w:rStyle w:val="TextprogramovhokduChar"/>
+          <w:rFonts w:eastAsiaTheme="minorHAnsi"/>
+        </w:rPr>
+        <w:t>.debug</w:t>
+      </w:r>
+      <w:r>
+        <w:t xml:space="preserve">, </w:t>
+      </w:r>
+      <w:r>
+        <w:rPr>
+          <w:rStyle w:val="TextprogramovhokduChar"/>
+          <w:rFonts w:eastAsiaTheme="minorHAnsi"/>
+        </w:rPr>
+        <w:t>.warning</w:t>
+      </w:r>
+      <w:r>
+        <w:t xml:space="preserve">, </w:t>
+      </w:r>
+      <w:r>
+        <w:rPr>
+          <w:rStyle w:val="TextprogramovhokduChar"/>
+          <w:rFonts w:eastAsiaTheme="minorHAnsi"/>
+        </w:rPr>
+        <w:t>.error</w:t>
+      </w:r>
+      <w:r>
+        <w:t xml:space="preserve"> and </w:t>
+      </w:r>
+      <w:r>
+        <w:rPr>
+          <w:rStyle w:val="TextprogramovhokduChar"/>
+          <w:rFonts w:eastAsiaTheme="minorHAnsi"/>
+        </w:rPr>
+        <w:t>.critical</w:t>
+      </w:r>
+      <w:r>
+        <w:t>. These denote the severity of the message were it to be run. The</w:t>
+      </w:r>
+      <w:r>
+        <w:t xml:space="preserve"> program can be configured to only log messages of a certain severity and higher – developers may not wish to save every message used for debugging, and may thus configure the logger to only save to file messages of the “Error” or “Critical” variety.</w:t>
+      </w:r>
+    </w:p>
+    <w:p>
+      <w:r>
+        <w:t>This configuration can be seen in the example given in the documentation for the Python logging library:</w:t>
+      </w:r>
+    </w:p>
+    <w:p>
+      <w:pPr>
+        <w:rPr>
+          <w:b/>
+          <w:bCs/>
+        </w:rPr>
+      </w:pPr>
+      <w:r>
+        <w:rPr>
+          <w:b/>
+          <w:bCs/>
+          <w:iCs/>
+          <w:lang w:val="en-GB"/>
+        </w:rPr>
+        <w:t xml:space="preserve">Code </w:t>
+      </w:r>
+      <w:r>
+        <w:rPr>
+          <w:iCs/>
+          <w:lang w:val="cs-CZ"/>
+        </w:rPr>
+        <w:fldChar w:fldCharType="begin"/>
+      </w:r>
+      <w:r>
+        <w:rPr>
+          <w:b/>
+          <w:bCs/>
+          <w:iCs/>
+          <w:lang w:val="en-GB"/>
+        </w:rPr>
+        <w:instrText xml:space="preserve"> STYLEREF 1 \s </w:instrText>
+      </w:r>
+      <w:r>
+        <w:rPr>
+          <w:iCs/>
+          <w:lang w:val="cs-CZ"/>
+        </w:rPr>
+        <w:fldChar w:fldCharType="separate"/>
+      </w:r>
+      <w:r>
+        <w:rPr>
+          <w:b/>
+          <w:bCs/>
+          <w:iCs/>
+          <w:lang w:val="en-GB"/>
+        </w:rPr>
+        <w:t>1</w:t>
+      </w:r>
+      <w:r>
+        <w:fldChar w:fldCharType="end"/>
+      </w:r>
+      <w:r>
+        <w:rPr>
+          <w:b/>
+          <w:bCs/>
+          <w:iCs/>
+          <w:lang w:val="en-GB"/>
+        </w:rPr>
+        <w:t>.</w:t>
+      </w:r>
+      <w:r>
+        <w:rPr>
+          <w:b/>
+          <w:bCs/>
+          <w:iCs/>
+          <w:lang w:val="cs-CZ"/>
+        </w:rPr>
+        <w:t>5</w:t>
+      </w:r>
+    </w:p>
+    <w:p>
+      <w:pPr>
+        <w:rPr>
+          <w:i/>
+          <w:lang w:val="en-GB"/>
+        </w:rPr>
+      </w:pPr>
+      <w:r>
+        <w:rPr>
+          <w:i/>
+          <w:lang w:val="en-GB"/>
+        </w:rPr>
+        <w:t xml:space="preserve">A sample </w:t>
+      </w:r>
+      <w:r>
+        <w:rPr>
+          <w:i/>
+          <w:lang w:val="en-GB"/>
+        </w:rPr>
+        <w:t>logger configuration as seen in the Python logging library</w:t>
+      </w:r>
+    </w:p>
+    <w:p>
+      <w:pPr>
+        <w:pStyle w:val="Textprogramovhokdu"/>
+        <w:numPr>
+          <w:ilvl w:val="0"/>
+          <w:numId w:val="46"/>
+        </w:numPr>
+      </w:pPr>
+      <w:r>
+        <w:rPr>
+          <w:rFonts w:eastAsiaTheme="majorEastAsia"/>
+        </w:rPr>
+        <w:t>l</w:t>
+      </w:r>
+      <w:r>
+        <w:rPr>
+          <w:rFonts w:eastAsiaTheme="majorEastAsia"/>
+        </w:rPr>
+        <w:t>ogging.basicConfig</w:t>
+      </w:r>
+      <w:r>
+        <w:t>(</w:t>
+      </w:r>
+      <w:r>
+        <w:rPr>
+          <w:rFonts w:eastAsiaTheme="majorEastAsia"/>
+        </w:rPr>
+        <w:t>filename=</w:t>
+      </w:r>
+      <w:r>
+        <w:t xml:space="preserve">'myapp.log', </w:t>
+      </w:r>
+      <w:r>
+        <w:rPr>
+          <w:rFonts w:eastAsiaTheme="majorEastAsia"/>
+        </w:rPr>
+        <w:t>level=logging.INFO</w:t>
+      </w:r>
+      <w:r>
+        <w:t>)</w:t>
+      </w:r>
+    </w:p>
+    <w:p>
+      <w:pPr>
+        <w:pStyle w:val="Textprogramovhokdu"/>
+        <w:numPr>
+          <w:ilvl w:val="0"/>
+          <w:numId w:val="46"/>
+        </w:numPr>
+      </w:pPr>
+      <w:r>
+        <w:rPr>
+          <w:rFonts w:eastAsiaTheme="majorEastAsia"/>
+        </w:rPr>
+        <w:t>logger.info</w:t>
+      </w:r>
+      <w:r>
+        <w:t>('Started')</w:t>
+      </w:r>
+    </w:p>
+    <w:p>
+      <w:pPr>
+        <w:pStyle w:val="Textprogramovhokdu"/>
+        <w:numPr>
+          <w:ilvl w:val="0"/>
+          <w:numId w:val="46"/>
+        </w:numPr>
+      </w:pPr>
+      <w:r>
+        <w:rPr>
+          <w:rFonts w:eastAsiaTheme="majorEastAsia"/>
+        </w:rPr>
+        <w:t>mylib.do_something</w:t>
+      </w:r>
+      <w:r>
+        <w:t>()</w:t>
+      </w:r>
+    </w:p>
+    <w:p>
+      <w:pPr>
+        <w:pStyle w:val="Textprogramovhokdu"/>
+        <w:numPr>
+          <w:ilvl w:val="0"/>
+          <w:numId w:val="46"/>
+        </w:numPr>
+      </w:pPr>
+      <w:r>
+        <w:rPr>
+          <w:rFonts w:eastAsiaTheme="majorEastAsia"/>
+        </w:rPr>
+        <w:t>logger.info</w:t>
+      </w:r>
+      <w:r>
+        <w:t>('Finished'</w:t>
+      </w:r>
+      <w:r>
+        <w:t>)</w:t>
+      </w:r>
+    </w:p>
+    <w:p/>
+    <w:p>
+      <w:r>
+        <w:t xml:space="preserve">In this configuration, the logger is set with level=logging.INFO to log everything including and above INFO, meaning </w:t>
+      </w:r>
+      <w:r>
+        <w:t>messages</w:t>
+      </w:r>
+      <w:r>
+        <w:t xml:space="preserve"> generated by .debug functions will not be saved to myapp.log.</w:t>
+      </w:r>
+    </w:p>
+    <w:p/>
+    <w:p/>
+    <w:p/>
+    <w:p/>
+    <w:p/>
+    <w:p>
+      <w:r>
+        <w:t>https://sci-hub.box/10.1109/ICSE.2012.6227202</w:t>
+      </w:r>
+    </w:p>
+    <w:p>
+      <w:pPr>
+        <w:pStyle w:val="Nadpis2"/>
+      </w:pPr>
+      <w:bookmarkStart w:id="14" w:name="_Toc224131584"/>
+      <w:r>
+        <w:t>Storing and analyzing logs</w:t>
+      </w:r>
       <w:bookmarkEnd w:id="14"/>
     </w:p>
+    <w:p>
+      <w:r>
+        <w:t>https://www.ecb.europa.eu/ecb/access_to_documents/shared/pdf/filing_retention_plan.en.pdf</w:t>
+      </w:r>
+    </w:p>
+    <w:p>
+      <w:r>
+        <w:t xml:space="preserve">Large software projects generate a large number of logs. To give an example, the encyclopedic site Wikipedia receives 10 000 page views every second. If the site were to log </w:t>
+      </w:r>
+      <w:r>
+        <w:t xml:space="preserve">just </w:t>
+      </w:r>
+      <w:r>
+        <w:t xml:space="preserve">the IP address of the origin of every incoming request (4 bytes), the site would generate over a terabyte of data a year.  </w:t>
+      </w:r>
+    </w:p>
+    <w:p>
+      <w:r>
+        <w:t xml:space="preserve">Many jurisdictions require logs to be stored for a prolonged period of time. European Central Bank requires the retention of </w:t>
+      </w:r>
+      <w:r>
+        <w:t xml:space="preserve">all IT logs including system, application and security </w:t>
+      </w:r>
+      <w:r>
+        <w:t>logs,</w:t>
+      </w:r>
+      <w:r>
+        <w:t xml:space="preserve"> to be retained for at least 2 years. With the number of employees, servers and the amount of transactions provided by this institution, this places a large requirement on the storage of these logs. </w:t>
+      </w:r>
+    </w:p>
+    <w:p>
+      <w:r>
+        <w:t>For companies affected by these requirements, this can cause tens of thousands of euros in additional expenses. For this reason, it is essential that great attention should be paid to the efficient storage of logs and other documents.</w:t>
+      </w:r>
+    </w:p>
     <w:p/>
-    <w:p>
-      <w:pPr>
-        <w:pStyle w:val="Nadpis2"/>
-      </w:pPr>
-      <w:bookmarkStart w:id="15" w:name="_Toc224131583"/>
-      <w:r>
-        <w:t>Creating logs</w:t>
-      </w:r>
-      <w:bookmarkEnd w:id="15"/>
-    </w:p>
-    <w:p>
-      <w:r>
-        <w:t xml:space="preserve">On average across a plethora of open-source software applications, 1 line of logging code is included for every 30 lines of code. </w:t>
-      </w:r>
-      <w:r>
-        <w:t>(Yuan et al., 2012)</w:t>
-      </w:r>
-      <w:r>
-        <w:t xml:space="preserve"> </w:t>
-      </w:r>
-      <w:r>
-        <w:t xml:space="preserve">This shows the amount of importance that open-source software places on the act of logging – especially as development on these projects is done by hundreds of people from different countries.  </w:t>
-      </w:r>
-    </w:p>
-    <w:p>
-      <w:pPr>
-        <w:pStyle w:val="Nadpis2"/>
-      </w:pPr>
-      <w:bookmarkStart w:id="16" w:name="_Toc224131584"/>
-      <w:r>
-        <w:t>Storing and analyzing logs</w:t>
-      </w:r>
-      <w:bookmarkEnd w:id="16"/>
-    </w:p>
     <w:p/>
+    <w:p/>
     <w:p>
       <w:pPr>
         <w:pStyle w:val="Nadpis3"/>
       </w:pPr>
-      <w:bookmarkStart w:id="17" w:name="_Toc224131585"/>
+      <w:bookmarkStart w:id="15" w:name="_Toc224131585"/>
       <w:r>
         <w:lastRenderedPageBreak/>
         <w:t>System Logs</w:t>
       </w:r>
+      <w:bookmarkEnd w:id="15"/>
+    </w:p>
+    <w:p>
+      <w:pPr>
+        <w:pStyle w:val="Nadpis3"/>
+      </w:pPr>
+      <w:bookmarkStart w:id="16" w:name="_Toc224131586"/>
+      <w:r>
+        <w:t>Storage requirements and costs</w:t>
+      </w:r>
+      <w:bookmarkEnd w:id="16"/>
+    </w:p>
+    <w:p>
+      <w:pPr>
+        <w:pStyle w:val="Nadpis2"/>
+      </w:pPr>
+      <w:bookmarkStart w:id="17" w:name="_Toc224131587"/>
+      <w:r>
+        <w:t>Monitoring</w:t>
+      </w:r>
       <w:bookmarkEnd w:id="17"/>
     </w:p>
     <w:p>
       <w:pPr>
         <w:pStyle w:val="Nadpis3"/>
       </w:pPr>
-      <w:bookmarkStart w:id="18" w:name="_Toc224131586"/>
-      <w:r>
-        <w:t>Storage requirements and costs</w:t>
+      <w:bookmarkStart w:id="18" w:name="_Toc224131588"/>
+      <w:r>
+        <w:t>Real-time monitoring</w:t>
       </w:r>
       <w:bookmarkEnd w:id="18"/>
     </w:p>
     <w:p>
       <w:pPr>
+        <w:pStyle w:val="Nadpis3"/>
+      </w:pPr>
+      <w:bookmarkStart w:id="19" w:name="_Toc224131589"/>
+      <w:r>
+        <w:t>Dashboards and Single Pane of Glass</w:t>
+      </w:r>
+      <w:bookmarkEnd w:id="19"/>
+    </w:p>
+    <w:p>
+      <w:pPr>
         <w:pStyle w:val="Nadpis2"/>
       </w:pPr>
-      <w:bookmarkStart w:id="19" w:name="_Toc224131587"/>
-      <w:r>
-        <w:t>Monitoring</w:t>
-      </w:r>
-      <w:bookmarkEnd w:id="19"/>
+      <w:bookmarkStart w:id="20" w:name="_Toc224131590"/>
+      <w:r>
+        <w:t>Alerting</w:t>
+      </w:r>
+      <w:bookmarkEnd w:id="20"/>
     </w:p>
     <w:p>
       <w:pPr>
         <w:pStyle w:val="Nadpis3"/>
       </w:pPr>
-      <w:bookmarkStart w:id="20" w:name="_Toc224131588"/>
-      <w:r>
-        <w:t>Real-time monitoring</w:t>
-      </w:r>
-      <w:bookmarkEnd w:id="20"/>
+      <w:bookmarkStart w:id="21" w:name="_Toc224131591"/>
+      <w:r>
+        <w:t>Methods of Alerting</w:t>
+      </w:r>
+      <w:bookmarkEnd w:id="21"/>
     </w:p>
     <w:p>
       <w:pPr>
         <w:pStyle w:val="Nadpis3"/>
       </w:pPr>
-      <w:bookmarkStart w:id="21" w:name="_Toc224131589"/>
-      <w:r>
-        <w:t>Dashboards and Single Pane of Glass</w:t>
-      </w:r>
-      <w:bookmarkEnd w:id="21"/>
-    </w:p>
-    <w:p>
-      <w:pPr>
-        <w:pStyle w:val="Nadpis2"/>
-      </w:pPr>
-      <w:bookmarkStart w:id="22" w:name="_Toc224131590"/>
-      <w:r>
-        <w:t>Alerting</w:t>
+      <w:r>
+        <w:tab/>
+      </w:r>
+      <w:bookmarkStart w:id="22" w:name="_Toc224131592"/>
+      <w:r>
+        <w:t>Alert Fatigue</w:t>
       </w:r>
       <w:bookmarkEnd w:id="22"/>
     </w:p>
     <w:p>
       <w:pPr>
-        <w:pStyle w:val="Nadpis3"/>
-      </w:pPr>
-      <w:bookmarkStart w:id="23" w:name="_Toc224131591"/>
-      <w:r>
-        <w:t>Methods of Alerting</w:t>
-      </w:r>
-      <w:bookmarkEnd w:id="23"/>
-    </w:p>
-    <w:p>
-      <w:pPr>
-        <w:pStyle w:val="Nadpis3"/>
-      </w:pPr>
-      <w:r>
-        <w:tab/>
-      </w:r>
-      <w:bookmarkStart w:id="24" w:name="_Toc224131592"/>
-      <w:r>
-        <w:t>Alert Fatigue</w:t>
-      </w:r>
-      <w:bookmarkEnd w:id="24"/>
-    </w:p>
-    <w:p>
-      <w:pPr>
         <w:pStyle w:val="Nadpis1"/>
       </w:pPr>
-      <w:bookmarkStart w:id="25" w:name="_Toc224131593"/>
+      <w:bookmarkStart w:id="23" w:name="_Toc224131593"/>
       <w:r>
         <w:lastRenderedPageBreak/>
         <w:t>Application</w:t>
@@ -7372,15 +7809,35 @@
       <w:r>
         <w:t xml:space="preserve"> Implementation</w:t>
       </w:r>
+      <w:bookmarkEnd w:id="23"/>
+    </w:p>
+    <w:p>
+      <w:pPr>
+        <w:pStyle w:val="Nadpis2"/>
+      </w:pPr>
+      <w:bookmarkStart w:id="24" w:name="_Toc224131594"/>
+      <w:r>
+        <w:t>Requirements</w:t>
+      </w:r>
+      <w:bookmarkEnd w:id="24"/>
+    </w:p>
+    <w:p>
+      <w:pPr>
+        <w:pStyle w:val="Nadpis2"/>
+      </w:pPr>
+      <w:bookmarkStart w:id="25" w:name="_Toc224131595"/>
+      <w:r>
+        <w:t>Specification</w:t>
+      </w:r>
       <w:bookmarkEnd w:id="25"/>
     </w:p>
     <w:p>
       <w:pPr>
         <w:pStyle w:val="Nadpis2"/>
       </w:pPr>
-      <w:bookmarkStart w:id="26" w:name="_Toc224131594"/>
-      <w:r>
-        <w:t>Requirements</w:t>
+      <w:bookmarkStart w:id="26" w:name="_Toc224131596"/>
+      <w:r>
+        <w:t>Implementation</w:t>
       </w:r>
       <w:bookmarkEnd w:id="26"/>
     </w:p>
@@ -7388,64 +7845,44 @@
       <w:pPr>
         <w:pStyle w:val="Nadpis2"/>
       </w:pPr>
-      <w:bookmarkStart w:id="27" w:name="_Toc224131595"/>
-      <w:r>
-        <w:t>Specification</w:t>
+      <w:bookmarkStart w:id="27" w:name="_Toc224131597"/>
+      <w:r>
+        <w:t>Testing and CI/CD</w:t>
       </w:r>
       <w:bookmarkEnd w:id="27"/>
     </w:p>
     <w:p>
       <w:pPr>
-        <w:pStyle w:val="Nadpis2"/>
-      </w:pPr>
-      <w:bookmarkStart w:id="28" w:name="_Toc224131596"/>
-      <w:r>
-        <w:t>Implementation</w:t>
-      </w:r>
-      <w:bookmarkEnd w:id="28"/>
-    </w:p>
-    <w:p>
-      <w:pPr>
-        <w:pStyle w:val="Nadpis2"/>
-      </w:pPr>
-      <w:bookmarkStart w:id="29" w:name="_Toc224131597"/>
-      <w:r>
-        <w:t>Testing and CI/CD</w:t>
-      </w:r>
-      <w:bookmarkEnd w:id="29"/>
-    </w:p>
-    <w:p>
-      <w:pPr>
         <w:pStyle w:val="Nadpis1"/>
       </w:pPr>
-      <w:bookmarkStart w:id="30" w:name="_Toc224131598"/>
+      <w:bookmarkStart w:id="28" w:name="_Toc224131598"/>
       <w:r>
         <w:lastRenderedPageBreak/>
         <w:t>Discussion to implementation</w:t>
       </w:r>
-      <w:bookmarkEnd w:id="30"/>
+      <w:bookmarkEnd w:id="28"/>
     </w:p>
     <w:p>
       <w:pPr>
         <w:pStyle w:val="Nadpis1"/>
       </w:pPr>
-      <w:bookmarkStart w:id="31" w:name="_Toc224131599"/>
+      <w:bookmarkStart w:id="29" w:name="_Toc224131599"/>
       <w:r>
         <w:lastRenderedPageBreak/>
         <w:t>Conclusions</w:t>
       </w:r>
-      <w:bookmarkEnd w:id="31"/>
+      <w:bookmarkEnd w:id="29"/>
     </w:p>
     <w:p>
       <w:pPr>
         <w:pStyle w:val="Nadpis1"/>
       </w:pPr>
-      <w:bookmarkStart w:id="32" w:name="_Toc224131600"/>
+      <w:bookmarkStart w:id="30" w:name="_Toc224131600"/>
       <w:r>
         <w:lastRenderedPageBreak/>
         <w:t>List of references</w:t>
       </w:r>
-      <w:bookmarkEnd w:id="32"/>
+      <w:bookmarkEnd w:id="30"/>
     </w:p>
     <w:p>
       <w:r>
@@ -7555,12 +7992,12 @@
       <w:pPr>
         <w:pStyle w:val="Nadpis1neslovan"/>
       </w:pPr>
-      <w:bookmarkStart w:id="33" w:name="_Toc224131601"/>
+      <w:bookmarkStart w:id="31" w:name="_Toc224131601"/>
       <w:r>
         <w:lastRenderedPageBreak/>
         <w:t>Appendices</w:t>
       </w:r>
-      <w:bookmarkEnd w:id="33"/>
+      <w:bookmarkEnd w:id="31"/>
     </w:p>
     <w:p/>
     <w:sectPr>
@@ -8995,6 +9432,95 @@
     </w:lvl>
   </w:abstractNum>
   <w:abstractNum w:abstractNumId="12" w15:restartNumberingAfterBreak="0">
+    <w:nsid w:val="19D420BA"/>
+    <w:multiLevelType w:val="hybridMultilevel"/>
+    <w:tmpl w:val="5302C61A"/>
+    <w:lvl w:ilvl="0" w:tplc="A87888F0">
+      <w:start w:val="1"/>
+      <w:numFmt w:val="decimal"/>
+      <w:lvlText w:val="%1"/>
+      <w:lvlJc w:val="left"/>
+      <w:pPr>
+        <w:ind w:left="360" w:hanging="360"/>
+      </w:pPr>
+      <w:rPr>
+        <w:rFonts w:hint="default"/>
+      </w:rPr>
+    </w:lvl>
+    <w:lvl w:ilvl="1" w:tplc="04050019" w:tentative="1">
+      <w:start w:val="1"/>
+      <w:numFmt w:val="lowerLetter"/>
+      <w:lvlText w:val="%2."/>
+      <w:lvlJc w:val="left"/>
+      <w:pPr>
+        <w:ind w:left="1080" w:hanging="360"/>
+      </w:pPr>
+    </w:lvl>
+    <w:lvl w:ilvl="2" w:tplc="0405001B" w:tentative="1">
+      <w:start w:val="1"/>
+      <w:numFmt w:val="lowerRoman"/>
+      <w:lvlText w:val="%3."/>
+      <w:lvlJc w:val="right"/>
+      <w:pPr>
+        <w:ind w:left="1800" w:hanging="180"/>
+      </w:pPr>
+    </w:lvl>
+    <w:lvl w:ilvl="3" w:tplc="0405000F" w:tentative="1">
+      <w:start w:val="1"/>
+      <w:numFmt w:val="decimal"/>
+      <w:lvlText w:val="%4."/>
+      <w:lvlJc w:val="left"/>
+      <w:pPr>
+        <w:ind w:left="2520" w:hanging="360"/>
+      </w:pPr>
+    </w:lvl>
+    <w:lvl w:ilvl="4" w:tplc="04050019" w:tentative="1">
+      <w:start w:val="1"/>
+      <w:numFmt w:val="lowerLetter"/>
+      <w:lvlText w:val="%5."/>
+      <w:lvlJc w:val="left"/>
+      <w:pPr>
+        <w:ind w:left="3240" w:hanging="360"/>
+      </w:pPr>
+    </w:lvl>
+    <w:lvl w:ilvl="5" w:tplc="0405001B" w:tentative="1">
+      <w:start w:val="1"/>
+      <w:numFmt w:val="lowerRoman"/>
+      <w:lvlText w:val="%6."/>
+      <w:lvlJc w:val="right"/>
+      <w:pPr>
+        <w:ind w:left="3960" w:hanging="180"/>
+      </w:pPr>
+    </w:lvl>
+    <w:lvl w:ilvl="6" w:tplc="0405000F" w:tentative="1">
+      <w:start w:val="1"/>
+      <w:numFmt w:val="decimal"/>
+      <w:lvlText w:val="%7."/>
+      <w:lvlJc w:val="left"/>
+      <w:pPr>
+        <w:ind w:left="4680" w:hanging="360"/>
+      </w:pPr>
+    </w:lvl>
+    <w:lvl w:ilvl="7" w:tplc="04050019" w:tentative="1">
+      <w:start w:val="1"/>
+      <w:numFmt w:val="lowerLetter"/>
+      <w:lvlText w:val="%8."/>
+      <w:lvlJc w:val="left"/>
+      <w:pPr>
+        <w:ind w:left="5400" w:hanging="360"/>
+      </w:pPr>
+    </w:lvl>
+    <w:lvl w:ilvl="8" w:tplc="0405001B" w:tentative="1">
+      <w:start w:val="1"/>
+      <w:numFmt w:val="lowerRoman"/>
+      <w:lvlText w:val="%9."/>
+      <w:lvlJc w:val="right"/>
+      <w:pPr>
+        <w:ind w:left="6120" w:hanging="180"/>
+      </w:pPr>
+    </w:lvl>
+  </w:abstractNum>
+  <w:abstractNum w:abstractNumId="13" w15:restartNumberingAfterBreak="0">
     <w:nsid w:val="1DE8106F"/>
     <w:multiLevelType w:val="hybridMultilevel"/>
     <w:tmpl w:val="01AA4DDA"/>
@@ -9107,7 +9633,7 @@
       </w:rPr>
     </w:lvl>
   </w:abstractNum>
-  <w:abstractNum w:abstractNumId="13" w15:restartNumberingAfterBreak="0">
+  <w:abstractNum w:abstractNumId="14" w15:restartNumberingAfterBreak="0">
     <w:nsid w:val="250C7B49"/>
     <w:multiLevelType w:val="hybridMultilevel"/>
     <w:tmpl w:val="D5C8E642"/>
@@ -9220,7 +9746,7 @@
       </w:rPr>
     </w:lvl>
   </w:abstractNum>
-  <w:abstractNum w:abstractNumId="14" w15:restartNumberingAfterBreak="0">
+  <w:abstractNum w:abstractNumId="15" w15:restartNumberingAfterBreak="0">
     <w:nsid w:val="25F44B3F"/>
     <w:multiLevelType w:val="hybridMultilevel"/>
     <w:tmpl w:val="C44293AC"/>
@@ -9332,7 +9858,7 @@
       </w:rPr>
     </w:lvl>
   </w:abstractNum>
-  <w:abstractNum w:abstractNumId="15" w15:restartNumberingAfterBreak="0">
+  <w:abstractNum w:abstractNumId="16" w15:restartNumberingAfterBreak="0">
     <w:nsid w:val="28AC0914"/>
     <w:multiLevelType w:val="hybridMultilevel"/>
     <w:tmpl w:val="7E66A68C"/>
@@ -9445,7 +9971,7 @@
       </w:rPr>
     </w:lvl>
   </w:abstractNum>
-  <w:abstractNum w:abstractNumId="16" w15:restartNumberingAfterBreak="0">
+  <w:abstractNum w:abstractNumId="17" w15:restartNumberingAfterBreak="0">
     <w:nsid w:val="2A5E20FB"/>
     <w:multiLevelType w:val="hybridMultilevel"/>
     <w:tmpl w:val="4798295C"/>
@@ -9558,7 +10084,96 @@
       </w:rPr>
     </w:lvl>
   </w:abstractNum>
-  <w:abstractNum w:abstractNumId="17" w15:restartNumberingAfterBreak="0">
+  <w:abstractNum w:abstractNumId="18" w15:restartNumberingAfterBreak="0">
+    <w:nsid w:val="2B372143"/>
+    <w:multiLevelType w:val="hybridMultilevel"/>
+    <w:tmpl w:val="5D68D098"/>
+    <w:lvl w:ilvl="0" w:tplc="A87888F0">
+      <w:start w:val="1"/>
+      <w:numFmt w:val="decimal"/>
+      <w:lvlText w:val="%1"/>
+      <w:lvlJc w:val="left"/>
+      <w:pPr>
+        <w:ind w:left="360" w:hanging="360"/>
+      </w:pPr>
+      <w:rPr>
+        <w:rFonts w:hint="default"/>
+      </w:rPr>
+    </w:lvl>
+    <w:lvl w:ilvl="1" w:tplc="04050019" w:tentative="1">
+      <w:start w:val="1"/>
+      <w:numFmt w:val="lowerLetter"/>
+      <w:lvlText w:val="%2."/>
+      <w:lvlJc w:val="left"/>
+      <w:pPr>
+        <w:ind w:left="1080" w:hanging="360"/>
+      </w:pPr>
+    </w:lvl>
+    <w:lvl w:ilvl="2" w:tplc="0405001B" w:tentative="1">
+      <w:start w:val="1"/>
+      <w:numFmt w:val="lowerRoman"/>
+      <w:lvlText w:val="%3."/>
+      <w:lvlJc w:val="right"/>
+      <w:pPr>
+        <w:ind w:left="1800" w:hanging="180"/>
+      </w:pPr>
+    </w:lvl>
+    <w:lvl w:ilvl="3" w:tplc="0405000F" w:tentative="1">
+      <w:start w:val="1"/>
+      <w:numFmt w:val="decimal"/>
+      <w:lvlText w:val="%4."/>
+      <w:lvlJc w:val="left"/>
+      <w:pPr>
+        <w:ind w:left="2520" w:hanging="360"/>
+      </w:pPr>
+    </w:lvl>
+    <w:lvl w:ilvl="4" w:tplc="04050019" w:tentative="1">
+      <w:start w:val="1"/>
+      <w:numFmt w:val="lowerLetter"/>
+      <w:lvlText w:val="%5."/>
+      <w:lvlJc w:val="left"/>
+      <w:pPr>
+        <w:ind w:left="3240" w:hanging="360"/>
+      </w:pPr>
+    </w:lvl>
+    <w:lvl w:ilvl="5" w:tplc="0405001B" w:tentative="1">
+      <w:start w:val="1"/>
+      <w:numFmt w:val="lowerRoman"/>
+      <w:lvlText w:val="%6."/>
+      <w:lvlJc w:val="right"/>
+      <w:pPr>
+        <w:ind w:left="3960" w:hanging="180"/>
+      </w:pPr>
+    </w:lvl>
+    <w:lvl w:ilvl="6" w:tplc="0405000F" w:tentative="1">
+      <w:start w:val="1"/>
+      <w:numFmt w:val="decimal"/>
+      <w:lvlText w:val="%7."/>
+      <w:lvlJc w:val="left"/>
+      <w:pPr>
+        <w:ind w:left="4680" w:hanging="360"/>
+      </w:pPr>
+    </w:lvl>
+    <w:lvl w:ilvl="7" w:tplc="04050019" w:tentative="1">
+      <w:start w:val="1"/>
+      <w:numFmt w:val="lowerLetter"/>
+      <w:lvlText w:val="%8."/>
+      <w:lvlJc w:val="left"/>
+      <w:pPr>
+        <w:ind w:left="5400" w:hanging="360"/>
+      </w:pPr>
+    </w:lvl>
+    <w:lvl w:ilvl="8" w:tplc="0405001B" w:tentative="1">
+      <w:start w:val="1"/>
+      <w:numFmt w:val="lowerRoman"/>
+      <w:lvlText w:val="%9."/>
+      <w:lvlJc w:val="right"/>
+      <w:pPr>
+        <w:ind w:left="6120" w:hanging="180"/>
+      </w:pPr>
+    </w:lvl>
+  </w:abstractNum>
+  <w:abstractNum w:abstractNumId="19" w15:restartNumberingAfterBreak="0">
     <w:nsid w:val="2E9C55DE"/>
     <w:multiLevelType w:val="hybridMultilevel"/>
     <w:tmpl w:val="D3AE6432"/>
@@ -9670,7 +10285,93 @@
       </w:rPr>
     </w:lvl>
   </w:abstractNum>
-  <w:abstractNum w:abstractNumId="18" w15:restartNumberingAfterBreak="0">
+  <w:abstractNum w:abstractNumId="20" w15:restartNumberingAfterBreak="0">
+    <w:nsid w:val="2F4057E8"/>
+    <w:multiLevelType w:val="hybridMultilevel"/>
+    <w:tmpl w:val="4C9080DE"/>
+    <w:lvl w:ilvl="0" w:tplc="0405000F">
+      <w:start w:val="1"/>
+      <w:numFmt w:val="decimal"/>
+      <w:lvlText w:val="%1."/>
+      <w:lvlJc w:val="left"/>
+      <w:pPr>
+        <w:ind w:left="360" w:hanging="360"/>
+      </w:pPr>
+    </w:lvl>
+    <w:lvl w:ilvl="1" w:tplc="04050019" w:tentative="1">
+      <w:start w:val="1"/>
+      <w:numFmt w:val="lowerLetter"/>
+      <w:lvlText w:val="%2."/>
+      <w:lvlJc w:val="left"/>
+      <w:pPr>
+        <w:ind w:left="1080" w:hanging="360"/>
+      </w:pPr>
+    </w:lvl>
+    <w:lvl w:ilvl="2" w:tplc="0405001B" w:tentative="1">
+      <w:start w:val="1"/>
+      <w:numFmt w:val="lowerRoman"/>
+      <w:lvlText w:val="%3."/>
+      <w:lvlJc w:val="right"/>
+      <w:pPr>
+        <w:ind w:left="1800" w:hanging="180"/>
+      </w:pPr>
+    </w:lvl>
+    <w:lvl w:ilvl="3" w:tplc="0405000F" w:tentative="1">
+      <w:start w:val="1"/>
+      <w:numFmt w:val="decimal"/>
+      <w:lvlText w:val="%4."/>
+      <w:lvlJc w:val="left"/>
+      <w:pPr>
+        <w:ind w:left="2520" w:hanging="360"/>
+      </w:pPr>
+    </w:lvl>
+    <w:lvl w:ilvl="4" w:tplc="04050019" w:tentative="1">
+      <w:start w:val="1"/>
+      <w:numFmt w:val="lowerLetter"/>
+      <w:lvlText w:val="%5."/>
+      <w:lvlJc w:val="left"/>
+      <w:pPr>
+        <w:ind w:left="3240" w:hanging="360"/>
+      </w:pPr>
+    </w:lvl>
+    <w:lvl w:ilvl="5" w:tplc="0405001B" w:tentative="1">
+      <w:start w:val="1"/>
+      <w:numFmt w:val="lowerRoman"/>
+      <w:lvlText w:val="%6."/>
+      <w:lvlJc w:val="right"/>
+      <w:pPr>
+        <w:ind w:left="3960" w:hanging="180"/>
+      </w:pPr>
+    </w:lvl>
+    <w:lvl w:ilvl="6" w:tplc="0405000F" w:tentative="1">
+      <w:start w:val="1"/>
+      <w:numFmt w:val="decimal"/>
+      <w:lvlText w:val="%7."/>
+      <w:lvlJc w:val="left"/>
+      <w:pPr>
+        <w:ind w:left="4680" w:hanging="360"/>
+      </w:pPr>
+    </w:lvl>
+    <w:lvl w:ilvl="7" w:tplc="04050019" w:tentative="1">
+      <w:start w:val="1"/>
+      <w:numFmt w:val="lowerLetter"/>
+      <w:lvlText w:val="%8."/>
+      <w:lvlJc w:val="left"/>
+      <w:pPr>
+        <w:ind w:left="5400" w:hanging="360"/>
+      </w:pPr>
+    </w:lvl>
+    <w:lvl w:ilvl="8" w:tplc="0405001B" w:tentative="1">
+      <w:start w:val="1"/>
+      <w:numFmt w:val="lowerRoman"/>
+      <w:lvlText w:val="%9."/>
+      <w:lvlJc w:val="right"/>
+      <w:pPr>
+        <w:ind w:left="6120" w:hanging="180"/>
+      </w:pPr>
+    </w:lvl>
+  </w:abstractNum>
+  <w:abstractNum w:abstractNumId="21" w15:restartNumberingAfterBreak="0">
     <w:nsid w:val="324A72F7"/>
     <w:multiLevelType w:val="hybridMultilevel"/>
     <w:tmpl w:val="819EF9EE"/>
@@ -9783,7 +10484,7 @@
       </w:rPr>
     </w:lvl>
   </w:abstractNum>
-  <w:abstractNum w:abstractNumId="19" w15:restartNumberingAfterBreak="0">
+  <w:abstractNum w:abstractNumId="22" w15:restartNumberingAfterBreak="0">
     <w:nsid w:val="36093E53"/>
     <w:multiLevelType w:val="hybridMultilevel"/>
     <w:tmpl w:val="B0DC7B9C"/>
@@ -9895,7 +10596,7 @@
       </w:rPr>
     </w:lvl>
   </w:abstractNum>
-  <w:abstractNum w:abstractNumId="20" w15:restartNumberingAfterBreak="0">
+  <w:abstractNum w:abstractNumId="23" w15:restartNumberingAfterBreak="0">
     <w:nsid w:val="39953D46"/>
     <w:multiLevelType w:val="hybridMultilevel"/>
     <w:tmpl w:val="DD0CC1C8"/>
@@ -10008,7 +10709,7 @@
       </w:rPr>
     </w:lvl>
   </w:abstractNum>
-  <w:abstractNum w:abstractNumId="21" w15:restartNumberingAfterBreak="0">
+  <w:abstractNum w:abstractNumId="24" w15:restartNumberingAfterBreak="0">
     <w:nsid w:val="3A297E0E"/>
     <w:multiLevelType w:val="hybridMultilevel"/>
     <w:tmpl w:val="6F187ADE"/>
@@ -10121,7 +10822,7 @@
       </w:rPr>
     </w:lvl>
   </w:abstractNum>
-  <w:abstractNum w:abstractNumId="22" w15:restartNumberingAfterBreak="0">
+  <w:abstractNum w:abstractNumId="25" w15:restartNumberingAfterBreak="0">
     <w:nsid w:val="3F1C639D"/>
     <w:multiLevelType w:val="hybridMultilevel"/>
     <w:tmpl w:val="0EB23D7A"/>
@@ -10234,7 +10935,7 @@
       </w:rPr>
     </w:lvl>
   </w:abstractNum>
-  <w:abstractNum w:abstractNumId="23" w15:restartNumberingAfterBreak="0">
+  <w:abstractNum w:abstractNumId="26" w15:restartNumberingAfterBreak="0">
     <w:nsid w:val="3F764A25"/>
     <w:multiLevelType w:val="hybridMultilevel"/>
     <w:tmpl w:val="71E60104"/>
@@ -10346,7 +11047,7 @@
       </w:rPr>
     </w:lvl>
   </w:abstractNum>
-  <w:abstractNum w:abstractNumId="24" w15:restartNumberingAfterBreak="0">
+  <w:abstractNum w:abstractNumId="27" w15:restartNumberingAfterBreak="0">
     <w:nsid w:val="49A61E05"/>
     <w:multiLevelType w:val="multilevel"/>
     <w:tmpl w:val="68C8236A"/>
@@ -10461,7 +11162,7 @@
       </w:rPr>
     </w:lvl>
   </w:abstractNum>
-  <w:abstractNum w:abstractNumId="25" w15:restartNumberingAfterBreak="0">
+  <w:abstractNum w:abstractNumId="28" w15:restartNumberingAfterBreak="0">
     <w:nsid w:val="49E360DC"/>
     <w:multiLevelType w:val="hybridMultilevel"/>
     <w:tmpl w:val="650299C4"/>
@@ -10547,7 +11248,7 @@
       </w:pPr>
     </w:lvl>
   </w:abstractNum>
-  <w:abstractNum w:abstractNumId="26" w15:restartNumberingAfterBreak="0">
+  <w:abstractNum w:abstractNumId="29" w15:restartNumberingAfterBreak="0">
     <w:nsid w:val="4A084E4E"/>
     <w:multiLevelType w:val="hybridMultilevel"/>
     <w:tmpl w:val="DF5429E4"/>
@@ -10636,7 +11337,96 @@
       </w:pPr>
     </w:lvl>
   </w:abstractNum>
-  <w:abstractNum w:abstractNumId="27" w15:restartNumberingAfterBreak="0">
+  <w:abstractNum w:abstractNumId="30" w15:restartNumberingAfterBreak="0">
+    <w:nsid w:val="5006429E"/>
+    <w:multiLevelType w:val="hybridMultilevel"/>
+    <w:tmpl w:val="B77EFC0C"/>
+    <w:lvl w:ilvl="0" w:tplc="A87888F0">
+      <w:start w:val="1"/>
+      <w:numFmt w:val="decimal"/>
+      <w:lvlText w:val="%1"/>
+      <w:lvlJc w:val="left"/>
+      <w:pPr>
+        <w:ind w:left="720" w:hanging="360"/>
+      </w:pPr>
+      <w:rPr>
+        <w:rFonts w:hint="default"/>
+      </w:rPr>
+    </w:lvl>
+    <w:lvl w:ilvl="1" w:tplc="04050019" w:tentative="1">
+      <w:start w:val="1"/>
+      <w:numFmt w:val="lowerLetter"/>
+      <w:lvlText w:val="%2."/>
+      <w:lvlJc w:val="left"/>
+      <w:pPr>
+        <w:ind w:left="1440" w:hanging="360"/>
+      </w:pPr>
+    </w:lvl>
+    <w:lvl w:ilvl="2" w:tplc="0405001B" w:tentative="1">
+      <w:start w:val="1"/>
+      <w:numFmt w:val="lowerRoman"/>
+      <w:lvlText w:val="%3."/>
+      <w:lvlJc w:val="right"/>
+      <w:pPr>
+        <w:ind w:left="2160" w:hanging="180"/>
+      </w:pPr>
+    </w:lvl>
+    <w:lvl w:ilvl="3" w:tplc="0405000F" w:tentative="1">
+      <w:start w:val="1"/>
+      <w:numFmt w:val="decimal"/>
+      <w:lvlText w:val="%4."/>
+      <w:lvlJc w:val="left"/>
+      <w:pPr>
+        <w:ind w:left="2880" w:hanging="360"/>
+      </w:pPr>
+    </w:lvl>
+    <w:lvl w:ilvl="4" w:tplc="04050019" w:tentative="1">
+      <w:start w:val="1"/>
+      <w:numFmt w:val="lowerLetter"/>
+      <w:lvlText w:val="%5."/>
+      <w:lvlJc w:val="left"/>
+      <w:pPr>
+        <w:ind w:left="3600" w:hanging="360"/>
+      </w:pPr>
+    </w:lvl>
+    <w:lvl w:ilvl="5" w:tplc="0405001B" w:tentative="1">
+      <w:start w:val="1"/>
+      <w:numFmt w:val="lowerRoman"/>
+      <w:lvlText w:val="%6."/>
+      <w:lvlJc w:val="right"/>
+      <w:pPr>
+        <w:ind w:left="4320" w:hanging="180"/>
+      </w:pPr>
+    </w:lvl>
+    <w:lvl w:ilvl="6" w:tplc="0405000F" w:tentative="1">
+      <w:start w:val="1"/>
+      <w:numFmt w:val="decimal"/>
+      <w:lvlText w:val="%7."/>
+      <w:lvlJc w:val="left"/>
+      <w:pPr>
+        <w:ind w:left="5040" w:hanging="360"/>
+      </w:pPr>
+    </w:lvl>
+    <w:lvl w:ilvl="7" w:tplc="04050019" w:tentative="1">
+      <w:start w:val="1"/>
+      <w:numFmt w:val="lowerLetter"/>
+      <w:lvlText w:val="%8."/>
+      <w:lvlJc w:val="left"/>
+      <w:pPr>
+        <w:ind w:left="5760" w:hanging="360"/>
+      </w:pPr>
+    </w:lvl>
+    <w:lvl w:ilvl="8" w:tplc="0405001B" w:tentative="1">
+      <w:start w:val="1"/>
+      <w:numFmt w:val="lowerRoman"/>
+      <w:lvlText w:val="%9."/>
+      <w:lvlJc w:val="right"/>
+      <w:pPr>
+        <w:ind w:left="6480" w:hanging="180"/>
+      </w:pPr>
+    </w:lvl>
+  </w:abstractNum>
+  <w:abstractNum w:abstractNumId="31" w15:restartNumberingAfterBreak="0">
     <w:nsid w:val="5A6B816F"/>
     <w:multiLevelType w:val="hybridMultilevel"/>
     <w:tmpl w:val="8674763E"/>
@@ -10750,7 +11540,7 @@
       </w:rPr>
     </w:lvl>
   </w:abstractNum>
-  <w:abstractNum w:abstractNumId="28" w15:restartNumberingAfterBreak="0">
+  <w:abstractNum w:abstractNumId="32" w15:restartNumberingAfterBreak="0">
     <w:nsid w:val="5DBC5132"/>
     <w:multiLevelType w:val="hybridMultilevel"/>
     <w:tmpl w:val="782EE7CA"/>
@@ -10863,7 +11653,93 @@
       </w:rPr>
     </w:lvl>
   </w:abstractNum>
-  <w:abstractNum w:abstractNumId="29" w15:restartNumberingAfterBreak="0">
+  <w:abstractNum w:abstractNumId="33" w15:restartNumberingAfterBreak="0">
+    <w:nsid w:val="5F9226C4"/>
+    <w:multiLevelType w:val="hybridMultilevel"/>
+    <w:tmpl w:val="C1405086"/>
+    <w:lvl w:ilvl="0" w:tplc="0405000F">
+      <w:start w:val="1"/>
+      <w:numFmt w:val="decimal"/>
+      <w:lvlText w:val="%1."/>
+      <w:lvlJc w:val="left"/>
+      <w:pPr>
+        <w:ind w:left="360" w:hanging="360"/>
+      </w:pPr>
+    </w:lvl>
+    <w:lvl w:ilvl="1" w:tplc="04050019">
+      <w:start w:val="1"/>
+      <w:numFmt w:val="lowerLetter"/>
+      <w:lvlText w:val="%2."/>
+      <w:lvlJc w:val="left"/>
+      <w:pPr>
+        <w:ind w:left="1080" w:hanging="360"/>
+      </w:pPr>
+    </w:lvl>
+    <w:lvl w:ilvl="2" w:tplc="0405001B" w:tentative="1">
+      <w:start w:val="1"/>
+      <w:numFmt w:val="lowerRoman"/>
+      <w:lvlText w:val="%3."/>
+      <w:lvlJc w:val="right"/>
+      <w:pPr>
+        <w:ind w:left="1800" w:hanging="180"/>
+      </w:pPr>
+    </w:lvl>
+    <w:lvl w:ilvl="3" w:tplc="0405000F" w:tentative="1">
+      <w:start w:val="1"/>
+      <w:numFmt w:val="decimal"/>
+      <w:lvlText w:val="%4."/>
+      <w:lvlJc w:val="left"/>
+      <w:pPr>
+        <w:ind w:left="2520" w:hanging="360"/>
+      </w:pPr>
+    </w:lvl>
+    <w:lvl w:ilvl="4" w:tplc="04050019" w:tentative="1">
+      <w:start w:val="1"/>
+      <w:numFmt w:val="lowerLetter"/>
+      <w:lvlText w:val="%5."/>
+      <w:lvlJc w:val="left"/>
+      <w:pPr>
+        <w:ind w:left="3240" w:hanging="360"/>
+      </w:pPr>
+    </w:lvl>
+    <w:lvl w:ilvl="5" w:tplc="0405001B" w:tentative="1">
+      <w:start w:val="1"/>
+      <w:numFmt w:val="lowerRoman"/>
+      <w:lvlText w:val="%6."/>
+      <w:lvlJc w:val="right"/>
+      <w:pPr>
+        <w:ind w:left="3960" w:hanging="180"/>
+      </w:pPr>
+    </w:lvl>
+    <w:lvl w:ilvl="6" w:tplc="0405000F" w:tentative="1">
+      <w:start w:val="1"/>
+      <w:numFmt w:val="decimal"/>
+      <w:lvlText w:val="%7."/>
+      <w:lvlJc w:val="left"/>
+      <w:pPr>
+        <w:ind w:left="4680" w:hanging="360"/>
+      </w:pPr>
+    </w:lvl>
+    <w:lvl w:ilvl="7" w:tplc="04050019" w:tentative="1">
+      <w:start w:val="1"/>
+      <w:numFmt w:val="lowerLetter"/>
+      <w:lvlText w:val="%8."/>
+      <w:lvlJc w:val="left"/>
+      <w:pPr>
+        <w:ind w:left="5400" w:hanging="360"/>
+      </w:pPr>
+    </w:lvl>
+    <w:lvl w:ilvl="8" w:tplc="0405001B" w:tentative="1">
+      <w:start w:val="1"/>
+      <w:numFmt w:val="lowerRoman"/>
+      <w:lvlText w:val="%9."/>
+      <w:lvlJc w:val="right"/>
+      <w:pPr>
+        <w:ind w:left="6120" w:hanging="180"/>
+      </w:pPr>
+    </w:lvl>
+  </w:abstractNum>
+  <w:abstractNum w:abstractNumId="34" w15:restartNumberingAfterBreak="0">
     <w:nsid w:val="631F5680"/>
     <w:multiLevelType w:val="multilevel"/>
     <w:tmpl w:val="F08CAB9E"/>
@@ -10976,7 +11852,7 @@
       </w:rPr>
     </w:lvl>
   </w:abstractNum>
-  <w:abstractNum w:abstractNumId="30" w15:restartNumberingAfterBreak="0">
+  <w:abstractNum w:abstractNumId="35" w15:restartNumberingAfterBreak="0">
     <w:nsid w:val="63963E3C"/>
     <w:multiLevelType w:val="hybridMultilevel"/>
     <w:tmpl w:val="9970ECF8"/>
@@ -11065,7 +11941,7 @@
       </w:pPr>
     </w:lvl>
   </w:abstractNum>
-  <w:abstractNum w:abstractNumId="31" w15:restartNumberingAfterBreak="0">
+  <w:abstractNum w:abstractNumId="36" w15:restartNumberingAfterBreak="0">
     <w:nsid w:val="64560340"/>
     <w:multiLevelType w:val="hybridMultilevel"/>
     <w:tmpl w:val="A224F0FC"/>
@@ -11178,7 +12054,7 @@
       </w:rPr>
     </w:lvl>
   </w:abstractNum>
-  <w:abstractNum w:abstractNumId="32" w15:restartNumberingAfterBreak="0">
+  <w:abstractNum w:abstractNumId="37" w15:restartNumberingAfterBreak="0">
     <w:nsid w:val="66081024"/>
     <w:multiLevelType w:val="hybridMultilevel"/>
     <w:tmpl w:val="A9662508"/>
@@ -11290,7 +12166,7 @@
       </w:rPr>
     </w:lvl>
   </w:abstractNum>
-  <w:abstractNum w:abstractNumId="33" w15:restartNumberingAfterBreak="0">
+  <w:abstractNum w:abstractNumId="38" w15:restartNumberingAfterBreak="0">
     <w:nsid w:val="6AA21E91"/>
     <w:multiLevelType w:val="multilevel"/>
     <w:tmpl w:val="FFFA9DB4"/>
@@ -11415,7 +12291,7 @@
       </w:rPr>
     </w:lvl>
   </w:abstractNum>
-  <w:abstractNum w:abstractNumId="34" w15:restartNumberingAfterBreak="0">
+  <w:abstractNum w:abstractNumId="39" w15:restartNumberingAfterBreak="0">
     <w:nsid w:val="6C4D14B0"/>
     <w:multiLevelType w:val="hybridMultilevel"/>
     <w:tmpl w:val="38824C30"/>
@@ -11528,7 +12404,185 @@
       </w:rPr>
     </w:lvl>
   </w:abstractNum>
-  <w:abstractNum w:abstractNumId="35" w15:restartNumberingAfterBreak="0">
+  <w:abstractNum w:abstractNumId="40" w15:restartNumberingAfterBreak="0">
+    <w:nsid w:val="6C931379"/>
+    <w:multiLevelType w:val="hybridMultilevel"/>
+    <w:tmpl w:val="0B2CFF74"/>
+    <w:lvl w:ilvl="0" w:tplc="A87888F0">
+      <w:start w:val="7"/>
+      <w:numFmt w:val="decimal"/>
+      <w:lvlText w:val="%1"/>
+      <w:lvlJc w:val="left"/>
+      <w:pPr>
+        <w:ind w:left="360" w:hanging="360"/>
+      </w:pPr>
+      <w:rPr>
+        <w:rFonts w:hint="default"/>
+      </w:rPr>
+    </w:lvl>
+    <w:lvl w:ilvl="1" w:tplc="04050019" w:tentative="1">
+      <w:start w:val="1"/>
+      <w:numFmt w:val="lowerLetter"/>
+      <w:lvlText w:val="%2."/>
+      <w:lvlJc w:val="left"/>
+      <w:pPr>
+        <w:ind w:left="1080" w:hanging="360"/>
+      </w:pPr>
+    </w:lvl>
+    <w:lvl w:ilvl="2" w:tplc="0405001B" w:tentative="1">
+      <w:start w:val="1"/>
+      <w:numFmt w:val="lowerRoman"/>
+      <w:lvlText w:val="%3."/>
+      <w:lvlJc w:val="right"/>
+      <w:pPr>
+        <w:ind w:left="1800" w:hanging="180"/>
+      </w:pPr>
+    </w:lvl>
+    <w:lvl w:ilvl="3" w:tplc="0405000F" w:tentative="1">
+      <w:start w:val="1"/>
+      <w:numFmt w:val="decimal"/>
+      <w:lvlText w:val="%4."/>
+      <w:lvlJc w:val="left"/>
+      <w:pPr>
+        <w:ind w:left="2520" w:hanging="360"/>
+      </w:pPr>
+    </w:lvl>
+    <w:lvl w:ilvl="4" w:tplc="04050019" w:tentative="1">
+      <w:start w:val="1"/>
+      <w:numFmt w:val="lowerLetter"/>
+      <w:lvlText w:val="%5."/>
+      <w:lvlJc w:val="left"/>
+      <w:pPr>
+        <w:ind w:left="3240" w:hanging="360"/>
+      </w:pPr>
+    </w:lvl>
+    <w:lvl w:ilvl="5" w:tplc="0405001B" w:tentative="1">
+      <w:start w:val="1"/>
+      <w:numFmt w:val="lowerRoman"/>
+      <w:lvlText w:val="%6."/>
+      <w:lvlJc w:val="right"/>
+      <w:pPr>
+        <w:ind w:left="3960" w:hanging="180"/>
+      </w:pPr>
+    </w:lvl>
+    <w:lvl w:ilvl="6" w:tplc="0405000F" w:tentative="1">
+      <w:start w:val="1"/>
+      <w:numFmt w:val="decimal"/>
+      <w:lvlText w:val="%7."/>
+      <w:lvlJc w:val="left"/>
+      <w:pPr>
+        <w:ind w:left="4680" w:hanging="360"/>
+      </w:pPr>
+    </w:lvl>
+    <w:lvl w:ilvl="7" w:tplc="04050019" w:tentative="1">
+      <w:start w:val="1"/>
+      <w:numFmt w:val="lowerLetter"/>
+      <w:lvlText w:val="%8."/>
+      <w:lvlJc w:val="left"/>
+      <w:pPr>
+        <w:ind w:left="5400" w:hanging="360"/>
+      </w:pPr>
+    </w:lvl>
+    <w:lvl w:ilvl="8" w:tplc="0405001B" w:tentative="1">
+      <w:start w:val="1"/>
+      <w:numFmt w:val="lowerRoman"/>
+      <w:lvlText w:val="%9."/>
+      <w:lvlJc w:val="right"/>
+      <w:pPr>
+        <w:ind w:left="6120" w:hanging="180"/>
+      </w:pPr>
+    </w:lvl>
+  </w:abstractNum>
+  <w:abstractNum w:abstractNumId="41" w15:restartNumberingAfterBreak="0">
+    <w:nsid w:val="71482FE9"/>
+    <w:multiLevelType w:val="hybridMultilevel"/>
+    <w:tmpl w:val="E21E5CB6"/>
+    <w:lvl w:ilvl="0" w:tplc="A87888F0">
+      <w:start w:val="1"/>
+      <w:numFmt w:val="decimal"/>
+      <w:lvlText w:val="%1"/>
+      <w:lvlJc w:val="left"/>
+      <w:pPr>
+        <w:ind w:left="360" w:hanging="360"/>
+      </w:pPr>
+      <w:rPr>
+        <w:rFonts w:hint="default"/>
+      </w:rPr>
+    </w:lvl>
+    <w:lvl w:ilvl="1" w:tplc="04050019" w:tentative="1">
+      <w:start w:val="1"/>
+      <w:numFmt w:val="lowerLetter"/>
+      <w:lvlText w:val="%2."/>
+      <w:lvlJc w:val="left"/>
+      <w:pPr>
+        <w:ind w:left="1080" w:hanging="360"/>
+      </w:pPr>
+    </w:lvl>
+    <w:lvl w:ilvl="2" w:tplc="0405001B" w:tentative="1">
+      <w:start w:val="1"/>
+      <w:numFmt w:val="lowerRoman"/>
+      <w:lvlText w:val="%3."/>
+      <w:lvlJc w:val="right"/>
+      <w:pPr>
+        <w:ind w:left="1800" w:hanging="180"/>
+      </w:pPr>
+    </w:lvl>
+    <w:lvl w:ilvl="3" w:tplc="0405000F" w:tentative="1">
+      <w:start w:val="1"/>
+      <w:numFmt w:val="decimal"/>
+      <w:lvlText w:val="%4."/>
+      <w:lvlJc w:val="left"/>
+      <w:pPr>
+        <w:ind w:left="2520" w:hanging="360"/>
+      </w:pPr>
+    </w:lvl>
+    <w:lvl w:ilvl="4" w:tplc="04050019" w:tentative="1">
+      <w:start w:val="1"/>
+      <w:numFmt w:val="lowerLetter"/>
+      <w:lvlText w:val="%5."/>
+      <w:lvlJc w:val="left"/>
+      <w:pPr>
+        <w:ind w:left="3240" w:hanging="360"/>
+      </w:pPr>
+    </w:lvl>
+    <w:lvl w:ilvl="5" w:tplc="0405001B" w:tentative="1">
+      <w:start w:val="1"/>
+      <w:numFmt w:val="lowerRoman"/>
+      <w:lvlText w:val="%6."/>
+      <w:lvlJc w:val="right"/>
+      <w:pPr>
+        <w:ind w:left="3960" w:hanging="180"/>
+      </w:pPr>
+    </w:lvl>
+    <w:lvl w:ilvl="6" w:tplc="0405000F" w:tentative="1">
+      <w:start w:val="1"/>
+      <w:numFmt w:val="decimal"/>
+      <w:lvlText w:val="%7."/>
+      <w:lvlJc w:val="left"/>
+      <w:pPr>
+        <w:ind w:left="4680" w:hanging="360"/>
+      </w:pPr>
+    </w:lvl>
+    <w:lvl w:ilvl="7" w:tplc="04050019" w:tentative="1">
+      <w:start w:val="1"/>
+      <w:numFmt w:val="lowerLetter"/>
+      <w:lvlText w:val="%8."/>
+      <w:lvlJc w:val="left"/>
+      <w:pPr>
+        <w:ind w:left="5400" w:hanging="360"/>
+      </w:pPr>
+    </w:lvl>
+    <w:lvl w:ilvl="8" w:tplc="0405001B" w:tentative="1">
+      <w:start w:val="1"/>
+      <w:numFmt w:val="lowerRoman"/>
+      <w:lvlText w:val="%9."/>
+      <w:lvlJc w:val="right"/>
+      <w:pPr>
+        <w:ind w:left="6120" w:hanging="180"/>
+      </w:pPr>
+    </w:lvl>
+  </w:abstractNum>
+  <w:abstractNum w:abstractNumId="42" w15:restartNumberingAfterBreak="0">
     <w:nsid w:val="7551022D"/>
     <w:multiLevelType w:val="hybridMultilevel"/>
     <w:tmpl w:val="4FE6B7FC"/>
@@ -11616,7 +12670,7 @@
       </w:pPr>
     </w:lvl>
   </w:abstractNum>
-  <w:abstractNum w:abstractNumId="36" w15:restartNumberingAfterBreak="0">
+  <w:abstractNum w:abstractNumId="43" w15:restartNumberingAfterBreak="0">
     <w:nsid w:val="776F1C4E"/>
     <w:multiLevelType w:val="hybridMultilevel"/>
     <w:tmpl w:val="79BED6E8"/>
@@ -11729,7 +12783,7 @@
       </w:rPr>
     </w:lvl>
   </w:abstractNum>
-  <w:abstractNum w:abstractNumId="37" w15:restartNumberingAfterBreak="0">
+  <w:abstractNum w:abstractNumId="44" w15:restartNumberingAfterBreak="0">
     <w:nsid w:val="7A35285D"/>
     <w:multiLevelType w:val="hybridMultilevel"/>
     <w:tmpl w:val="18EC5B6E"/>
@@ -11820,7 +12874,7 @@
       </w:pPr>
     </w:lvl>
   </w:abstractNum>
-  <w:abstractNum w:abstractNumId="38" w15:restartNumberingAfterBreak="0">
+  <w:abstractNum w:abstractNumId="45" w15:restartNumberingAfterBreak="0">
     <w:nsid w:val="7FC56F47"/>
     <w:multiLevelType w:val="hybridMultilevel"/>
     <w:tmpl w:val="6FB60EBC"/>
@@ -11907,61 +12961,61 @@
     </w:lvl>
   </w:abstractNum>
   <w:num w:numId="1" w16cid:durableId="944732855">
-    <w:abstractNumId w:val="33"/>
+    <w:abstractNumId w:val="38"/>
   </w:num>
   <w:num w:numId="2" w16cid:durableId="136922467">
-    <w:abstractNumId w:val="29"/>
+    <w:abstractNumId w:val="34"/>
   </w:num>
   <w:num w:numId="3" w16cid:durableId="1191992487">
-    <w:abstractNumId w:val="24"/>
+    <w:abstractNumId w:val="27"/>
   </w:num>
   <w:num w:numId="4" w16cid:durableId="1589192832">
-    <w:abstractNumId w:val="23"/>
+    <w:abstractNumId w:val="26"/>
   </w:num>
   <w:num w:numId="5" w16cid:durableId="562180158">
-    <w:abstractNumId w:val="22"/>
+    <w:abstractNumId w:val="25"/>
   </w:num>
   <w:num w:numId="6" w16cid:durableId="1181777835">
-    <w:abstractNumId w:val="25"/>
+    <w:abstractNumId w:val="28"/>
   </w:num>
   <w:num w:numId="7" w16cid:durableId="418911056">
-    <w:abstractNumId w:val="36"/>
+    <w:abstractNumId w:val="43"/>
   </w:num>
   <w:num w:numId="8" w16cid:durableId="1196117197">
-    <w:abstractNumId w:val="17"/>
+    <w:abstractNumId w:val="19"/>
   </w:num>
   <w:num w:numId="9" w16cid:durableId="722606638">
-    <w:abstractNumId w:val="12"/>
+    <w:abstractNumId w:val="13"/>
   </w:num>
   <w:num w:numId="10" w16cid:durableId="1181358229">
     <w:abstractNumId w:val="8"/>
   </w:num>
   <w:num w:numId="11" w16cid:durableId="66197232">
-    <w:abstractNumId w:val="21"/>
+    <w:abstractNumId w:val="24"/>
   </w:num>
   <w:num w:numId="12" w16cid:durableId="54087011">
-    <w:abstractNumId w:val="31"/>
+    <w:abstractNumId w:val="36"/>
   </w:num>
   <w:num w:numId="13" w16cid:durableId="1495760012">
     <w:abstractNumId w:val="5"/>
   </w:num>
   <w:num w:numId="14" w16cid:durableId="1716347460">
-    <w:abstractNumId w:val="18"/>
+    <w:abstractNumId w:val="21"/>
   </w:num>
   <w:num w:numId="15" w16cid:durableId="1837114021">
     <w:abstractNumId w:val="10"/>
   </w:num>
   <w:num w:numId="16" w16cid:durableId="1523863412">
-    <w:abstractNumId w:val="20"/>
+    <w:abstractNumId w:val="23"/>
   </w:num>
   <w:num w:numId="17" w16cid:durableId="1214536231">
-    <w:abstractNumId w:val="27"/>
+    <w:abstractNumId w:val="31"/>
   </w:num>
   <w:num w:numId="18" w16cid:durableId="483859003">
-    <w:abstractNumId w:val="28"/>
+    <w:abstractNumId w:val="32"/>
   </w:num>
   <w:num w:numId="19" w16cid:durableId="57439879">
-    <w:abstractNumId w:val="15"/>
+    <w:abstractNumId w:val="16"/>
   </w:num>
   <w:num w:numId="20" w16cid:durableId="1958826030">
     <w:abstractNumId w:val="11"/>
@@ -11970,22 +13024,22 @@
     <w:abstractNumId w:val="1"/>
   </w:num>
   <w:num w:numId="22" w16cid:durableId="637537357">
-    <w:abstractNumId w:val="19"/>
+    <w:abstractNumId w:val="22"/>
   </w:num>
   <w:num w:numId="23" w16cid:durableId="63140882">
-    <w:abstractNumId w:val="16"/>
+    <w:abstractNumId w:val="17"/>
   </w:num>
   <w:num w:numId="24" w16cid:durableId="1632202433">
-    <w:abstractNumId w:val="32"/>
+    <w:abstractNumId w:val="37"/>
   </w:num>
   <w:num w:numId="25" w16cid:durableId="584460224">
-    <w:abstractNumId w:val="14"/>
+    <w:abstractNumId w:val="15"/>
   </w:num>
   <w:num w:numId="26" w16cid:durableId="1696954710">
-    <w:abstractNumId w:val="34"/>
+    <w:abstractNumId w:val="39"/>
   </w:num>
   <w:num w:numId="27" w16cid:durableId="1424034111">
-    <w:abstractNumId w:val="26"/>
+    <w:abstractNumId w:val="29"/>
   </w:num>
   <w:num w:numId="28" w16cid:durableId="823737647">
     <w:abstractNumId w:val="9"/>
@@ -11994,22 +13048,22 @@
     <w:abstractNumId w:val="2"/>
   </w:num>
   <w:num w:numId="30" w16cid:durableId="242301541">
-    <w:abstractNumId w:val="30"/>
+    <w:abstractNumId w:val="35"/>
   </w:num>
   <w:num w:numId="31" w16cid:durableId="974411067">
     <w:abstractNumId w:val="3"/>
   </w:num>
   <w:num w:numId="32" w16cid:durableId="479737047">
-    <w:abstractNumId w:val="37"/>
+    <w:abstractNumId w:val="44"/>
   </w:num>
   <w:num w:numId="33" w16cid:durableId="2021539256">
     <w:abstractNumId w:val="7"/>
   </w:num>
   <w:num w:numId="34" w16cid:durableId="483468373">
-    <w:abstractNumId w:val="35"/>
+    <w:abstractNumId w:val="42"/>
   </w:num>
   <w:num w:numId="35" w16cid:durableId="789666635">
-    <w:abstractNumId w:val="13"/>
+    <w:abstractNumId w:val="14"/>
   </w:num>
   <w:num w:numId="36" w16cid:durableId="559512824">
     <w:abstractNumId w:val="4"/>
@@ -12021,7 +13075,28 @@
     <w:abstractNumId w:val="6"/>
   </w:num>
   <w:num w:numId="39" w16cid:durableId="1122771933">
-    <w:abstractNumId w:val="38"/>
+    <w:abstractNumId w:val="45"/>
+  </w:num>
+  <w:num w:numId="40" w16cid:durableId="460266116">
+    <w:abstractNumId w:val="33"/>
+  </w:num>
+  <w:num w:numId="41" w16cid:durableId="1472207944">
+    <w:abstractNumId w:val="20"/>
+  </w:num>
+  <w:num w:numId="42" w16cid:durableId="1166900568">
+    <w:abstractNumId w:val="18"/>
+  </w:num>
+  <w:num w:numId="43" w16cid:durableId="308677812">
+    <w:abstractNumId w:val="41"/>
+  </w:num>
+  <w:num w:numId="44" w16cid:durableId="1075127388">
+    <w:abstractNumId w:val="40"/>
+  </w:num>
+  <w:num w:numId="45" w16cid:durableId="833882237">
+    <w:abstractNumId w:val="30"/>
+  </w:num>
+  <w:num w:numId="46" w16cid:durableId="653070777">
+    <w:abstractNumId w:val="12"/>
   </w:num>
 </w:numbering>
 </file>

</xml_diff>